<commit_message>
fix Staff Advance document
</commit_message>
<xml_diff>
--- a/documents/FA-G-10 เงินทดรองจ่ายพนักงาน (Chat bot).docx
+++ b/documents/FA-G-10 เงินทดรองจ่ายพนักงาน (Chat bot).docx
@@ -14,7 +14,7 @@
       <w:proofErr w:type="spellStart"/>
       <w:r>
         <w:rPr>
-          <w:rFonts w:ascii="Lotuss Smart TX" w:eastAsia="Lotuss Smart TX" w:hAnsi="Lotuss Smart TX" w:cs="Lotuss Smart TX"/>
+          <w:rFonts w:ascii="Lotuss Smart TX" w:hAnsi="Lotuss Smart TX" w:eastAsia="Lotuss Smart TX" w:cs="Lotuss Smart TX"/>
           <w:sz w:val="18"/>
           <w:szCs w:val="18"/>
         </w:rPr>
@@ -23,7 +23,7 @@
       <w:proofErr w:type="spellEnd"/>
       <w:r>
         <w:rPr>
-          <w:rFonts w:ascii="Lotuss Smart TX" w:eastAsia="Lotuss Smart TX" w:hAnsi="Lotuss Smart TX" w:cs="Lotuss Smart TX"/>
+          <w:rFonts w:ascii="Lotuss Smart TX" w:hAnsi="Lotuss Smart TX" w:eastAsia="Lotuss Smart TX" w:cs="Lotuss Smart TX"/>
           <w:sz w:val="18"/>
           <w:szCs w:val="18"/>
         </w:rPr>
@@ -31,7 +31,7 @@
       </w:r>
       <w:r>
         <w:rPr>
-          <w:rFonts w:ascii="Lotuss Smart TX" w:eastAsia="Lotuss Smart TX" w:hAnsi="Lotuss Smart TX" w:cs="Lotuss Smart TX"/>
+          <w:rFonts w:ascii="Lotuss Smart TX" w:hAnsi="Lotuss Smart TX" w:eastAsia="Lotuss Smart TX" w:cs="Lotuss Smart TX"/>
           <w:sz w:val="18"/>
           <w:szCs w:val="18"/>
           <w:cs/>
@@ -40,7 +40,7 @@
       </w:r>
       <w:r>
         <w:rPr>
-          <w:rFonts w:ascii="Lotuss Smart TX" w:eastAsia="Lotuss Smart TX" w:hAnsi="Lotuss Smart TX" w:cs="Lotuss Smart TX"/>
+          <w:rFonts w:ascii="Lotuss Smart TX" w:hAnsi="Lotuss Smart TX" w:eastAsia="Lotuss Smart TX" w:cs="Lotuss Smart TX"/>
           <w:sz w:val="18"/>
           <w:szCs w:val="18"/>
         </w:rPr>
@@ -50,7 +50,7 @@
         <w:r>
           <w:rPr>
             <w:rStyle w:val="Hyperlink"/>
-            <w:rFonts w:ascii="Lotuss Smart TX" w:eastAsia="Lotuss Smart TX" w:hAnsi="Lotuss Smart TX" w:cs="Lotuss Smart TX"/>
+            <w:rFonts w:ascii="Lotuss Smart TX" w:hAnsi="Lotuss Smart TX" w:eastAsia="Lotuss Smart TX" w:cs="Lotuss Smart TX"/>
             <w:sz w:val="18"/>
             <w:szCs w:val="18"/>
           </w:rPr>
@@ -70,7 +70,7 @@
       <w:proofErr w:type="spellStart"/>
       <w:r>
         <w:rPr>
-          <w:rFonts w:ascii="Lotuss Smart TX" w:eastAsia="Arial Unicode MS" w:hAnsi="Lotuss Smart TX" w:cs="Lotuss Smart TX"/>
+          <w:rFonts w:ascii="Lotuss Smart TX" w:hAnsi="Lotuss Smart TX" w:eastAsia="Arial Unicode MS" w:cs="Lotuss Smart TX"/>
           <w:b/>
           <w:sz w:val="18"/>
           <w:szCs w:val="18"/>
@@ -80,7 +80,7 @@
       <w:proofErr w:type="spellEnd"/>
       <w:r>
         <w:rPr>
-          <w:rFonts w:ascii="Lotuss Smart TX" w:eastAsia="Arial Unicode MS" w:hAnsi="Lotuss Smart TX" w:cs="Lotuss Smart TX"/>
+          <w:rFonts w:ascii="Lotuss Smart TX" w:hAnsi="Lotuss Smart TX" w:eastAsia="Arial Unicode MS" w:cs="Lotuss Smart TX"/>
           <w:b/>
           <w:sz w:val="18"/>
           <w:szCs w:val="18"/>
@@ -109,7 +109,7 @@
       <w:proofErr w:type="gramStart"/>
       <w:r>
         <w:rPr>
-          <w:rFonts w:ascii="Lotuss Smart TX" w:eastAsia="Arial Unicode MS" w:hAnsi="Lotuss Smart TX" w:cs="Lotuss Smart TX"/>
+          <w:rFonts w:ascii="Lotuss Smart TX" w:hAnsi="Lotuss Smart TX" w:eastAsia="Arial Unicode MS" w:cs="Lotuss Smart TX"/>
           <w:sz w:val="18"/>
           <w:szCs w:val="18"/>
           <w:cs/>
@@ -118,7 +118,7 @@
       </w:r>
       <w:r>
         <w:rPr>
-          <w:rFonts w:ascii="Lotuss Smart TX" w:eastAsia="Arial Unicode MS" w:hAnsi="Lotuss Smart TX" w:cs="Lotuss Smart TX"/>
+          <w:rFonts w:ascii="Lotuss Smart TX" w:hAnsi="Lotuss Smart TX" w:eastAsia="Arial Unicode MS" w:cs="Lotuss Smart TX"/>
           <w:sz w:val="18"/>
           <w:szCs w:val="18"/>
         </w:rPr>
@@ -127,7 +127,7 @@
       <w:proofErr w:type="gramEnd"/>
       <w:r>
         <w:rPr>
-          <w:rFonts w:ascii="Lotuss Smart TX" w:eastAsia="Arial Unicode MS" w:hAnsi="Lotuss Smart TX" w:cs="Lotuss Smart TX"/>
+          <w:rFonts w:ascii="Lotuss Smart TX" w:hAnsi="Lotuss Smart TX" w:eastAsia="Arial Unicode MS" w:cs="Lotuss Smart TX"/>
           <w:sz w:val="18"/>
           <w:szCs w:val="18"/>
         </w:rPr>
@@ -135,7 +135,7 @@
       </w:r>
       <w:r>
         <w:rPr>
-          <w:rFonts w:ascii="Lotuss Smart TX" w:eastAsia="Arial Unicode MS" w:hAnsi="Lotuss Smart TX" w:cs="Lotuss Smart TX"/>
+          <w:rFonts w:ascii="Lotuss Smart TX" w:hAnsi="Lotuss Smart TX" w:eastAsia="Arial Unicode MS" w:cs="Lotuss Smart TX"/>
           <w:sz w:val="18"/>
           <w:szCs w:val="18"/>
         </w:rPr>
@@ -143,7 +143,7 @@
       </w:r>
       <w:r>
         <w:rPr>
-          <w:rFonts w:ascii="Lotuss Smart TX" w:eastAsia="Arial Unicode MS" w:hAnsi="Lotuss Smart TX" w:cs="Lotuss Smart TX"/>
+          <w:rFonts w:ascii="Lotuss Smart TX" w:hAnsi="Lotuss Smart TX" w:eastAsia="Arial Unicode MS" w:cs="Lotuss Smart TX"/>
           <w:sz w:val="18"/>
           <w:szCs w:val="18"/>
         </w:rPr>
@@ -152,7 +152,7 @@
       <w:proofErr w:type="spellStart"/>
       <w:r>
         <w:rPr>
-          <w:rFonts w:ascii="Lotuss Smart TX" w:eastAsia="Arial Unicode MS" w:hAnsi="Lotuss Smart TX" w:cs="Lotuss Smart TX"/>
+          <w:rFonts w:ascii="Lotuss Smart TX" w:hAnsi="Lotuss Smart TX" w:eastAsia="Arial Unicode MS" w:cs="Lotuss Smart TX"/>
           <w:sz w:val="18"/>
           <w:szCs w:val="18"/>
         </w:rPr>
@@ -161,7 +161,7 @@
       <w:proofErr w:type="spellEnd"/>
       <w:r>
         <w:rPr>
-          <w:rFonts w:ascii="Lotuss Smart TX" w:eastAsia="Arial Unicode MS" w:hAnsi="Lotuss Smart TX" w:cs="Lotuss Smart TX"/>
+          <w:rFonts w:ascii="Lotuss Smart TX" w:hAnsi="Lotuss Smart TX" w:eastAsia="Arial Unicode MS" w:cs="Lotuss Smart TX"/>
           <w:sz w:val="18"/>
           <w:szCs w:val="18"/>
         </w:rPr>
@@ -170,7 +170,7 @@
       <w:proofErr w:type="spellStart"/>
       <w:r>
         <w:rPr>
-          <w:rFonts w:ascii="Lotuss Smart TX" w:eastAsia="Arial Unicode MS" w:hAnsi="Lotuss Smart TX" w:cs="Lotuss Smart TX"/>
+          <w:rFonts w:ascii="Lotuss Smart TX" w:hAnsi="Lotuss Smart TX" w:eastAsia="Arial Unicode MS" w:cs="Lotuss Smart TX"/>
           <w:sz w:val="18"/>
           <w:szCs w:val="18"/>
         </w:rPr>
@@ -179,7 +179,7 @@
       <w:proofErr w:type="spellEnd"/>
       <w:r>
         <w:rPr>
-          <w:rFonts w:ascii="Lotuss Smart TX" w:eastAsia="Arial Unicode MS" w:hAnsi="Lotuss Smart TX" w:cs="Lotuss Smart TX"/>
+          <w:rFonts w:ascii="Lotuss Smart TX" w:hAnsi="Lotuss Smart TX" w:eastAsia="Arial Unicode MS" w:cs="Lotuss Smart TX"/>
           <w:sz w:val="18"/>
           <w:szCs w:val="18"/>
         </w:rPr>
@@ -187,7 +187,7 @@
       </w:r>
       <w:r>
         <w:rPr>
-          <w:rFonts w:ascii="Lotuss Smart TX" w:eastAsia="Arial Unicode MS" w:hAnsi="Lotuss Smart TX" w:cs="Lotuss Smart TX"/>
+          <w:rFonts w:ascii="Lotuss Smart TX" w:hAnsi="Lotuss Smart TX" w:eastAsia="Arial Unicode MS" w:cs="Lotuss Smart TX"/>
           <w:sz w:val="18"/>
           <w:szCs w:val="18"/>
         </w:rPr>
@@ -196,7 +196,7 @@
       <w:proofErr w:type="spellStart"/>
       <w:r>
         <w:rPr>
-          <w:rFonts w:ascii="Lotuss Smart TX" w:eastAsia="Arial Unicode MS" w:hAnsi="Lotuss Smart TX" w:cs="Lotuss Smart TX"/>
+          <w:rFonts w:ascii="Lotuss Smart TX" w:hAnsi="Lotuss Smart TX" w:eastAsia="Arial Unicode MS" w:cs="Lotuss Smart TX"/>
           <w:sz w:val="18"/>
           <w:szCs w:val="18"/>
         </w:rPr>
@@ -205,7 +205,7 @@
       <w:proofErr w:type="spellEnd"/>
       <w:r>
         <w:rPr>
-          <w:rFonts w:ascii="Lotuss Smart TX" w:eastAsia="Arial Unicode MS" w:hAnsi="Lotuss Smart TX" w:cs="Lotuss Smart TX"/>
+          <w:rFonts w:ascii="Lotuss Smart TX" w:hAnsi="Lotuss Smart TX" w:eastAsia="Arial Unicode MS" w:cs="Lotuss Smart TX"/>
           <w:sz w:val="18"/>
           <w:szCs w:val="18"/>
         </w:rPr>
@@ -214,7 +214,7 @@
       <w:proofErr w:type="spellStart"/>
       <w:r>
         <w:rPr>
-          <w:rFonts w:ascii="Lotuss Smart TX" w:eastAsia="Arial Unicode MS" w:hAnsi="Lotuss Smart TX" w:cs="Lotuss Smart TX"/>
+          <w:rFonts w:ascii="Lotuss Smart TX" w:hAnsi="Lotuss Smart TX" w:eastAsia="Arial Unicode MS" w:cs="Lotuss Smart TX"/>
           <w:sz w:val="18"/>
           <w:szCs w:val="18"/>
         </w:rPr>
@@ -223,7 +223,7 @@
       <w:proofErr w:type="spellEnd"/>
       <w:r>
         <w:rPr>
-          <w:rFonts w:ascii="Lotuss Smart TX" w:eastAsia="Arial Unicode MS" w:hAnsi="Lotuss Smart TX" w:cs="Lotuss Smart TX"/>
+          <w:rFonts w:ascii="Lotuss Smart TX" w:hAnsi="Lotuss Smart TX" w:eastAsia="Arial Unicode MS" w:cs="Lotuss Smart TX"/>
           <w:sz w:val="18"/>
           <w:szCs w:val="18"/>
         </w:rPr>
@@ -232,7 +232,7 @@
       <w:proofErr w:type="spellStart"/>
       <w:r>
         <w:rPr>
-          <w:rFonts w:ascii="Lotuss Smart TX" w:eastAsia="Arial Unicode MS" w:hAnsi="Lotuss Smart TX" w:cs="Lotuss Smart TX"/>
+          <w:rFonts w:ascii="Lotuss Smart TX" w:hAnsi="Lotuss Smart TX" w:eastAsia="Arial Unicode MS" w:cs="Lotuss Smart TX"/>
           <w:sz w:val="18"/>
           <w:szCs w:val="18"/>
         </w:rPr>
@@ -253,7 +253,7 @@
       <w:proofErr w:type="spellStart"/>
       <w:r>
         <w:rPr>
-          <w:rFonts w:ascii="Lotuss Smart TX" w:eastAsia="Arial Unicode MS" w:hAnsi="Lotuss Smart TX" w:cs="Lotuss Smart TX"/>
+          <w:rFonts w:ascii="Lotuss Smart TX" w:hAnsi="Lotuss Smart TX" w:eastAsia="Arial Unicode MS" w:cs="Lotuss Smart TX"/>
           <w:b/>
           <w:sz w:val="18"/>
           <w:szCs w:val="18"/>
@@ -266,14 +266,14 @@
       <w:pPr>
         <w:spacing w:before="240" w:after="240" w:line="240" w:lineRule="auto"/>
         <w:rPr>
-          <w:rFonts w:ascii="Lotuss Smart TX" w:eastAsia="Arial Unicode MS" w:hAnsi="Lotuss Smart TX" w:cs="Lotuss Smart TX"/>
-          <w:sz w:val="18"/>
-          <w:szCs w:val="18"/>
-        </w:rPr>
-      </w:pPr>
-      <w:r>
-        <w:rPr>
-          <w:rFonts w:ascii="Lotuss Smart TX" w:eastAsia="Arial Unicode MS" w:hAnsi="Lotuss Smart TX" w:cs="Lotuss Smart TX"/>
+          <w:rFonts w:ascii="Lotuss Smart TX" w:hAnsi="Lotuss Smart TX" w:eastAsia="Arial Unicode MS" w:cs="Lotuss Smart TX"/>
+          <w:sz w:val="18"/>
+          <w:szCs w:val="18"/>
+        </w:rPr>
+      </w:pPr>
+      <w:r>
+        <w:rPr>
+          <w:rFonts w:ascii="Lotuss Smart TX" w:hAnsi="Lotuss Smart TX" w:eastAsia="Arial Unicode MS" w:cs="Lotuss Smart TX"/>
           <w:sz w:val="18"/>
           <w:szCs w:val="18"/>
           <w:cs/>
@@ -285,7 +285,7 @@
       <w:pPr>
         <w:spacing w:before="240" w:after="240" w:line="240" w:lineRule="auto"/>
         <w:rPr>
-          <w:rFonts w:ascii="Lotuss Smart TX" w:eastAsia="Arial Unicode MS" w:hAnsi="Lotuss Smart TX" w:cs="Lotuss Smart TX"/>
+          <w:rFonts w:ascii="Lotuss Smart TX" w:hAnsi="Lotuss Smart TX" w:eastAsia="Arial Unicode MS" w:cs="Lotuss Smart TX"/>
           <w:bCs/>
           <w:sz w:val="18"/>
           <w:szCs w:val="18"/>
@@ -293,7 +293,7 @@
       </w:pPr>
       <w:r>
         <w:rPr>
-          <w:rFonts w:ascii="Lotuss Smart TX" w:eastAsia="Arial Unicode MS" w:hAnsi="Lotuss Smart TX" w:cs="Lotuss Smart TX"/>
+          <w:rFonts w:ascii="Lotuss Smart TX" w:hAnsi="Lotuss Smart TX" w:eastAsia="Arial Unicode MS" w:cs="Lotuss Smart TX"/>
           <w:bCs/>
           <w:sz w:val="18"/>
           <w:szCs w:val="18"/>
@@ -306,14 +306,14 @@
       <w:pPr>
         <w:spacing w:before="240" w:after="240" w:line="240" w:lineRule="auto"/>
         <w:rPr>
-          <w:rFonts w:ascii="Lotuss Smart TX" w:eastAsia="Arial Unicode MS" w:hAnsi="Lotuss Smart TX" w:cs="Lotuss Smart TX"/>
-          <w:sz w:val="18"/>
-          <w:szCs w:val="18"/>
-        </w:rPr>
-      </w:pPr>
-      <w:r>
-        <w:rPr>
-          <w:rFonts w:ascii="Lotuss Smart TX" w:eastAsia="Arial Unicode MS" w:hAnsi="Lotuss Smart TX" w:cs="Lotuss Smart TX"/>
+          <w:rFonts w:ascii="Lotuss Smart TX" w:hAnsi="Lotuss Smart TX" w:eastAsia="Arial Unicode MS" w:cs="Lotuss Smart TX"/>
+          <w:sz w:val="18"/>
+          <w:szCs w:val="18"/>
+        </w:rPr>
+      </w:pPr>
+      <w:r>
+        <w:rPr>
+          <w:rFonts w:ascii="Lotuss Smart TX" w:hAnsi="Lotuss Smart TX" w:eastAsia="Arial Unicode MS" w:cs="Lotuss Smart TX"/>
           <w:sz w:val="18"/>
           <w:szCs w:val="18"/>
           <w:cs/>
@@ -325,7 +325,7 @@
       <w:pPr>
         <w:spacing w:before="240" w:after="240" w:line="240" w:lineRule="auto"/>
         <w:rPr>
-          <w:rFonts w:ascii="Lotuss Smart TX" w:eastAsia="Arial Unicode MS" w:hAnsi="Lotuss Smart TX" w:cs="Lotuss Smart TX"/>
+          <w:rFonts w:ascii="Lotuss Smart TX" w:hAnsi="Lotuss Smart TX" w:eastAsia="Arial Unicode MS" w:cs="Lotuss Smart TX"/>
           <w:b/>
           <w:bCs/>
           <w:sz w:val="18"/>
@@ -337,7 +337,7 @@
       <w:proofErr w:type="spellStart"/>
       <w:r>
         <w:rPr>
-          <w:rFonts w:ascii="Lotuss Smart TX" w:eastAsia="Arial Unicode MS" w:hAnsi="Lotuss Smart TX" w:cs="Lotuss Smart TX"/>
+          <w:rFonts w:ascii="Lotuss Smart TX" w:hAnsi="Lotuss Smart TX" w:eastAsia="Arial Unicode MS" w:cs="Lotuss Smart TX"/>
           <w:b/>
           <w:bCs/>
           <w:sz w:val="18"/>
@@ -352,14 +352,14 @@
       <w:pPr>
         <w:spacing w:before="240" w:after="240" w:line="240" w:lineRule="auto"/>
         <w:rPr>
-          <w:rFonts w:ascii="Lotuss Smart TX" w:eastAsia="Arial Unicode MS" w:hAnsi="Lotuss Smart TX" w:cs="Lotuss Smart TX"/>
-          <w:sz w:val="18"/>
-          <w:szCs w:val="18"/>
-        </w:rPr>
-      </w:pPr>
-      <w:r>
-        <w:rPr>
-          <w:rFonts w:ascii="Lotuss Smart TX" w:eastAsia="Arial Unicode MS" w:hAnsi="Lotuss Smart TX" w:cs="Lotuss Smart TX"/>
+          <w:rFonts w:ascii="Lotuss Smart TX" w:hAnsi="Lotuss Smart TX" w:eastAsia="Arial Unicode MS" w:cs="Lotuss Smart TX"/>
+          <w:sz w:val="18"/>
+          <w:szCs w:val="18"/>
+        </w:rPr>
+      </w:pPr>
+      <w:r>
+        <w:rPr>
+          <w:rFonts w:ascii="Lotuss Smart TX" w:hAnsi="Lotuss Smart TX" w:eastAsia="Arial Unicode MS" w:cs="Lotuss Smart TX"/>
           <w:b/>
           <w:bCs/>
           <w:sz w:val="18"/>
@@ -369,7 +369,7 @@
       </w:r>
       <w:r>
         <w:rPr>
-          <w:rFonts w:ascii="Lotuss Smart TX" w:eastAsia="Arial Unicode MS" w:hAnsi="Lotuss Smart TX" w:cs="Lotuss Smart TX"/>
+          <w:rFonts w:ascii="Lotuss Smart TX" w:hAnsi="Lotuss Smart TX" w:eastAsia="Arial Unicode MS" w:cs="Lotuss Smart TX"/>
           <w:b/>
           <w:bCs/>
           <w:sz w:val="18"/>
@@ -380,7 +380,7 @@
       </w:r>
       <w:r>
         <w:rPr>
-          <w:rFonts w:ascii="Lotuss Smart TX" w:eastAsia="Arial Unicode MS" w:hAnsi="Lotuss Smart TX" w:cs="Lotuss Smart TX"/>
+          <w:rFonts w:ascii="Lotuss Smart TX" w:hAnsi="Lotuss Smart TX" w:eastAsia="Arial Unicode MS" w:cs="Lotuss Smart TX"/>
           <w:b/>
           <w:bCs/>
           <w:sz w:val="18"/>
@@ -391,7 +391,7 @@
       <w:proofErr w:type="spellStart"/>
       <w:r>
         <w:rPr>
-          <w:rFonts w:ascii="Lotuss Smart TX" w:eastAsia="Arial Unicode MS" w:hAnsi="Lotuss Smart TX" w:cs="Lotuss Smart TX"/>
+          <w:rFonts w:ascii="Lotuss Smart TX" w:hAnsi="Lotuss Smart TX" w:eastAsia="Arial Unicode MS" w:cs="Lotuss Smart TX"/>
           <w:sz w:val="18"/>
           <w:szCs w:val="18"/>
         </w:rPr>
@@ -400,7 +400,7 @@
       <w:proofErr w:type="spellEnd"/>
       <w:r>
         <w:rPr>
-          <w:rFonts w:ascii="Lotuss Smart TX" w:eastAsia="Arial Unicode MS" w:hAnsi="Lotuss Smart TX" w:cs="Lotuss Smart TX"/>
+          <w:rFonts w:ascii="Lotuss Smart TX" w:hAnsi="Lotuss Smart TX" w:eastAsia="Arial Unicode MS" w:cs="Lotuss Smart TX"/>
           <w:sz w:val="18"/>
           <w:szCs w:val="18"/>
           <w:cs/>
@@ -409,7 +409,7 @@
       </w:r>
       <w:r>
         <w:rPr>
-          <w:rFonts w:ascii="Lotuss Smart TX" w:eastAsia="Arial Unicode MS" w:hAnsi="Lotuss Smart TX" w:cs="Lotuss Smart TX"/>
+          <w:rFonts w:ascii="Lotuss Smart TX" w:hAnsi="Lotuss Smart TX" w:eastAsia="Arial Unicode MS" w:cs="Lotuss Smart TX"/>
           <w:sz w:val="18"/>
           <w:szCs w:val="18"/>
           <w:cs/>
@@ -418,7 +418,7 @@
       </w:r>
       <w:r>
         <w:rPr>
-          <w:rFonts w:ascii="Lotuss Smart TX" w:eastAsia="Arial Unicode MS" w:hAnsi="Lotuss Smart TX" w:cs="Lotuss Smart TX"/>
+          <w:rFonts w:ascii="Lotuss Smart TX" w:hAnsi="Lotuss Smart TX" w:eastAsia="Arial Unicode MS" w:cs="Lotuss Smart TX"/>
           <w:sz w:val="18"/>
           <w:szCs w:val="18"/>
           <w:cs/>
@@ -427,7 +427,7 @@
       </w:r>
       <w:r>
         <w:rPr>
-          <w:rFonts w:ascii="Lotuss Smart TX" w:eastAsia="Arial Unicode MS" w:hAnsi="Lotuss Smart TX" w:cs="Lotuss Smart TX"/>
+          <w:rFonts w:ascii="Lotuss Smart TX" w:hAnsi="Lotuss Smart TX" w:eastAsia="Arial Unicode MS" w:cs="Lotuss Smart TX"/>
           <w:color w:val="0000FF"/>
           <w:sz w:val="18"/>
           <w:szCs w:val="18"/>
@@ -437,7 +437,7 @@
       </w:r>
       <w:r>
         <w:rPr>
-          <w:rFonts w:ascii="Lotuss Smart TX" w:eastAsia="Arial Unicode MS" w:hAnsi="Lotuss Smart TX" w:cs="Lotuss Smart TX"/>
+          <w:rFonts w:ascii="Lotuss Smart TX" w:hAnsi="Lotuss Smart TX" w:eastAsia="Arial Unicode MS" w:cs="Lotuss Smart TX"/>
           <w:color w:val="0000FF"/>
           <w:sz w:val="18"/>
           <w:szCs w:val="18"/>
@@ -447,7 +447,7 @@
       </w:r>
       <w:r>
         <w:rPr>
-          <w:rFonts w:ascii="Lotuss Smart TX" w:eastAsia="Arial Unicode MS" w:hAnsi="Lotuss Smart TX" w:cs="Lotuss Smart TX"/>
+          <w:rFonts w:ascii="Lotuss Smart TX" w:hAnsi="Lotuss Smart TX" w:eastAsia="Arial Unicode MS" w:cs="Lotuss Smart TX"/>
           <w:sz w:val="18"/>
           <w:szCs w:val="18"/>
         </w:rPr>
@@ -458,7 +458,7 @@
       <w:pPr>
         <w:spacing w:before="240" w:after="240" w:line="240" w:lineRule="auto"/>
         <w:rPr>
-          <w:rFonts w:ascii="Lotuss Smart TX" w:eastAsia="Arial Unicode MS" w:hAnsi="Lotuss Smart TX" w:cs="Lotuss Smart TX"/>
+          <w:rFonts w:ascii="Lotuss Smart TX" w:hAnsi="Lotuss Smart TX" w:eastAsia="Arial Unicode MS" w:cs="Lotuss Smart TX"/>
           <w:b/>
           <w:bCs/>
           <w:sz w:val="18"/>
@@ -467,7 +467,7 @@
       </w:pPr>
       <w:r>
         <w:rPr>
-          <w:rFonts w:ascii="Lotuss Smart TX" w:eastAsia="Arial Unicode MS" w:hAnsi="Lotuss Smart TX" w:cs="Lotuss Smart TX"/>
+          <w:rFonts w:ascii="Lotuss Smart TX" w:hAnsi="Lotuss Smart TX" w:eastAsia="Arial Unicode MS" w:cs="Lotuss Smart TX"/>
           <w:b/>
           <w:bCs/>
           <w:sz w:val="18"/>
@@ -477,7 +477,7 @@
       </w:r>
       <w:r>
         <w:rPr>
-          <w:rFonts w:ascii="Lotuss Smart TX" w:eastAsia="Arial Unicode MS" w:hAnsi="Lotuss Smart TX" w:cs="Lotuss Smart TX"/>
+          <w:rFonts w:ascii="Lotuss Smart TX" w:hAnsi="Lotuss Smart TX" w:eastAsia="Arial Unicode MS" w:cs="Lotuss Smart TX"/>
           <w:b/>
           <w:bCs/>
           <w:sz w:val="18"/>
@@ -491,14 +491,14 @@
       <w:pPr>
         <w:spacing w:before="240" w:after="240" w:line="240" w:lineRule="auto"/>
         <w:rPr>
-          <w:rFonts w:ascii="Lotuss Smart TX" w:eastAsia="Arial Unicode MS" w:hAnsi="Lotuss Smart TX" w:cs="Lotuss Smart TX"/>
-          <w:sz w:val="18"/>
-          <w:szCs w:val="18"/>
-        </w:rPr>
-      </w:pPr>
-      <w:r>
-        <w:rPr>
-          <w:rFonts w:ascii="Lotuss Smart TX" w:eastAsia="Arial Unicode MS" w:hAnsi="Lotuss Smart TX" w:cs="Lotuss Smart TX"/>
+          <w:rFonts w:ascii="Lotuss Smart TX" w:hAnsi="Lotuss Smart TX" w:eastAsia="Arial Unicode MS" w:cs="Lotuss Smart TX"/>
+          <w:sz w:val="18"/>
+          <w:szCs w:val="18"/>
+        </w:rPr>
+      </w:pPr>
+      <w:r>
+        <w:rPr>
+          <w:rFonts w:ascii="Lotuss Smart TX" w:hAnsi="Lotuss Smart TX" w:eastAsia="Arial Unicode MS" w:cs="Lotuss Smart TX"/>
           <w:sz w:val="18"/>
           <w:szCs w:val="18"/>
           <w:cs/>
@@ -507,7 +507,7 @@
       </w:r>
       <w:r>
         <w:rPr>
-          <w:rFonts w:ascii="Lotuss Smart TX" w:eastAsia="Arial Unicode MS" w:hAnsi="Lotuss Smart TX" w:cs="Lotuss Smart TX"/>
+          <w:rFonts w:ascii="Lotuss Smart TX" w:hAnsi="Lotuss Smart TX" w:eastAsia="Arial Unicode MS" w:cs="Lotuss Smart TX"/>
           <w:sz w:val="18"/>
           <w:szCs w:val="18"/>
         </w:rPr>
@@ -515,7 +515,7 @@
       </w:r>
       <w:r>
         <w:rPr>
-          <w:rFonts w:ascii="Lotuss Smart TX" w:eastAsia="Arial Unicode MS" w:hAnsi="Lotuss Smart TX" w:cs="Lotuss Smart TX"/>
+          <w:rFonts w:ascii="Lotuss Smart TX" w:hAnsi="Lotuss Smart TX" w:eastAsia="Arial Unicode MS" w:cs="Lotuss Smart TX"/>
           <w:sz w:val="18"/>
           <w:szCs w:val="18"/>
           <w:cs/>
@@ -524,7 +524,7 @@
       </w:r>
       <w:r>
         <w:rPr>
-          <w:rFonts w:ascii="Lotuss Smart TX" w:eastAsia="Arial Unicode MS" w:hAnsi="Lotuss Smart TX" w:cs="Lotuss Smart TX"/>
+          <w:rFonts w:ascii="Lotuss Smart TX" w:hAnsi="Lotuss Smart TX" w:eastAsia="Arial Unicode MS" w:cs="Lotuss Smart TX"/>
           <w:sz w:val="18"/>
           <w:szCs w:val="18"/>
         </w:rPr>
@@ -532,7 +532,7 @@
       </w:r>
       <w:r>
         <w:rPr>
-          <w:rFonts w:ascii="Lotuss Smart TX" w:eastAsia="Arial Unicode MS" w:hAnsi="Lotuss Smart TX" w:cs="Lotuss Smart TX"/>
+          <w:rFonts w:ascii="Lotuss Smart TX" w:hAnsi="Lotuss Smart TX" w:eastAsia="Arial Unicode MS" w:cs="Lotuss Smart TX"/>
           <w:sz w:val="18"/>
           <w:szCs w:val="18"/>
           <w:cs/>
@@ -541,7 +541,7 @@
       </w:r>
       <w:r>
         <w:rPr>
-          <w:rFonts w:ascii="Lotuss Smart TX" w:eastAsia="Arial Unicode MS" w:hAnsi="Lotuss Smart TX" w:cs="Lotuss Smart TX"/>
+          <w:rFonts w:ascii="Lotuss Smart TX" w:hAnsi="Lotuss Smart TX" w:eastAsia="Arial Unicode MS" w:cs="Lotuss Smart TX"/>
           <w:sz w:val="18"/>
           <w:szCs w:val="18"/>
         </w:rPr>
@@ -549,7 +549,7 @@
       </w:r>
       <w:r>
         <w:rPr>
-          <w:rFonts w:ascii="Lotuss Smart TX" w:eastAsia="Arial Unicode MS" w:hAnsi="Lotuss Smart TX" w:cs="Lotuss Smart TX"/>
+          <w:rFonts w:ascii="Lotuss Smart TX" w:hAnsi="Lotuss Smart TX" w:eastAsia="Arial Unicode MS" w:cs="Lotuss Smart TX"/>
           <w:sz w:val="18"/>
           <w:szCs w:val="18"/>
           <w:cs/>
@@ -559,7 +559,7 @@
       <w:proofErr w:type="spellStart"/>
       <w:r>
         <w:rPr>
-          <w:rFonts w:ascii="Lotuss Smart TX" w:eastAsia="Arial Unicode MS" w:hAnsi="Lotuss Smart TX" w:cs="Lotuss Smart TX"/>
+          <w:rFonts w:ascii="Lotuss Smart TX" w:hAnsi="Lotuss Smart TX" w:eastAsia="Arial Unicode MS" w:cs="Lotuss Smart TX"/>
           <w:sz w:val="18"/>
           <w:szCs w:val="18"/>
         </w:rPr>
@@ -568,7 +568,7 @@
       <w:proofErr w:type="spellEnd"/>
       <w:r>
         <w:rPr>
-          <w:rFonts w:ascii="Lotuss Smart TX" w:eastAsia="Arial Unicode MS" w:hAnsi="Lotuss Smart TX" w:cs="Lotuss Smart TX"/>
+          <w:rFonts w:ascii="Lotuss Smart TX" w:hAnsi="Lotuss Smart TX" w:eastAsia="Arial Unicode MS" w:cs="Lotuss Smart TX"/>
           <w:sz w:val="18"/>
           <w:szCs w:val="18"/>
         </w:rPr>
@@ -576,7 +576,7 @@
       </w:r>
       <w:r>
         <w:rPr>
-          <w:rFonts w:ascii="Lotuss Smart TX" w:eastAsia="Arial Unicode MS" w:hAnsi="Lotuss Smart TX" w:cs="Lotuss Smart TX"/>
+          <w:rFonts w:ascii="Lotuss Smart TX" w:hAnsi="Lotuss Smart TX" w:eastAsia="Arial Unicode MS" w:cs="Lotuss Smart TX"/>
           <w:sz w:val="18"/>
           <w:szCs w:val="18"/>
           <w:cs/>
@@ -585,7 +585,7 @@
       </w:r>
       <w:r>
         <w:rPr>
-          <w:rFonts w:ascii="Lotuss Smart TX" w:eastAsia="Arial Unicode MS" w:hAnsi="Lotuss Smart TX" w:cs="Lotuss Smart TX"/>
+          <w:rFonts w:ascii="Lotuss Smart TX" w:hAnsi="Lotuss Smart TX" w:eastAsia="Arial Unicode MS" w:cs="Lotuss Smart TX"/>
           <w:sz w:val="18"/>
           <w:szCs w:val="18"/>
         </w:rPr>
@@ -593,7 +593,7 @@
       </w:r>
       <w:r>
         <w:rPr>
-          <w:rFonts w:ascii="Lotuss Smart TX" w:eastAsia="Arial Unicode MS" w:hAnsi="Lotuss Smart TX" w:cs="Lotuss Smart TX"/>
+          <w:rFonts w:ascii="Lotuss Smart TX" w:hAnsi="Lotuss Smart TX" w:eastAsia="Arial Unicode MS" w:cs="Lotuss Smart TX"/>
           <w:sz w:val="18"/>
           <w:szCs w:val="18"/>
           <w:cs/>
@@ -610,14 +610,14 @@
         </w:numPr>
         <w:spacing w:before="240" w:after="240" w:line="240" w:lineRule="auto"/>
         <w:rPr>
-          <w:rFonts w:ascii="Lotuss Smart TX" w:eastAsia="Arial Unicode MS" w:hAnsi="Lotuss Smart TX" w:cs="Lotuss Smart TX"/>
-          <w:sz w:val="18"/>
-          <w:szCs w:val="18"/>
-        </w:rPr>
-      </w:pPr>
-      <w:r>
-        <w:rPr>
-          <w:rFonts w:ascii="Lotuss Smart TX" w:eastAsia="Arial Unicode MS" w:hAnsi="Lotuss Smart TX" w:cs="Lotuss Smart TX"/>
+          <w:rFonts w:ascii="Lotuss Smart TX" w:hAnsi="Lotuss Smart TX" w:eastAsia="Arial Unicode MS" w:cs="Lotuss Smart TX"/>
+          <w:sz w:val="18"/>
+          <w:szCs w:val="18"/>
+        </w:rPr>
+      </w:pPr>
+      <w:r>
+        <w:rPr>
+          <w:rFonts w:ascii="Lotuss Smart TX" w:hAnsi="Lotuss Smart TX" w:eastAsia="Arial Unicode MS" w:cs="Lotuss Smart TX"/>
           <w:sz w:val="18"/>
           <w:szCs w:val="18"/>
           <w:cs/>
@@ -634,14 +634,14 @@
         </w:numPr>
         <w:spacing w:before="240" w:after="240" w:line="240" w:lineRule="auto"/>
         <w:rPr>
-          <w:rFonts w:ascii="Lotuss Smart TX" w:eastAsia="Arial Unicode MS" w:hAnsi="Lotuss Smart TX" w:cs="Lotuss Smart TX"/>
-          <w:sz w:val="18"/>
-          <w:szCs w:val="18"/>
-        </w:rPr>
-      </w:pPr>
-      <w:r>
-        <w:rPr>
-          <w:rFonts w:ascii="Lotuss Smart TX" w:eastAsia="Arial Unicode MS" w:hAnsi="Lotuss Smart TX" w:cs="Lotuss Smart TX"/>
+          <w:rFonts w:ascii="Lotuss Smart TX" w:hAnsi="Lotuss Smart TX" w:eastAsia="Arial Unicode MS" w:cs="Lotuss Smart TX"/>
+          <w:sz w:val="18"/>
+          <w:szCs w:val="18"/>
+        </w:rPr>
+      </w:pPr>
+      <w:r>
+        <w:rPr>
+          <w:rFonts w:ascii="Lotuss Smart TX" w:hAnsi="Lotuss Smart TX" w:eastAsia="Arial Unicode MS" w:cs="Lotuss Smart TX"/>
           <w:sz w:val="18"/>
           <w:szCs w:val="18"/>
           <w:cs/>
@@ -658,14 +658,14 @@
         </w:numPr>
         <w:spacing w:before="240" w:after="240" w:line="240" w:lineRule="auto"/>
         <w:rPr>
-          <w:rFonts w:ascii="Lotuss Smart TX" w:eastAsia="Arial Unicode MS" w:hAnsi="Lotuss Smart TX" w:cs="Lotuss Smart TX"/>
-          <w:sz w:val="18"/>
-          <w:szCs w:val="18"/>
-        </w:rPr>
-      </w:pPr>
-      <w:r>
-        <w:rPr>
-          <w:rFonts w:ascii="Lotuss Smart TX" w:eastAsia="Arial Unicode MS" w:hAnsi="Lotuss Smart TX" w:cs="Lotuss Smart TX"/>
+          <w:rFonts w:ascii="Lotuss Smart TX" w:hAnsi="Lotuss Smart TX" w:eastAsia="Arial Unicode MS" w:cs="Lotuss Smart TX"/>
+          <w:sz w:val="18"/>
+          <w:szCs w:val="18"/>
+        </w:rPr>
+      </w:pPr>
+      <w:r>
+        <w:rPr>
+          <w:rFonts w:ascii="Lotuss Smart TX" w:hAnsi="Lotuss Smart TX" w:eastAsia="Arial Unicode MS" w:cs="Lotuss Smart TX"/>
           <w:sz w:val="18"/>
           <w:szCs w:val="18"/>
           <w:cs/>
@@ -678,7 +678,7 @@
         <w:spacing w:after="40" w:line="300" w:lineRule="exact"/>
         <w:jc w:val="thaiDistribute"/>
         <w:rPr>
-          <w:rFonts w:ascii="Lotuss Smart TX" w:eastAsia="Arial Unicode MS" w:hAnsi="Lotuss Smart TX" w:cs="Lotuss Smart TX"/>
+          <w:rFonts w:ascii="Lotuss Smart TX" w:hAnsi="Lotuss Smart TX" w:eastAsia="Arial Unicode MS" w:cs="Lotuss Smart TX"/>
           <w:b/>
           <w:bCs/>
           <w:sz w:val="18"/>
@@ -687,7 +687,7 @@
       </w:pPr>
       <w:r>
         <w:rPr>
-          <w:rFonts w:ascii="Lotuss Smart TX" w:eastAsia="Arial Unicode MS" w:hAnsi="Lotuss Smart TX" w:cs="Lotuss Smart TX"/>
+          <w:rFonts w:ascii="Lotuss Smart TX" w:hAnsi="Lotuss Smart TX" w:eastAsia="Arial Unicode MS" w:cs="Lotuss Smart TX"/>
           <w:b/>
           <w:bCs/>
           <w:sz w:val="18"/>
@@ -697,7 +697,7 @@
       </w:r>
       <w:r>
         <w:rPr>
-          <w:rFonts w:ascii="Lotuss Smart TX" w:eastAsia="Arial Unicode MS" w:hAnsi="Lotuss Smart TX" w:cs="Lotuss Smart TX"/>
+          <w:rFonts w:ascii="Lotuss Smart TX" w:hAnsi="Lotuss Smart TX" w:eastAsia="Arial Unicode MS" w:cs="Lotuss Smart TX"/>
           <w:b/>
           <w:bCs/>
           <w:sz w:val="18"/>
@@ -712,14 +712,14 @@
         <w:spacing w:after="40" w:line="300" w:lineRule="exact"/>
         <w:jc w:val="thaiDistribute"/>
         <w:rPr>
-          <w:rFonts w:ascii="Lotuss Smart TX" w:eastAsia="Arial Unicode MS" w:hAnsi="Lotuss Smart TX" w:cs="Lotuss Smart TX"/>
-          <w:sz w:val="18"/>
-          <w:szCs w:val="18"/>
-        </w:rPr>
-      </w:pPr>
-      <w:r>
-        <w:rPr>
-          <w:rFonts w:ascii="Lotuss Smart TX" w:eastAsia="Arial Unicode MS" w:hAnsi="Lotuss Smart TX" w:cs="Lotuss Smart TX"/>
+          <w:rFonts w:ascii="Lotuss Smart TX" w:hAnsi="Lotuss Smart TX" w:eastAsia="Arial Unicode MS" w:cs="Lotuss Smart TX"/>
+          <w:sz w:val="18"/>
+          <w:szCs w:val="18"/>
+        </w:rPr>
+      </w:pPr>
+      <w:r>
+        <w:rPr>
+          <w:rFonts w:ascii="Lotuss Smart TX" w:hAnsi="Lotuss Smart TX" w:eastAsia="Arial Unicode MS" w:cs="Lotuss Smart TX"/>
           <w:sz w:val="18"/>
           <w:szCs w:val="18"/>
           <w:cs/>
@@ -729,7 +729,7 @@
       <w:proofErr w:type="spellStart"/>
       <w:r>
         <w:rPr>
-          <w:rFonts w:ascii="Lotuss Smart TX" w:eastAsia="Arial Unicode MS" w:hAnsi="Lotuss Smart TX" w:cs="Lotuss Smart TX"/>
+          <w:rFonts w:ascii="Lotuss Smart TX" w:hAnsi="Lotuss Smart TX" w:eastAsia="Arial Unicode MS" w:cs="Lotuss Smart TX"/>
           <w:color w:val="0000FF"/>
           <w:sz w:val="18"/>
           <w:szCs w:val="18"/>
@@ -740,7 +740,7 @@
       <w:proofErr w:type="spellEnd"/>
       <w:r>
         <w:rPr>
-          <w:rFonts w:ascii="Lotuss Smart TX" w:eastAsia="Arial Unicode MS" w:hAnsi="Lotuss Smart TX" w:cs="Lotuss Smart TX"/>
+          <w:rFonts w:ascii="Lotuss Smart TX" w:hAnsi="Lotuss Smart TX" w:eastAsia="Arial Unicode MS" w:cs="Lotuss Smart TX"/>
           <w:color w:val="0000FF"/>
           <w:sz w:val="18"/>
           <w:szCs w:val="18"/>
@@ -750,7 +750,7 @@
       </w:r>
       <w:r>
         <w:rPr>
-          <w:rFonts w:ascii="Lotuss Smart TX" w:eastAsia="Arial Unicode MS" w:hAnsi="Lotuss Smart TX" w:cs="Lotuss Smart TX"/>
+          <w:rFonts w:ascii="Lotuss Smart TX" w:hAnsi="Lotuss Smart TX" w:eastAsia="Arial Unicode MS" w:cs="Lotuss Smart TX"/>
           <w:color w:val="0000FF"/>
           <w:sz w:val="18"/>
           <w:szCs w:val="18"/>
@@ -765,7 +765,7 @@
       <w:pPr>
         <w:spacing w:before="240" w:after="240" w:line="240" w:lineRule="auto"/>
         <w:rPr>
-          <w:rFonts w:ascii="Lotuss Smart TX" w:eastAsia="Arial Unicode MS" w:hAnsi="Lotuss Smart TX" w:cs="Lotuss Smart TX"/>
+          <w:rFonts w:ascii="Lotuss Smart TX" w:hAnsi="Lotuss Smart TX" w:eastAsia="Arial Unicode MS" w:cs="Lotuss Smart TX"/>
           <w:bCs/>
           <w:sz w:val="18"/>
           <w:szCs w:val="18"/>
@@ -773,7 +773,7 @@
       </w:pPr>
       <w:r>
         <w:rPr>
-          <w:rFonts w:ascii="Lotuss Smart TX" w:eastAsia="Arial Unicode MS" w:hAnsi="Lotuss Smart TX" w:cs="Lotuss Smart TX"/>
+          <w:rFonts w:ascii="Lotuss Smart TX" w:hAnsi="Lotuss Smart TX" w:eastAsia="Arial Unicode MS" w:cs="Lotuss Smart TX"/>
           <w:bCs/>
           <w:sz w:val="18"/>
           <w:szCs w:val="18"/>
@@ -782,7 +782,7 @@
       </w:r>
       <w:r>
         <w:rPr>
-          <w:rFonts w:ascii="Lotuss Smart TX" w:eastAsia="Arial Unicode MS" w:hAnsi="Lotuss Smart TX" w:cs="Lotuss Smart TX"/>
+          <w:rFonts w:ascii="Lotuss Smart TX" w:hAnsi="Lotuss Smart TX" w:eastAsia="Arial Unicode MS" w:cs="Lotuss Smart TX"/>
           <w:bCs/>
           <w:sz w:val="18"/>
           <w:szCs w:val="18"/>
@@ -795,7 +795,7 @@
       <w:pPr>
         <w:spacing w:before="240" w:after="240" w:line="240" w:lineRule="auto"/>
         <w:rPr>
-          <w:rFonts w:ascii="Lotuss Smart TX" w:eastAsia="Arial Unicode MS" w:hAnsi="Lotuss Smart TX" w:cs="Lotuss Smart TX"/>
+          <w:rFonts w:ascii="Lotuss Smart TX" w:hAnsi="Lotuss Smart TX" w:eastAsia="Arial Unicode MS" w:cs="Lotuss Smart TX"/>
           <w:color w:val="0000FF"/>
           <w:sz w:val="18"/>
           <w:szCs w:val="18"/>
@@ -805,7 +805,7 @@
       </w:pPr>
       <w:r>
         <w:rPr>
-          <w:rFonts w:ascii="Lotuss Smart TX" w:eastAsia="Arial Unicode MS" w:hAnsi="Lotuss Smart TX" w:cs="Lotuss Smart TX"/>
+          <w:rFonts w:ascii="Lotuss Smart TX" w:hAnsi="Lotuss Smart TX" w:eastAsia="Arial Unicode MS" w:cs="Lotuss Smart TX"/>
           <w:sz w:val="18"/>
           <w:szCs w:val="18"/>
           <w:cs/>
@@ -815,7 +815,7 @@
       <w:proofErr w:type="spellStart"/>
       <w:r>
         <w:rPr>
-          <w:rFonts w:ascii="Lotuss Smart TX" w:eastAsia="Arial Unicode MS" w:hAnsi="Lotuss Smart TX" w:cs="Lotuss Smart TX"/>
+          <w:rFonts w:ascii="Lotuss Smart TX" w:hAnsi="Lotuss Smart TX" w:eastAsia="Arial Unicode MS" w:cs="Lotuss Smart TX"/>
           <w:color w:val="0000FF"/>
           <w:sz w:val="18"/>
           <w:szCs w:val="18"/>
@@ -826,7 +826,7 @@
       <w:proofErr w:type="spellEnd"/>
       <w:r>
         <w:rPr>
-          <w:rFonts w:ascii="Lotuss Smart TX" w:eastAsia="Arial Unicode MS" w:hAnsi="Lotuss Smart TX" w:cs="Lotuss Smart TX"/>
+          <w:rFonts w:ascii="Lotuss Smart TX" w:hAnsi="Lotuss Smart TX" w:eastAsia="Arial Unicode MS" w:cs="Lotuss Smart TX"/>
           <w:color w:val="0000FF"/>
           <w:sz w:val="18"/>
           <w:szCs w:val="18"/>
@@ -836,7 +836,7 @@
       </w:r>
       <w:r>
         <w:rPr>
-          <w:rFonts w:ascii="Lotuss Smart TX" w:eastAsia="Arial Unicode MS" w:hAnsi="Lotuss Smart TX" w:cs="Lotuss Smart TX"/>
+          <w:rFonts w:ascii="Lotuss Smart TX" w:hAnsi="Lotuss Smart TX" w:eastAsia="Arial Unicode MS" w:cs="Lotuss Smart TX"/>
           <w:color w:val="0000FF"/>
           <w:sz w:val="18"/>
           <w:szCs w:val="18"/>
@@ -849,10 +849,10 @@
     </w:p>
     <w:p>
       <w:pPr>
-        <w:spacing w:before="40" w:afterLines="40" w:after="96" w:line="280" w:lineRule="exact"/>
+        <w:spacing w:before="40" w:after="96" w:afterLines="40" w:line="280" w:lineRule="exact"/>
         <w:jc w:val="thaiDistribute"/>
         <w:rPr>
-          <w:rFonts w:ascii="Lotuss Smart TX" w:eastAsia="Arial Unicode MS" w:hAnsi="Lotuss Smart TX" w:cs="Lotuss Smart TX"/>
+          <w:rFonts w:ascii="Lotuss Smart TX" w:hAnsi="Lotuss Smart TX" w:eastAsia="Arial Unicode MS" w:cs="Lotuss Smart TX"/>
           <w:bCs/>
           <w:sz w:val="18"/>
           <w:szCs w:val="18"/>
@@ -861,7 +861,7 @@
       </w:pPr>
       <w:r>
         <w:rPr>
-          <w:rFonts w:ascii="Lotuss Smart TX" w:eastAsia="Arial Unicode MS" w:hAnsi="Lotuss Smart TX" w:cs="Lotuss Smart TX"/>
+          <w:rFonts w:ascii="Lotuss Smart TX" w:hAnsi="Lotuss Smart TX" w:eastAsia="Arial Unicode MS" w:cs="Lotuss Smart TX"/>
           <w:bCs/>
           <w:sz w:val="18"/>
           <w:szCs w:val="18"/>
@@ -871,7 +871,7 @@
       </w:r>
       <w:r>
         <w:rPr>
-          <w:rFonts w:ascii="Lotuss Smart TX" w:eastAsia="Arial Unicode MS" w:hAnsi="Lotuss Smart TX" w:cs="Lotuss Smart TX"/>
+          <w:rFonts w:ascii="Lotuss Smart TX" w:hAnsi="Lotuss Smart TX" w:eastAsia="Arial Unicode MS" w:cs="Lotuss Smart TX"/>
           <w:bCs/>
           <w:sz w:val="18"/>
           <w:szCs w:val="18"/>
@@ -883,10 +883,10 @@
     </w:p>
     <w:p>
       <w:pPr>
-        <w:spacing w:before="40" w:afterLines="40" w:after="96" w:line="280" w:lineRule="exact"/>
+        <w:spacing w:before="40" w:after="96" w:afterLines="40" w:line="280" w:lineRule="exact"/>
         <w:jc w:val="thaiDistribute"/>
         <w:rPr>
-          <w:rFonts w:ascii="Lotuss Smart TX" w:eastAsia="Arial Unicode MS" w:hAnsi="Lotuss Smart TX" w:cs="Lotuss Smart TX"/>
+          <w:rFonts w:ascii="Lotuss Smart TX" w:hAnsi="Lotuss Smart TX" w:eastAsia="Arial Unicode MS" w:cs="Lotuss Smart TX"/>
           <w:bCs/>
           <w:sz w:val="18"/>
           <w:szCs w:val="18"/>
@@ -894,7 +894,7 @@
       </w:pPr>
       <w:r>
         <w:rPr>
-          <w:rFonts w:ascii="Lotuss Smart TX" w:eastAsia="Arial Unicode MS" w:hAnsi="Lotuss Smart TX" w:cs="Lotuss Smart TX"/>
+          <w:rFonts w:ascii="Lotuss Smart TX" w:hAnsi="Lotuss Smart TX" w:eastAsia="Arial Unicode MS" w:cs="Lotuss Smart TX"/>
           <w:bCs/>
           <w:sz w:val="18"/>
           <w:szCs w:val="18"/>
@@ -903,7 +903,7 @@
       </w:r>
       <w:r>
         <w:rPr>
-          <w:rFonts w:ascii="Lotuss Smart TX" w:eastAsia="Arial Unicode MS" w:hAnsi="Lotuss Smart TX" w:cs="Lotuss Smart TX"/>
+          <w:rFonts w:ascii="Lotuss Smart TX" w:hAnsi="Lotuss Smart TX" w:eastAsia="Arial Unicode MS" w:cs="Lotuss Smart TX"/>
           <w:bCs/>
           <w:sz w:val="18"/>
           <w:szCs w:val="18"/>
@@ -919,10 +919,10 @@
           <w:ilvl w:val="0"/>
           <w:numId w:val="4"/>
         </w:numPr>
-        <w:spacing w:before="40" w:afterLines="40" w:after="96" w:line="280" w:lineRule="exact"/>
+        <w:spacing w:before="40" w:after="96" w:afterLines="40" w:line="280" w:lineRule="exact"/>
         <w:jc w:val="thaiDistribute"/>
         <w:rPr>
-          <w:rFonts w:ascii="Lotuss Smart TX" w:eastAsia="Arial Unicode MS" w:hAnsi="Lotuss Smart TX" w:cs="Lotuss Smart TX"/>
+          <w:rFonts w:ascii="Lotuss Smart TX" w:hAnsi="Lotuss Smart TX" w:eastAsia="Arial Unicode MS" w:cs="Lotuss Smart TX"/>
           <w:sz w:val="18"/>
           <w:szCs w:val="18"/>
           <w:u w:val="single"/>
@@ -963,10 +963,10 @@
     </w:p>
     <w:p>
       <w:pPr>
-        <w:spacing w:before="40" w:afterLines="40" w:after="96" w:line="280" w:lineRule="exact"/>
+        <w:spacing w:before="40" w:after="96" w:afterLines="40" w:line="280" w:lineRule="exact"/>
         <w:jc w:val="thaiDistribute"/>
         <w:rPr>
-          <w:rFonts w:ascii="Lotuss Smart TX" w:eastAsia="Arial Unicode MS" w:hAnsi="Lotuss Smart TX" w:cs="Lotuss Smart TX"/>
+          <w:rFonts w:ascii="Lotuss Smart TX" w:hAnsi="Lotuss Smart TX" w:eastAsia="Arial Unicode MS" w:cs="Lotuss Smart TX"/>
           <w:b/>
           <w:bCs/>
           <w:sz w:val="18"/>
@@ -975,7 +975,7 @@
       </w:pPr>
       <w:r>
         <w:rPr>
-          <w:rFonts w:ascii="Lotuss Smart TX" w:eastAsia="Arial Unicode MS" w:hAnsi="Lotuss Smart TX" w:cs="Lotuss Smart TX"/>
+          <w:rFonts w:ascii="Lotuss Smart TX" w:hAnsi="Lotuss Smart TX" w:eastAsia="Arial Unicode MS" w:cs="Lotuss Smart TX"/>
           <w:b/>
           <w:bCs/>
           <w:sz w:val="18"/>
@@ -986,7 +986,7 @@
       </w:r>
       <w:r>
         <w:rPr>
-          <w:rFonts w:ascii="Lotuss Smart TX" w:eastAsia="Arial Unicode MS" w:hAnsi="Lotuss Smart TX" w:cs="Lotuss Smart TX"/>
+          <w:rFonts w:ascii="Lotuss Smart TX" w:hAnsi="Lotuss Smart TX" w:eastAsia="Arial Unicode MS" w:cs="Lotuss Smart TX"/>
           <w:b/>
           <w:bCs/>
           <w:sz w:val="18"/>
@@ -1003,10 +1003,10 @@
           <w:ilvl w:val="0"/>
           <w:numId w:val="4"/>
         </w:numPr>
-        <w:spacing w:before="40" w:afterLines="40" w:after="96" w:line="280" w:lineRule="exact"/>
+        <w:spacing w:before="40" w:after="96" w:afterLines="40" w:line="280" w:lineRule="exact"/>
         <w:jc w:val="thaiDistribute"/>
         <w:rPr>
-          <w:rFonts w:ascii="Lotuss Smart TX" w:eastAsia="Arial Unicode MS" w:hAnsi="Lotuss Smart TX" w:cs="Lotuss Smart TX"/>
+          <w:rFonts w:ascii="Lotuss Smart TX" w:hAnsi="Lotuss Smart TX" w:eastAsia="Arial Unicode MS" w:cs="Lotuss Smart TX"/>
           <w:sz w:val="18"/>
           <w:szCs w:val="18"/>
           <w:u w:val="single"/>
@@ -1032,7 +1032,7 @@
           <w:ilvl w:val="0"/>
           <w:numId w:val="4"/>
         </w:numPr>
-        <w:spacing w:before="40" w:afterLines="40" w:after="96" w:line="280" w:lineRule="exact"/>
+        <w:spacing w:before="40" w:after="96" w:afterLines="40" w:line="280" w:lineRule="exact"/>
         <w:jc w:val="thaiDistribute"/>
         <w:rPr>
           <w:rFonts w:ascii="Lotuss Smart TX" w:hAnsi="Lotuss Smart TX" w:cs="Lotuss Smart TX"/>
@@ -1060,7 +1060,7 @@
           <w:ilvl w:val="0"/>
           <w:numId w:val="4"/>
         </w:numPr>
-        <w:spacing w:before="40" w:afterLines="40" w:after="96" w:line="280" w:lineRule="exact"/>
+        <w:spacing w:before="40" w:after="96" w:afterLines="40" w:line="280" w:lineRule="exact"/>
         <w:jc w:val="thaiDistribute"/>
         <w:rPr>
           <w:rFonts w:ascii="Lotuss Smart TX" w:hAnsi="Lotuss Smart TX" w:cs="Lotuss Smart TX"/>
@@ -1185,7 +1185,7 @@
           <w:ilvl w:val="0"/>
           <w:numId w:val="4"/>
         </w:numPr>
-        <w:spacing w:before="40" w:afterLines="40" w:after="96" w:line="280" w:lineRule="exact"/>
+        <w:spacing w:before="40" w:after="96" w:afterLines="40" w:line="280" w:lineRule="exact"/>
         <w:jc w:val="thaiDistribute"/>
         <w:rPr>
           <w:rFonts w:ascii="Lotuss Smart TX" w:hAnsi="Lotuss Smart TX" w:cs="Lotuss Smart TX"/>
@@ -1214,7 +1214,7 @@
           <w:ilvl w:val="0"/>
           <w:numId w:val="4"/>
         </w:numPr>
-        <w:spacing w:before="40" w:afterLines="40" w:after="96" w:line="280" w:lineRule="exact"/>
+        <w:spacing w:before="40" w:after="96" w:afterLines="40" w:line="280" w:lineRule="exact"/>
         <w:jc w:val="thaiDistribute"/>
         <w:rPr>
           <w:rFonts w:ascii="Lotuss Smart TX" w:hAnsi="Lotuss Smart TX" w:cs="Lotuss Smart TX"/>
@@ -1254,7 +1254,78 @@
           <w:cs/>
           <w:lang w:eastAsia="th-TH"/>
         </w:rPr>
-        <w:t>ตามตารางจ่ายเงินพนักงานเท่านั้น วันที่ต้องการเงินทดรองจ่ายต้องถัดจากวันส่งใบเบิกเงินทดรองจ่ายที่สมบูรณ์ให้แผนกบัญชีไม่น้อยกว่า 5 วันทำการ และต้องไม่ก่อนวันที่คาดว่าจะดำเนินกิจกรรมธุรกิจที่ได้รับอนุมัติเกินกว่า 10 วันทำการ</w:t>
+        <w:t xml:space="preserve">ตามตารางจ่ายเงินพนักงานเท่านั้น วันที่ต้องการเงินทดรองจ่ายต้องถัดจากวันส่งใบเบิกเงินทดรองจ่ายที่สมบูรณ์ให้แผนกบัญชีไม่น้อยกว่า </w:t>
+      </w:r>
+      <w:r>
+        <w:rPr>
+          <w:rFonts w:ascii="Lotuss Smart TX" w:hAnsi="Lotuss Smart TX" w:cs="Lotuss Smart TX"/>
+          <w:snapToGrid w:val="0"/>
+          <w:sz w:val="18"/>
+          <w:szCs w:val="18"/>
+          <w:cs/>
+          <w:lang w:eastAsia="th-TH"/>
+        </w:rPr>
+        <w:t>7</w:t>
+      </w:r>
+      <w:r>
+        <w:rPr>
+          <w:rFonts w:ascii="Lotuss Smart TX" w:hAnsi="Lotuss Smart TX" w:cs="Lotuss Smart TX"/>
+          <w:snapToGrid w:val="0"/>
+          <w:sz w:val="18"/>
+          <w:szCs w:val="18"/>
+          <w:cs/>
+          <w:lang w:eastAsia="th-TH"/>
+        </w:rPr>
+        <w:t xml:space="preserve"> </w:t>
+      </w:r>
+      <w:r>
+        <w:rPr>
+          <w:rFonts w:ascii="Lotuss Smart TX" w:hAnsi="Lotuss Smart TX" w:cs="Lotuss Smart TX"/>
+          <w:snapToGrid w:val="0"/>
+          <w:sz w:val="18"/>
+          <w:szCs w:val="18"/>
+          <w:cs/>
+          <w:lang w:eastAsia="th-TH"/>
+        </w:rPr>
+        <w:t>ว</w:t>
+      </w:r>
+      <w:r>
+        <w:rPr>
+          <w:rFonts w:ascii="Lotuss Smart TX" w:hAnsi="Lotuss Smart TX" w:cs="Lotuss Smart TX"/>
+          <w:snapToGrid w:val="0"/>
+          <w:sz w:val="18"/>
+          <w:szCs w:val="18"/>
+          <w:cs/>
+          <w:lang w:eastAsia="th-TH"/>
+        </w:rPr>
+        <w:t>ันทำการ และต้องไม่ก่อนวันที่คาดว่าจะดำเนินกิจกรรมธุรกิจที่ได้รับอนุมัติเกินกว่า 10 วันทำการ</w:t>
+      </w:r>
+    </w:p>
+    <w:p w14:noSpellErr="1">
+      <w:pPr>
+        <w:pStyle w:val="ListParagraph"/>
+        <w:rPr>
+          <w:rFonts w:ascii="Lotuss Smart TX" w:hAnsi="Lotuss Smart TX" w:cs="Lotuss Smart TX"/>
+          <w:sz w:val="22"/>
+          <w:szCs w:val="22"/>
+          <w:lang w:eastAsia="th-TH"/>
+        </w:rPr>
+      </w:pPr>
+      <w:r>
+        <w:rPr/>
+        <w:t>โดยปกติแล้วกิจกรรมธุรกิจที่จะเบิกเงินทดรองจ่าย ต้องเกิดขึ้นหลังจากได้รับเงินทดรองจ่าย หากกิจกรรมธุรกิจเกิดแล้วพนักงานจะต้องใช้ระเบียบปฏิบัติการเบิกค่าใช้จ่ายพนักงาน (</w:t>
+      </w:r>
+      <w:r>
+        <w:rPr/>
+        <w:t>FA-G-</w:t>
+      </w:r>
+      <w:r>
+        <w:rPr/>
+        <w:t xml:space="preserve">02) </w:t>
+      </w:r>
+      <w:r>
+        <w:rPr/>
+        <w:t>แทน</w:t>
       </w:r>
     </w:p>
     <w:p>
@@ -1264,9 +1335,10 @@
           <w:ilvl w:val="0"/>
           <w:numId w:val="4"/>
         </w:numPr>
-        <w:spacing w:before="40" w:afterLines="40" w:after="96" w:line="280" w:lineRule="exact"/>
+        <w:spacing w:before="40" w:after="96" w:afterLines="40" w:line="280" w:lineRule="exact"/>
         <w:jc w:val="thaiDistribute"/>
         <w:rPr>
+          <w:rStyle w:val="eop"/>
           <w:rFonts w:ascii="Lotuss Smart TX" w:hAnsi="Lotuss Smart TX" w:cs="Lotuss Smart TX"/>
           <w:snapToGrid w:val="0"/>
           <w:sz w:val="18"/>
@@ -1276,35 +1348,118 @@
       </w:pPr>
       <w:r>
         <w:rPr>
-          <w:rFonts w:ascii="Lotuss Smart TX" w:hAnsi="Lotuss Smart TX" w:cs="Lotuss Smart TX"/>
-          <w:snapToGrid w:val="0"/>
-          <w:sz w:val="18"/>
-          <w:szCs w:val="18"/>
-          <w:cs/>
-          <w:lang w:eastAsia="th-TH"/>
-        </w:rPr>
-        <w:t>โดยปกติแล้วกิจกรรมธุรกิจที่จะเบิกเงินทดรองจ่าย ต้องเกิดขึ้นหลังจากได้รับเงินทดรองจ่าย หากกิจกรรมธุรกิจเกิดแล้วพนักงานจะต้องใช้ระเบียบปฏิบัติการเบิกค่าใช้จ่ายพนักงาน (</w:t>
-      </w:r>
-      <w:r>
-        <w:rPr>
-          <w:rFonts w:ascii="Lotuss Smart TX" w:hAnsi="Lotuss Smart TX" w:cs="Lotuss Smart TX"/>
-          <w:snapToGrid w:val="0"/>
-          <w:sz w:val="18"/>
-          <w:szCs w:val="18"/>
-          <w:lang w:eastAsia="th-TH"/>
-        </w:rPr>
-        <w:t>FA-G-</w:t>
-      </w:r>
-      <w:r>
-        <w:rPr>
-          <w:rFonts w:ascii="Lotuss Smart TX" w:hAnsi="Lotuss Smart TX" w:cs="Lotuss Smart TX"/>
-          <w:snapToGrid w:val="0"/>
-          <w:sz w:val="18"/>
-          <w:szCs w:val="18"/>
-          <w:cs/>
-          <w:lang w:eastAsia="th-TH"/>
-        </w:rPr>
-        <w:t>02) แทน</w:t>
+          <w:rStyle w:val="normaltextrun"/>
+          <w:rFonts w:ascii="Lotuss Smart TX" w:hAnsi="Lotuss Smart TX" w:cs="Lotuss Smart TX"/>
+          <w:color w:val="000000"/>
+          <w:sz w:val="18"/>
+          <w:szCs w:val="18"/>
+          <w:shd w:val="clear" w:color="auto" w:fill="FFFFFF"/>
+          <w:cs/>
+        </w:rPr>
+        <w:t xml:space="preserve">พนักงานต้องระบุวันที่จะ </w:t>
+      </w:r>
+      <w:r>
+        <w:rPr>
+          <w:rStyle w:val="normaltextrun"/>
+          <w:rFonts w:ascii="Lotuss Smart TX" w:hAnsi="Lotuss Smart TX" w:cs="Lotuss Smart TX"/>
+          <w:color w:val="000000"/>
+          <w:sz w:val="18"/>
+          <w:szCs w:val="18"/>
+          <w:shd w:val="clear" w:color="auto" w:fill="FFFFFF"/>
+        </w:rPr>
+        <w:t xml:space="preserve">settle </w:t>
+      </w:r>
+      <w:r>
+        <w:rPr>
+          <w:rStyle w:val="normaltextrun"/>
+          <w:rFonts w:ascii="Lotuss Smart TX" w:hAnsi="Lotuss Smart TX" w:cs="Lotuss Smart TX"/>
+          <w:color w:val="000000"/>
+          <w:sz w:val="18"/>
+          <w:szCs w:val="18"/>
+          <w:shd w:val="clear" w:color="auto" w:fill="FFFFFF"/>
+        </w:rPr>
+        <w:t xml:space="preserve">หรือเคลีย์</w:t>
+      </w:r>
+      <w:r>
+        <w:rPr>
+          <w:rStyle w:val="normaltextrun"/>
+          <w:rFonts w:ascii="Lotuss Smart TX" w:hAnsi="Lotuss Smart TX" w:cs="Lotuss Smart TX"/>
+          <w:color w:val="000000"/>
+          <w:sz w:val="18"/>
+          <w:szCs w:val="18"/>
+          <w:shd w:val="clear" w:color="auto" w:fill="FFFFFF"/>
+          <w:cs/>
+        </w:rPr>
+        <w:t>เงินทดรองจ่าย (</w:t>
+      </w:r>
+      <w:r>
+        <w:rPr>
+          <w:rStyle w:val="normaltextrun"/>
+          <w:rFonts w:ascii="Lotuss Smart TX" w:hAnsi="Lotuss Smart TX" w:cs="Lotuss Smart TX"/>
+          <w:color w:val="000000"/>
+          <w:sz w:val="18"/>
+          <w:szCs w:val="18"/>
+          <w:shd w:val="clear" w:color="auto" w:fill="FFFFFF"/>
+        </w:rPr>
+        <w:t xml:space="preserve">Date to be settled) </w:t>
+      </w:r>
+      <w:r>
+        <w:rPr>
+          <w:rStyle w:val="normaltextrun"/>
+          <w:rFonts w:ascii="Lotuss Smart TX" w:hAnsi="Lotuss Smart TX" w:cs="Lotuss Smart TX"/>
+          <w:color w:val="000000"/>
+          <w:sz w:val="18"/>
+          <w:szCs w:val="18"/>
+          <w:shd w:val="clear" w:color="auto" w:fill="FFFFFF"/>
+          <w:cs/>
+        </w:rPr>
+        <w:t xml:space="preserve">ไม่เกิน </w:t>
+      </w:r>
+      <w:r>
+        <w:rPr>
+          <w:rStyle w:val="normaltextrun"/>
+          <w:rFonts w:ascii="Lotuss Smart TX" w:hAnsi="Lotuss Smart TX" w:cs="Lotuss Smart TX"/>
+          <w:color w:val="000000"/>
+          <w:sz w:val="18"/>
+          <w:szCs w:val="18"/>
+          <w:shd w:val="clear" w:color="auto" w:fill="FFFFFF"/>
+        </w:rPr>
+        <w:t xml:space="preserve">30 </w:t>
+      </w:r>
+      <w:r>
+        <w:rPr>
+          <w:rStyle w:val="normaltextrun"/>
+          <w:rFonts w:ascii="Lotuss Smart TX" w:hAnsi="Lotuss Smart TX" w:cs="Lotuss Smart TX"/>
+          <w:color w:val="000000"/>
+          <w:sz w:val="18"/>
+          <w:szCs w:val="18"/>
+          <w:shd w:val="clear" w:color="auto" w:fill="FFFFFF"/>
+          <w:cs/>
+        </w:rPr>
+        <w:t>วัน</w:t>
+      </w:r>
+      <w:r>
+        <w:rPr>
+          <w:rStyle w:val="normaltextrun"/>
+          <w:rFonts w:ascii="Lotuss Smart TX" w:hAnsi="Lotuss Smart TX" w:cs="Lotuss Smart TX"/>
+          <w:color w:val="000000"/>
+          <w:sz w:val="18"/>
+          <w:szCs w:val="18"/>
+          <w:shd w:val="clear" w:color="auto" w:fill="FFFFFF"/>
+          <w:cs/>
+        </w:rPr>
+        <w:t>นับจากวันที่ได้รับเงินทดรองจ่าย</w:t>
+      </w:r>
+      <w:r>
+        <w:rPr>
+          <w:rStyle w:val="eop"/>
+          <w:rFonts w:ascii="Cambria" w:hAnsi="Cambria" w:cs="Cambria"/>
+          <w:color w:val="000000"/>
+          <w:sz w:val="18"/>
+          <w:szCs w:val="18"/>
+          <w:shd w:val="clear" w:color="auto" w:fill="FFFFFF"/>
+        </w:rPr>
+        <w:t> </w:t>
       </w:r>
     </w:p>
     <w:p>
@@ -1314,118 +1469,7 @@
           <w:ilvl w:val="0"/>
           <w:numId w:val="4"/>
         </w:numPr>
-        <w:spacing w:before="40" w:afterLines="40" w:after="96" w:line="280" w:lineRule="exact"/>
-        <w:jc w:val="thaiDistribute"/>
-        <w:rPr>
-          <w:rStyle w:val="eop"/>
-          <w:rFonts w:ascii="Lotuss Smart TX" w:hAnsi="Lotuss Smart TX" w:cs="Lotuss Smart TX"/>
-          <w:snapToGrid w:val="0"/>
-          <w:sz w:val="18"/>
-          <w:szCs w:val="18"/>
-          <w:lang w:eastAsia="th-TH"/>
-        </w:rPr>
-      </w:pPr>
-      <w:r>
-        <w:rPr>
-          <w:rStyle w:val="normaltextrun"/>
-          <w:rFonts w:ascii="Lotuss Smart TX" w:hAnsi="Lotuss Smart TX" w:cs="Lotuss Smart TX"/>
-          <w:color w:val="000000"/>
-          <w:sz w:val="18"/>
-          <w:szCs w:val="18"/>
-          <w:shd w:val="clear" w:color="auto" w:fill="FFFFFF"/>
-          <w:cs/>
-        </w:rPr>
-        <w:t xml:space="preserve">พนักงานต้องระบุวันที่จะ </w:t>
-      </w:r>
-      <w:r>
-        <w:rPr>
-          <w:rStyle w:val="normaltextrun"/>
-          <w:rFonts w:ascii="Lotuss Smart TX" w:hAnsi="Lotuss Smart TX" w:cs="Lotuss Smart TX"/>
-          <w:color w:val="000000"/>
-          <w:sz w:val="18"/>
-          <w:szCs w:val="18"/>
-          <w:shd w:val="clear" w:color="auto" w:fill="FFFFFF"/>
-        </w:rPr>
-        <w:t xml:space="preserve">settle </w:t>
-      </w:r>
-      <w:r>
-        <w:rPr>
-          <w:rStyle w:val="normaltextrun"/>
-          <w:rFonts w:ascii="Lotuss Smart TX" w:hAnsi="Lotuss Smart TX" w:cs="Lotuss Smart TX"/>
-          <w:color w:val="000000"/>
-          <w:sz w:val="18"/>
-          <w:szCs w:val="18"/>
-          <w:shd w:val="clear" w:color="auto" w:fill="FFFFFF"/>
-          <w:cs/>
-        </w:rPr>
-        <w:t>เงินทดรองจ่าย (</w:t>
-      </w:r>
-      <w:r>
-        <w:rPr>
-          <w:rStyle w:val="normaltextrun"/>
-          <w:rFonts w:ascii="Lotuss Smart TX" w:hAnsi="Lotuss Smart TX" w:cs="Lotuss Smart TX"/>
-          <w:color w:val="000000"/>
-          <w:sz w:val="18"/>
-          <w:szCs w:val="18"/>
-          <w:shd w:val="clear" w:color="auto" w:fill="FFFFFF"/>
-        </w:rPr>
-        <w:t xml:space="preserve">Date to be settled) </w:t>
-      </w:r>
-      <w:r>
-        <w:rPr>
-          <w:rStyle w:val="normaltextrun"/>
-          <w:rFonts w:ascii="Lotuss Smart TX" w:hAnsi="Lotuss Smart TX" w:cs="Lotuss Smart TX"/>
-          <w:color w:val="000000"/>
-          <w:sz w:val="18"/>
-          <w:szCs w:val="18"/>
-          <w:shd w:val="clear" w:color="auto" w:fill="FFFFFF"/>
-          <w:cs/>
-        </w:rPr>
-        <w:t xml:space="preserve">ไม่เกิน </w:t>
-      </w:r>
-      <w:r>
-        <w:rPr>
-          <w:rStyle w:val="normaltextrun"/>
-          <w:rFonts w:ascii="Lotuss Smart TX" w:hAnsi="Lotuss Smart TX" w:cs="Lotuss Smart TX"/>
-          <w:color w:val="000000"/>
-          <w:sz w:val="18"/>
-          <w:szCs w:val="18"/>
-          <w:shd w:val="clear" w:color="auto" w:fill="FFFFFF"/>
-        </w:rPr>
-        <w:t xml:space="preserve">30 </w:t>
-      </w:r>
-      <w:r>
-        <w:rPr>
-          <w:rStyle w:val="normaltextrun"/>
-          <w:rFonts w:ascii="Lotuss Smart TX" w:hAnsi="Lotuss Smart TX" w:cs="Lotuss Smart TX"/>
-          <w:color w:val="000000"/>
-          <w:sz w:val="18"/>
-          <w:szCs w:val="18"/>
-          <w:shd w:val="clear" w:color="auto" w:fill="FFFFFF"/>
-          <w:cs/>
-        </w:rPr>
-        <w:t>วันนับจากวันที่ได้รับเงินทดรองจ่าย</w:t>
-      </w:r>
-      <w:r>
-        <w:rPr>
-          <w:rStyle w:val="eop"/>
-          <w:rFonts w:ascii="Cambria" w:hAnsi="Cambria" w:cs="Cambria"/>
-          <w:color w:val="000000"/>
-          <w:sz w:val="18"/>
-          <w:szCs w:val="18"/>
-          <w:shd w:val="clear" w:color="auto" w:fill="FFFFFF"/>
-        </w:rPr>
-        <w:t> </w:t>
-      </w:r>
-    </w:p>
-    <w:p>
-      <w:pPr>
-        <w:pStyle w:val="ListParagraph"/>
-        <w:numPr>
-          <w:ilvl w:val="0"/>
-          <w:numId w:val="4"/>
-        </w:numPr>
-        <w:spacing w:before="40" w:afterLines="40" w:after="96" w:line="280" w:lineRule="exact"/>
+        <w:spacing w:before="40" w:after="96" w:afterLines="40" w:line="280" w:lineRule="exact"/>
         <w:jc w:val="thaiDistribute"/>
         <w:rPr>
           <w:rFonts w:ascii="Lotuss Smart TX" w:hAnsi="Lotuss Smart TX" w:cs="Lotuss Smart TX"/>
@@ -1624,7 +1668,7 @@
           <w:ilvl w:val="0"/>
           <w:numId w:val="4"/>
         </w:numPr>
-        <w:spacing w:before="40" w:afterLines="40" w:after="96" w:line="280" w:lineRule="exact"/>
+        <w:spacing w:before="40" w:after="96" w:afterLines="40" w:line="280" w:lineRule="exact"/>
         <w:jc w:val="thaiDistribute"/>
         <w:rPr>
           <w:rFonts w:ascii="Lotuss Smart TX" w:hAnsi="Lotuss Smart TX" w:cs="Lotuss Smart TX"/>
@@ -1684,7 +1728,7 @@
     <w:p>
       <w:pPr>
         <w:pStyle w:val="ListParagraph"/>
-        <w:spacing w:before="40" w:afterLines="40" w:after="96" w:line="280" w:lineRule="exact"/>
+        <w:spacing w:before="40" w:after="96" w:afterLines="40" w:line="280" w:lineRule="exact"/>
         <w:jc w:val="thaiDistribute"/>
         <w:rPr>
           <w:rFonts w:ascii="Lotuss Smart TX" w:hAnsi="Lotuss Smart TX" w:cs="Lotuss Smart TX"/>
@@ -1697,7 +1741,7 @@
     </w:p>
     <w:p>
       <w:pPr>
-        <w:spacing w:afterLines="40" w:after="96" w:line="280" w:lineRule="exact"/>
+        <w:spacing w:after="96" w:afterLines="40" w:line="280" w:lineRule="exact"/>
         <w:jc w:val="thaiDistribute"/>
         <w:rPr>
           <w:rFonts w:ascii="Lotuss Smart TX" w:hAnsi="Lotuss Smart TX" w:cs="Lotuss Smart TX"/>
@@ -1709,7 +1753,7 @@
       </w:pPr>
       <w:r>
         <w:rPr>
-          <w:rFonts w:ascii="Lotuss Smart TX" w:eastAsia="Arial Unicode MS" w:hAnsi="Lotuss Smart TX" w:cs="Lotuss Smart TX"/>
+          <w:rFonts w:ascii="Lotuss Smart TX" w:hAnsi="Lotuss Smart TX" w:eastAsia="Arial Unicode MS" w:cs="Lotuss Smart TX"/>
           <w:bCs/>
           <w:sz w:val="18"/>
           <w:szCs w:val="18"/>
@@ -1718,7 +1762,7 @@
       </w:r>
       <w:r>
         <w:rPr>
-          <w:rFonts w:ascii="Lotuss Smart TX" w:eastAsia="Arial Unicode MS" w:hAnsi="Lotuss Smart TX" w:cs="Lotuss Smart TX"/>
+          <w:rFonts w:ascii="Lotuss Smart TX" w:hAnsi="Lotuss Smart TX" w:eastAsia="Arial Unicode MS" w:cs="Lotuss Smart TX"/>
           <w:bCs/>
           <w:sz w:val="18"/>
           <w:szCs w:val="18"/>
@@ -1734,10 +1778,10 @@
           <w:ilvl w:val="0"/>
           <w:numId w:val="5"/>
         </w:numPr>
-        <w:spacing w:before="40" w:afterLines="40" w:after="96" w:line="280" w:lineRule="exact"/>
+        <w:spacing w:before="40" w:after="96" w:afterLines="40" w:line="280" w:lineRule="exact"/>
         <w:jc w:val="thaiDistribute"/>
         <w:rPr>
-          <w:rFonts w:ascii="Lotuss Smart TX" w:eastAsia="Arial Unicode MS" w:hAnsi="Lotuss Smart TX" w:cs="Lotuss Smart TX"/>
+          <w:rFonts w:ascii="Lotuss Smart TX" w:hAnsi="Lotuss Smart TX" w:eastAsia="Arial Unicode MS" w:cs="Lotuss Smart TX"/>
           <w:b/>
           <w:sz w:val="18"/>
           <w:szCs w:val="18"/>
@@ -1745,7 +1789,7 @@
       </w:pPr>
       <w:r>
         <w:rPr>
-          <w:rFonts w:ascii="Lotuss Smart TX" w:eastAsia="Arial Unicode MS" w:hAnsi="Lotuss Smart TX" w:cs="Lotuss Smart TX"/>
+          <w:rFonts w:ascii="Lotuss Smart TX" w:hAnsi="Lotuss Smart TX" w:eastAsia="Arial Unicode MS" w:cs="Lotuss Smart TX"/>
           <w:b/>
           <w:sz w:val="18"/>
           <w:szCs w:val="18"/>
@@ -1766,7 +1810,7 @@
       </w:pPr>
       <w:r>
         <w:rPr>
-          <w:rFonts w:ascii="Lotuss Smart TX" w:eastAsia="Arial Unicode MS" w:hAnsi="Lotuss Smart TX" w:cs="Lotuss Smart TX"/>
+          <w:rFonts w:ascii="Lotuss Smart TX" w:hAnsi="Lotuss Smart TX" w:eastAsia="Arial Unicode MS" w:cs="Lotuss Smart TX"/>
           <w:bCs/>
           <w:sz w:val="18"/>
           <w:szCs w:val="18"/>
@@ -1775,7 +1819,7 @@
       </w:r>
       <w:r>
         <w:rPr>
-          <w:rFonts w:ascii="Lotuss Smart TX" w:eastAsia="Arial Unicode MS" w:hAnsi="Lotuss Smart TX" w:cs="Lotuss Smart TX"/>
+          <w:rFonts w:ascii="Lotuss Smart TX" w:hAnsi="Lotuss Smart TX" w:eastAsia="Arial Unicode MS" w:cs="Lotuss Smart TX"/>
           <w:bCs/>
           <w:sz w:val="18"/>
           <w:szCs w:val="18"/>
@@ -1785,7 +1829,7 @@
       </w:r>
       <w:r>
         <w:rPr>
-          <w:rFonts w:ascii="Lotuss Smart TX" w:eastAsia="Arial Unicode MS" w:hAnsi="Lotuss Smart TX" w:cs="Lotuss Smart TX"/>
+          <w:rFonts w:ascii="Lotuss Smart TX" w:hAnsi="Lotuss Smart TX" w:eastAsia="Arial Unicode MS" w:cs="Lotuss Smart TX"/>
           <w:b/>
           <w:sz w:val="18"/>
           <w:szCs w:val="18"/>
@@ -1794,7 +1838,7 @@
       </w:r>
       <w:r>
         <w:rPr>
-          <w:rFonts w:ascii="Lotuss Smart TX" w:eastAsia="Arial Unicode MS" w:hAnsi="Lotuss Smart TX" w:cs="Lotuss Smart TX"/>
+          <w:rFonts w:ascii="Lotuss Smart TX" w:hAnsi="Lotuss Smart TX" w:eastAsia="Arial Unicode MS" w:cs="Lotuss Smart TX"/>
           <w:bCs/>
           <w:sz w:val="18"/>
           <w:szCs w:val="18"/>
@@ -1812,14 +1856,14 @@
         </w:numPr>
         <w:spacing w:before="240" w:line="240" w:lineRule="auto"/>
         <w:rPr>
-          <w:rFonts w:ascii="Lotuss Smart TX" w:eastAsia="Arial Unicode MS" w:hAnsi="Lotuss Smart TX" w:cs="Lotuss Smart TX"/>
-          <w:sz w:val="18"/>
-          <w:szCs w:val="18"/>
-        </w:rPr>
-      </w:pPr>
-      <w:r>
-        <w:rPr>
-          <w:rFonts w:ascii="Lotuss Smart TX" w:eastAsia="Arial Unicode MS" w:hAnsi="Lotuss Smart TX" w:cs="Lotuss Smart TX"/>
+          <w:rFonts w:ascii="Lotuss Smart TX" w:hAnsi="Lotuss Smart TX" w:eastAsia="Arial Unicode MS" w:cs="Lotuss Smart TX"/>
+          <w:sz w:val="18"/>
+          <w:szCs w:val="18"/>
+        </w:rPr>
+      </w:pPr>
+      <w:r>
+        <w:rPr>
+          <w:rFonts w:ascii="Lotuss Smart TX" w:hAnsi="Lotuss Smart TX" w:eastAsia="Arial Unicode MS" w:cs="Lotuss Smart TX"/>
           <w:sz w:val="18"/>
           <w:szCs w:val="18"/>
           <w:cs/>
@@ -1828,7 +1872,7 @@
       </w:r>
       <w:r>
         <w:rPr>
-          <w:rFonts w:ascii="Lotuss Smart TX" w:eastAsia="Arial Unicode MS" w:hAnsi="Lotuss Smart TX" w:cs="Lotuss Smart TX"/>
+          <w:rFonts w:ascii="Lotuss Smart TX" w:hAnsi="Lotuss Smart TX" w:eastAsia="Arial Unicode MS" w:cs="Lotuss Smart TX"/>
           <w:sz w:val="18"/>
           <w:szCs w:val="18"/>
         </w:rPr>
@@ -1836,7 +1880,7 @@
       </w:r>
       <w:r>
         <w:rPr>
-          <w:rFonts w:ascii="Lotuss Smart TX" w:eastAsia="Arial Unicode MS" w:hAnsi="Lotuss Smart TX" w:cs="Lotuss Smart TX"/>
+          <w:rFonts w:ascii="Lotuss Smart TX" w:hAnsi="Lotuss Smart TX" w:eastAsia="Arial Unicode MS" w:cs="Lotuss Smart TX"/>
           <w:sz w:val="18"/>
           <w:szCs w:val="18"/>
           <w:cs/>
@@ -1845,7 +1889,7 @@
       </w:r>
       <w:r>
         <w:rPr>
-          <w:rFonts w:ascii="Lotuss Smart TX" w:eastAsia="Arial Unicode MS" w:hAnsi="Lotuss Smart TX" w:cs="Lotuss Smart TX"/>
+          <w:rFonts w:ascii="Lotuss Smart TX" w:hAnsi="Lotuss Smart TX" w:eastAsia="Arial Unicode MS" w:cs="Lotuss Smart TX"/>
           <w:sz w:val="18"/>
           <w:szCs w:val="18"/>
         </w:rPr>
@@ -1853,7 +1897,7 @@
       </w:r>
       <w:r>
         <w:rPr>
-          <w:rFonts w:ascii="Lotuss Smart TX" w:eastAsia="Arial Unicode MS" w:hAnsi="Lotuss Smart TX" w:cs="Lotuss Smart TX"/>
+          <w:rFonts w:ascii="Lotuss Smart TX" w:hAnsi="Lotuss Smart TX" w:eastAsia="Arial Unicode MS" w:cs="Lotuss Smart TX"/>
           <w:sz w:val="18"/>
           <w:szCs w:val="18"/>
           <w:cs/>
@@ -1870,14 +1914,14 @@
         </w:numPr>
         <w:spacing w:before="240" w:line="240" w:lineRule="auto"/>
         <w:rPr>
-          <w:rFonts w:ascii="Lotuss Smart TX" w:eastAsia="Arial Unicode MS" w:hAnsi="Lotuss Smart TX" w:cs="Lotuss Smart TX"/>
-          <w:sz w:val="18"/>
-          <w:szCs w:val="18"/>
-        </w:rPr>
-      </w:pPr>
-      <w:r>
-        <w:rPr>
-          <w:rFonts w:ascii="Lotuss Smart TX" w:eastAsia="Arial Unicode MS" w:hAnsi="Lotuss Smart TX" w:cs="Lotuss Smart TX"/>
+          <w:rFonts w:ascii="Lotuss Smart TX" w:hAnsi="Lotuss Smart TX" w:eastAsia="Arial Unicode MS" w:cs="Lotuss Smart TX"/>
+          <w:sz w:val="18"/>
+          <w:szCs w:val="18"/>
+        </w:rPr>
+      </w:pPr>
+      <w:r>
+        <w:rPr>
+          <w:rFonts w:ascii="Lotuss Smart TX" w:hAnsi="Lotuss Smart TX" w:eastAsia="Arial Unicode MS" w:cs="Lotuss Smart TX"/>
           <w:sz w:val="18"/>
           <w:szCs w:val="18"/>
           <w:cs/>
@@ -1894,14 +1938,14 @@
         </w:numPr>
         <w:spacing w:before="240" w:line="240" w:lineRule="auto"/>
         <w:rPr>
-          <w:rFonts w:ascii="Lotuss Smart TX" w:eastAsia="Arial Unicode MS" w:hAnsi="Lotuss Smart TX" w:cs="Lotuss Smart TX"/>
-          <w:sz w:val="18"/>
-          <w:szCs w:val="18"/>
-        </w:rPr>
-      </w:pPr>
-      <w:r>
-        <w:rPr>
-          <w:rFonts w:ascii="Lotuss Smart TX" w:eastAsia="Arial Unicode MS" w:hAnsi="Lotuss Smart TX" w:cs="Lotuss Smart TX"/>
+          <w:rFonts w:ascii="Lotuss Smart TX" w:hAnsi="Lotuss Smart TX" w:eastAsia="Arial Unicode MS" w:cs="Lotuss Smart TX"/>
+          <w:sz w:val="18"/>
+          <w:szCs w:val="18"/>
+        </w:rPr>
+      </w:pPr>
+      <w:r>
+        <w:rPr>
+          <w:rFonts w:ascii="Lotuss Smart TX" w:hAnsi="Lotuss Smart TX" w:eastAsia="Arial Unicode MS" w:cs="Lotuss Smart TX"/>
           <w:sz w:val="18"/>
           <w:szCs w:val="18"/>
           <w:cs/>
@@ -1910,7 +1954,7 @@
       </w:r>
       <w:r>
         <w:rPr>
-          <w:rFonts w:ascii="Lotuss Smart TX" w:eastAsia="Arial Unicode MS" w:hAnsi="Lotuss Smart TX" w:cs="Lotuss Smart TX"/>
+          <w:rFonts w:ascii="Lotuss Smart TX" w:hAnsi="Lotuss Smart TX" w:eastAsia="Arial Unicode MS" w:cs="Lotuss Smart TX"/>
           <w:sz w:val="18"/>
           <w:szCs w:val="18"/>
         </w:rPr>
@@ -1918,7 +1962,7 @@
       </w:r>
       <w:r>
         <w:rPr>
-          <w:rFonts w:ascii="Lotuss Smart TX" w:eastAsia="Arial Unicode MS" w:hAnsi="Lotuss Smart TX" w:cs="Lotuss Smart TX"/>
+          <w:rFonts w:ascii="Lotuss Smart TX" w:hAnsi="Lotuss Smart TX" w:eastAsia="Arial Unicode MS" w:cs="Lotuss Smart TX"/>
           <w:sz w:val="18"/>
           <w:szCs w:val="18"/>
           <w:cs/>
@@ -1927,7 +1971,7 @@
       </w:r>
       <w:r>
         <w:rPr>
-          <w:rFonts w:ascii="Lotuss Smart TX" w:eastAsia="Arial Unicode MS" w:hAnsi="Lotuss Smart TX" w:cs="Lotuss Smart TX"/>
+          <w:rFonts w:ascii="Lotuss Smart TX" w:hAnsi="Lotuss Smart TX" w:eastAsia="Arial Unicode MS" w:cs="Lotuss Smart TX"/>
           <w:sz w:val="18"/>
           <w:szCs w:val="18"/>
           <w:cs/>
@@ -1936,7 +1980,7 @@
       </w:r>
       <w:r>
         <w:rPr>
-          <w:rFonts w:ascii="Lotuss Smart TX" w:eastAsia="Arial Unicode MS" w:hAnsi="Lotuss Smart TX" w:cs="Lotuss Smart TX"/>
+          <w:rFonts w:ascii="Lotuss Smart TX" w:hAnsi="Lotuss Smart TX" w:eastAsia="Arial Unicode MS" w:cs="Lotuss Smart TX"/>
           <w:color w:val="0000FF"/>
           <w:sz w:val="18"/>
           <w:szCs w:val="18"/>
@@ -1946,7 +1990,7 @@
       </w:r>
       <w:r>
         <w:rPr>
-          <w:rFonts w:ascii="Lotuss Smart TX" w:eastAsia="Arial Unicode MS" w:hAnsi="Lotuss Smart TX" w:cs="Lotuss Smart TX"/>
+          <w:rFonts w:ascii="Lotuss Smart TX" w:hAnsi="Lotuss Smart TX" w:eastAsia="Arial Unicode MS" w:cs="Lotuss Smart TX"/>
           <w:color w:val="0000FF"/>
           <w:sz w:val="18"/>
           <w:szCs w:val="18"/>
@@ -1955,7 +1999,7 @@
       </w:r>
       <w:r>
         <w:rPr>
-          <w:rFonts w:ascii="Lotuss Smart TX" w:eastAsia="Arial Unicode MS" w:hAnsi="Lotuss Smart TX" w:cs="Lotuss Smart TX"/>
+          <w:rFonts w:ascii="Lotuss Smart TX" w:hAnsi="Lotuss Smart TX" w:eastAsia="Arial Unicode MS" w:cs="Lotuss Smart TX"/>
           <w:color w:val="0000FF"/>
           <w:sz w:val="18"/>
           <w:szCs w:val="18"/>
@@ -1965,7 +2009,7 @@
       </w:r>
       <w:r>
         <w:rPr>
-          <w:rFonts w:ascii="Lotuss Smart TX" w:eastAsia="Arial Unicode MS" w:hAnsi="Lotuss Smart TX" w:cs="Lotuss Smart TX"/>
+          <w:rFonts w:ascii="Lotuss Smart TX" w:hAnsi="Lotuss Smart TX" w:eastAsia="Arial Unicode MS" w:cs="Lotuss Smart TX"/>
           <w:sz w:val="18"/>
           <w:szCs w:val="18"/>
           <w:cs/>
@@ -1974,7 +2018,7 @@
       </w:r>
       <w:r>
         <w:rPr>
-          <w:rFonts w:ascii="Lotuss Smart TX" w:eastAsia="Arial Unicode MS" w:hAnsi="Lotuss Smart TX" w:cs="Lotuss Smart TX"/>
+          <w:rFonts w:ascii="Lotuss Smart TX" w:hAnsi="Lotuss Smart TX" w:eastAsia="Arial Unicode MS" w:cs="Lotuss Smart TX"/>
           <w:sz w:val="18"/>
           <w:szCs w:val="18"/>
           <w:cs/>
@@ -1983,7 +2027,7 @@
       </w:r>
       <w:r>
         <w:rPr>
-          <w:rFonts w:ascii="Lotuss Smart TX" w:eastAsia="Arial Unicode MS" w:hAnsi="Lotuss Smart TX" w:cs="Lotuss Smart TX"/>
+          <w:rFonts w:ascii="Lotuss Smart TX" w:hAnsi="Lotuss Smart TX" w:eastAsia="Arial Unicode MS" w:cs="Lotuss Smart TX"/>
           <w:color w:val="0000FF"/>
           <w:sz w:val="18"/>
           <w:szCs w:val="18"/>
@@ -1993,7 +2037,7 @@
       </w:r>
       <w:r>
         <w:rPr>
-          <w:rFonts w:ascii="Lotuss Smart TX" w:eastAsia="Arial Unicode MS" w:hAnsi="Lotuss Smart TX" w:cs="Lotuss Smart TX"/>
+          <w:rFonts w:ascii="Lotuss Smart TX" w:hAnsi="Lotuss Smart TX" w:eastAsia="Arial Unicode MS" w:cs="Lotuss Smart TX"/>
           <w:color w:val="0000FF"/>
           <w:sz w:val="18"/>
           <w:szCs w:val="18"/>
@@ -2002,7 +2046,7 @@
       </w:r>
       <w:r>
         <w:rPr>
-          <w:rFonts w:ascii="Lotuss Smart TX" w:eastAsia="Arial Unicode MS" w:hAnsi="Lotuss Smart TX" w:cs="Lotuss Smart TX"/>
+          <w:rFonts w:ascii="Lotuss Smart TX" w:hAnsi="Lotuss Smart TX" w:eastAsia="Arial Unicode MS" w:cs="Lotuss Smart TX"/>
           <w:color w:val="0000FF"/>
           <w:sz w:val="18"/>
           <w:szCs w:val="18"/>
@@ -2015,7 +2059,7 @@
       <w:pPr>
         <w:spacing w:before="240" w:after="240" w:line="240" w:lineRule="auto"/>
         <w:rPr>
-          <w:rFonts w:ascii="Lotuss Smart TX" w:eastAsia="Arial Unicode MS" w:hAnsi="Lotuss Smart TX" w:cs="Lotuss Smart TX"/>
+          <w:rFonts w:ascii="Lotuss Smart TX" w:hAnsi="Lotuss Smart TX" w:eastAsia="Arial Unicode MS" w:cs="Lotuss Smart TX"/>
           <w:bCs/>
           <w:sz w:val="18"/>
           <w:szCs w:val="18"/>
@@ -2023,7 +2067,7 @@
       </w:pPr>
       <w:r>
         <w:rPr>
-          <w:rFonts w:ascii="Lotuss Smart TX" w:eastAsia="Arial Unicode MS" w:hAnsi="Lotuss Smart TX" w:cs="Lotuss Smart TX"/>
+          <w:rFonts w:ascii="Lotuss Smart TX" w:hAnsi="Lotuss Smart TX" w:eastAsia="Arial Unicode MS" w:cs="Lotuss Smart TX"/>
           <w:bCs/>
           <w:sz w:val="18"/>
           <w:szCs w:val="18"/>
@@ -2033,7 +2077,7 @@
       </w:r>
       <w:r>
         <w:rPr>
-          <w:rFonts w:ascii="Lotuss Smart TX" w:eastAsia="Arial Unicode MS" w:hAnsi="Lotuss Smart TX" w:cs="Lotuss Smart TX"/>
+          <w:rFonts w:ascii="Lotuss Smart TX" w:hAnsi="Lotuss Smart TX" w:eastAsia="Arial Unicode MS" w:cs="Lotuss Smart TX"/>
           <w:bCs/>
           <w:sz w:val="18"/>
           <w:szCs w:val="18"/>
@@ -2043,7 +2087,7 @@
       </w:r>
       <w:r>
         <w:rPr>
-          <w:rFonts w:ascii="Lotuss Smart TX" w:eastAsia="Arial Unicode MS" w:hAnsi="Lotuss Smart TX" w:cs="Lotuss Smart TX" w:hint="cs"/>
+          <w:rFonts w:hint="cs" w:ascii="Lotuss Smart TX" w:hAnsi="Lotuss Smart TX" w:eastAsia="Arial Unicode MS" w:cs="Lotuss Smart TX"/>
           <w:bCs/>
           <w:sz w:val="18"/>
           <w:szCs w:val="18"/>
@@ -2095,7 +2139,7 @@
       <w:pPr>
         <w:spacing w:before="240" w:after="240" w:line="240" w:lineRule="auto"/>
         <w:rPr>
-          <w:rFonts w:ascii="Lotuss Smart TX" w:eastAsia="Arial Unicode MS" w:hAnsi="Lotuss Smart TX" w:cs="Lotuss Smart TX"/>
+          <w:rFonts w:ascii="Lotuss Smart TX" w:hAnsi="Lotuss Smart TX" w:eastAsia="Arial Unicode MS" w:cs="Lotuss Smart TX"/>
           <w:b/>
           <w:bCs/>
           <w:sz w:val="18"/>
@@ -2108,7 +2152,7 @@
       <w:pPr>
         <w:spacing w:before="240" w:after="240" w:line="240" w:lineRule="auto"/>
         <w:rPr>
-          <w:rFonts w:ascii="Lotuss Smart TX" w:eastAsia="Arial Unicode MS" w:hAnsi="Lotuss Smart TX" w:cs="Lotuss Smart TX"/>
+          <w:rFonts w:ascii="Lotuss Smart TX" w:hAnsi="Lotuss Smart TX" w:eastAsia="Arial Unicode MS" w:cs="Lotuss Smart TX"/>
           <w:b/>
           <w:bCs/>
           <w:sz w:val="18"/>
@@ -2121,14 +2165,14 @@
       <w:pPr>
         <w:spacing w:before="240" w:after="240" w:line="240" w:lineRule="auto"/>
         <w:rPr>
-          <w:rFonts w:ascii="Lotuss Smart TX" w:eastAsia="Arial Unicode MS" w:hAnsi="Lotuss Smart TX" w:cs="Lotuss Smart TX"/>
-          <w:sz w:val="18"/>
-          <w:szCs w:val="18"/>
-        </w:rPr>
-      </w:pPr>
-      <w:r>
-        <w:rPr>
-          <w:rFonts w:ascii="Lotuss Smart TX" w:eastAsia="Arial Unicode MS" w:hAnsi="Lotuss Smart TX" w:cs="Lotuss Smart TX"/>
+          <w:rFonts w:ascii="Lotuss Smart TX" w:hAnsi="Lotuss Smart TX" w:eastAsia="Arial Unicode MS" w:cs="Lotuss Smart TX"/>
+          <w:sz w:val="18"/>
+          <w:szCs w:val="18"/>
+        </w:rPr>
+      </w:pPr>
+      <w:r>
+        <w:rPr>
+          <w:rFonts w:ascii="Lotuss Smart TX" w:hAnsi="Lotuss Smart TX" w:eastAsia="Arial Unicode MS" w:cs="Lotuss Smart TX"/>
           <w:b/>
           <w:bCs/>
           <w:sz w:val="18"/>
@@ -2141,7 +2185,7 @@
       </w:r>
       <w:r>
         <w:rPr>
-          <w:rFonts w:ascii="Lotuss Smart TX" w:eastAsia="Arial Unicode MS" w:hAnsi="Lotuss Smart TX" w:cs="Lotuss Smart TX"/>
+          <w:rFonts w:ascii="Lotuss Smart TX" w:hAnsi="Lotuss Smart TX" w:eastAsia="Arial Unicode MS" w:cs="Lotuss Smart TX"/>
           <w:b/>
           <w:bCs/>
           <w:sz w:val="18"/>
@@ -2152,7 +2196,7 @@
       </w:r>
       <w:r>
         <w:rPr>
-          <w:rFonts w:ascii="Lotuss Smart TX" w:eastAsia="Arial Unicode MS" w:hAnsi="Lotuss Smart TX" w:cs="Lotuss Smart TX"/>
+          <w:rFonts w:ascii="Lotuss Smart TX" w:hAnsi="Lotuss Smart TX" w:eastAsia="Arial Unicode MS" w:cs="Lotuss Smart TX"/>
           <w:b/>
           <w:bCs/>
           <w:sz w:val="18"/>
@@ -2164,7 +2208,7 @@
       </w:r>
       <w:r>
         <w:rPr>
-          <w:rFonts w:ascii="Lotuss Smart TX" w:eastAsia="Arial Unicode MS" w:hAnsi="Lotuss Smart TX" w:cs="Lotuss Smart TX"/>
+          <w:rFonts w:ascii="Lotuss Smart TX" w:hAnsi="Lotuss Smart TX" w:eastAsia="Arial Unicode MS" w:cs="Lotuss Smart TX"/>
           <w:sz w:val="18"/>
           <w:szCs w:val="18"/>
           <w:cs/>
@@ -2173,7 +2217,7 @@
       </w:r>
       <w:r>
         <w:rPr>
-          <w:rFonts w:ascii="Lotuss Smart TX" w:eastAsia="Arial Unicode MS" w:hAnsi="Lotuss Smart TX" w:cs="Lotuss Smart TX"/>
+          <w:rFonts w:ascii="Lotuss Smart TX" w:hAnsi="Lotuss Smart TX" w:eastAsia="Arial Unicode MS" w:cs="Lotuss Smart TX"/>
           <w:sz w:val="18"/>
           <w:szCs w:val="18"/>
         </w:rPr>
@@ -2184,7 +2228,7 @@
       <w:pPr>
         <w:spacing w:before="240" w:after="240" w:line="240" w:lineRule="auto"/>
         <w:rPr>
-          <w:rFonts w:ascii="Lotuss Smart TX" w:eastAsia="Arial Unicode MS" w:hAnsi="Lotuss Smart TX" w:cs="Lotuss Smart TX"/>
+          <w:rFonts w:ascii="Lotuss Smart TX" w:hAnsi="Lotuss Smart TX" w:eastAsia="Arial Unicode MS" w:cs="Lotuss Smart TX"/>
           <w:b/>
           <w:bCs/>
           <w:sz w:val="18"/>
@@ -2193,7 +2237,7 @@
       </w:pPr>
       <w:r>
         <w:rPr>
-          <w:rFonts w:ascii="Lotuss Smart TX" w:eastAsia="Arial Unicode MS" w:hAnsi="Lotuss Smart TX" w:cs="Lotuss Smart TX"/>
+          <w:rFonts w:ascii="Lotuss Smart TX" w:hAnsi="Lotuss Smart TX" w:eastAsia="Arial Unicode MS" w:cs="Lotuss Smart TX"/>
           <w:b/>
           <w:bCs/>
           <w:sz w:val="18"/>
@@ -2203,7 +2247,7 @@
       </w:r>
       <w:r>
         <w:rPr>
-          <w:rFonts w:ascii="Lotuss Smart TX" w:eastAsia="Arial Unicode MS" w:hAnsi="Lotuss Smart TX" w:cs="Lotuss Smart TX"/>
+          <w:rFonts w:ascii="Lotuss Smart TX" w:hAnsi="Lotuss Smart TX" w:eastAsia="Arial Unicode MS" w:cs="Lotuss Smart TX"/>
           <w:b/>
           <w:bCs/>
           <w:sz w:val="18"/>
@@ -2222,14 +2266,14 @@
         </w:numPr>
         <w:spacing w:before="240" w:after="240" w:line="240" w:lineRule="auto"/>
         <w:rPr>
-          <w:rFonts w:ascii="Lotuss Smart TX" w:eastAsia="Arial Unicode MS" w:hAnsi="Lotuss Smart TX" w:cs="Lotuss Smart TX"/>
-          <w:sz w:val="18"/>
-          <w:szCs w:val="18"/>
-        </w:rPr>
-      </w:pPr>
-      <w:r>
-        <w:rPr>
-          <w:rFonts w:ascii="Lotuss Smart TX" w:eastAsia="Arial Unicode MS" w:hAnsi="Lotuss Smart TX" w:cs="Lotuss Smart TX"/>
+          <w:rFonts w:ascii="Lotuss Smart TX" w:hAnsi="Lotuss Smart TX" w:eastAsia="Arial Unicode MS" w:cs="Lotuss Smart TX"/>
+          <w:sz w:val="18"/>
+          <w:szCs w:val="18"/>
+        </w:rPr>
+      </w:pPr>
+      <w:r>
+        <w:rPr>
+          <w:rFonts w:ascii="Lotuss Smart TX" w:hAnsi="Lotuss Smart TX" w:eastAsia="Arial Unicode MS" w:cs="Lotuss Smart TX"/>
           <w:sz w:val="18"/>
           <w:szCs w:val="18"/>
           <w:cs/>
@@ -2238,7 +2282,7 @@
       </w:r>
       <w:r>
         <w:rPr>
-          <w:rFonts w:ascii="Lotuss Smart TX" w:eastAsia="Arial Unicode MS" w:hAnsi="Lotuss Smart TX" w:cs="Lotuss Smart TX"/>
+          <w:rFonts w:ascii="Lotuss Smart TX" w:hAnsi="Lotuss Smart TX" w:eastAsia="Arial Unicode MS" w:cs="Lotuss Smart TX"/>
           <w:sz w:val="18"/>
           <w:szCs w:val="18"/>
         </w:rPr>
@@ -2254,14 +2298,14 @@
         </w:numPr>
         <w:spacing w:before="240" w:after="240" w:line="240" w:lineRule="auto"/>
         <w:rPr>
-          <w:rFonts w:ascii="Lotuss Smart TX" w:eastAsia="Arial Unicode MS" w:hAnsi="Lotuss Smart TX" w:cs="Lotuss Smart TX"/>
-          <w:sz w:val="18"/>
-          <w:szCs w:val="18"/>
-        </w:rPr>
-      </w:pPr>
-      <w:r>
-        <w:rPr>
-          <w:rFonts w:ascii="Lotuss Smart TX" w:eastAsia="Arial Unicode MS" w:hAnsi="Lotuss Smart TX" w:cs="Lotuss Smart TX"/>
+          <w:rFonts w:ascii="Lotuss Smart TX" w:hAnsi="Lotuss Smart TX" w:eastAsia="Arial Unicode MS" w:cs="Lotuss Smart TX"/>
+          <w:sz w:val="18"/>
+          <w:szCs w:val="18"/>
+        </w:rPr>
+      </w:pPr>
+      <w:r>
+        <w:rPr>
+          <w:rFonts w:ascii="Lotuss Smart TX" w:hAnsi="Lotuss Smart TX" w:eastAsia="Arial Unicode MS" w:cs="Lotuss Smart TX"/>
           <w:sz w:val="18"/>
           <w:szCs w:val="18"/>
           <w:cs/>
@@ -2270,7 +2314,7 @@
       </w:r>
       <w:r>
         <w:rPr>
-          <w:rFonts w:ascii="Lotuss Smart TX" w:eastAsia="Arial Unicode MS" w:hAnsi="Lotuss Smart TX" w:cs="Lotuss Smart TX"/>
+          <w:rFonts w:ascii="Lotuss Smart TX" w:hAnsi="Lotuss Smart TX" w:eastAsia="Arial Unicode MS" w:cs="Lotuss Smart TX"/>
           <w:sz w:val="18"/>
           <w:szCs w:val="18"/>
         </w:rPr>
@@ -2278,7 +2322,7 @@
       </w:r>
       <w:r>
         <w:rPr>
-          <w:rFonts w:ascii="Lotuss Smart TX" w:eastAsia="Arial Unicode MS" w:hAnsi="Lotuss Smart TX" w:cs="Lotuss Smart TX"/>
+          <w:rFonts w:ascii="Lotuss Smart TX" w:hAnsi="Lotuss Smart TX" w:eastAsia="Arial Unicode MS" w:cs="Lotuss Smart TX"/>
           <w:sz w:val="18"/>
           <w:szCs w:val="18"/>
           <w:cs/>
@@ -2295,14 +2339,14 @@
         </w:numPr>
         <w:spacing w:before="240" w:after="240" w:line="240" w:lineRule="auto"/>
         <w:rPr>
-          <w:rFonts w:ascii="Lotuss Smart TX" w:eastAsia="Arial Unicode MS" w:hAnsi="Lotuss Smart TX" w:cs="Lotuss Smart TX"/>
-          <w:sz w:val="18"/>
-          <w:szCs w:val="18"/>
-        </w:rPr>
-      </w:pPr>
-      <w:r>
-        <w:rPr>
-          <w:rFonts w:ascii="Lotuss Smart TX" w:eastAsia="Arial Unicode MS" w:hAnsi="Lotuss Smart TX" w:cs="Lotuss Smart TX" w:hint="cs"/>
+          <w:rFonts w:ascii="Lotuss Smart TX" w:hAnsi="Lotuss Smart TX" w:eastAsia="Arial Unicode MS" w:cs="Lotuss Smart TX"/>
+          <w:sz w:val="18"/>
+          <w:szCs w:val="18"/>
+        </w:rPr>
+      </w:pPr>
+      <w:r>
+        <w:rPr>
+          <w:rFonts w:hint="cs" w:ascii="Lotuss Smart TX" w:hAnsi="Lotuss Smart TX" w:eastAsia="Arial Unicode MS" w:cs="Lotuss Smart TX"/>
           <w:sz w:val="18"/>
           <w:szCs w:val="18"/>
           <w:cs/>
@@ -2311,7 +2355,7 @@
       </w:r>
       <w:r>
         <w:rPr>
-          <w:rFonts w:ascii="Lotuss Smart TX" w:eastAsia="Arial Unicode MS" w:hAnsi="Lotuss Smart TX" w:cs="Lotuss Smart TX"/>
+          <w:rFonts w:ascii="Lotuss Smart TX" w:hAnsi="Lotuss Smart TX" w:eastAsia="Arial Unicode MS" w:cs="Lotuss Smart TX"/>
           <w:sz w:val="18"/>
           <w:szCs w:val="18"/>
           <w:cs/>
@@ -2335,7 +2379,7 @@
       <w:pPr>
         <w:spacing w:before="240" w:after="240" w:line="240" w:lineRule="auto"/>
         <w:rPr>
-          <w:rFonts w:ascii="Lotuss Smart TX" w:eastAsia="Arial Unicode MS" w:hAnsi="Lotuss Smart TX" w:cs="Lotuss Smart TX"/>
+          <w:rFonts w:ascii="Lotuss Smart TX" w:hAnsi="Lotuss Smart TX" w:eastAsia="Arial Unicode MS" w:cs="Lotuss Smart TX"/>
           <w:b/>
           <w:bCs/>
           <w:sz w:val="18"/>
@@ -2344,7 +2388,7 @@
       </w:pPr>
       <w:r>
         <w:rPr>
-          <w:rFonts w:ascii="Lotuss Smart TX" w:eastAsia="Arial Unicode MS" w:hAnsi="Lotuss Smart TX" w:cs="Lotuss Smart TX"/>
+          <w:rFonts w:ascii="Lotuss Smart TX" w:hAnsi="Lotuss Smart TX" w:eastAsia="Arial Unicode MS" w:cs="Lotuss Smart TX"/>
           <w:b/>
           <w:bCs/>
           <w:sz w:val="18"/>
@@ -2356,7 +2400,7 @@
       </w:r>
       <w:r>
         <w:rPr>
-          <w:rFonts w:ascii="Lotuss Smart TX" w:eastAsia="Arial Unicode MS" w:hAnsi="Lotuss Smart TX" w:cs="Lotuss Smart TX"/>
+          <w:rFonts w:ascii="Lotuss Smart TX" w:hAnsi="Lotuss Smart TX" w:eastAsia="Arial Unicode MS" w:cs="Lotuss Smart TX"/>
           <w:b/>
           <w:bCs/>
           <w:sz w:val="18"/>
@@ -2370,7 +2414,7 @@
       <w:pPr>
         <w:spacing w:before="240" w:after="240" w:line="240" w:lineRule="auto"/>
         <w:rPr>
-          <w:rFonts w:ascii="Lotuss Smart TX" w:eastAsia="Arial Unicode MS" w:hAnsi="Lotuss Smart TX" w:cs="Lotuss Smart TX"/>
+          <w:rFonts w:ascii="Lotuss Smart TX" w:hAnsi="Lotuss Smart TX" w:eastAsia="Arial Unicode MS" w:cs="Lotuss Smart TX"/>
           <w:b/>
           <w:bCs/>
           <w:sz w:val="18"/>
@@ -2379,7 +2423,7 @@
       </w:pPr>
       <w:r>
         <w:rPr>
-          <w:rFonts w:ascii="Lotuss Smart TX" w:eastAsia="Arial Unicode MS" w:hAnsi="Lotuss Smart TX" w:cs="Lotuss Smart TX"/>
+          <w:rFonts w:ascii="Lotuss Smart TX" w:hAnsi="Lotuss Smart TX" w:eastAsia="Arial Unicode MS" w:cs="Lotuss Smart TX"/>
           <w:b/>
           <w:bCs/>
           <w:sz w:val="18"/>
@@ -2390,7 +2434,7 @@
       </w:r>
       <w:r>
         <w:rPr>
-          <w:rFonts w:ascii="Lotuss Smart TX" w:eastAsia="Arial Unicode MS" w:hAnsi="Lotuss Smart TX" w:cs="Lotuss Smart TX"/>
+          <w:rFonts w:ascii="Lotuss Smart TX" w:hAnsi="Lotuss Smart TX" w:eastAsia="Arial Unicode MS" w:cs="Lotuss Smart TX"/>
           <w:b/>
           <w:bCs/>
           <w:sz w:val="18"/>
@@ -2422,7 +2466,7 @@
       </w:r>
       <w:r>
         <w:rPr>
-          <w:rFonts w:ascii="Lotuss Smart TX" w:hAnsi="Lotuss Smart TX" w:cs="Lotuss Smart TX" w:hint="cs"/>
+          <w:rFonts w:hint="cs" w:ascii="Lotuss Smart TX" w:hAnsi="Lotuss Smart TX" w:cs="Lotuss Smart TX"/>
           <w:color w:val="FF0000"/>
           <w:sz w:val="18"/>
           <w:szCs w:val="18"/>
@@ -2454,7 +2498,7 @@
       </w:r>
       <w:r>
         <w:rPr>
-          <w:rFonts w:ascii="Lotuss Smart TX" w:hAnsi="Lotuss Smart TX" w:cs="Lotuss Smart TX" w:hint="cs"/>
+          <w:rFonts w:hint="cs" w:ascii="Lotuss Smart TX" w:hAnsi="Lotuss Smart TX" w:cs="Lotuss Smart TX"/>
           <w:color w:val="0000FF"/>
           <w:sz w:val="18"/>
           <w:szCs w:val="18"/>
@@ -2475,7 +2519,7 @@
       </w:r>
       <w:r>
         <w:rPr>
-          <w:rFonts w:ascii="Lotuss Smart TX" w:hAnsi="Lotuss Smart TX" w:cs="Lotuss Smart TX" w:hint="cs"/>
+          <w:rFonts w:hint="cs" w:ascii="Lotuss Smart TX" w:hAnsi="Lotuss Smart TX" w:cs="Lotuss Smart TX"/>
           <w:color w:val="0000FF"/>
           <w:sz w:val="18"/>
           <w:szCs w:val="18"/>
@@ -2835,7 +2879,7 @@
       </w:r>
       <w:r>
         <w:rPr>
-          <w:rFonts w:ascii="Lotuss Smart TX" w:hAnsi="Lotuss Smart TX" w:cs="Lotuss Smart TX" w:hint="cs"/>
+          <w:rFonts w:hint="cs" w:ascii="Lotuss Smart TX" w:hAnsi="Lotuss Smart TX" w:cs="Lotuss Smart TX"/>
           <w:color w:val="0000FF"/>
           <w:sz w:val="18"/>
           <w:szCs w:val="18"/>
@@ -2857,7 +2901,7 @@
       </w:r>
       <w:r>
         <w:rPr>
-          <w:rFonts w:ascii="Lotuss Smart TX" w:hAnsi="Lotuss Smart TX" w:cs="Lotuss Smart TX" w:hint="cs"/>
+          <w:rFonts w:hint="cs" w:ascii="Lotuss Smart TX" w:hAnsi="Lotuss Smart TX" w:cs="Lotuss Smart TX"/>
           <w:color w:val="0000FF"/>
           <w:sz w:val="18"/>
           <w:szCs w:val="18"/>
@@ -3285,7 +3329,7 @@
       </w:r>
       <w:r>
         <w:rPr>
-          <w:rFonts w:ascii="Lotuss Smart TX" w:hAnsi="Lotuss Smart TX" w:cs="Lotuss Smart TX" w:hint="cs"/>
+          <w:rFonts w:hint="cs" w:ascii="Lotuss Smart TX" w:hAnsi="Lotuss Smart TX" w:cs="Lotuss Smart TX"/>
           <w:color w:val="FF0000"/>
           <w:sz w:val="18"/>
           <w:szCs w:val="18"/>
@@ -3296,7 +3340,7 @@
       </w:r>
       <w:r>
         <w:rPr>
-          <w:rFonts w:ascii="Lotuss Smart TX" w:hAnsi="Lotuss Smart TX" w:cs="Lotuss Smart TX" w:hint="cs"/>
+          <w:rFonts w:hint="cs" w:ascii="Lotuss Smart TX" w:hAnsi="Lotuss Smart TX" w:cs="Lotuss Smart TX"/>
           <w:color w:val="FF0000"/>
           <w:sz w:val="18"/>
           <w:szCs w:val="18"/>
@@ -3586,7 +3630,7 @@
       </w:r>
       <w:r>
         <w:rPr>
-          <w:rFonts w:ascii="Lotuss Smart TX" w:hAnsi="Lotuss Smart TX" w:cs="Lotuss Smart TX" w:hint="cs"/>
+          <w:rFonts w:hint="cs" w:ascii="Lotuss Smart TX" w:hAnsi="Lotuss Smart TX" w:cs="Lotuss Smart TX"/>
           <w:sz w:val="18"/>
           <w:szCs w:val="18"/>
           <w:cs/>
@@ -3670,7 +3714,7 @@
       </w:r>
       <w:r>
         <w:rPr>
-          <w:rFonts w:ascii="Lotuss Smart TX" w:hAnsi="Lotuss Smart TX" w:cs="Lotuss Smart TX" w:hint="cs"/>
+          <w:rFonts w:hint="cs" w:ascii="Lotuss Smart TX" w:hAnsi="Lotuss Smart TX" w:cs="Lotuss Smart TX"/>
           <w:color w:val="0000FF"/>
           <w:sz w:val="18"/>
           <w:szCs w:val="18"/>
@@ -3691,7 +3735,7 @@
       </w:r>
       <w:r>
         <w:rPr>
-          <w:rFonts w:ascii="Lotuss Smart TX" w:hAnsi="Lotuss Smart TX" w:cs="Lotuss Smart TX" w:hint="cs"/>
+          <w:rFonts w:hint="cs" w:ascii="Lotuss Smart TX" w:hAnsi="Lotuss Smart TX" w:cs="Lotuss Smart TX"/>
           <w:color w:val="0000FF"/>
           <w:sz w:val="18"/>
           <w:szCs w:val="18"/>
@@ -3994,7 +4038,7 @@
       </w:r>
       <w:r>
         <w:rPr>
-          <w:rFonts w:ascii="Lotuss Smart TX" w:hAnsi="Lotuss Smart TX" w:cs="Lotuss Smart TX" w:hint="cs"/>
+          <w:rFonts w:hint="cs" w:ascii="Lotuss Smart TX" w:hAnsi="Lotuss Smart TX" w:cs="Lotuss Smart TX"/>
           <w:color w:val="0000FF"/>
           <w:sz w:val="18"/>
           <w:szCs w:val="18"/>
@@ -4015,7 +4059,7 @@
       </w:r>
       <w:r>
         <w:rPr>
-          <w:rFonts w:ascii="Lotuss Smart TX" w:hAnsi="Lotuss Smart TX" w:cs="Lotuss Smart TX" w:hint="cs"/>
+          <w:rFonts w:hint="cs" w:ascii="Lotuss Smart TX" w:hAnsi="Lotuss Smart TX" w:cs="Lotuss Smart TX"/>
           <w:color w:val="0000FF"/>
           <w:sz w:val="18"/>
           <w:szCs w:val="18"/>
@@ -4026,7 +4070,7 @@
       </w:r>
       <w:r>
         <w:rPr>
-          <w:rFonts w:ascii="Lotuss Smart TX" w:hAnsi="Lotuss Smart TX" w:cs="Lotuss Smart TX" w:hint="cs"/>
+          <w:rFonts w:hint="cs" w:ascii="Lotuss Smart TX" w:hAnsi="Lotuss Smart TX" w:cs="Lotuss Smart TX"/>
           <w:color w:val="0000FF"/>
           <w:sz w:val="18"/>
           <w:szCs w:val="18"/>
@@ -4068,7 +4112,7 @@
       </w:r>
       <w:r>
         <w:rPr>
-          <w:rFonts w:ascii="Lotuss Smart TX" w:hAnsi="Lotuss Smart TX" w:cs="Lotuss Smart TX" w:hint="cs"/>
+          <w:rFonts w:hint="cs" w:ascii="Lotuss Smart TX" w:hAnsi="Lotuss Smart TX" w:cs="Lotuss Smart TX"/>
           <w:color w:val="0000FF"/>
           <w:sz w:val="18"/>
           <w:szCs w:val="18"/>
@@ -4089,7 +4133,7 @@
       </w:r>
       <w:r>
         <w:rPr>
-          <w:rFonts w:ascii="Lotuss Smart TX" w:hAnsi="Lotuss Smart TX" w:cs="Lotuss Smart TX" w:hint="cs"/>
+          <w:rFonts w:hint="cs" w:ascii="Lotuss Smart TX" w:hAnsi="Lotuss Smart TX" w:cs="Lotuss Smart TX"/>
           <w:color w:val="0000FF"/>
           <w:sz w:val="18"/>
           <w:szCs w:val="18"/>
@@ -4100,7 +4144,7 @@
       </w:r>
       <w:r>
         <w:rPr>
-          <w:rFonts w:ascii="Lotuss Smart TX" w:hAnsi="Lotuss Smart TX" w:cs="Lotuss Smart TX" w:hint="cs"/>
+          <w:rFonts w:hint="cs" w:ascii="Lotuss Smart TX" w:hAnsi="Lotuss Smart TX" w:cs="Lotuss Smart TX"/>
           <w:color w:val="0000FF"/>
           <w:sz w:val="18"/>
           <w:szCs w:val="18"/>
@@ -4424,7 +4468,7 @@
       </w:r>
       <w:r>
         <w:rPr>
-          <w:rFonts w:ascii="Lotuss Smart TX" w:hAnsi="Lotuss Smart TX" w:cs="Lotuss Smart TX" w:hint="cs"/>
+          <w:rFonts w:hint="cs" w:ascii="Lotuss Smart TX" w:hAnsi="Lotuss Smart TX" w:cs="Lotuss Smart TX"/>
           <w:color w:val="0000FF"/>
           <w:sz w:val="18"/>
           <w:szCs w:val="18"/>
@@ -4445,7 +4489,7 @@
       </w:r>
       <w:r>
         <w:rPr>
-          <w:rFonts w:ascii="Lotuss Smart TX" w:hAnsi="Lotuss Smart TX" w:cs="Lotuss Smart TX" w:hint="cs"/>
+          <w:rFonts w:hint="cs" w:ascii="Lotuss Smart TX" w:hAnsi="Lotuss Smart TX" w:cs="Lotuss Smart TX"/>
           <w:color w:val="0000FF"/>
           <w:sz w:val="18"/>
           <w:szCs w:val="18"/>
@@ -4456,7 +4500,7 @@
       </w:r>
       <w:r>
         <w:rPr>
-          <w:rFonts w:ascii="Lotuss Smart TX" w:hAnsi="Lotuss Smart TX" w:cs="Lotuss Smart TX" w:hint="cs"/>
+          <w:rFonts w:hint="cs" w:ascii="Lotuss Smart TX" w:hAnsi="Lotuss Smart TX" w:cs="Lotuss Smart TX"/>
           <w:color w:val="0000FF"/>
           <w:sz w:val="18"/>
           <w:szCs w:val="18"/>
@@ -4739,12 +4783,116 @@
     </w:p>
     <w:p>
       <w:pPr>
+        <w:spacing w:before="240" w:beforeAutospacing="off" w:after="240" w:afterAutospacing="off" w:line="240" w:lineRule="auto"/>
+      </w:pPr>
+      <w:r>
+        <w:rPr>
+          <w:rFonts w:ascii="Lotuss Smart TX" w:hAnsi="Lotuss Smart TX" w:eastAsia="Lotuss Smart TX" w:cs="Lotuss Smart TX"/>
+          <w:b w:val="1"/>
+          <w:bCs w:val="1"/>
+          <w:noProof w:val="0"/>
+          <w:sz w:val="18"/>
+          <w:szCs w:val="18"/>
+          <w:lang w:val="en-US"/>
+        </w:rPr>
+        <w:t># หากติดปัญหาหรือมีคำถามเพิ่มเติม:</w:t>
+      </w:r>
+    </w:p>
+    <w:p>
+      <w:pPr>
+        <w:pStyle w:val="Normal"/>
+        <w:suppressLineNumbers w:val="0"/>
+        <w:bidi w:val="0"/>
+        <w:spacing w:before="240" w:beforeAutospacing="off" w:after="240" w:afterAutospacing="off" w:line="276" w:lineRule="auto"/>
+        <w:ind w:left="0" w:right="0"/>
+        <w:jc w:val="left"/>
+        <w:rPr>
+          <w:rFonts w:ascii="Lotuss Smart TX" w:hAnsi="Lotuss Smart TX" w:eastAsia="Lotuss Smart TX" w:cs="Lotuss Smart TX"/>
+          <w:noProof w:val="0"/>
+          <w:sz w:val="18"/>
+          <w:szCs w:val="18"/>
+          <w:lang w:val="en-US"/>
+        </w:rPr>
+      </w:pPr>
+      <w:r>
+        <w:rPr>
+          <w:rFonts w:ascii="Lotuss Smart TX" w:hAnsi="Lotuss Smart TX" w:eastAsia="Lotuss Smart TX" w:cs="Lotuss Smart TX"/>
+          <w:noProof w:val="0"/>
+          <w:sz w:val="18"/>
+          <w:szCs w:val="18"/>
+          <w:lang w:val="en-US"/>
+        </w:rPr>
+        <w:t xml:space="preserve">- </w:t>
+      </w:r>
+      <w:r>
+        <w:rPr>
+          <w:rFonts w:ascii="Lotuss Smart TX" w:hAnsi="Lotuss Smart TX" w:eastAsia="Lotuss Smart TX" w:cs="Lotuss Smart TX"/>
+          <w:noProof w:val="0"/>
+          <w:sz w:val="18"/>
+          <w:szCs w:val="18"/>
+          <w:lang w:val="en-US"/>
+        </w:rPr>
+        <w:t>ติดต่อ</w:t>
+      </w:r>
+      <w:r>
+        <w:rPr>
+          <w:rFonts w:ascii="Lotuss Smart TX" w:hAnsi="Lotuss Smart TX" w:eastAsia="Lotuss Smart TX" w:cs="Lotuss Smart TX"/>
+          <w:noProof w:val="0"/>
+          <w:sz w:val="18"/>
+          <w:szCs w:val="18"/>
+          <w:lang w:val="en-US"/>
+        </w:rPr>
+        <w:t xml:space="preserve">  </w:t>
+      </w:r>
+      <w:r>
+        <w:rPr>
+          <w:rFonts w:ascii="Lotuss Smart TX" w:hAnsi="Lotuss Smart TX" w:eastAsia="Lotuss Smart TX" w:cs="Lotuss Smart TX"/>
+          <w:noProof w:val="0"/>
+          <w:sz w:val="18"/>
+          <w:szCs w:val="18"/>
+          <w:lang w:val="en-US"/>
+        </w:rPr>
+        <w:t>K.Piyawan</w:t>
+      </w:r>
+      <w:r>
+        <w:rPr>
+          <w:rFonts w:ascii="Lotuss Smart TX" w:hAnsi="Lotuss Smart TX" w:eastAsia="Lotuss Smart TX" w:cs="Lotuss Smart TX"/>
+          <w:noProof w:val="0"/>
+          <w:sz w:val="18"/>
+          <w:szCs w:val="18"/>
+          <w:lang w:val="en-US"/>
+        </w:rPr>
+        <w:t xml:space="preserve"> </w:t>
+      </w:r>
+      <w:r>
+        <w:rPr>
+          <w:rFonts w:ascii="Lotuss Smart TX" w:hAnsi="Lotuss Smart TX" w:eastAsia="Lotuss Smart TX" w:cs="Lotuss Smart TX"/>
+          <w:noProof w:val="0"/>
+          <w:sz w:val="18"/>
+          <w:szCs w:val="18"/>
+          <w:lang w:val="en-US"/>
+        </w:rPr>
+        <w:t>Poonsasomsup</w:t>
+      </w:r>
+      <w:r>
+        <w:rPr>
+          <w:rFonts w:ascii="Lotuss Smart TX" w:hAnsi="Lotuss Smart TX" w:eastAsia="Lotuss Smart TX" w:cs="Lotuss Smart TX"/>
+          <w:noProof w:val="0"/>
+          <w:sz w:val="18"/>
+          <w:szCs w:val="18"/>
+          <w:lang w:val="en-US"/>
+        </w:rPr>
+        <w:t xml:space="preserve"> </w:t>
+      </w:r>
+    </w:p>
+    <w:p>
+      <w:pPr>
         <w:spacing w:before="240" w:after="240" w:line="240" w:lineRule="auto"/>
         <w:rPr>
           <w:rStyle w:val="normaltextrun"/>
           <w:rFonts w:ascii="Lotuss Smart TX" w:hAnsi="Lotuss Smart TX" w:cs="Lotuss Smart TX"/>
-          <w:b/>
-          <w:bCs/>
+          <w:b w:val="1"/>
+          <w:bCs w:val="1"/>
           <w:color w:val="000000"/>
           <w:sz w:val="18"/>
           <w:szCs w:val="18"/>
@@ -4753,7 +4901,7 @@
       </w:pPr>
     </w:p>
     <w:sectPr>
-      <w:pgSz w:w="12240" w:h="15840"/>
+      <w:pgSz w:w="12240" w:h="15840" w:orient="portrait"/>
       <w:pgMar w:top="1440" w:right="1440" w:bottom="1440" w:left="1440" w:header="720" w:footer="720" w:gutter="0"/>
       <w:pgNumType w:start="1"/>
       <w:cols w:space="720"/>
@@ -4777,7 +4925,7 @@
         <w:ind w:left="1440" w:hanging="360"/>
       </w:pPr>
       <w:rPr>
-        <w:rFonts w:ascii="Symbol" w:hAnsi="Symbol" w:hint="default"/>
+        <w:rFonts w:hint="default" w:ascii="Symbol" w:hAnsi="Symbol"/>
       </w:rPr>
     </w:lvl>
     <w:lvl w:ilvl="1" w:tplc="04090003" w:tentative="1">
@@ -4789,7 +4937,7 @@
         <w:ind w:left="2160" w:hanging="360"/>
       </w:pPr>
       <w:rPr>
-        <w:rFonts w:ascii="Courier New" w:hAnsi="Courier New" w:cs="Courier New" w:hint="default"/>
+        <w:rFonts w:hint="default" w:ascii="Courier New" w:hAnsi="Courier New" w:cs="Courier New"/>
       </w:rPr>
     </w:lvl>
     <w:lvl w:ilvl="2" w:tplc="04090005" w:tentative="1">
@@ -4801,7 +4949,7 @@
         <w:ind w:left="2880" w:hanging="360"/>
       </w:pPr>
       <w:rPr>
-        <w:rFonts w:ascii="Wingdings" w:hAnsi="Wingdings" w:hint="default"/>
+        <w:rFonts w:hint="default" w:ascii="Wingdings" w:hAnsi="Wingdings"/>
       </w:rPr>
     </w:lvl>
     <w:lvl w:ilvl="3" w:tplc="04090001" w:tentative="1">
@@ -4813,7 +4961,7 @@
         <w:ind w:left="3600" w:hanging="360"/>
       </w:pPr>
       <w:rPr>
-        <w:rFonts w:ascii="Symbol" w:hAnsi="Symbol" w:hint="default"/>
+        <w:rFonts w:hint="default" w:ascii="Symbol" w:hAnsi="Symbol"/>
       </w:rPr>
     </w:lvl>
     <w:lvl w:ilvl="4" w:tplc="04090003" w:tentative="1">
@@ -4825,7 +4973,7 @@
         <w:ind w:left="4320" w:hanging="360"/>
       </w:pPr>
       <w:rPr>
-        <w:rFonts w:ascii="Courier New" w:hAnsi="Courier New" w:cs="Courier New" w:hint="default"/>
+        <w:rFonts w:hint="default" w:ascii="Courier New" w:hAnsi="Courier New" w:cs="Courier New"/>
       </w:rPr>
     </w:lvl>
     <w:lvl w:ilvl="5" w:tplc="04090005" w:tentative="1">
@@ -4837,7 +4985,7 @@
         <w:ind w:left="5040" w:hanging="360"/>
       </w:pPr>
       <w:rPr>
-        <w:rFonts w:ascii="Wingdings" w:hAnsi="Wingdings" w:hint="default"/>
+        <w:rFonts w:hint="default" w:ascii="Wingdings" w:hAnsi="Wingdings"/>
       </w:rPr>
     </w:lvl>
     <w:lvl w:ilvl="6" w:tplc="04090001" w:tentative="1">
@@ -4849,7 +4997,7 @@
         <w:ind w:left="5760" w:hanging="360"/>
       </w:pPr>
       <w:rPr>
-        <w:rFonts w:ascii="Symbol" w:hAnsi="Symbol" w:hint="default"/>
+        <w:rFonts w:hint="default" w:ascii="Symbol" w:hAnsi="Symbol"/>
       </w:rPr>
     </w:lvl>
     <w:lvl w:ilvl="7" w:tplc="04090003" w:tentative="1">
@@ -4861,7 +5009,7 @@
         <w:ind w:left="6480" w:hanging="360"/>
       </w:pPr>
       <w:rPr>
-        <w:rFonts w:ascii="Courier New" w:hAnsi="Courier New" w:cs="Courier New" w:hint="default"/>
+        <w:rFonts w:hint="default" w:ascii="Courier New" w:hAnsi="Courier New" w:cs="Courier New"/>
       </w:rPr>
     </w:lvl>
     <w:lvl w:ilvl="8" w:tplc="04090005" w:tentative="1">
@@ -4873,7 +5021,7 @@
         <w:ind w:left="7200" w:hanging="360"/>
       </w:pPr>
       <w:rPr>
-        <w:rFonts w:ascii="Wingdings" w:hAnsi="Wingdings" w:hint="default"/>
+        <w:rFonts w:hint="default" w:ascii="Wingdings" w:hAnsi="Wingdings"/>
       </w:rPr>
     </w:lvl>
   </w:abstractNum>
@@ -4890,7 +5038,7 @@
         <w:ind w:left="720" w:hanging="360"/>
       </w:pPr>
       <w:rPr>
-        <w:rFonts w:ascii="Wingdings" w:hAnsi="Wingdings" w:hint="default"/>
+        <w:rFonts w:hint="default" w:ascii="Wingdings" w:hAnsi="Wingdings"/>
       </w:rPr>
     </w:lvl>
     <w:lvl w:ilvl="1" w:tplc="04090003" w:tentative="1">
@@ -4902,7 +5050,7 @@
         <w:ind w:left="1440" w:hanging="360"/>
       </w:pPr>
       <w:rPr>
-        <w:rFonts w:ascii="Courier New" w:hAnsi="Courier New" w:cs="Courier New" w:hint="default"/>
+        <w:rFonts w:hint="default" w:ascii="Courier New" w:hAnsi="Courier New" w:cs="Courier New"/>
       </w:rPr>
     </w:lvl>
     <w:lvl w:ilvl="2" w:tplc="04090005" w:tentative="1">
@@ -4914,7 +5062,7 @@
         <w:ind w:left="2160" w:hanging="360"/>
       </w:pPr>
       <w:rPr>
-        <w:rFonts w:ascii="Wingdings" w:hAnsi="Wingdings" w:hint="default"/>
+        <w:rFonts w:hint="default" w:ascii="Wingdings" w:hAnsi="Wingdings"/>
       </w:rPr>
     </w:lvl>
     <w:lvl w:ilvl="3" w:tplc="04090001" w:tentative="1">
@@ -4926,7 +5074,7 @@
         <w:ind w:left="2880" w:hanging="360"/>
       </w:pPr>
       <w:rPr>
-        <w:rFonts w:ascii="Symbol" w:hAnsi="Symbol" w:hint="default"/>
+        <w:rFonts w:hint="default" w:ascii="Symbol" w:hAnsi="Symbol"/>
       </w:rPr>
     </w:lvl>
     <w:lvl w:ilvl="4" w:tplc="04090003" w:tentative="1">
@@ -4938,7 +5086,7 @@
         <w:ind w:left="3600" w:hanging="360"/>
       </w:pPr>
       <w:rPr>
-        <w:rFonts w:ascii="Courier New" w:hAnsi="Courier New" w:cs="Courier New" w:hint="default"/>
+        <w:rFonts w:hint="default" w:ascii="Courier New" w:hAnsi="Courier New" w:cs="Courier New"/>
       </w:rPr>
     </w:lvl>
     <w:lvl w:ilvl="5" w:tplc="04090005" w:tentative="1">
@@ -4950,7 +5098,7 @@
         <w:ind w:left="4320" w:hanging="360"/>
       </w:pPr>
       <w:rPr>
-        <w:rFonts w:ascii="Wingdings" w:hAnsi="Wingdings" w:hint="default"/>
+        <w:rFonts w:hint="default" w:ascii="Wingdings" w:hAnsi="Wingdings"/>
       </w:rPr>
     </w:lvl>
     <w:lvl w:ilvl="6" w:tplc="04090001" w:tentative="1">
@@ -4962,7 +5110,7 @@
         <w:ind w:left="5040" w:hanging="360"/>
       </w:pPr>
       <w:rPr>
-        <w:rFonts w:ascii="Symbol" w:hAnsi="Symbol" w:hint="default"/>
+        <w:rFonts w:hint="default" w:ascii="Symbol" w:hAnsi="Symbol"/>
       </w:rPr>
     </w:lvl>
     <w:lvl w:ilvl="7" w:tplc="04090003" w:tentative="1">
@@ -4974,7 +5122,7 @@
         <w:ind w:left="5760" w:hanging="360"/>
       </w:pPr>
       <w:rPr>
-        <w:rFonts w:ascii="Courier New" w:hAnsi="Courier New" w:cs="Courier New" w:hint="default"/>
+        <w:rFonts w:hint="default" w:ascii="Courier New" w:hAnsi="Courier New" w:cs="Courier New"/>
       </w:rPr>
     </w:lvl>
     <w:lvl w:ilvl="8" w:tplc="04090005" w:tentative="1">
@@ -4986,7 +5134,7 @@
         <w:ind w:left="6480" w:hanging="360"/>
       </w:pPr>
       <w:rPr>
-        <w:rFonts w:ascii="Wingdings" w:hAnsi="Wingdings" w:hint="default"/>
+        <w:rFonts w:hint="default" w:ascii="Wingdings" w:hAnsi="Wingdings"/>
       </w:rPr>
     </w:lvl>
   </w:abstractNum>
@@ -5003,7 +5151,7 @@
         <w:ind w:left="720" w:hanging="360"/>
       </w:pPr>
       <w:rPr>
-        <w:rFonts w:ascii="Wingdings" w:hAnsi="Wingdings" w:hint="default"/>
+        <w:rFonts w:hint="default" w:ascii="Wingdings" w:hAnsi="Wingdings"/>
       </w:rPr>
     </w:lvl>
     <w:lvl w:ilvl="1" w:tplc="04090003" w:tentative="1">
@@ -5015,7 +5163,7 @@
         <w:ind w:left="1440" w:hanging="360"/>
       </w:pPr>
       <w:rPr>
-        <w:rFonts w:ascii="Courier New" w:hAnsi="Courier New" w:cs="Courier New" w:hint="default"/>
+        <w:rFonts w:hint="default" w:ascii="Courier New" w:hAnsi="Courier New" w:cs="Courier New"/>
       </w:rPr>
     </w:lvl>
     <w:lvl w:ilvl="2" w:tplc="04090005" w:tentative="1">
@@ -5027,7 +5175,7 @@
         <w:ind w:left="2160" w:hanging="360"/>
       </w:pPr>
       <w:rPr>
-        <w:rFonts w:ascii="Wingdings" w:hAnsi="Wingdings" w:hint="default"/>
+        <w:rFonts w:hint="default" w:ascii="Wingdings" w:hAnsi="Wingdings"/>
       </w:rPr>
     </w:lvl>
     <w:lvl w:ilvl="3" w:tplc="04090001" w:tentative="1">
@@ -5039,7 +5187,7 @@
         <w:ind w:left="2880" w:hanging="360"/>
       </w:pPr>
       <w:rPr>
-        <w:rFonts w:ascii="Symbol" w:hAnsi="Symbol" w:hint="default"/>
+        <w:rFonts w:hint="default" w:ascii="Symbol" w:hAnsi="Symbol"/>
       </w:rPr>
     </w:lvl>
     <w:lvl w:ilvl="4" w:tplc="04090003" w:tentative="1">
@@ -5051,7 +5199,7 @@
         <w:ind w:left="3600" w:hanging="360"/>
       </w:pPr>
       <w:rPr>
-        <w:rFonts w:ascii="Courier New" w:hAnsi="Courier New" w:cs="Courier New" w:hint="default"/>
+        <w:rFonts w:hint="default" w:ascii="Courier New" w:hAnsi="Courier New" w:cs="Courier New"/>
       </w:rPr>
     </w:lvl>
     <w:lvl w:ilvl="5" w:tplc="04090005" w:tentative="1">
@@ -5063,7 +5211,7 @@
         <w:ind w:left="4320" w:hanging="360"/>
       </w:pPr>
       <w:rPr>
-        <w:rFonts w:ascii="Wingdings" w:hAnsi="Wingdings" w:hint="default"/>
+        <w:rFonts w:hint="default" w:ascii="Wingdings" w:hAnsi="Wingdings"/>
       </w:rPr>
     </w:lvl>
     <w:lvl w:ilvl="6" w:tplc="04090001" w:tentative="1">
@@ -5075,7 +5223,7 @@
         <w:ind w:left="5040" w:hanging="360"/>
       </w:pPr>
       <w:rPr>
-        <w:rFonts w:ascii="Symbol" w:hAnsi="Symbol" w:hint="default"/>
+        <w:rFonts w:hint="default" w:ascii="Symbol" w:hAnsi="Symbol"/>
       </w:rPr>
     </w:lvl>
     <w:lvl w:ilvl="7" w:tplc="04090003" w:tentative="1">
@@ -5087,7 +5235,7 @@
         <w:ind w:left="5760" w:hanging="360"/>
       </w:pPr>
       <w:rPr>
-        <w:rFonts w:ascii="Courier New" w:hAnsi="Courier New" w:cs="Courier New" w:hint="default"/>
+        <w:rFonts w:hint="default" w:ascii="Courier New" w:hAnsi="Courier New" w:cs="Courier New"/>
       </w:rPr>
     </w:lvl>
     <w:lvl w:ilvl="8" w:tplc="04090005" w:tentative="1">
@@ -5099,7 +5247,7 @@
         <w:ind w:left="6480" w:hanging="360"/>
       </w:pPr>
       <w:rPr>
-        <w:rFonts w:ascii="Wingdings" w:hAnsi="Wingdings" w:hint="default"/>
+        <w:rFonts w:hint="default" w:ascii="Wingdings" w:hAnsi="Wingdings"/>
       </w:rPr>
     </w:lvl>
   </w:abstractNum>
@@ -5229,7 +5377,7 @@
         <w:ind w:left="720" w:hanging="360"/>
       </w:pPr>
       <w:rPr>
-        <w:rFonts w:ascii="Wingdings" w:hAnsi="Wingdings" w:hint="default"/>
+        <w:rFonts w:hint="default" w:ascii="Wingdings" w:hAnsi="Wingdings"/>
       </w:rPr>
     </w:lvl>
     <w:lvl w:ilvl="1" w:tplc="04090003" w:tentative="1">
@@ -5241,7 +5389,7 @@
         <w:ind w:left="1440" w:hanging="360"/>
       </w:pPr>
       <w:rPr>
-        <w:rFonts w:ascii="Courier New" w:hAnsi="Courier New" w:cs="Courier New" w:hint="default"/>
+        <w:rFonts w:hint="default" w:ascii="Courier New" w:hAnsi="Courier New" w:cs="Courier New"/>
       </w:rPr>
     </w:lvl>
     <w:lvl w:ilvl="2" w:tplc="04090005" w:tentative="1">
@@ -5253,7 +5401,7 @@
         <w:ind w:left="2160" w:hanging="360"/>
       </w:pPr>
       <w:rPr>
-        <w:rFonts w:ascii="Wingdings" w:hAnsi="Wingdings" w:hint="default"/>
+        <w:rFonts w:hint="default" w:ascii="Wingdings" w:hAnsi="Wingdings"/>
       </w:rPr>
     </w:lvl>
     <w:lvl w:ilvl="3" w:tplc="04090001" w:tentative="1">
@@ -5265,7 +5413,7 @@
         <w:ind w:left="2880" w:hanging="360"/>
       </w:pPr>
       <w:rPr>
-        <w:rFonts w:ascii="Symbol" w:hAnsi="Symbol" w:hint="default"/>
+        <w:rFonts w:hint="default" w:ascii="Symbol" w:hAnsi="Symbol"/>
       </w:rPr>
     </w:lvl>
     <w:lvl w:ilvl="4" w:tplc="04090003" w:tentative="1">
@@ -5277,7 +5425,7 @@
         <w:ind w:left="3600" w:hanging="360"/>
       </w:pPr>
       <w:rPr>
-        <w:rFonts w:ascii="Courier New" w:hAnsi="Courier New" w:cs="Courier New" w:hint="default"/>
+        <w:rFonts w:hint="default" w:ascii="Courier New" w:hAnsi="Courier New" w:cs="Courier New"/>
       </w:rPr>
     </w:lvl>
     <w:lvl w:ilvl="5" w:tplc="04090005" w:tentative="1">
@@ -5289,7 +5437,7 @@
         <w:ind w:left="4320" w:hanging="360"/>
       </w:pPr>
       <w:rPr>
-        <w:rFonts w:ascii="Wingdings" w:hAnsi="Wingdings" w:hint="default"/>
+        <w:rFonts w:hint="default" w:ascii="Wingdings" w:hAnsi="Wingdings"/>
       </w:rPr>
     </w:lvl>
     <w:lvl w:ilvl="6" w:tplc="04090001" w:tentative="1">
@@ -5301,7 +5449,7 @@
         <w:ind w:left="5040" w:hanging="360"/>
       </w:pPr>
       <w:rPr>
-        <w:rFonts w:ascii="Symbol" w:hAnsi="Symbol" w:hint="default"/>
+        <w:rFonts w:hint="default" w:ascii="Symbol" w:hAnsi="Symbol"/>
       </w:rPr>
     </w:lvl>
     <w:lvl w:ilvl="7" w:tplc="04090003" w:tentative="1">
@@ -5313,7 +5461,7 @@
         <w:ind w:left="5760" w:hanging="360"/>
       </w:pPr>
       <w:rPr>
-        <w:rFonts w:ascii="Courier New" w:hAnsi="Courier New" w:cs="Courier New" w:hint="default"/>
+        <w:rFonts w:hint="default" w:ascii="Courier New" w:hAnsi="Courier New" w:cs="Courier New"/>
       </w:rPr>
     </w:lvl>
     <w:lvl w:ilvl="8" w:tplc="04090005" w:tentative="1">
@@ -5325,7 +5473,7 @@
         <w:ind w:left="6480" w:hanging="360"/>
       </w:pPr>
       <w:rPr>
-        <w:rFonts w:ascii="Wingdings" w:hAnsi="Wingdings" w:hint="default"/>
+        <w:rFonts w:hint="default" w:ascii="Wingdings" w:hAnsi="Wingdings"/>
       </w:rPr>
     </w:lvl>
   </w:abstractNum>
@@ -5342,7 +5490,7 @@
         <w:ind w:left="1440" w:hanging="360"/>
       </w:pPr>
       <w:rPr>
-        <w:rFonts w:ascii="Symbol" w:hAnsi="Symbol" w:hint="default"/>
+        <w:rFonts w:hint="default" w:ascii="Symbol" w:hAnsi="Symbol"/>
       </w:rPr>
     </w:lvl>
     <w:lvl w:ilvl="1" w:tplc="04090003" w:tentative="1">
@@ -5354,7 +5502,7 @@
         <w:ind w:left="2160" w:hanging="360"/>
       </w:pPr>
       <w:rPr>
-        <w:rFonts w:ascii="Courier New" w:hAnsi="Courier New" w:cs="Courier New" w:hint="default"/>
+        <w:rFonts w:hint="default" w:ascii="Courier New" w:hAnsi="Courier New" w:cs="Courier New"/>
       </w:rPr>
     </w:lvl>
     <w:lvl w:ilvl="2" w:tplc="04090005" w:tentative="1">
@@ -5366,7 +5514,7 @@
         <w:ind w:left="2880" w:hanging="360"/>
       </w:pPr>
       <w:rPr>
-        <w:rFonts w:ascii="Wingdings" w:hAnsi="Wingdings" w:hint="default"/>
+        <w:rFonts w:hint="default" w:ascii="Wingdings" w:hAnsi="Wingdings"/>
       </w:rPr>
     </w:lvl>
     <w:lvl w:ilvl="3" w:tplc="04090001" w:tentative="1">
@@ -5378,7 +5526,7 @@
         <w:ind w:left="3600" w:hanging="360"/>
       </w:pPr>
       <w:rPr>
-        <w:rFonts w:ascii="Symbol" w:hAnsi="Symbol" w:hint="default"/>
+        <w:rFonts w:hint="default" w:ascii="Symbol" w:hAnsi="Symbol"/>
       </w:rPr>
     </w:lvl>
     <w:lvl w:ilvl="4" w:tplc="04090003" w:tentative="1">
@@ -5390,7 +5538,7 @@
         <w:ind w:left="4320" w:hanging="360"/>
       </w:pPr>
       <w:rPr>
-        <w:rFonts w:ascii="Courier New" w:hAnsi="Courier New" w:cs="Courier New" w:hint="default"/>
+        <w:rFonts w:hint="default" w:ascii="Courier New" w:hAnsi="Courier New" w:cs="Courier New"/>
       </w:rPr>
     </w:lvl>
     <w:lvl w:ilvl="5" w:tplc="04090005" w:tentative="1">
@@ -5402,7 +5550,7 @@
         <w:ind w:left="5040" w:hanging="360"/>
       </w:pPr>
       <w:rPr>
-        <w:rFonts w:ascii="Wingdings" w:hAnsi="Wingdings" w:hint="default"/>
+        <w:rFonts w:hint="default" w:ascii="Wingdings" w:hAnsi="Wingdings"/>
       </w:rPr>
     </w:lvl>
     <w:lvl w:ilvl="6" w:tplc="04090001" w:tentative="1">
@@ -5414,7 +5562,7 @@
         <w:ind w:left="5760" w:hanging="360"/>
       </w:pPr>
       <w:rPr>
-        <w:rFonts w:ascii="Symbol" w:hAnsi="Symbol" w:hint="default"/>
+        <w:rFonts w:hint="default" w:ascii="Symbol" w:hAnsi="Symbol"/>
       </w:rPr>
     </w:lvl>
     <w:lvl w:ilvl="7" w:tplc="04090003" w:tentative="1">
@@ -5426,7 +5574,7 @@
         <w:ind w:left="6480" w:hanging="360"/>
       </w:pPr>
       <w:rPr>
-        <w:rFonts w:ascii="Courier New" w:hAnsi="Courier New" w:cs="Courier New" w:hint="default"/>
+        <w:rFonts w:hint="default" w:ascii="Courier New" w:hAnsi="Courier New" w:cs="Courier New"/>
       </w:rPr>
     </w:lvl>
     <w:lvl w:ilvl="8" w:tplc="04090005" w:tentative="1">
@@ -5438,7 +5586,7 @@
         <w:ind w:left="7200" w:hanging="360"/>
       </w:pPr>
       <w:rPr>
-        <w:rFonts w:ascii="Wingdings" w:hAnsi="Wingdings" w:hint="default"/>
+        <w:rFonts w:hint="default" w:ascii="Wingdings" w:hAnsi="Wingdings"/>
       </w:rPr>
     </w:lvl>
   </w:abstractNum>
@@ -5455,7 +5603,7 @@
         <w:ind w:left="720" w:hanging="360"/>
       </w:pPr>
       <w:rPr>
-        <w:rFonts w:ascii="Wingdings" w:hAnsi="Wingdings" w:hint="default"/>
+        <w:rFonts w:hint="default" w:ascii="Wingdings" w:hAnsi="Wingdings"/>
       </w:rPr>
     </w:lvl>
     <w:lvl w:ilvl="1" w:tplc="04090003" w:tentative="1">
@@ -5467,7 +5615,7 @@
         <w:ind w:left="1440" w:hanging="360"/>
       </w:pPr>
       <w:rPr>
-        <w:rFonts w:ascii="Courier New" w:hAnsi="Courier New" w:cs="Courier New" w:hint="default"/>
+        <w:rFonts w:hint="default" w:ascii="Courier New" w:hAnsi="Courier New" w:cs="Courier New"/>
       </w:rPr>
     </w:lvl>
     <w:lvl w:ilvl="2" w:tplc="04090005" w:tentative="1">
@@ -5479,7 +5627,7 @@
         <w:ind w:left="2160" w:hanging="360"/>
       </w:pPr>
       <w:rPr>
-        <w:rFonts w:ascii="Wingdings" w:hAnsi="Wingdings" w:hint="default"/>
+        <w:rFonts w:hint="default" w:ascii="Wingdings" w:hAnsi="Wingdings"/>
       </w:rPr>
     </w:lvl>
     <w:lvl w:ilvl="3" w:tplc="04090001" w:tentative="1">
@@ -5491,7 +5639,7 @@
         <w:ind w:left="2880" w:hanging="360"/>
       </w:pPr>
       <w:rPr>
-        <w:rFonts w:ascii="Symbol" w:hAnsi="Symbol" w:hint="default"/>
+        <w:rFonts w:hint="default" w:ascii="Symbol" w:hAnsi="Symbol"/>
       </w:rPr>
     </w:lvl>
     <w:lvl w:ilvl="4" w:tplc="04090003" w:tentative="1">
@@ -5503,7 +5651,7 @@
         <w:ind w:left="3600" w:hanging="360"/>
       </w:pPr>
       <w:rPr>
-        <w:rFonts w:ascii="Courier New" w:hAnsi="Courier New" w:cs="Courier New" w:hint="default"/>
+        <w:rFonts w:hint="default" w:ascii="Courier New" w:hAnsi="Courier New" w:cs="Courier New"/>
       </w:rPr>
     </w:lvl>
     <w:lvl w:ilvl="5" w:tplc="04090005" w:tentative="1">
@@ -5515,7 +5663,7 @@
         <w:ind w:left="4320" w:hanging="360"/>
       </w:pPr>
       <w:rPr>
-        <w:rFonts w:ascii="Wingdings" w:hAnsi="Wingdings" w:hint="default"/>
+        <w:rFonts w:hint="default" w:ascii="Wingdings" w:hAnsi="Wingdings"/>
       </w:rPr>
     </w:lvl>
     <w:lvl w:ilvl="6" w:tplc="04090001" w:tentative="1">
@@ -5527,7 +5675,7 @@
         <w:ind w:left="5040" w:hanging="360"/>
       </w:pPr>
       <w:rPr>
-        <w:rFonts w:ascii="Symbol" w:hAnsi="Symbol" w:hint="default"/>
+        <w:rFonts w:hint="default" w:ascii="Symbol" w:hAnsi="Symbol"/>
       </w:rPr>
     </w:lvl>
     <w:lvl w:ilvl="7" w:tplc="04090003" w:tentative="1">
@@ -5539,7 +5687,7 @@
         <w:ind w:left="5760" w:hanging="360"/>
       </w:pPr>
       <w:rPr>
-        <w:rFonts w:ascii="Courier New" w:hAnsi="Courier New" w:cs="Courier New" w:hint="default"/>
+        <w:rFonts w:hint="default" w:ascii="Courier New" w:hAnsi="Courier New" w:cs="Courier New"/>
       </w:rPr>
     </w:lvl>
     <w:lvl w:ilvl="8" w:tplc="04090005" w:tentative="1">
@@ -5551,7 +5699,7 @@
         <w:ind w:left="6480" w:hanging="360"/>
       </w:pPr>
       <w:rPr>
-        <w:rFonts w:ascii="Wingdings" w:hAnsi="Wingdings" w:hint="default"/>
+        <w:rFonts w:hint="default" w:ascii="Wingdings" w:hAnsi="Wingdings"/>
       </w:rPr>
     </w:lvl>
   </w:abstractNum>
@@ -5568,7 +5716,7 @@
         <w:ind w:left="720" w:hanging="360"/>
       </w:pPr>
       <w:rPr>
-        <w:rFonts w:ascii="Symbol" w:hAnsi="Symbol" w:hint="default"/>
+        <w:rFonts w:hint="default" w:ascii="Symbol" w:hAnsi="Symbol"/>
       </w:rPr>
     </w:lvl>
     <w:lvl w:ilvl="1" w:tplc="04090003" w:tentative="1">
@@ -5580,7 +5728,7 @@
         <w:ind w:left="1440" w:hanging="360"/>
       </w:pPr>
       <w:rPr>
-        <w:rFonts w:ascii="Courier New" w:hAnsi="Courier New" w:cs="Courier New" w:hint="default"/>
+        <w:rFonts w:hint="default" w:ascii="Courier New" w:hAnsi="Courier New" w:cs="Courier New"/>
       </w:rPr>
     </w:lvl>
     <w:lvl w:ilvl="2" w:tplc="04090005" w:tentative="1">
@@ -5592,7 +5740,7 @@
         <w:ind w:left="2160" w:hanging="360"/>
       </w:pPr>
       <w:rPr>
-        <w:rFonts w:ascii="Wingdings" w:hAnsi="Wingdings" w:hint="default"/>
+        <w:rFonts w:hint="default" w:ascii="Wingdings" w:hAnsi="Wingdings"/>
       </w:rPr>
     </w:lvl>
     <w:lvl w:ilvl="3" w:tplc="04090001" w:tentative="1">
@@ -5604,7 +5752,7 @@
         <w:ind w:left="2880" w:hanging="360"/>
       </w:pPr>
       <w:rPr>
-        <w:rFonts w:ascii="Symbol" w:hAnsi="Symbol" w:hint="default"/>
+        <w:rFonts w:hint="default" w:ascii="Symbol" w:hAnsi="Symbol"/>
       </w:rPr>
     </w:lvl>
     <w:lvl w:ilvl="4" w:tplc="04090003" w:tentative="1">
@@ -5616,7 +5764,7 @@
         <w:ind w:left="3600" w:hanging="360"/>
       </w:pPr>
       <w:rPr>
-        <w:rFonts w:ascii="Courier New" w:hAnsi="Courier New" w:cs="Courier New" w:hint="default"/>
+        <w:rFonts w:hint="default" w:ascii="Courier New" w:hAnsi="Courier New" w:cs="Courier New"/>
       </w:rPr>
     </w:lvl>
     <w:lvl w:ilvl="5" w:tplc="04090005" w:tentative="1">
@@ -5628,7 +5776,7 @@
         <w:ind w:left="4320" w:hanging="360"/>
       </w:pPr>
       <w:rPr>
-        <w:rFonts w:ascii="Wingdings" w:hAnsi="Wingdings" w:hint="default"/>
+        <w:rFonts w:hint="default" w:ascii="Wingdings" w:hAnsi="Wingdings"/>
       </w:rPr>
     </w:lvl>
     <w:lvl w:ilvl="6" w:tplc="04090001" w:tentative="1">
@@ -5640,7 +5788,7 @@
         <w:ind w:left="5040" w:hanging="360"/>
       </w:pPr>
       <w:rPr>
-        <w:rFonts w:ascii="Symbol" w:hAnsi="Symbol" w:hint="default"/>
+        <w:rFonts w:hint="default" w:ascii="Symbol" w:hAnsi="Symbol"/>
       </w:rPr>
     </w:lvl>
     <w:lvl w:ilvl="7" w:tplc="04090003" w:tentative="1">
@@ -5652,7 +5800,7 @@
         <w:ind w:left="5760" w:hanging="360"/>
       </w:pPr>
       <w:rPr>
-        <w:rFonts w:ascii="Courier New" w:hAnsi="Courier New" w:cs="Courier New" w:hint="default"/>
+        <w:rFonts w:hint="default" w:ascii="Courier New" w:hAnsi="Courier New" w:cs="Courier New"/>
       </w:rPr>
     </w:lvl>
     <w:lvl w:ilvl="8" w:tplc="04090005" w:tentative="1">
@@ -5664,7 +5812,7 @@
         <w:ind w:left="6480" w:hanging="360"/>
       </w:pPr>
       <w:rPr>
-        <w:rFonts w:ascii="Wingdings" w:hAnsi="Wingdings" w:hint="default"/>
+        <w:rFonts w:hint="default" w:ascii="Wingdings" w:hAnsi="Wingdings"/>
       </w:rPr>
     </w:lvl>
   </w:abstractNum>
@@ -5680,7 +5828,7 @@
         <w:ind w:left="2640" w:hanging="360"/>
       </w:pPr>
       <w:rPr>
-        <w:rFonts w:ascii="Cordia New" w:eastAsia="Times New Roman" w:hAnsi="Cordia New" w:cs="Cordia New" w:hint="default"/>
+        <w:rFonts w:hint="default" w:ascii="Cordia New" w:hAnsi="Cordia New" w:eastAsia="Times New Roman" w:cs="Cordia New"/>
         <w:color w:val="000000"/>
       </w:rPr>
     </w:lvl>
@@ -5693,7 +5841,7 @@
         <w:ind w:left="2760" w:hanging="360"/>
       </w:pPr>
       <w:rPr>
-        <w:rFonts w:ascii="Courier New" w:hAnsi="Courier New" w:cs="Courier New" w:hint="default"/>
+        <w:rFonts w:hint="default" w:ascii="Courier New" w:hAnsi="Courier New" w:cs="Courier New"/>
       </w:rPr>
     </w:lvl>
     <w:lvl w:ilvl="2" w:tplc="04090005" w:tentative="1">
@@ -5705,7 +5853,7 @@
         <w:ind w:left="3480" w:hanging="360"/>
       </w:pPr>
       <w:rPr>
-        <w:rFonts w:ascii="Wingdings" w:hAnsi="Wingdings" w:hint="default"/>
+        <w:rFonts w:hint="default" w:ascii="Wingdings" w:hAnsi="Wingdings"/>
       </w:rPr>
     </w:lvl>
     <w:lvl w:ilvl="3" w:tplc="04090001" w:tentative="1">
@@ -5717,7 +5865,7 @@
         <w:ind w:left="4200" w:hanging="360"/>
       </w:pPr>
       <w:rPr>
-        <w:rFonts w:ascii="Symbol" w:hAnsi="Symbol" w:hint="default"/>
+        <w:rFonts w:hint="default" w:ascii="Symbol" w:hAnsi="Symbol"/>
       </w:rPr>
     </w:lvl>
     <w:lvl w:ilvl="4" w:tplc="04090003" w:tentative="1">
@@ -5729,7 +5877,7 @@
         <w:ind w:left="4920" w:hanging="360"/>
       </w:pPr>
       <w:rPr>
-        <w:rFonts w:ascii="Courier New" w:hAnsi="Courier New" w:cs="Courier New" w:hint="default"/>
+        <w:rFonts w:hint="default" w:ascii="Courier New" w:hAnsi="Courier New" w:cs="Courier New"/>
       </w:rPr>
     </w:lvl>
     <w:lvl w:ilvl="5" w:tplc="04090005" w:tentative="1">
@@ -5741,7 +5889,7 @@
         <w:ind w:left="5640" w:hanging="360"/>
       </w:pPr>
       <w:rPr>
-        <w:rFonts w:ascii="Wingdings" w:hAnsi="Wingdings" w:hint="default"/>
+        <w:rFonts w:hint="default" w:ascii="Wingdings" w:hAnsi="Wingdings"/>
       </w:rPr>
     </w:lvl>
     <w:lvl w:ilvl="6" w:tplc="04090001" w:tentative="1">
@@ -5753,7 +5901,7 @@
         <w:ind w:left="6360" w:hanging="360"/>
       </w:pPr>
       <w:rPr>
-        <w:rFonts w:ascii="Symbol" w:hAnsi="Symbol" w:hint="default"/>
+        <w:rFonts w:hint="default" w:ascii="Symbol" w:hAnsi="Symbol"/>
       </w:rPr>
     </w:lvl>
     <w:lvl w:ilvl="7" w:tplc="04090003" w:tentative="1">
@@ -5765,7 +5913,7 @@
         <w:ind w:left="7080" w:hanging="360"/>
       </w:pPr>
       <w:rPr>
-        <w:rFonts w:ascii="Courier New" w:hAnsi="Courier New" w:cs="Courier New" w:hint="default"/>
+        <w:rFonts w:hint="default" w:ascii="Courier New" w:hAnsi="Courier New" w:cs="Courier New"/>
       </w:rPr>
     </w:lvl>
     <w:lvl w:ilvl="8" w:tplc="04090005" w:tentative="1">
@@ -5777,7 +5925,7 @@
         <w:ind w:left="7800" w:hanging="360"/>
       </w:pPr>
       <w:rPr>
-        <w:rFonts w:ascii="Wingdings" w:hAnsi="Wingdings" w:hint="default"/>
+        <w:rFonts w:hint="default" w:ascii="Wingdings" w:hAnsi="Wingdings"/>
       </w:rPr>
     </w:lvl>
   </w:abstractNum>
@@ -5794,7 +5942,7 @@
         <w:ind w:left="720" w:hanging="360"/>
       </w:pPr>
       <w:rPr>
-        <w:rFonts w:ascii="Lotuss Smart TX" w:eastAsiaTheme="minorHAnsi" w:hAnsi="Lotuss Smart TX" w:cs="Lotuss Smart TX" w:hint="default"/>
+        <w:rFonts w:hint="default" w:ascii="Lotuss Smart TX" w:hAnsi="Lotuss Smart TX" w:cs="Lotuss Smart TX" w:eastAsiaTheme="minorHAnsi"/>
       </w:rPr>
     </w:lvl>
     <w:lvl w:ilvl="1" w:tplc="04090003" w:tentative="1">
@@ -5806,7 +5954,7 @@
         <w:ind w:left="1440" w:hanging="360"/>
       </w:pPr>
       <w:rPr>
-        <w:rFonts w:ascii="Courier New" w:hAnsi="Courier New" w:cs="Courier New" w:hint="default"/>
+        <w:rFonts w:hint="default" w:ascii="Courier New" w:hAnsi="Courier New" w:cs="Courier New"/>
       </w:rPr>
     </w:lvl>
     <w:lvl w:ilvl="2" w:tplc="04090005" w:tentative="1">
@@ -5818,7 +5966,7 @@
         <w:ind w:left="2160" w:hanging="360"/>
       </w:pPr>
       <w:rPr>
-        <w:rFonts w:ascii="Wingdings" w:hAnsi="Wingdings" w:hint="default"/>
+        <w:rFonts w:hint="default" w:ascii="Wingdings" w:hAnsi="Wingdings"/>
       </w:rPr>
     </w:lvl>
     <w:lvl w:ilvl="3" w:tplc="04090001" w:tentative="1">
@@ -5830,7 +5978,7 @@
         <w:ind w:left="2880" w:hanging="360"/>
       </w:pPr>
       <w:rPr>
-        <w:rFonts w:ascii="Symbol" w:hAnsi="Symbol" w:hint="default"/>
+        <w:rFonts w:hint="default" w:ascii="Symbol" w:hAnsi="Symbol"/>
       </w:rPr>
     </w:lvl>
     <w:lvl w:ilvl="4" w:tplc="04090003" w:tentative="1">
@@ -5842,7 +5990,7 @@
         <w:ind w:left="3600" w:hanging="360"/>
       </w:pPr>
       <w:rPr>
-        <w:rFonts w:ascii="Courier New" w:hAnsi="Courier New" w:cs="Courier New" w:hint="default"/>
+        <w:rFonts w:hint="default" w:ascii="Courier New" w:hAnsi="Courier New" w:cs="Courier New"/>
       </w:rPr>
     </w:lvl>
     <w:lvl w:ilvl="5" w:tplc="04090005" w:tentative="1">
@@ -5854,7 +6002,7 @@
         <w:ind w:left="4320" w:hanging="360"/>
       </w:pPr>
       <w:rPr>
-        <w:rFonts w:ascii="Wingdings" w:hAnsi="Wingdings" w:hint="default"/>
+        <w:rFonts w:hint="default" w:ascii="Wingdings" w:hAnsi="Wingdings"/>
       </w:rPr>
     </w:lvl>
     <w:lvl w:ilvl="6" w:tplc="04090001" w:tentative="1">
@@ -5866,7 +6014,7 @@
         <w:ind w:left="5040" w:hanging="360"/>
       </w:pPr>
       <w:rPr>
-        <w:rFonts w:ascii="Symbol" w:hAnsi="Symbol" w:hint="default"/>
+        <w:rFonts w:hint="default" w:ascii="Symbol" w:hAnsi="Symbol"/>
       </w:rPr>
     </w:lvl>
     <w:lvl w:ilvl="7" w:tplc="04090003" w:tentative="1">
@@ -5878,7 +6026,7 @@
         <w:ind w:left="5760" w:hanging="360"/>
       </w:pPr>
       <w:rPr>
-        <w:rFonts w:ascii="Courier New" w:hAnsi="Courier New" w:cs="Courier New" w:hint="default"/>
+        <w:rFonts w:hint="default" w:ascii="Courier New" w:hAnsi="Courier New" w:cs="Courier New"/>
       </w:rPr>
     </w:lvl>
     <w:lvl w:ilvl="8" w:tplc="04090005" w:tentative="1">
@@ -5890,7 +6038,7 @@
         <w:ind w:left="6480" w:hanging="360"/>
       </w:pPr>
       <w:rPr>
-        <w:rFonts w:ascii="Wingdings" w:hAnsi="Wingdings" w:hint="default"/>
+        <w:rFonts w:hint="default" w:ascii="Wingdings" w:hAnsi="Wingdings"/>
       </w:rPr>
     </w:lvl>
   </w:abstractNum>
@@ -5907,7 +6055,7 @@
         <w:ind w:left="720" w:hanging="360"/>
       </w:pPr>
       <w:rPr>
-        <w:rFonts w:ascii="Wingdings" w:hAnsi="Wingdings" w:hint="default"/>
+        <w:rFonts w:hint="default" w:ascii="Wingdings" w:hAnsi="Wingdings"/>
       </w:rPr>
     </w:lvl>
     <w:lvl w:ilvl="1" w:tplc="04090003" w:tentative="1">
@@ -5919,7 +6067,7 @@
         <w:ind w:left="1440" w:hanging="360"/>
       </w:pPr>
       <w:rPr>
-        <w:rFonts w:ascii="Courier New" w:hAnsi="Courier New" w:cs="Courier New" w:hint="default"/>
+        <w:rFonts w:hint="default" w:ascii="Courier New" w:hAnsi="Courier New" w:cs="Courier New"/>
       </w:rPr>
     </w:lvl>
     <w:lvl w:ilvl="2" w:tplc="04090005" w:tentative="1">
@@ -5931,7 +6079,7 @@
         <w:ind w:left="2160" w:hanging="360"/>
       </w:pPr>
       <w:rPr>
-        <w:rFonts w:ascii="Wingdings" w:hAnsi="Wingdings" w:hint="default"/>
+        <w:rFonts w:hint="default" w:ascii="Wingdings" w:hAnsi="Wingdings"/>
       </w:rPr>
     </w:lvl>
     <w:lvl w:ilvl="3" w:tplc="04090001" w:tentative="1">
@@ -5943,7 +6091,7 @@
         <w:ind w:left="2880" w:hanging="360"/>
       </w:pPr>
       <w:rPr>
-        <w:rFonts w:ascii="Symbol" w:hAnsi="Symbol" w:hint="default"/>
+        <w:rFonts w:hint="default" w:ascii="Symbol" w:hAnsi="Symbol"/>
       </w:rPr>
     </w:lvl>
     <w:lvl w:ilvl="4" w:tplc="04090003" w:tentative="1">
@@ -5955,7 +6103,7 @@
         <w:ind w:left="3600" w:hanging="360"/>
       </w:pPr>
       <w:rPr>
-        <w:rFonts w:ascii="Courier New" w:hAnsi="Courier New" w:cs="Courier New" w:hint="default"/>
+        <w:rFonts w:hint="default" w:ascii="Courier New" w:hAnsi="Courier New" w:cs="Courier New"/>
       </w:rPr>
     </w:lvl>
     <w:lvl w:ilvl="5" w:tplc="04090005" w:tentative="1">
@@ -5967,7 +6115,7 @@
         <w:ind w:left="4320" w:hanging="360"/>
       </w:pPr>
       <w:rPr>
-        <w:rFonts w:ascii="Wingdings" w:hAnsi="Wingdings" w:hint="default"/>
+        <w:rFonts w:hint="default" w:ascii="Wingdings" w:hAnsi="Wingdings"/>
       </w:rPr>
     </w:lvl>
     <w:lvl w:ilvl="6" w:tplc="04090001" w:tentative="1">
@@ -5979,7 +6127,7 @@
         <w:ind w:left="5040" w:hanging="360"/>
       </w:pPr>
       <w:rPr>
-        <w:rFonts w:ascii="Symbol" w:hAnsi="Symbol" w:hint="default"/>
+        <w:rFonts w:hint="default" w:ascii="Symbol" w:hAnsi="Symbol"/>
       </w:rPr>
     </w:lvl>
     <w:lvl w:ilvl="7" w:tplc="04090003" w:tentative="1">
@@ -5991,7 +6139,7 @@
         <w:ind w:left="5760" w:hanging="360"/>
       </w:pPr>
       <w:rPr>
-        <w:rFonts w:ascii="Courier New" w:hAnsi="Courier New" w:cs="Courier New" w:hint="default"/>
+        <w:rFonts w:hint="default" w:ascii="Courier New" w:hAnsi="Courier New" w:cs="Courier New"/>
       </w:rPr>
     </w:lvl>
     <w:lvl w:ilvl="8" w:tplc="04090005" w:tentative="1">
@@ -6003,7 +6151,7 @@
         <w:ind w:left="6480" w:hanging="360"/>
       </w:pPr>
       <w:rPr>
-        <w:rFonts w:ascii="Wingdings" w:hAnsi="Wingdings" w:hint="default"/>
+        <w:rFonts w:hint="default" w:ascii="Wingdings" w:hAnsi="Wingdings"/>
       </w:rPr>
     </w:lvl>
   </w:abstractNum>
@@ -6133,7 +6281,7 @@
         <w:ind w:left="720" w:hanging="360"/>
       </w:pPr>
       <w:rPr>
-        <w:rFonts w:ascii="Wingdings" w:hAnsi="Wingdings" w:hint="default"/>
+        <w:rFonts w:hint="default" w:ascii="Wingdings" w:hAnsi="Wingdings"/>
       </w:rPr>
     </w:lvl>
     <w:lvl w:ilvl="1" w:tplc="04090003" w:tentative="1">
@@ -6145,7 +6293,7 @@
         <w:ind w:left="1440" w:hanging="360"/>
       </w:pPr>
       <w:rPr>
-        <w:rFonts w:ascii="Courier New" w:hAnsi="Courier New" w:cs="Courier New" w:hint="default"/>
+        <w:rFonts w:hint="default" w:ascii="Courier New" w:hAnsi="Courier New" w:cs="Courier New"/>
       </w:rPr>
     </w:lvl>
     <w:lvl w:ilvl="2" w:tplc="04090005" w:tentative="1">
@@ -6157,7 +6305,7 @@
         <w:ind w:left="2160" w:hanging="360"/>
       </w:pPr>
       <w:rPr>
-        <w:rFonts w:ascii="Wingdings" w:hAnsi="Wingdings" w:hint="default"/>
+        <w:rFonts w:hint="default" w:ascii="Wingdings" w:hAnsi="Wingdings"/>
       </w:rPr>
     </w:lvl>
     <w:lvl w:ilvl="3" w:tplc="04090001" w:tentative="1">
@@ -6169,7 +6317,7 @@
         <w:ind w:left="2880" w:hanging="360"/>
       </w:pPr>
       <w:rPr>
-        <w:rFonts w:ascii="Symbol" w:hAnsi="Symbol" w:hint="default"/>
+        <w:rFonts w:hint="default" w:ascii="Symbol" w:hAnsi="Symbol"/>
       </w:rPr>
     </w:lvl>
     <w:lvl w:ilvl="4" w:tplc="04090003" w:tentative="1">
@@ -6181,7 +6329,7 @@
         <w:ind w:left="3600" w:hanging="360"/>
       </w:pPr>
       <w:rPr>
-        <w:rFonts w:ascii="Courier New" w:hAnsi="Courier New" w:cs="Courier New" w:hint="default"/>
+        <w:rFonts w:hint="default" w:ascii="Courier New" w:hAnsi="Courier New" w:cs="Courier New"/>
       </w:rPr>
     </w:lvl>
     <w:lvl w:ilvl="5" w:tplc="04090005" w:tentative="1">
@@ -6193,7 +6341,7 @@
         <w:ind w:left="4320" w:hanging="360"/>
       </w:pPr>
       <w:rPr>
-        <w:rFonts w:ascii="Wingdings" w:hAnsi="Wingdings" w:hint="default"/>
+        <w:rFonts w:hint="default" w:ascii="Wingdings" w:hAnsi="Wingdings"/>
       </w:rPr>
     </w:lvl>
     <w:lvl w:ilvl="6" w:tplc="04090001" w:tentative="1">
@@ -6205,7 +6353,7 @@
         <w:ind w:left="5040" w:hanging="360"/>
       </w:pPr>
       <w:rPr>
-        <w:rFonts w:ascii="Symbol" w:hAnsi="Symbol" w:hint="default"/>
+        <w:rFonts w:hint="default" w:ascii="Symbol" w:hAnsi="Symbol"/>
       </w:rPr>
     </w:lvl>
     <w:lvl w:ilvl="7" w:tplc="04090003" w:tentative="1">
@@ -6217,7 +6365,7 @@
         <w:ind w:left="5760" w:hanging="360"/>
       </w:pPr>
       <w:rPr>
-        <w:rFonts w:ascii="Courier New" w:hAnsi="Courier New" w:cs="Courier New" w:hint="default"/>
+        <w:rFonts w:hint="default" w:ascii="Courier New" w:hAnsi="Courier New" w:cs="Courier New"/>
       </w:rPr>
     </w:lvl>
     <w:lvl w:ilvl="8" w:tplc="04090005" w:tentative="1">
@@ -6229,7 +6377,7 @@
         <w:ind w:left="6480" w:hanging="360"/>
       </w:pPr>
       <w:rPr>
-        <w:rFonts w:ascii="Wingdings" w:hAnsi="Wingdings" w:hint="default"/>
+        <w:rFonts w:hint="default" w:ascii="Wingdings" w:hAnsi="Wingdings"/>
       </w:rPr>
     </w:lvl>
   </w:abstractNum>
@@ -6246,7 +6394,7 @@
         <w:ind w:left="1440" w:hanging="360"/>
       </w:pPr>
       <w:rPr>
-        <w:rFonts w:ascii="Courier New" w:hAnsi="Courier New" w:cs="Courier New" w:hint="default"/>
+        <w:rFonts w:hint="default" w:ascii="Courier New" w:hAnsi="Courier New" w:cs="Courier New"/>
       </w:rPr>
     </w:lvl>
     <w:lvl w:ilvl="1" w:tplc="04090003" w:tentative="1">
@@ -6258,7 +6406,7 @@
         <w:ind w:left="2160" w:hanging="360"/>
       </w:pPr>
       <w:rPr>
-        <w:rFonts w:ascii="Courier New" w:hAnsi="Courier New" w:cs="Courier New" w:hint="default"/>
+        <w:rFonts w:hint="default" w:ascii="Courier New" w:hAnsi="Courier New" w:cs="Courier New"/>
       </w:rPr>
     </w:lvl>
     <w:lvl w:ilvl="2" w:tplc="04090005" w:tentative="1">
@@ -6270,7 +6418,7 @@
         <w:ind w:left="2880" w:hanging="360"/>
       </w:pPr>
       <w:rPr>
-        <w:rFonts w:ascii="Wingdings" w:hAnsi="Wingdings" w:hint="default"/>
+        <w:rFonts w:hint="default" w:ascii="Wingdings" w:hAnsi="Wingdings"/>
       </w:rPr>
     </w:lvl>
     <w:lvl w:ilvl="3" w:tplc="04090001" w:tentative="1">
@@ -6282,7 +6430,7 @@
         <w:ind w:left="3600" w:hanging="360"/>
       </w:pPr>
       <w:rPr>
-        <w:rFonts w:ascii="Symbol" w:hAnsi="Symbol" w:hint="default"/>
+        <w:rFonts w:hint="default" w:ascii="Symbol" w:hAnsi="Symbol"/>
       </w:rPr>
     </w:lvl>
     <w:lvl w:ilvl="4" w:tplc="04090003" w:tentative="1">
@@ -6294,7 +6442,7 @@
         <w:ind w:left="4320" w:hanging="360"/>
       </w:pPr>
       <w:rPr>
-        <w:rFonts w:ascii="Courier New" w:hAnsi="Courier New" w:cs="Courier New" w:hint="default"/>
+        <w:rFonts w:hint="default" w:ascii="Courier New" w:hAnsi="Courier New" w:cs="Courier New"/>
       </w:rPr>
     </w:lvl>
     <w:lvl w:ilvl="5" w:tplc="04090005" w:tentative="1">
@@ -6306,7 +6454,7 @@
         <w:ind w:left="5040" w:hanging="360"/>
       </w:pPr>
       <w:rPr>
-        <w:rFonts w:ascii="Wingdings" w:hAnsi="Wingdings" w:hint="default"/>
+        <w:rFonts w:hint="default" w:ascii="Wingdings" w:hAnsi="Wingdings"/>
       </w:rPr>
     </w:lvl>
     <w:lvl w:ilvl="6" w:tplc="04090001" w:tentative="1">
@@ -6318,7 +6466,7 @@
         <w:ind w:left="5760" w:hanging="360"/>
       </w:pPr>
       <w:rPr>
-        <w:rFonts w:ascii="Symbol" w:hAnsi="Symbol" w:hint="default"/>
+        <w:rFonts w:hint="default" w:ascii="Symbol" w:hAnsi="Symbol"/>
       </w:rPr>
     </w:lvl>
     <w:lvl w:ilvl="7" w:tplc="04090003" w:tentative="1">
@@ -6330,7 +6478,7 @@
         <w:ind w:left="6480" w:hanging="360"/>
       </w:pPr>
       <w:rPr>
-        <w:rFonts w:ascii="Courier New" w:hAnsi="Courier New" w:cs="Courier New" w:hint="default"/>
+        <w:rFonts w:hint="default" w:ascii="Courier New" w:hAnsi="Courier New" w:cs="Courier New"/>
       </w:rPr>
     </w:lvl>
     <w:lvl w:ilvl="8" w:tplc="04090005" w:tentative="1">
@@ -6342,7 +6490,7 @@
         <w:ind w:left="7200" w:hanging="360"/>
       </w:pPr>
       <w:rPr>
-        <w:rFonts w:ascii="Wingdings" w:hAnsi="Wingdings" w:hint="default"/>
+        <w:rFonts w:hint="default" w:ascii="Wingdings" w:hAnsi="Wingdings"/>
       </w:rPr>
     </w:lvl>
   </w:abstractNum>
@@ -6359,7 +6507,7 @@
         <w:ind w:left="720" w:hanging="360"/>
       </w:pPr>
       <w:rPr>
-        <w:rFonts w:ascii="Wingdings" w:hAnsi="Wingdings" w:hint="default"/>
+        <w:rFonts w:hint="default" w:ascii="Wingdings" w:hAnsi="Wingdings"/>
       </w:rPr>
     </w:lvl>
     <w:lvl w:ilvl="1" w:tplc="04090003" w:tentative="1">
@@ -6371,7 +6519,7 @@
         <w:ind w:left="1440" w:hanging="360"/>
       </w:pPr>
       <w:rPr>
-        <w:rFonts w:ascii="Courier New" w:hAnsi="Courier New" w:cs="Courier New" w:hint="default"/>
+        <w:rFonts w:hint="default" w:ascii="Courier New" w:hAnsi="Courier New" w:cs="Courier New"/>
       </w:rPr>
     </w:lvl>
     <w:lvl w:ilvl="2" w:tplc="04090005" w:tentative="1">
@@ -6383,7 +6531,7 @@
         <w:ind w:left="2160" w:hanging="360"/>
       </w:pPr>
       <w:rPr>
-        <w:rFonts w:ascii="Wingdings" w:hAnsi="Wingdings" w:hint="default"/>
+        <w:rFonts w:hint="default" w:ascii="Wingdings" w:hAnsi="Wingdings"/>
       </w:rPr>
     </w:lvl>
     <w:lvl w:ilvl="3" w:tplc="04090001" w:tentative="1">
@@ -6395,7 +6543,7 @@
         <w:ind w:left="2880" w:hanging="360"/>
       </w:pPr>
       <w:rPr>
-        <w:rFonts w:ascii="Symbol" w:hAnsi="Symbol" w:hint="default"/>
+        <w:rFonts w:hint="default" w:ascii="Symbol" w:hAnsi="Symbol"/>
       </w:rPr>
     </w:lvl>
     <w:lvl w:ilvl="4" w:tplc="04090003" w:tentative="1">
@@ -6407,7 +6555,7 @@
         <w:ind w:left="3600" w:hanging="360"/>
       </w:pPr>
       <w:rPr>
-        <w:rFonts w:ascii="Courier New" w:hAnsi="Courier New" w:cs="Courier New" w:hint="default"/>
+        <w:rFonts w:hint="default" w:ascii="Courier New" w:hAnsi="Courier New" w:cs="Courier New"/>
       </w:rPr>
     </w:lvl>
     <w:lvl w:ilvl="5" w:tplc="04090005" w:tentative="1">
@@ -6419,7 +6567,7 @@
         <w:ind w:left="4320" w:hanging="360"/>
       </w:pPr>
       <w:rPr>
-        <w:rFonts w:ascii="Wingdings" w:hAnsi="Wingdings" w:hint="default"/>
+        <w:rFonts w:hint="default" w:ascii="Wingdings" w:hAnsi="Wingdings"/>
       </w:rPr>
     </w:lvl>
     <w:lvl w:ilvl="6" w:tplc="04090001" w:tentative="1">
@@ -6431,7 +6579,7 @@
         <w:ind w:left="5040" w:hanging="360"/>
       </w:pPr>
       <w:rPr>
-        <w:rFonts w:ascii="Symbol" w:hAnsi="Symbol" w:hint="default"/>
+        <w:rFonts w:hint="default" w:ascii="Symbol" w:hAnsi="Symbol"/>
       </w:rPr>
     </w:lvl>
     <w:lvl w:ilvl="7" w:tplc="04090003" w:tentative="1">
@@ -6443,7 +6591,7 @@
         <w:ind w:left="5760" w:hanging="360"/>
       </w:pPr>
       <w:rPr>
-        <w:rFonts w:ascii="Courier New" w:hAnsi="Courier New" w:cs="Courier New" w:hint="default"/>
+        <w:rFonts w:hint="default" w:ascii="Courier New" w:hAnsi="Courier New" w:cs="Courier New"/>
       </w:rPr>
     </w:lvl>
     <w:lvl w:ilvl="8" w:tplc="04090005" w:tentative="1">
@@ -6455,7 +6603,7 @@
         <w:ind w:left="6480" w:hanging="360"/>
       </w:pPr>
       <w:rPr>
-        <w:rFonts w:ascii="Wingdings" w:hAnsi="Wingdings" w:hint="default"/>
+        <w:rFonts w:hint="default" w:ascii="Wingdings" w:hAnsi="Wingdings"/>
       </w:rPr>
     </w:lvl>
   </w:abstractNum>
@@ -6472,7 +6620,7 @@
         <w:ind w:left="720" w:hanging="360"/>
       </w:pPr>
       <w:rPr>
-        <w:rFonts w:ascii="Wingdings" w:hAnsi="Wingdings" w:hint="default"/>
+        <w:rFonts w:hint="default" w:ascii="Wingdings" w:hAnsi="Wingdings"/>
       </w:rPr>
     </w:lvl>
     <w:lvl w:ilvl="1" w:tplc="04090003" w:tentative="1">
@@ -6484,7 +6632,7 @@
         <w:ind w:left="1440" w:hanging="360"/>
       </w:pPr>
       <w:rPr>
-        <w:rFonts w:ascii="Courier New" w:hAnsi="Courier New" w:cs="Courier New" w:hint="default"/>
+        <w:rFonts w:hint="default" w:ascii="Courier New" w:hAnsi="Courier New" w:cs="Courier New"/>
       </w:rPr>
     </w:lvl>
     <w:lvl w:ilvl="2" w:tplc="04090005" w:tentative="1">
@@ -6496,7 +6644,7 @@
         <w:ind w:left="2160" w:hanging="360"/>
       </w:pPr>
       <w:rPr>
-        <w:rFonts w:ascii="Wingdings" w:hAnsi="Wingdings" w:hint="default"/>
+        <w:rFonts w:hint="default" w:ascii="Wingdings" w:hAnsi="Wingdings"/>
       </w:rPr>
     </w:lvl>
     <w:lvl w:ilvl="3" w:tplc="04090001" w:tentative="1">
@@ -6508,7 +6656,7 @@
         <w:ind w:left="2880" w:hanging="360"/>
       </w:pPr>
       <w:rPr>
-        <w:rFonts w:ascii="Symbol" w:hAnsi="Symbol" w:hint="default"/>
+        <w:rFonts w:hint="default" w:ascii="Symbol" w:hAnsi="Symbol"/>
       </w:rPr>
     </w:lvl>
     <w:lvl w:ilvl="4" w:tplc="04090003" w:tentative="1">
@@ -6520,7 +6668,7 @@
         <w:ind w:left="3600" w:hanging="360"/>
       </w:pPr>
       <w:rPr>
-        <w:rFonts w:ascii="Courier New" w:hAnsi="Courier New" w:cs="Courier New" w:hint="default"/>
+        <w:rFonts w:hint="default" w:ascii="Courier New" w:hAnsi="Courier New" w:cs="Courier New"/>
       </w:rPr>
     </w:lvl>
     <w:lvl w:ilvl="5" w:tplc="04090005" w:tentative="1">
@@ -6532,7 +6680,7 @@
         <w:ind w:left="4320" w:hanging="360"/>
       </w:pPr>
       <w:rPr>
-        <w:rFonts w:ascii="Wingdings" w:hAnsi="Wingdings" w:hint="default"/>
+        <w:rFonts w:hint="default" w:ascii="Wingdings" w:hAnsi="Wingdings"/>
       </w:rPr>
     </w:lvl>
     <w:lvl w:ilvl="6" w:tplc="04090001" w:tentative="1">
@@ -6544,7 +6692,7 @@
         <w:ind w:left="5040" w:hanging="360"/>
       </w:pPr>
       <w:rPr>
-        <w:rFonts w:ascii="Symbol" w:hAnsi="Symbol" w:hint="default"/>
+        <w:rFonts w:hint="default" w:ascii="Symbol" w:hAnsi="Symbol"/>
       </w:rPr>
     </w:lvl>
     <w:lvl w:ilvl="7" w:tplc="04090003" w:tentative="1">
@@ -6556,7 +6704,7 @@
         <w:ind w:left="5760" w:hanging="360"/>
       </w:pPr>
       <w:rPr>
-        <w:rFonts w:ascii="Courier New" w:hAnsi="Courier New" w:cs="Courier New" w:hint="default"/>
+        <w:rFonts w:hint="default" w:ascii="Courier New" w:hAnsi="Courier New" w:cs="Courier New"/>
       </w:rPr>
     </w:lvl>
     <w:lvl w:ilvl="8" w:tplc="04090005" w:tentative="1">
@@ -6568,7 +6716,7 @@
         <w:ind w:left="6480" w:hanging="360"/>
       </w:pPr>
       <w:rPr>
-        <w:rFonts w:ascii="Wingdings" w:hAnsi="Wingdings" w:hint="default"/>
+        <w:rFonts w:hint="default" w:ascii="Wingdings" w:hAnsi="Wingdings"/>
       </w:rPr>
     </w:lvl>
   </w:abstractNum>
@@ -6585,7 +6733,7 @@
         <w:ind w:left="770" w:hanging="360"/>
       </w:pPr>
       <w:rPr>
-        <w:rFonts w:ascii="Wingdings" w:hAnsi="Wingdings" w:hint="default"/>
+        <w:rFonts w:hint="default" w:ascii="Wingdings" w:hAnsi="Wingdings"/>
       </w:rPr>
     </w:lvl>
     <w:lvl w:ilvl="1" w:tplc="04090003" w:tentative="1">
@@ -6597,7 +6745,7 @@
         <w:ind w:left="1490" w:hanging="360"/>
       </w:pPr>
       <w:rPr>
-        <w:rFonts w:ascii="Courier New" w:hAnsi="Courier New" w:cs="Courier New" w:hint="default"/>
+        <w:rFonts w:hint="default" w:ascii="Courier New" w:hAnsi="Courier New" w:cs="Courier New"/>
       </w:rPr>
     </w:lvl>
     <w:lvl w:ilvl="2" w:tplc="04090005" w:tentative="1">
@@ -6609,7 +6757,7 @@
         <w:ind w:left="2210" w:hanging="360"/>
       </w:pPr>
       <w:rPr>
-        <w:rFonts w:ascii="Wingdings" w:hAnsi="Wingdings" w:hint="default"/>
+        <w:rFonts w:hint="default" w:ascii="Wingdings" w:hAnsi="Wingdings"/>
       </w:rPr>
     </w:lvl>
     <w:lvl w:ilvl="3" w:tplc="04090001" w:tentative="1">
@@ -6621,7 +6769,7 @@
         <w:ind w:left="2930" w:hanging="360"/>
       </w:pPr>
       <w:rPr>
-        <w:rFonts w:ascii="Symbol" w:hAnsi="Symbol" w:hint="default"/>
+        <w:rFonts w:hint="default" w:ascii="Symbol" w:hAnsi="Symbol"/>
       </w:rPr>
     </w:lvl>
     <w:lvl w:ilvl="4" w:tplc="04090003" w:tentative="1">
@@ -6633,7 +6781,7 @@
         <w:ind w:left="3650" w:hanging="360"/>
       </w:pPr>
       <w:rPr>
-        <w:rFonts w:ascii="Courier New" w:hAnsi="Courier New" w:cs="Courier New" w:hint="default"/>
+        <w:rFonts w:hint="default" w:ascii="Courier New" w:hAnsi="Courier New" w:cs="Courier New"/>
       </w:rPr>
     </w:lvl>
     <w:lvl w:ilvl="5" w:tplc="04090005" w:tentative="1">
@@ -6645,7 +6793,7 @@
         <w:ind w:left="4370" w:hanging="360"/>
       </w:pPr>
       <w:rPr>
-        <w:rFonts w:ascii="Wingdings" w:hAnsi="Wingdings" w:hint="default"/>
+        <w:rFonts w:hint="default" w:ascii="Wingdings" w:hAnsi="Wingdings"/>
       </w:rPr>
     </w:lvl>
     <w:lvl w:ilvl="6" w:tplc="04090001" w:tentative="1">
@@ -6657,7 +6805,7 @@
         <w:ind w:left="5090" w:hanging="360"/>
       </w:pPr>
       <w:rPr>
-        <w:rFonts w:ascii="Symbol" w:hAnsi="Symbol" w:hint="default"/>
+        <w:rFonts w:hint="default" w:ascii="Symbol" w:hAnsi="Symbol"/>
       </w:rPr>
     </w:lvl>
     <w:lvl w:ilvl="7" w:tplc="04090003" w:tentative="1">
@@ -6669,7 +6817,7 @@
         <w:ind w:left="5810" w:hanging="360"/>
       </w:pPr>
       <w:rPr>
-        <w:rFonts w:ascii="Courier New" w:hAnsi="Courier New" w:cs="Courier New" w:hint="default"/>
+        <w:rFonts w:hint="default" w:ascii="Courier New" w:hAnsi="Courier New" w:cs="Courier New"/>
       </w:rPr>
     </w:lvl>
     <w:lvl w:ilvl="8" w:tplc="04090005" w:tentative="1">
@@ -6681,7 +6829,7 @@
         <w:ind w:left="6530" w:hanging="360"/>
       </w:pPr>
       <w:rPr>
-        <w:rFonts w:ascii="Wingdings" w:hAnsi="Wingdings" w:hint="default"/>
+        <w:rFonts w:hint="default" w:ascii="Wingdings" w:hAnsi="Wingdings"/>
       </w:rPr>
     </w:lvl>
   </w:abstractNum>
@@ -6698,7 +6846,7 @@
         <w:ind w:left="720" w:hanging="360"/>
       </w:pPr>
       <w:rPr>
-        <w:rFonts w:ascii="Wingdings" w:hAnsi="Wingdings" w:hint="default"/>
+        <w:rFonts w:hint="default" w:ascii="Wingdings" w:hAnsi="Wingdings"/>
       </w:rPr>
     </w:lvl>
     <w:lvl w:ilvl="1" w:tplc="04090003" w:tentative="1">
@@ -6710,7 +6858,7 @@
         <w:ind w:left="1440" w:hanging="360"/>
       </w:pPr>
       <w:rPr>
-        <w:rFonts w:ascii="Courier New" w:hAnsi="Courier New" w:cs="Courier New" w:hint="default"/>
+        <w:rFonts w:hint="default" w:ascii="Courier New" w:hAnsi="Courier New" w:cs="Courier New"/>
       </w:rPr>
     </w:lvl>
     <w:lvl w:ilvl="2" w:tplc="04090005" w:tentative="1">
@@ -6722,7 +6870,7 @@
         <w:ind w:left="2160" w:hanging="360"/>
       </w:pPr>
       <w:rPr>
-        <w:rFonts w:ascii="Wingdings" w:hAnsi="Wingdings" w:hint="default"/>
+        <w:rFonts w:hint="default" w:ascii="Wingdings" w:hAnsi="Wingdings"/>
       </w:rPr>
     </w:lvl>
     <w:lvl w:ilvl="3" w:tplc="04090001" w:tentative="1">
@@ -6734,7 +6882,7 @@
         <w:ind w:left="2880" w:hanging="360"/>
       </w:pPr>
       <w:rPr>
-        <w:rFonts w:ascii="Symbol" w:hAnsi="Symbol" w:hint="default"/>
+        <w:rFonts w:hint="default" w:ascii="Symbol" w:hAnsi="Symbol"/>
       </w:rPr>
     </w:lvl>
     <w:lvl w:ilvl="4" w:tplc="04090003" w:tentative="1">
@@ -6746,7 +6894,7 @@
         <w:ind w:left="3600" w:hanging="360"/>
       </w:pPr>
       <w:rPr>
-        <w:rFonts w:ascii="Courier New" w:hAnsi="Courier New" w:cs="Courier New" w:hint="default"/>
+        <w:rFonts w:hint="default" w:ascii="Courier New" w:hAnsi="Courier New" w:cs="Courier New"/>
       </w:rPr>
     </w:lvl>
     <w:lvl w:ilvl="5" w:tplc="04090005" w:tentative="1">
@@ -6758,7 +6906,7 @@
         <w:ind w:left="4320" w:hanging="360"/>
       </w:pPr>
       <w:rPr>
-        <w:rFonts w:ascii="Wingdings" w:hAnsi="Wingdings" w:hint="default"/>
+        <w:rFonts w:hint="default" w:ascii="Wingdings" w:hAnsi="Wingdings"/>
       </w:rPr>
     </w:lvl>
     <w:lvl w:ilvl="6" w:tplc="04090001" w:tentative="1">
@@ -6770,7 +6918,7 @@
         <w:ind w:left="5040" w:hanging="360"/>
       </w:pPr>
       <w:rPr>
-        <w:rFonts w:ascii="Symbol" w:hAnsi="Symbol" w:hint="default"/>
+        <w:rFonts w:hint="default" w:ascii="Symbol" w:hAnsi="Symbol"/>
       </w:rPr>
     </w:lvl>
     <w:lvl w:ilvl="7" w:tplc="04090003" w:tentative="1">
@@ -6782,7 +6930,7 @@
         <w:ind w:left="5760" w:hanging="360"/>
       </w:pPr>
       <w:rPr>
-        <w:rFonts w:ascii="Courier New" w:hAnsi="Courier New" w:cs="Courier New" w:hint="default"/>
+        <w:rFonts w:hint="default" w:ascii="Courier New" w:hAnsi="Courier New" w:cs="Courier New"/>
       </w:rPr>
     </w:lvl>
     <w:lvl w:ilvl="8" w:tplc="04090005" w:tentative="1">
@@ -6794,7 +6942,7 @@
         <w:ind w:left="6480" w:hanging="360"/>
       </w:pPr>
       <w:rPr>
-        <w:rFonts w:ascii="Wingdings" w:hAnsi="Wingdings" w:hint="default"/>
+        <w:rFonts w:hint="default" w:ascii="Wingdings" w:hAnsi="Wingdings"/>
       </w:rPr>
     </w:lvl>
   </w:abstractNum>
@@ -6924,7 +7072,7 @@
         <w:ind w:left="720" w:hanging="360"/>
       </w:pPr>
       <w:rPr>
-        <w:rFonts w:ascii="Wingdings" w:hAnsi="Wingdings" w:hint="default"/>
+        <w:rFonts w:hint="default" w:ascii="Wingdings" w:hAnsi="Wingdings"/>
       </w:rPr>
     </w:lvl>
     <w:lvl w:ilvl="1" w:tplc="04090003" w:tentative="1">
@@ -6936,7 +7084,7 @@
         <w:ind w:left="1440" w:hanging="360"/>
       </w:pPr>
       <w:rPr>
-        <w:rFonts w:ascii="Courier New" w:hAnsi="Courier New" w:cs="Courier New" w:hint="default"/>
+        <w:rFonts w:hint="default" w:ascii="Courier New" w:hAnsi="Courier New" w:cs="Courier New"/>
       </w:rPr>
     </w:lvl>
     <w:lvl w:ilvl="2" w:tplc="04090005" w:tentative="1">
@@ -6948,7 +7096,7 @@
         <w:ind w:left="2160" w:hanging="360"/>
       </w:pPr>
       <w:rPr>
-        <w:rFonts w:ascii="Wingdings" w:hAnsi="Wingdings" w:hint="default"/>
+        <w:rFonts w:hint="default" w:ascii="Wingdings" w:hAnsi="Wingdings"/>
       </w:rPr>
     </w:lvl>
     <w:lvl w:ilvl="3" w:tplc="04090001" w:tentative="1">
@@ -6960,7 +7108,7 @@
         <w:ind w:left="2880" w:hanging="360"/>
       </w:pPr>
       <w:rPr>
-        <w:rFonts w:ascii="Symbol" w:hAnsi="Symbol" w:hint="default"/>
+        <w:rFonts w:hint="default" w:ascii="Symbol" w:hAnsi="Symbol"/>
       </w:rPr>
     </w:lvl>
     <w:lvl w:ilvl="4" w:tplc="04090003" w:tentative="1">
@@ -6972,7 +7120,7 @@
         <w:ind w:left="3600" w:hanging="360"/>
       </w:pPr>
       <w:rPr>
-        <w:rFonts w:ascii="Courier New" w:hAnsi="Courier New" w:cs="Courier New" w:hint="default"/>
+        <w:rFonts w:hint="default" w:ascii="Courier New" w:hAnsi="Courier New" w:cs="Courier New"/>
       </w:rPr>
     </w:lvl>
     <w:lvl w:ilvl="5" w:tplc="04090005" w:tentative="1">
@@ -6984,7 +7132,7 @@
         <w:ind w:left="4320" w:hanging="360"/>
       </w:pPr>
       <w:rPr>
-        <w:rFonts w:ascii="Wingdings" w:hAnsi="Wingdings" w:hint="default"/>
+        <w:rFonts w:hint="default" w:ascii="Wingdings" w:hAnsi="Wingdings"/>
       </w:rPr>
     </w:lvl>
     <w:lvl w:ilvl="6" w:tplc="04090001" w:tentative="1">
@@ -6996,7 +7144,7 @@
         <w:ind w:left="5040" w:hanging="360"/>
       </w:pPr>
       <w:rPr>
-        <w:rFonts w:ascii="Symbol" w:hAnsi="Symbol" w:hint="default"/>
+        <w:rFonts w:hint="default" w:ascii="Symbol" w:hAnsi="Symbol"/>
       </w:rPr>
     </w:lvl>
     <w:lvl w:ilvl="7" w:tplc="04090003" w:tentative="1">
@@ -7008,7 +7156,7 @@
         <w:ind w:left="5760" w:hanging="360"/>
       </w:pPr>
       <w:rPr>
-        <w:rFonts w:ascii="Courier New" w:hAnsi="Courier New" w:cs="Courier New" w:hint="default"/>
+        <w:rFonts w:hint="default" w:ascii="Courier New" w:hAnsi="Courier New" w:cs="Courier New"/>
       </w:rPr>
     </w:lvl>
     <w:lvl w:ilvl="8" w:tplc="04090005" w:tentative="1">
@@ -7020,7 +7168,7 @@
         <w:ind w:left="6480" w:hanging="360"/>
       </w:pPr>
       <w:rPr>
-        <w:rFonts w:ascii="Wingdings" w:hAnsi="Wingdings" w:hint="default"/>
+        <w:rFonts w:hint="default" w:ascii="Wingdings" w:hAnsi="Wingdings"/>
       </w:rPr>
     </w:lvl>
   </w:abstractNum>
@@ -7036,7 +7184,7 @@
         <w:ind w:left="1320" w:hanging="360"/>
       </w:pPr>
       <w:rPr>
-        <w:rFonts w:ascii="Cordia New" w:eastAsia="Times New Roman" w:hAnsi="Cordia New" w:cs="Cordia New" w:hint="default"/>
+        <w:rFonts w:hint="default" w:ascii="Cordia New" w:hAnsi="Cordia New" w:eastAsia="Times New Roman" w:cs="Cordia New"/>
         <w:color w:val="000000"/>
       </w:rPr>
     </w:lvl>
@@ -7049,7 +7197,7 @@
         <w:ind w:left="2040" w:hanging="360"/>
       </w:pPr>
       <w:rPr>
-        <w:rFonts w:ascii="Courier New" w:hAnsi="Courier New" w:cs="Courier New" w:hint="default"/>
+        <w:rFonts w:hint="default" w:ascii="Courier New" w:hAnsi="Courier New" w:cs="Courier New"/>
       </w:rPr>
     </w:lvl>
     <w:lvl w:ilvl="2" w:tplc="04090005" w:tentative="1">
@@ -7061,7 +7209,7 @@
         <w:ind w:left="2760" w:hanging="360"/>
       </w:pPr>
       <w:rPr>
-        <w:rFonts w:ascii="Wingdings" w:hAnsi="Wingdings" w:hint="default"/>
+        <w:rFonts w:hint="default" w:ascii="Wingdings" w:hAnsi="Wingdings"/>
       </w:rPr>
     </w:lvl>
     <w:lvl w:ilvl="3" w:tplc="04090001" w:tentative="1">
@@ -7073,7 +7221,7 @@
         <w:ind w:left="3480" w:hanging="360"/>
       </w:pPr>
       <w:rPr>
-        <w:rFonts w:ascii="Symbol" w:hAnsi="Symbol" w:hint="default"/>
+        <w:rFonts w:hint="default" w:ascii="Symbol" w:hAnsi="Symbol"/>
       </w:rPr>
     </w:lvl>
     <w:lvl w:ilvl="4" w:tplc="04090003" w:tentative="1">
@@ -7085,7 +7233,7 @@
         <w:ind w:left="4200" w:hanging="360"/>
       </w:pPr>
       <w:rPr>
-        <w:rFonts w:ascii="Courier New" w:hAnsi="Courier New" w:cs="Courier New" w:hint="default"/>
+        <w:rFonts w:hint="default" w:ascii="Courier New" w:hAnsi="Courier New" w:cs="Courier New"/>
       </w:rPr>
     </w:lvl>
     <w:lvl w:ilvl="5" w:tplc="04090005" w:tentative="1">
@@ -7097,7 +7245,7 @@
         <w:ind w:left="4920" w:hanging="360"/>
       </w:pPr>
       <w:rPr>
-        <w:rFonts w:ascii="Wingdings" w:hAnsi="Wingdings" w:hint="default"/>
+        <w:rFonts w:hint="default" w:ascii="Wingdings" w:hAnsi="Wingdings"/>
       </w:rPr>
     </w:lvl>
     <w:lvl w:ilvl="6" w:tplc="04090001" w:tentative="1">
@@ -7109,7 +7257,7 @@
         <w:ind w:left="5640" w:hanging="360"/>
       </w:pPr>
       <w:rPr>
-        <w:rFonts w:ascii="Symbol" w:hAnsi="Symbol" w:hint="default"/>
+        <w:rFonts w:hint="default" w:ascii="Symbol" w:hAnsi="Symbol"/>
       </w:rPr>
     </w:lvl>
     <w:lvl w:ilvl="7" w:tplc="04090003" w:tentative="1">
@@ -7121,7 +7269,7 @@
         <w:ind w:left="6360" w:hanging="360"/>
       </w:pPr>
       <w:rPr>
-        <w:rFonts w:ascii="Courier New" w:hAnsi="Courier New" w:cs="Courier New" w:hint="default"/>
+        <w:rFonts w:hint="default" w:ascii="Courier New" w:hAnsi="Courier New" w:cs="Courier New"/>
       </w:rPr>
     </w:lvl>
     <w:lvl w:ilvl="8" w:tplc="04090005" w:tentative="1">
@@ -7133,7 +7281,7 @@
         <w:ind w:left="7080" w:hanging="360"/>
       </w:pPr>
       <w:rPr>
-        <w:rFonts w:ascii="Wingdings" w:hAnsi="Wingdings" w:hint="default"/>
+        <w:rFonts w:hint="default" w:ascii="Wingdings" w:hAnsi="Wingdings"/>
       </w:rPr>
     </w:lvl>
   </w:abstractNum>
@@ -7150,7 +7298,7 @@
         <w:ind w:left="720" w:hanging="360"/>
       </w:pPr>
       <w:rPr>
-        <w:rFonts w:ascii="Wingdings" w:hAnsi="Wingdings" w:hint="default"/>
+        <w:rFonts w:hint="default" w:ascii="Wingdings" w:hAnsi="Wingdings"/>
       </w:rPr>
     </w:lvl>
     <w:lvl w:ilvl="1" w:tplc="04090003" w:tentative="1">
@@ -7162,7 +7310,7 @@
         <w:ind w:left="1440" w:hanging="360"/>
       </w:pPr>
       <w:rPr>
-        <w:rFonts w:ascii="Courier New" w:hAnsi="Courier New" w:cs="Courier New" w:hint="default"/>
+        <w:rFonts w:hint="default" w:ascii="Courier New" w:hAnsi="Courier New" w:cs="Courier New"/>
       </w:rPr>
     </w:lvl>
     <w:lvl w:ilvl="2" w:tplc="04090005" w:tentative="1">
@@ -7174,7 +7322,7 @@
         <w:ind w:left="2160" w:hanging="360"/>
       </w:pPr>
       <w:rPr>
-        <w:rFonts w:ascii="Wingdings" w:hAnsi="Wingdings" w:hint="default"/>
+        <w:rFonts w:hint="default" w:ascii="Wingdings" w:hAnsi="Wingdings"/>
       </w:rPr>
     </w:lvl>
     <w:lvl w:ilvl="3" w:tplc="04090001" w:tentative="1">
@@ -7186,7 +7334,7 @@
         <w:ind w:left="2880" w:hanging="360"/>
       </w:pPr>
       <w:rPr>
-        <w:rFonts w:ascii="Symbol" w:hAnsi="Symbol" w:hint="default"/>
+        <w:rFonts w:hint="default" w:ascii="Symbol" w:hAnsi="Symbol"/>
       </w:rPr>
     </w:lvl>
     <w:lvl w:ilvl="4" w:tplc="04090003" w:tentative="1">
@@ -7198,7 +7346,7 @@
         <w:ind w:left="3600" w:hanging="360"/>
       </w:pPr>
       <w:rPr>
-        <w:rFonts w:ascii="Courier New" w:hAnsi="Courier New" w:cs="Courier New" w:hint="default"/>
+        <w:rFonts w:hint="default" w:ascii="Courier New" w:hAnsi="Courier New" w:cs="Courier New"/>
       </w:rPr>
     </w:lvl>
     <w:lvl w:ilvl="5" w:tplc="04090005" w:tentative="1">
@@ -7210,7 +7358,7 @@
         <w:ind w:left="4320" w:hanging="360"/>
       </w:pPr>
       <w:rPr>
-        <w:rFonts w:ascii="Wingdings" w:hAnsi="Wingdings" w:hint="default"/>
+        <w:rFonts w:hint="default" w:ascii="Wingdings" w:hAnsi="Wingdings"/>
       </w:rPr>
     </w:lvl>
     <w:lvl w:ilvl="6" w:tplc="04090001" w:tentative="1">
@@ -7222,7 +7370,7 @@
         <w:ind w:left="5040" w:hanging="360"/>
       </w:pPr>
       <w:rPr>
-        <w:rFonts w:ascii="Symbol" w:hAnsi="Symbol" w:hint="default"/>
+        <w:rFonts w:hint="default" w:ascii="Symbol" w:hAnsi="Symbol"/>
       </w:rPr>
     </w:lvl>
     <w:lvl w:ilvl="7" w:tplc="04090003" w:tentative="1">
@@ -7234,7 +7382,7 @@
         <w:ind w:left="5760" w:hanging="360"/>
       </w:pPr>
       <w:rPr>
-        <w:rFonts w:ascii="Courier New" w:hAnsi="Courier New" w:cs="Courier New" w:hint="default"/>
+        <w:rFonts w:hint="default" w:ascii="Courier New" w:hAnsi="Courier New" w:cs="Courier New"/>
       </w:rPr>
     </w:lvl>
     <w:lvl w:ilvl="8" w:tplc="04090005" w:tentative="1">
@@ -7246,7 +7394,7 @@
         <w:ind w:left="6480" w:hanging="360"/>
       </w:pPr>
       <w:rPr>
-        <w:rFonts w:ascii="Wingdings" w:hAnsi="Wingdings" w:hint="default"/>
+        <w:rFonts w:hint="default" w:ascii="Wingdings" w:hAnsi="Wingdings"/>
       </w:rPr>
     </w:lvl>
   </w:abstractNum>
@@ -7325,7 +7473,7 @@
   <w:docDefaults>
     <w:rPrDefault>
       <w:rPr>
-        <w:rFonts w:ascii="Arial" w:eastAsia="Arial" w:hAnsi="Arial" w:cs="Arial"/>
+        <w:rFonts w:ascii="Arial" w:hAnsi="Arial" w:eastAsia="Arial" w:cs="Arial"/>
         <w:sz w:val="22"/>
         <w:szCs w:val="22"/>
         <w:lang w:val="en" w:eastAsia="en-US" w:bidi="th-TH"/>
@@ -7340,14 +7488,14 @@
   <w:latentStyles w:defLockedState="0" w:defUIPriority="99" w:defSemiHidden="0" w:defUnhideWhenUsed="0" w:defQFormat="0" w:count="376">
     <w:lsdException w:name="Normal" w:uiPriority="0" w:qFormat="1"/>
     <w:lsdException w:name="heading 1" w:uiPriority="9" w:qFormat="1"/>
-    <w:lsdException w:name="heading 2" w:semiHidden="1" w:uiPriority="9" w:unhideWhenUsed="1" w:qFormat="1"/>
-    <w:lsdException w:name="heading 3" w:semiHidden="1" w:uiPriority="9" w:unhideWhenUsed="1" w:qFormat="1"/>
-    <w:lsdException w:name="heading 4" w:semiHidden="1" w:uiPriority="9" w:unhideWhenUsed="1" w:qFormat="1"/>
-    <w:lsdException w:name="heading 5" w:semiHidden="1" w:uiPriority="9" w:unhideWhenUsed="1" w:qFormat="1"/>
-    <w:lsdException w:name="heading 6" w:semiHidden="1" w:uiPriority="9" w:unhideWhenUsed="1" w:qFormat="1"/>
-    <w:lsdException w:name="heading 7" w:semiHidden="1" w:uiPriority="9" w:unhideWhenUsed="1" w:qFormat="1"/>
-    <w:lsdException w:name="heading 8" w:semiHidden="1" w:uiPriority="9" w:unhideWhenUsed="1" w:qFormat="1"/>
-    <w:lsdException w:name="heading 9" w:semiHidden="1" w:uiPriority="9" w:unhideWhenUsed="1" w:qFormat="1"/>
+    <w:lsdException w:name="heading 2" w:uiPriority="9" w:semiHidden="1" w:unhideWhenUsed="1" w:qFormat="1"/>
+    <w:lsdException w:name="heading 3" w:uiPriority="9" w:semiHidden="1" w:unhideWhenUsed="1" w:qFormat="1"/>
+    <w:lsdException w:name="heading 4" w:uiPriority="9" w:semiHidden="1" w:unhideWhenUsed="1" w:qFormat="1"/>
+    <w:lsdException w:name="heading 5" w:uiPriority="9" w:semiHidden="1" w:unhideWhenUsed="1" w:qFormat="1"/>
+    <w:lsdException w:name="heading 6" w:uiPriority="9" w:semiHidden="1" w:unhideWhenUsed="1" w:qFormat="1"/>
+    <w:lsdException w:name="heading 7" w:uiPriority="9" w:semiHidden="1" w:unhideWhenUsed="1" w:qFormat="1"/>
+    <w:lsdException w:name="heading 8" w:uiPriority="9" w:semiHidden="1" w:unhideWhenUsed="1" w:qFormat="1"/>
+    <w:lsdException w:name="heading 9" w:uiPriority="9" w:semiHidden="1" w:unhideWhenUsed="1" w:qFormat="1"/>
     <w:lsdException w:name="index 1" w:semiHidden="1" w:unhideWhenUsed="1"/>
     <w:lsdException w:name="index 2" w:semiHidden="1" w:unhideWhenUsed="1"/>
     <w:lsdException w:name="index 3" w:semiHidden="1" w:unhideWhenUsed="1"/>
@@ -7357,22 +7505,22 @@
     <w:lsdException w:name="index 7" w:semiHidden="1" w:unhideWhenUsed="1"/>
     <w:lsdException w:name="index 8" w:semiHidden="1" w:unhideWhenUsed="1"/>
     <w:lsdException w:name="index 9" w:semiHidden="1" w:unhideWhenUsed="1"/>
-    <w:lsdException w:name="toc 1" w:semiHidden="1" w:uiPriority="39" w:unhideWhenUsed="1"/>
-    <w:lsdException w:name="toc 2" w:semiHidden="1" w:uiPriority="39" w:unhideWhenUsed="1"/>
-    <w:lsdException w:name="toc 3" w:semiHidden="1" w:uiPriority="39" w:unhideWhenUsed="1"/>
-    <w:lsdException w:name="toc 4" w:semiHidden="1" w:uiPriority="39" w:unhideWhenUsed="1"/>
-    <w:lsdException w:name="toc 5" w:semiHidden="1" w:uiPriority="39" w:unhideWhenUsed="1"/>
-    <w:lsdException w:name="toc 6" w:semiHidden="1" w:uiPriority="39" w:unhideWhenUsed="1"/>
-    <w:lsdException w:name="toc 7" w:semiHidden="1" w:uiPriority="39" w:unhideWhenUsed="1"/>
-    <w:lsdException w:name="toc 8" w:semiHidden="1" w:uiPriority="39" w:unhideWhenUsed="1"/>
-    <w:lsdException w:name="toc 9" w:semiHidden="1" w:uiPriority="39" w:unhideWhenUsed="1"/>
+    <w:lsdException w:name="toc 1" w:uiPriority="39" w:semiHidden="1" w:unhideWhenUsed="1"/>
+    <w:lsdException w:name="toc 2" w:uiPriority="39" w:semiHidden="1" w:unhideWhenUsed="1"/>
+    <w:lsdException w:name="toc 3" w:uiPriority="39" w:semiHidden="1" w:unhideWhenUsed="1"/>
+    <w:lsdException w:name="toc 4" w:uiPriority="39" w:semiHidden="1" w:unhideWhenUsed="1"/>
+    <w:lsdException w:name="toc 5" w:uiPriority="39" w:semiHidden="1" w:unhideWhenUsed="1"/>
+    <w:lsdException w:name="toc 6" w:uiPriority="39" w:semiHidden="1" w:unhideWhenUsed="1"/>
+    <w:lsdException w:name="toc 7" w:uiPriority="39" w:semiHidden="1" w:unhideWhenUsed="1"/>
+    <w:lsdException w:name="toc 8" w:uiPriority="39" w:semiHidden="1" w:unhideWhenUsed="1"/>
+    <w:lsdException w:name="toc 9" w:uiPriority="39" w:semiHidden="1" w:unhideWhenUsed="1"/>
     <w:lsdException w:name="Normal Indent" w:semiHidden="1" w:unhideWhenUsed="1"/>
     <w:lsdException w:name="footnote text" w:semiHidden="1" w:unhideWhenUsed="1"/>
     <w:lsdException w:name="annotation text" w:semiHidden="1" w:unhideWhenUsed="1"/>
     <w:lsdException w:name="header" w:semiHidden="1" w:unhideWhenUsed="1"/>
     <w:lsdException w:name="footer" w:semiHidden="1" w:unhideWhenUsed="1"/>
     <w:lsdException w:name="index heading" w:semiHidden="1" w:unhideWhenUsed="1"/>
-    <w:lsdException w:name="caption" w:semiHidden="1" w:uiPriority="35" w:unhideWhenUsed="1" w:qFormat="1"/>
+    <w:lsdException w:name="caption" w:uiPriority="35" w:semiHidden="1" w:unhideWhenUsed="1" w:qFormat="1"/>
     <w:lsdException w:name="table of figures" w:semiHidden="1" w:unhideWhenUsed="1"/>
     <w:lsdException w:name="envelope address" w:semiHidden="1" w:unhideWhenUsed="1"/>
     <w:lsdException w:name="envelope return" w:semiHidden="1" w:unhideWhenUsed="1"/>
@@ -7403,7 +7551,7 @@
     <w:lsdException w:name="Title" w:uiPriority="10" w:qFormat="1"/>
     <w:lsdException w:name="Closing" w:semiHidden="1" w:unhideWhenUsed="1"/>
     <w:lsdException w:name="Signature" w:semiHidden="1" w:unhideWhenUsed="1"/>
-    <w:lsdException w:name="Default Paragraph Font" w:semiHidden="1" w:uiPriority="1" w:unhideWhenUsed="1"/>
+    <w:lsdException w:name="Default Paragraph Font" w:uiPriority="1" w:semiHidden="1" w:unhideWhenUsed="1"/>
     <w:lsdException w:name="Body Text" w:semiHidden="1" w:unhideWhenUsed="1"/>
     <w:lsdException w:name="Body Text Indent" w:semiHidden="1" w:unhideWhenUsed="1"/>
     <w:lsdException w:name="List Continue" w:semiHidden="1" w:unhideWhenUsed="1"/>
@@ -7603,8 +7751,8 @@
     <w:lsdException w:name="Subtle Reference" w:uiPriority="31" w:qFormat="1"/>
     <w:lsdException w:name="Intense Reference" w:uiPriority="32" w:qFormat="1"/>
     <w:lsdException w:name="Book Title" w:uiPriority="33" w:qFormat="1"/>
-    <w:lsdException w:name="Bibliography" w:semiHidden="1" w:uiPriority="37" w:unhideWhenUsed="1"/>
-    <w:lsdException w:name="TOC Heading" w:semiHidden="1" w:uiPriority="39" w:unhideWhenUsed="1" w:qFormat="1"/>
+    <w:lsdException w:name="Bibliography" w:uiPriority="37" w:semiHidden="1" w:unhideWhenUsed="1"/>
+    <w:lsdException w:name="TOC Heading" w:uiPriority="39" w:semiHidden="1" w:unhideWhenUsed="1" w:qFormat="1"/>
     <w:lsdException w:name="Plain Table 1" w:uiPriority="41"/>
     <w:lsdException w:name="Plain Table 2" w:uiPriority="42"/>
     <w:lsdException w:name="Plain Table 3" w:uiPriority="43"/>
@@ -7715,7 +7863,7 @@
     <w:lsdException w:name="Unresolved Mention" w:semiHidden="1" w:unhideWhenUsed="1"/>
     <w:lsdException w:name="Smart Link" w:semiHidden="1" w:unhideWhenUsed="1"/>
   </w:latentStyles>
-  <w:style w:type="paragraph" w:default="1" w:styleId="Normal">
+  <w:style w:type="paragraph" w:styleId="Normal" w:default="1">
     <w:name w:val="Normal"/>
     <w:qFormat/>
   </w:style>
@@ -7832,13 +7980,13 @@
       <w:color w:val="666666"/>
     </w:rPr>
   </w:style>
-  <w:style w:type="character" w:default="1" w:styleId="DefaultParagraphFont">
+  <w:style w:type="character" w:styleId="DefaultParagraphFont" w:default="1">
     <w:name w:val="Default Paragraph Font"/>
     <w:uiPriority w:val="1"/>
     <w:semiHidden/>
     <w:unhideWhenUsed/>
   </w:style>
-  <w:style w:type="table" w:default="1" w:styleId="TableNormal">
+  <w:style w:type="table" w:styleId="TableNormal" w:default="1">
     <w:name w:val="Normal Table"/>
     <w:uiPriority w:val="99"/>
     <w:semiHidden/>
@@ -7853,7 +8001,7 @@
       </w:tblCellMar>
     </w:tblPr>
   </w:style>
-  <w:style w:type="numbering" w:default="1" w:styleId="NoList">
+  <w:style w:type="numbering" w:styleId="NoList" w:default="1">
     <w:name w:val="No List"/>
     <w:uiPriority w:val="99"/>
     <w:semiHidden/>
@@ -7929,7 +8077,7 @@
       <w:spacing w:before="100" w:beforeAutospacing="1" w:after="100" w:afterAutospacing="1" w:line="240" w:lineRule="auto"/>
     </w:pPr>
     <w:rPr>
-      <w:rFonts w:ascii="Times New Roman" w:eastAsia="Times New Roman" w:hAnsi="Times New Roman" w:cs="Times New Roman"/>
+      <w:rFonts w:ascii="Times New Roman" w:hAnsi="Times New Roman" w:eastAsia="Times New Roman" w:cs="Times New Roman"/>
       <w:sz w:val="24"/>
       <w:szCs w:val="24"/>
       <w:lang w:val="en-US"/>
@@ -7949,20 +8097,20 @@
       <w:spacing w:line="240" w:lineRule="auto"/>
     </w:pPr>
     <w:rPr>
-      <w:rFonts w:ascii="Cordia New" w:eastAsia="Cordia New" w:hAnsi="Cordia New" w:cs="Angsana New"/>
+      <w:rFonts w:ascii="Cordia New" w:hAnsi="Cordia New" w:eastAsia="Cordia New" w:cs="Angsana New"/>
       <w:sz w:val="28"/>
       <w:szCs w:val="28"/>
       <w:lang w:val="en-US"/>
     </w:rPr>
   </w:style>
-  <w:style w:type="character" w:customStyle="1" w:styleId="FooterChar">
+  <w:style w:type="character" w:styleId="FooterChar" w:customStyle="1">
     <w:name w:val="Footer Char"/>
     <w:basedOn w:val="DefaultParagraphFont"/>
     <w:link w:val="Footer"/>
     <w:uiPriority w:val="99"/>
     <w:rsid w:val="008C7C1D"/>
     <w:rPr>
-      <w:rFonts w:ascii="Cordia New" w:eastAsia="Cordia New" w:hAnsi="Cordia New" w:cs="Angsana New"/>
+      <w:rFonts w:ascii="Cordia New" w:hAnsi="Cordia New" w:eastAsia="Cordia New" w:cs="Angsana New"/>
       <w:sz w:val="28"/>
       <w:szCs w:val="28"/>
       <w:lang w:val="en-US"/>
@@ -7979,17 +8127,17 @@
       <w:u w:val="single"/>
     </w:rPr>
   </w:style>
-  <w:style w:type="character" w:customStyle="1" w:styleId="normaltextrun">
+  <w:style w:type="character" w:styleId="normaltextrun" w:customStyle="1">
     <w:name w:val="normaltextrun"/>
     <w:basedOn w:val="DefaultParagraphFont"/>
     <w:rsid w:val="00AD0F31"/>
   </w:style>
-  <w:style w:type="character" w:customStyle="1" w:styleId="eop">
+  <w:style w:type="character" w:styleId="eop" w:customStyle="1">
     <w:name w:val="eop"/>
     <w:basedOn w:val="DefaultParagraphFont"/>
     <w:rsid w:val="00AD0F31"/>
   </w:style>
-  <w:style w:type="paragraph" w:customStyle="1" w:styleId="paragraph">
+  <w:style w:type="paragraph" w:styleId="paragraph" w:customStyle="1">
     <w:name w:val="paragraph"/>
     <w:basedOn w:val="Normal"/>
     <w:rsid w:val="00DC6589"/>
@@ -7997,7 +8145,7 @@
       <w:spacing w:before="100" w:beforeAutospacing="1" w:after="100" w:afterAutospacing="1" w:line="240" w:lineRule="auto"/>
     </w:pPr>
     <w:rPr>
-      <w:rFonts w:ascii="Times New Roman" w:eastAsia="Times New Roman" w:hAnsi="Times New Roman" w:cs="Times New Roman"/>
+      <w:rFonts w:ascii="Times New Roman" w:hAnsi="Times New Roman" w:eastAsia="Times New Roman" w:cs="Times New Roman"/>
       <w:sz w:val="24"/>
       <w:szCs w:val="24"/>
       <w:lang w:val="en-US"/>

</xml_diff>

<commit_message>
fix advance staff doc and FAQ1
</commit_message>
<xml_diff>
--- a/documents/FA-G-10 เงินทดรองจ่ายพนักงาน (Chat bot).docx
+++ b/documents/FA-G-10 เงินทดรองจ่ายพนักงาน (Chat bot).docx
@@ -11,27 +11,17 @@
           <w:szCs w:val="18"/>
         </w:rPr>
       </w:pPr>
-      <w:proofErr w:type="spellStart"/>
-      <w:r>
-        <w:rPr>
-          <w:rFonts w:ascii="Lotuss Smart TX" w:hAnsi="Lotuss Smart TX" w:eastAsia="Lotuss Smart TX" w:cs="Lotuss Smart TX"/>
-          <w:sz w:val="18"/>
-          <w:szCs w:val="18"/>
-        </w:rPr>
-        <w:t>ลิงค์เอกสารแนบ</w:t>
-      </w:r>
-      <w:proofErr w:type="spellEnd"/>
-      <w:r>
-        <w:rPr>
-          <w:rFonts w:ascii="Lotuss Smart TX" w:hAnsi="Lotuss Smart TX" w:eastAsia="Lotuss Smart TX" w:cs="Lotuss Smart TX"/>
-          <w:sz w:val="18"/>
-          <w:szCs w:val="18"/>
-        </w:rPr>
-        <w:t xml:space="preserve"> </w:t>
-      </w:r>
-      <w:r>
-        <w:rPr>
-          <w:rFonts w:ascii="Lotuss Smart TX" w:hAnsi="Lotuss Smart TX" w:eastAsia="Lotuss Smart TX" w:cs="Lotuss Smart TX"/>
+      <w:r>
+        <w:rPr>
+          <w:rFonts w:ascii="Lotuss Smart TX" w:eastAsia="Lotuss Smart TX" w:hAnsi="Lotuss Smart TX" w:cs="Lotuss Smart TX"/>
+          <w:sz w:val="18"/>
+          <w:szCs w:val="18"/>
+        </w:rPr>
+        <w:t xml:space="preserve">ลิงค์เอกสารแนบ </w:t>
+      </w:r>
+      <w:r>
+        <w:rPr>
+          <w:rFonts w:ascii="Lotuss Smart TX" w:eastAsia="Lotuss Smart TX" w:hAnsi="Lotuss Smart TX" w:cs="Lotuss Smart TX"/>
           <w:sz w:val="18"/>
           <w:szCs w:val="18"/>
           <w:cs/>
@@ -40,7 +30,7 @@
       </w:r>
       <w:r>
         <w:rPr>
-          <w:rFonts w:ascii="Lotuss Smart TX" w:hAnsi="Lotuss Smart TX" w:eastAsia="Lotuss Smart TX" w:cs="Lotuss Smart TX"/>
+          <w:rFonts w:ascii="Lotuss Smart TX" w:eastAsia="Lotuss Smart TX" w:hAnsi="Lotuss Smart TX" w:cs="Lotuss Smart TX"/>
           <w:sz w:val="18"/>
           <w:szCs w:val="18"/>
         </w:rPr>
@@ -50,7 +40,7 @@
         <w:r>
           <w:rPr>
             <w:rStyle w:val="Hyperlink"/>
-            <w:rFonts w:ascii="Lotuss Smart TX" w:hAnsi="Lotuss Smart TX" w:eastAsia="Lotuss Smart TX" w:cs="Lotuss Smart TX"/>
+            <w:rFonts w:ascii="Lotuss Smart TX" w:eastAsia="Lotuss Smart TX" w:hAnsi="Lotuss Smart TX" w:cs="Lotuss Smart TX"/>
             <w:sz w:val="18"/>
             <w:szCs w:val="18"/>
           </w:rPr>
@@ -67,20 +57,18 @@
           <w:szCs w:val="18"/>
         </w:rPr>
       </w:pPr>
-      <w:proofErr w:type="spellStart"/>
-      <w:r>
-        <w:rPr>
-          <w:rFonts w:ascii="Lotuss Smart TX" w:hAnsi="Lotuss Smart TX" w:eastAsia="Arial Unicode MS" w:cs="Lotuss Smart TX"/>
+      <w:r>
+        <w:rPr>
+          <w:rFonts w:ascii="Lotuss Smart TX" w:eastAsia="Arial Unicode MS" w:hAnsi="Lotuss Smart TX" w:cs="Lotuss Smart TX"/>
           <w:b/>
           <w:sz w:val="18"/>
           <w:szCs w:val="18"/>
         </w:rPr>
         <w:t>นโยบายด้านบัญชีและการเงิน</w:t>
       </w:r>
-      <w:proofErr w:type="spellEnd"/>
-      <w:r>
-        <w:rPr>
-          <w:rFonts w:ascii="Lotuss Smart TX" w:hAnsi="Lotuss Smart TX" w:eastAsia="Arial Unicode MS" w:cs="Lotuss Smart TX"/>
+      <w:r>
+        <w:rPr>
+          <w:rFonts w:ascii="Lotuss Smart TX" w:eastAsia="Arial Unicode MS" w:hAnsi="Lotuss Smart TX" w:cs="Lotuss Smart TX"/>
           <w:b/>
           <w:sz w:val="18"/>
           <w:szCs w:val="18"/>
@@ -106,10 +94,9 @@
         </w:rPr>
         <w:br/>
       </w:r>
-      <w:proofErr w:type="gramStart"/>
-      <w:r>
-        <w:rPr>
-          <w:rFonts w:ascii="Lotuss Smart TX" w:hAnsi="Lotuss Smart TX" w:eastAsia="Arial Unicode MS" w:cs="Lotuss Smart TX"/>
+      <w:r>
+        <w:rPr>
+          <w:rFonts w:ascii="Lotuss Smart TX" w:eastAsia="Arial Unicode MS" w:hAnsi="Lotuss Smart TX" w:cs="Lotuss Smart TX"/>
           <w:sz w:val="18"/>
           <w:szCs w:val="18"/>
           <w:cs/>
@@ -118,24 +105,15 @@
       </w:r>
       <w:r>
         <w:rPr>
-          <w:rFonts w:ascii="Lotuss Smart TX" w:hAnsi="Lotuss Smart TX" w:eastAsia="Arial Unicode MS" w:cs="Lotuss Smart TX"/>
-          <w:sz w:val="18"/>
-          <w:szCs w:val="18"/>
-        </w:rPr>
-        <w:t>:</w:t>
-      </w:r>
-      <w:proofErr w:type="gramEnd"/>
-      <w:r>
-        <w:rPr>
-          <w:rFonts w:ascii="Lotuss Smart TX" w:hAnsi="Lotuss Smart TX" w:eastAsia="Arial Unicode MS" w:cs="Lotuss Smart TX"/>
-          <w:sz w:val="18"/>
-          <w:szCs w:val="18"/>
-        </w:rPr>
-        <w:t xml:space="preserve"> </w:t>
-      </w:r>
-      <w:r>
-        <w:rPr>
-          <w:rFonts w:ascii="Lotuss Smart TX" w:hAnsi="Lotuss Smart TX" w:eastAsia="Arial Unicode MS" w:cs="Lotuss Smart TX"/>
+          <w:rFonts w:ascii="Lotuss Smart TX" w:eastAsia="Arial Unicode MS" w:hAnsi="Lotuss Smart TX" w:cs="Lotuss Smart TX"/>
+          <w:sz w:val="18"/>
+          <w:szCs w:val="18"/>
+        </w:rPr>
+        <w:t xml:space="preserve">: </w:t>
+      </w:r>
+      <w:r>
+        <w:rPr>
+          <w:rFonts w:ascii="Lotuss Smart TX" w:eastAsia="Arial Unicode MS" w:hAnsi="Lotuss Smart TX" w:cs="Lotuss Smart TX"/>
           <w:sz w:val="18"/>
           <w:szCs w:val="18"/>
         </w:rPr>
@@ -143,102 +121,22 @@
       </w:r>
       <w:r>
         <w:rPr>
-          <w:rFonts w:ascii="Lotuss Smart TX" w:hAnsi="Lotuss Smart TX" w:eastAsia="Arial Unicode MS" w:cs="Lotuss Smart TX"/>
+          <w:rFonts w:ascii="Lotuss Smart TX" w:eastAsia="Arial Unicode MS" w:hAnsi="Lotuss Smart TX" w:cs="Lotuss Smart TX"/>
           <w:sz w:val="18"/>
           <w:szCs w:val="18"/>
         </w:rPr>
         <w:br/>
-      </w:r>
-      <w:proofErr w:type="spellStart"/>
-      <w:r>
-        <w:rPr>
-          <w:rFonts w:ascii="Lotuss Smart TX" w:hAnsi="Lotuss Smart TX" w:eastAsia="Arial Unicode MS" w:cs="Lotuss Smart TX"/>
-          <w:sz w:val="18"/>
-          <w:szCs w:val="18"/>
-        </w:rPr>
-        <w:t>วันที่มีผลบังคับใช้</w:t>
-      </w:r>
-      <w:proofErr w:type="spellEnd"/>
-      <w:r>
-        <w:rPr>
-          <w:rFonts w:ascii="Lotuss Smart TX" w:hAnsi="Lotuss Smart TX" w:eastAsia="Arial Unicode MS" w:cs="Lotuss Smart TX"/>
-          <w:sz w:val="18"/>
-          <w:szCs w:val="18"/>
-        </w:rPr>
-        <w:t xml:space="preserve">: 15 </w:t>
-      </w:r>
-      <w:proofErr w:type="spellStart"/>
-      <w:r>
-        <w:rPr>
-          <w:rFonts w:ascii="Lotuss Smart TX" w:hAnsi="Lotuss Smart TX" w:eastAsia="Arial Unicode MS" w:cs="Lotuss Smart TX"/>
-          <w:sz w:val="18"/>
-          <w:szCs w:val="18"/>
-        </w:rPr>
-        <w:t>มกราคม</w:t>
-      </w:r>
-      <w:proofErr w:type="spellEnd"/>
-      <w:r>
-        <w:rPr>
-          <w:rFonts w:ascii="Lotuss Smart TX" w:hAnsi="Lotuss Smart TX" w:eastAsia="Arial Unicode MS" w:cs="Lotuss Smart TX"/>
-          <w:sz w:val="18"/>
-          <w:szCs w:val="18"/>
-        </w:rPr>
-        <w:t xml:space="preserve"> 2568</w:t>
-      </w:r>
-      <w:r>
-        <w:rPr>
-          <w:rFonts w:ascii="Lotuss Smart TX" w:hAnsi="Lotuss Smart TX" w:eastAsia="Arial Unicode MS" w:cs="Lotuss Smart TX"/>
+        <w:t>วันที่มีผลบังคับใช้: 15 มกราคม 2568</w:t>
+      </w:r>
+      <w:r>
+        <w:rPr>
+          <w:rFonts w:ascii="Lotuss Smart TX" w:eastAsia="Arial Unicode MS" w:hAnsi="Lotuss Smart TX" w:cs="Lotuss Smart TX"/>
           <w:sz w:val="18"/>
           <w:szCs w:val="18"/>
         </w:rPr>
         <w:br/>
-      </w:r>
-      <w:proofErr w:type="spellStart"/>
-      <w:r>
-        <w:rPr>
-          <w:rFonts w:ascii="Lotuss Smart TX" w:hAnsi="Lotuss Smart TX" w:eastAsia="Arial Unicode MS" w:cs="Lotuss Smart TX"/>
-          <w:sz w:val="18"/>
-          <w:szCs w:val="18"/>
-        </w:rPr>
-        <w:t>อนุมัติโดย</w:t>
-      </w:r>
-      <w:proofErr w:type="spellEnd"/>
-      <w:r>
-        <w:rPr>
-          <w:rFonts w:ascii="Lotuss Smart TX" w:hAnsi="Lotuss Smart TX" w:eastAsia="Arial Unicode MS" w:cs="Lotuss Smart TX"/>
-          <w:sz w:val="18"/>
-          <w:szCs w:val="18"/>
-        </w:rPr>
-        <w:t xml:space="preserve">: </w:t>
-      </w:r>
-      <w:proofErr w:type="spellStart"/>
-      <w:r>
-        <w:rPr>
-          <w:rFonts w:ascii="Lotuss Smart TX" w:hAnsi="Lotuss Smart TX" w:eastAsia="Arial Unicode MS" w:cs="Lotuss Smart TX"/>
-          <w:sz w:val="18"/>
-          <w:szCs w:val="18"/>
-        </w:rPr>
-        <w:t>รณกฤต</w:t>
-      </w:r>
-      <w:proofErr w:type="spellEnd"/>
-      <w:r>
-        <w:rPr>
-          <w:rFonts w:ascii="Lotuss Smart TX" w:hAnsi="Lotuss Smart TX" w:eastAsia="Arial Unicode MS" w:cs="Lotuss Smart TX"/>
-          <w:sz w:val="18"/>
-          <w:szCs w:val="18"/>
-        </w:rPr>
-        <w:t xml:space="preserve"> </w:t>
-      </w:r>
-      <w:proofErr w:type="spellStart"/>
-      <w:r>
-        <w:rPr>
-          <w:rFonts w:ascii="Lotuss Smart TX" w:hAnsi="Lotuss Smart TX" w:eastAsia="Arial Unicode MS" w:cs="Lotuss Smart TX"/>
-          <w:sz w:val="18"/>
-          <w:szCs w:val="18"/>
-        </w:rPr>
-        <w:t>พจมานพรชัย</w:t>
-      </w:r>
-      <w:proofErr w:type="spellEnd"/>
+        <w:t>อนุมัติโดย: รณกฤต พจมานพรชัย</w:t>
+      </w:r>
     </w:p>
     <w:p>
       <w:pPr>
@@ -250,30 +148,28 @@
           <w:szCs w:val="18"/>
         </w:rPr>
       </w:pPr>
-      <w:proofErr w:type="spellStart"/>
-      <w:r>
-        <w:rPr>
-          <w:rFonts w:ascii="Lotuss Smart TX" w:hAnsi="Lotuss Smart TX" w:eastAsia="Arial Unicode MS" w:cs="Lotuss Smart TX"/>
+      <w:r>
+        <w:rPr>
+          <w:rFonts w:ascii="Lotuss Smart TX" w:eastAsia="Arial Unicode MS" w:hAnsi="Lotuss Smart TX" w:cs="Lotuss Smart TX"/>
           <w:b/>
           <w:sz w:val="18"/>
           <w:szCs w:val="18"/>
         </w:rPr>
         <w:t>วัตถุประสงค์</w:t>
       </w:r>
-      <w:proofErr w:type="spellEnd"/>
     </w:p>
     <w:p>
       <w:pPr>
         <w:spacing w:before="240" w:after="240" w:line="240" w:lineRule="auto"/>
         <w:rPr>
-          <w:rFonts w:ascii="Lotuss Smart TX" w:hAnsi="Lotuss Smart TX" w:eastAsia="Arial Unicode MS" w:cs="Lotuss Smart TX"/>
-          <w:sz w:val="18"/>
-          <w:szCs w:val="18"/>
-        </w:rPr>
-      </w:pPr>
-      <w:r>
-        <w:rPr>
-          <w:rFonts w:ascii="Lotuss Smart TX" w:hAnsi="Lotuss Smart TX" w:eastAsia="Arial Unicode MS" w:cs="Lotuss Smart TX"/>
+          <w:rFonts w:ascii="Lotuss Smart TX" w:eastAsia="Arial Unicode MS" w:hAnsi="Lotuss Smart TX" w:cs="Lotuss Smart TX"/>
+          <w:sz w:val="18"/>
+          <w:szCs w:val="18"/>
+        </w:rPr>
+      </w:pPr>
+      <w:r>
+        <w:rPr>
+          <w:rFonts w:ascii="Lotuss Smart TX" w:eastAsia="Arial Unicode MS" w:hAnsi="Lotuss Smart TX" w:cs="Lotuss Smart TX"/>
           <w:sz w:val="18"/>
           <w:szCs w:val="18"/>
           <w:cs/>
@@ -285,7 +181,7 @@
       <w:pPr>
         <w:spacing w:before="240" w:after="240" w:line="240" w:lineRule="auto"/>
         <w:rPr>
-          <w:rFonts w:ascii="Lotuss Smart TX" w:hAnsi="Lotuss Smart TX" w:eastAsia="Arial Unicode MS" w:cs="Lotuss Smart TX"/>
+          <w:rFonts w:ascii="Lotuss Smart TX" w:eastAsia="Arial Unicode MS" w:hAnsi="Lotuss Smart TX" w:cs="Lotuss Smart TX"/>
           <w:bCs/>
           <w:sz w:val="18"/>
           <w:szCs w:val="18"/>
@@ -293,7 +189,7 @@
       </w:pPr>
       <w:r>
         <w:rPr>
-          <w:rFonts w:ascii="Lotuss Smart TX" w:hAnsi="Lotuss Smart TX" w:eastAsia="Arial Unicode MS" w:cs="Lotuss Smart TX"/>
+          <w:rFonts w:ascii="Lotuss Smart TX" w:eastAsia="Arial Unicode MS" w:hAnsi="Lotuss Smart TX" w:cs="Lotuss Smart TX"/>
           <w:bCs/>
           <w:sz w:val="18"/>
           <w:szCs w:val="18"/>
@@ -306,14 +202,14 @@
       <w:pPr>
         <w:spacing w:before="240" w:after="240" w:line="240" w:lineRule="auto"/>
         <w:rPr>
-          <w:rFonts w:ascii="Lotuss Smart TX" w:hAnsi="Lotuss Smart TX" w:eastAsia="Arial Unicode MS" w:cs="Lotuss Smart TX"/>
-          <w:sz w:val="18"/>
-          <w:szCs w:val="18"/>
-        </w:rPr>
-      </w:pPr>
-      <w:r>
-        <w:rPr>
-          <w:rFonts w:ascii="Lotuss Smart TX" w:hAnsi="Lotuss Smart TX" w:eastAsia="Arial Unicode MS" w:cs="Lotuss Smart TX"/>
+          <w:rFonts w:ascii="Lotuss Smart TX" w:eastAsia="Arial Unicode MS" w:hAnsi="Lotuss Smart TX" w:cs="Lotuss Smart TX"/>
+          <w:sz w:val="18"/>
+          <w:szCs w:val="18"/>
+        </w:rPr>
+      </w:pPr>
+      <w:r>
+        <w:rPr>
+          <w:rFonts w:ascii="Lotuss Smart TX" w:eastAsia="Arial Unicode MS" w:hAnsi="Lotuss Smart TX" w:cs="Lotuss Smart TX"/>
           <w:sz w:val="18"/>
           <w:szCs w:val="18"/>
           <w:cs/>
@@ -325,7 +221,7 @@
       <w:pPr>
         <w:spacing w:before="240" w:after="240" w:line="240" w:lineRule="auto"/>
         <w:rPr>
-          <w:rFonts w:ascii="Lotuss Smart TX" w:hAnsi="Lotuss Smart TX" w:eastAsia="Arial Unicode MS" w:cs="Lotuss Smart TX"/>
+          <w:rFonts w:ascii="Lotuss Smart TX" w:eastAsia="Arial Unicode MS" w:hAnsi="Lotuss Smart TX" w:cs="Lotuss Smart TX"/>
           <w:b/>
           <w:bCs/>
           <w:sz w:val="18"/>
@@ -334,10 +230,9 @@
           <w:cs/>
         </w:rPr>
       </w:pPr>
-      <w:proofErr w:type="spellStart"/>
-      <w:r>
-        <w:rPr>
-          <w:rFonts w:ascii="Lotuss Smart TX" w:hAnsi="Lotuss Smart TX" w:eastAsia="Arial Unicode MS" w:cs="Lotuss Smart TX"/>
+      <w:r>
+        <w:rPr>
+          <w:rFonts w:ascii="Lotuss Smart TX" w:eastAsia="Arial Unicode MS" w:hAnsi="Lotuss Smart TX" w:cs="Lotuss Smart TX"/>
           <w:b/>
           <w:bCs/>
           <w:sz w:val="18"/>
@@ -346,20 +241,19 @@
         </w:rPr>
         <w:t>คำจำกัดความ</w:t>
       </w:r>
-      <w:proofErr w:type="spellEnd"/>
     </w:p>
     <w:p>
       <w:pPr>
         <w:spacing w:before="240" w:after="240" w:line="240" w:lineRule="auto"/>
         <w:rPr>
-          <w:rFonts w:ascii="Lotuss Smart TX" w:hAnsi="Lotuss Smart TX" w:eastAsia="Arial Unicode MS" w:cs="Lotuss Smart TX"/>
-          <w:sz w:val="18"/>
-          <w:szCs w:val="18"/>
-        </w:rPr>
-      </w:pPr>
-      <w:r>
-        <w:rPr>
-          <w:rFonts w:ascii="Lotuss Smart TX" w:hAnsi="Lotuss Smart TX" w:eastAsia="Arial Unicode MS" w:cs="Lotuss Smart TX"/>
+          <w:rFonts w:ascii="Lotuss Smart TX" w:eastAsia="Arial Unicode MS" w:hAnsi="Lotuss Smart TX" w:cs="Lotuss Smart TX"/>
+          <w:sz w:val="18"/>
+          <w:szCs w:val="18"/>
+        </w:rPr>
+      </w:pPr>
+      <w:r>
+        <w:rPr>
+          <w:rFonts w:ascii="Lotuss Smart TX" w:eastAsia="Arial Unicode MS" w:hAnsi="Lotuss Smart TX" w:cs="Lotuss Smart TX"/>
           <w:b/>
           <w:bCs/>
           <w:sz w:val="18"/>
@@ -369,7 +263,7 @@
       </w:r>
       <w:r>
         <w:rPr>
-          <w:rFonts w:ascii="Lotuss Smart TX" w:hAnsi="Lotuss Smart TX" w:eastAsia="Arial Unicode MS" w:cs="Lotuss Smart TX"/>
+          <w:rFonts w:ascii="Lotuss Smart TX" w:eastAsia="Arial Unicode MS" w:hAnsi="Lotuss Smart TX" w:cs="Lotuss Smart TX"/>
           <w:b/>
           <w:bCs/>
           <w:sz w:val="18"/>
@@ -380,7 +274,7 @@
       </w:r>
       <w:r>
         <w:rPr>
-          <w:rFonts w:ascii="Lotuss Smart TX" w:hAnsi="Lotuss Smart TX" w:eastAsia="Arial Unicode MS" w:cs="Lotuss Smart TX"/>
+          <w:rFonts w:ascii="Lotuss Smart TX" w:eastAsia="Arial Unicode MS" w:hAnsi="Lotuss Smart TX" w:cs="Lotuss Smart TX"/>
           <w:b/>
           <w:bCs/>
           <w:sz w:val="18"/>
@@ -388,19 +282,17 @@
         </w:rPr>
         <w:t xml:space="preserve"> </w:t>
       </w:r>
-      <w:proofErr w:type="spellStart"/>
-      <w:r>
-        <w:rPr>
-          <w:rFonts w:ascii="Lotuss Smart TX" w:hAnsi="Lotuss Smart TX" w:eastAsia="Arial Unicode MS" w:cs="Lotuss Smart TX"/>
+      <w:r>
+        <w:rPr>
+          <w:rFonts w:ascii="Lotuss Smart TX" w:eastAsia="Arial Unicode MS" w:hAnsi="Lotuss Smart TX" w:cs="Lotuss Smart TX"/>
           <w:sz w:val="18"/>
           <w:szCs w:val="18"/>
         </w:rPr>
         <w:t>หมายถึง</w:t>
       </w:r>
-      <w:proofErr w:type="spellEnd"/>
-      <w:r>
-        <w:rPr>
-          <w:rFonts w:ascii="Lotuss Smart TX" w:hAnsi="Lotuss Smart TX" w:eastAsia="Arial Unicode MS" w:cs="Lotuss Smart TX"/>
+      <w:r>
+        <w:rPr>
+          <w:rFonts w:ascii="Lotuss Smart TX" w:eastAsia="Arial Unicode MS" w:hAnsi="Lotuss Smart TX" w:cs="Lotuss Smart TX"/>
           <w:sz w:val="18"/>
           <w:szCs w:val="18"/>
           <w:cs/>
@@ -409,7 +301,7 @@
       </w:r>
       <w:r>
         <w:rPr>
-          <w:rFonts w:ascii="Lotuss Smart TX" w:hAnsi="Lotuss Smart TX" w:eastAsia="Arial Unicode MS" w:cs="Lotuss Smart TX"/>
+          <w:rFonts w:ascii="Lotuss Smart TX" w:eastAsia="Arial Unicode MS" w:hAnsi="Lotuss Smart TX" w:cs="Lotuss Smart TX"/>
           <w:sz w:val="18"/>
           <w:szCs w:val="18"/>
           <w:cs/>
@@ -418,7 +310,7 @@
       </w:r>
       <w:r>
         <w:rPr>
-          <w:rFonts w:ascii="Lotuss Smart TX" w:hAnsi="Lotuss Smart TX" w:eastAsia="Arial Unicode MS" w:cs="Lotuss Smart TX"/>
+          <w:rFonts w:ascii="Lotuss Smart TX" w:eastAsia="Arial Unicode MS" w:hAnsi="Lotuss Smart TX" w:cs="Lotuss Smart TX"/>
           <w:sz w:val="18"/>
           <w:szCs w:val="18"/>
           <w:cs/>
@@ -427,7 +319,7 @@
       </w:r>
       <w:r>
         <w:rPr>
-          <w:rFonts w:ascii="Lotuss Smart TX" w:hAnsi="Lotuss Smart TX" w:eastAsia="Arial Unicode MS" w:cs="Lotuss Smart TX"/>
+          <w:rFonts w:ascii="Lotuss Smart TX" w:eastAsia="Arial Unicode MS" w:hAnsi="Lotuss Smart TX" w:cs="Lotuss Smart TX"/>
           <w:color w:val="0000FF"/>
           <w:sz w:val="18"/>
           <w:szCs w:val="18"/>
@@ -437,7 +329,7 @@
       </w:r>
       <w:r>
         <w:rPr>
-          <w:rFonts w:ascii="Lotuss Smart TX" w:hAnsi="Lotuss Smart TX" w:eastAsia="Arial Unicode MS" w:cs="Lotuss Smart TX"/>
+          <w:rFonts w:ascii="Lotuss Smart TX" w:eastAsia="Arial Unicode MS" w:hAnsi="Lotuss Smart TX" w:cs="Lotuss Smart TX"/>
           <w:color w:val="0000FF"/>
           <w:sz w:val="18"/>
           <w:szCs w:val="18"/>
@@ -447,7 +339,7 @@
       </w:r>
       <w:r>
         <w:rPr>
-          <w:rFonts w:ascii="Lotuss Smart TX" w:hAnsi="Lotuss Smart TX" w:eastAsia="Arial Unicode MS" w:cs="Lotuss Smart TX"/>
+          <w:rFonts w:ascii="Lotuss Smart TX" w:eastAsia="Arial Unicode MS" w:hAnsi="Lotuss Smart TX" w:cs="Lotuss Smart TX"/>
           <w:sz w:val="18"/>
           <w:szCs w:val="18"/>
         </w:rPr>
@@ -458,7 +350,7 @@
       <w:pPr>
         <w:spacing w:before="240" w:after="240" w:line="240" w:lineRule="auto"/>
         <w:rPr>
-          <w:rFonts w:ascii="Lotuss Smart TX" w:hAnsi="Lotuss Smart TX" w:eastAsia="Arial Unicode MS" w:cs="Lotuss Smart TX"/>
+          <w:rFonts w:ascii="Lotuss Smart TX" w:eastAsia="Arial Unicode MS" w:hAnsi="Lotuss Smart TX" w:cs="Lotuss Smart TX"/>
           <w:b/>
           <w:bCs/>
           <w:sz w:val="18"/>
@@ -467,7 +359,7 @@
       </w:pPr>
       <w:r>
         <w:rPr>
-          <w:rFonts w:ascii="Lotuss Smart TX" w:hAnsi="Lotuss Smart TX" w:eastAsia="Arial Unicode MS" w:cs="Lotuss Smart TX"/>
+          <w:rFonts w:ascii="Lotuss Smart TX" w:eastAsia="Arial Unicode MS" w:hAnsi="Lotuss Smart TX" w:cs="Lotuss Smart TX"/>
           <w:b/>
           <w:bCs/>
           <w:sz w:val="18"/>
@@ -477,7 +369,7 @@
       </w:r>
       <w:r>
         <w:rPr>
-          <w:rFonts w:ascii="Lotuss Smart TX" w:hAnsi="Lotuss Smart TX" w:eastAsia="Arial Unicode MS" w:cs="Lotuss Smart TX"/>
+          <w:rFonts w:ascii="Lotuss Smart TX" w:eastAsia="Arial Unicode MS" w:hAnsi="Lotuss Smart TX" w:cs="Lotuss Smart TX"/>
           <w:b/>
           <w:bCs/>
           <w:sz w:val="18"/>
@@ -491,14 +383,14 @@
       <w:pPr>
         <w:spacing w:before="240" w:after="240" w:line="240" w:lineRule="auto"/>
         <w:rPr>
-          <w:rFonts w:ascii="Lotuss Smart TX" w:hAnsi="Lotuss Smart TX" w:eastAsia="Arial Unicode MS" w:cs="Lotuss Smart TX"/>
-          <w:sz w:val="18"/>
-          <w:szCs w:val="18"/>
-        </w:rPr>
-      </w:pPr>
-      <w:r>
-        <w:rPr>
-          <w:rFonts w:ascii="Lotuss Smart TX" w:hAnsi="Lotuss Smart TX" w:eastAsia="Arial Unicode MS" w:cs="Lotuss Smart TX"/>
+          <w:rFonts w:ascii="Lotuss Smart TX" w:eastAsia="Arial Unicode MS" w:hAnsi="Lotuss Smart TX" w:cs="Lotuss Smart TX"/>
+          <w:sz w:val="18"/>
+          <w:szCs w:val="18"/>
+        </w:rPr>
+      </w:pPr>
+      <w:r>
+        <w:rPr>
+          <w:rFonts w:ascii="Lotuss Smart TX" w:eastAsia="Arial Unicode MS" w:hAnsi="Lotuss Smart TX" w:cs="Lotuss Smart TX"/>
           <w:sz w:val="18"/>
           <w:szCs w:val="18"/>
           <w:cs/>
@@ -507,7 +399,7 @@
       </w:r>
       <w:r>
         <w:rPr>
-          <w:rFonts w:ascii="Lotuss Smart TX" w:hAnsi="Lotuss Smart TX" w:eastAsia="Arial Unicode MS" w:cs="Lotuss Smart TX"/>
+          <w:rFonts w:ascii="Lotuss Smart TX" w:eastAsia="Arial Unicode MS" w:hAnsi="Lotuss Smart TX" w:cs="Lotuss Smart TX"/>
           <w:sz w:val="18"/>
           <w:szCs w:val="18"/>
         </w:rPr>
@@ -515,7 +407,7 @@
       </w:r>
       <w:r>
         <w:rPr>
-          <w:rFonts w:ascii="Lotuss Smart TX" w:hAnsi="Lotuss Smart TX" w:eastAsia="Arial Unicode MS" w:cs="Lotuss Smart TX"/>
+          <w:rFonts w:ascii="Lotuss Smart TX" w:eastAsia="Arial Unicode MS" w:hAnsi="Lotuss Smart TX" w:cs="Lotuss Smart TX"/>
           <w:sz w:val="18"/>
           <w:szCs w:val="18"/>
           <w:cs/>
@@ -524,7 +416,7 @@
       </w:r>
       <w:r>
         <w:rPr>
-          <w:rFonts w:ascii="Lotuss Smart TX" w:hAnsi="Lotuss Smart TX" w:eastAsia="Arial Unicode MS" w:cs="Lotuss Smart TX"/>
+          <w:rFonts w:ascii="Lotuss Smart TX" w:eastAsia="Arial Unicode MS" w:hAnsi="Lotuss Smart TX" w:cs="Lotuss Smart TX"/>
           <w:sz w:val="18"/>
           <w:szCs w:val="18"/>
         </w:rPr>
@@ -532,7 +424,7 @@
       </w:r>
       <w:r>
         <w:rPr>
-          <w:rFonts w:ascii="Lotuss Smart TX" w:hAnsi="Lotuss Smart TX" w:eastAsia="Arial Unicode MS" w:cs="Lotuss Smart TX"/>
+          <w:rFonts w:ascii="Lotuss Smart TX" w:eastAsia="Arial Unicode MS" w:hAnsi="Lotuss Smart TX" w:cs="Lotuss Smart TX"/>
           <w:sz w:val="18"/>
           <w:szCs w:val="18"/>
           <w:cs/>
@@ -541,7 +433,7 @@
       </w:r>
       <w:r>
         <w:rPr>
-          <w:rFonts w:ascii="Lotuss Smart TX" w:hAnsi="Lotuss Smart TX" w:eastAsia="Arial Unicode MS" w:cs="Lotuss Smart TX"/>
+          <w:rFonts w:ascii="Lotuss Smart TX" w:eastAsia="Arial Unicode MS" w:hAnsi="Lotuss Smart TX" w:cs="Lotuss Smart TX"/>
           <w:sz w:val="18"/>
           <w:szCs w:val="18"/>
         </w:rPr>
@@ -549,34 +441,24 @@
       </w:r>
       <w:r>
         <w:rPr>
-          <w:rFonts w:ascii="Lotuss Smart TX" w:hAnsi="Lotuss Smart TX" w:eastAsia="Arial Unicode MS" w:cs="Lotuss Smart TX"/>
+          <w:rFonts w:ascii="Lotuss Smart TX" w:eastAsia="Arial Unicode MS" w:hAnsi="Lotuss Smart TX" w:cs="Lotuss Smart TX"/>
           <w:sz w:val="18"/>
           <w:szCs w:val="18"/>
           <w:cs/>
         </w:rPr>
         <w:t xml:space="preserve">หรือ </w:t>
       </w:r>
-      <w:proofErr w:type="spellStart"/>
-      <w:r>
-        <w:rPr>
-          <w:rFonts w:ascii="Lotuss Smart TX" w:hAnsi="Lotuss Smart TX" w:eastAsia="Arial Unicode MS" w:cs="Lotuss Smart TX"/>
-          <w:sz w:val="18"/>
-          <w:szCs w:val="18"/>
-        </w:rPr>
-        <w:t>iExpense</w:t>
-      </w:r>
-      <w:proofErr w:type="spellEnd"/>
-      <w:r>
-        <w:rPr>
-          <w:rFonts w:ascii="Lotuss Smart TX" w:hAnsi="Lotuss Smart TX" w:eastAsia="Arial Unicode MS" w:cs="Lotuss Smart TX"/>
-          <w:sz w:val="18"/>
-          <w:szCs w:val="18"/>
-        </w:rPr>
-        <w:t xml:space="preserve"> </w:t>
-      </w:r>
-      <w:r>
-        <w:rPr>
-          <w:rFonts w:ascii="Lotuss Smart TX" w:hAnsi="Lotuss Smart TX" w:eastAsia="Arial Unicode MS" w:cs="Lotuss Smart TX"/>
+      <w:r>
+        <w:rPr>
+          <w:rFonts w:ascii="Lotuss Smart TX" w:eastAsia="Arial Unicode MS" w:hAnsi="Lotuss Smart TX" w:cs="Lotuss Smart TX"/>
+          <w:sz w:val="18"/>
+          <w:szCs w:val="18"/>
+        </w:rPr>
+        <w:t xml:space="preserve">iExpense </w:t>
+      </w:r>
+      <w:r>
+        <w:rPr>
+          <w:rFonts w:ascii="Lotuss Smart TX" w:eastAsia="Arial Unicode MS" w:hAnsi="Lotuss Smart TX" w:cs="Lotuss Smart TX"/>
           <w:sz w:val="18"/>
           <w:szCs w:val="18"/>
           <w:cs/>
@@ -585,7 +467,7 @@
       </w:r>
       <w:r>
         <w:rPr>
-          <w:rFonts w:ascii="Lotuss Smart TX" w:hAnsi="Lotuss Smart TX" w:eastAsia="Arial Unicode MS" w:cs="Lotuss Smart TX"/>
+          <w:rFonts w:ascii="Lotuss Smart TX" w:eastAsia="Arial Unicode MS" w:hAnsi="Lotuss Smart TX" w:cs="Lotuss Smart TX"/>
           <w:sz w:val="18"/>
           <w:szCs w:val="18"/>
         </w:rPr>
@@ -593,7 +475,7 @@
       </w:r>
       <w:r>
         <w:rPr>
-          <w:rFonts w:ascii="Lotuss Smart TX" w:hAnsi="Lotuss Smart TX" w:eastAsia="Arial Unicode MS" w:cs="Lotuss Smart TX"/>
+          <w:rFonts w:ascii="Lotuss Smart TX" w:eastAsia="Arial Unicode MS" w:hAnsi="Lotuss Smart TX" w:cs="Lotuss Smart TX"/>
           <w:sz w:val="18"/>
           <w:szCs w:val="18"/>
           <w:cs/>
@@ -610,14 +492,14 @@
         </w:numPr>
         <w:spacing w:before="240" w:after="240" w:line="240" w:lineRule="auto"/>
         <w:rPr>
-          <w:rFonts w:ascii="Lotuss Smart TX" w:hAnsi="Lotuss Smart TX" w:eastAsia="Arial Unicode MS" w:cs="Lotuss Smart TX"/>
-          <w:sz w:val="18"/>
-          <w:szCs w:val="18"/>
-        </w:rPr>
-      </w:pPr>
-      <w:r>
-        <w:rPr>
-          <w:rFonts w:ascii="Lotuss Smart TX" w:hAnsi="Lotuss Smart TX" w:eastAsia="Arial Unicode MS" w:cs="Lotuss Smart TX"/>
+          <w:rFonts w:ascii="Lotuss Smart TX" w:eastAsia="Arial Unicode MS" w:hAnsi="Lotuss Smart TX" w:cs="Lotuss Smart TX"/>
+          <w:sz w:val="18"/>
+          <w:szCs w:val="18"/>
+        </w:rPr>
+      </w:pPr>
+      <w:r>
+        <w:rPr>
+          <w:rFonts w:ascii="Lotuss Smart TX" w:eastAsia="Arial Unicode MS" w:hAnsi="Lotuss Smart TX" w:cs="Lotuss Smart TX"/>
           <w:sz w:val="18"/>
           <w:szCs w:val="18"/>
           <w:cs/>
@@ -634,14 +516,14 @@
         </w:numPr>
         <w:spacing w:before="240" w:after="240" w:line="240" w:lineRule="auto"/>
         <w:rPr>
-          <w:rFonts w:ascii="Lotuss Smart TX" w:hAnsi="Lotuss Smart TX" w:eastAsia="Arial Unicode MS" w:cs="Lotuss Smart TX"/>
-          <w:sz w:val="18"/>
-          <w:szCs w:val="18"/>
-        </w:rPr>
-      </w:pPr>
-      <w:r>
-        <w:rPr>
-          <w:rFonts w:ascii="Lotuss Smart TX" w:hAnsi="Lotuss Smart TX" w:eastAsia="Arial Unicode MS" w:cs="Lotuss Smart TX"/>
+          <w:rFonts w:ascii="Lotuss Smart TX" w:eastAsia="Arial Unicode MS" w:hAnsi="Lotuss Smart TX" w:cs="Lotuss Smart TX"/>
+          <w:sz w:val="18"/>
+          <w:szCs w:val="18"/>
+        </w:rPr>
+      </w:pPr>
+      <w:r>
+        <w:rPr>
+          <w:rFonts w:ascii="Lotuss Smart TX" w:eastAsia="Arial Unicode MS" w:hAnsi="Lotuss Smart TX" w:cs="Lotuss Smart TX"/>
           <w:sz w:val="18"/>
           <w:szCs w:val="18"/>
           <w:cs/>
@@ -658,14 +540,14 @@
         </w:numPr>
         <w:spacing w:before="240" w:after="240" w:line="240" w:lineRule="auto"/>
         <w:rPr>
-          <w:rFonts w:ascii="Lotuss Smart TX" w:hAnsi="Lotuss Smart TX" w:eastAsia="Arial Unicode MS" w:cs="Lotuss Smart TX"/>
-          <w:sz w:val="18"/>
-          <w:szCs w:val="18"/>
-        </w:rPr>
-      </w:pPr>
-      <w:r>
-        <w:rPr>
-          <w:rFonts w:ascii="Lotuss Smart TX" w:hAnsi="Lotuss Smart TX" w:eastAsia="Arial Unicode MS" w:cs="Lotuss Smart TX"/>
+          <w:rFonts w:ascii="Lotuss Smart TX" w:eastAsia="Arial Unicode MS" w:hAnsi="Lotuss Smart TX" w:cs="Lotuss Smart TX"/>
+          <w:sz w:val="18"/>
+          <w:szCs w:val="18"/>
+        </w:rPr>
+      </w:pPr>
+      <w:r>
+        <w:rPr>
+          <w:rFonts w:ascii="Lotuss Smart TX" w:eastAsia="Arial Unicode MS" w:hAnsi="Lotuss Smart TX" w:cs="Lotuss Smart TX"/>
           <w:sz w:val="18"/>
           <w:szCs w:val="18"/>
           <w:cs/>
@@ -678,7 +560,7 @@
         <w:spacing w:after="40" w:line="300" w:lineRule="exact"/>
         <w:jc w:val="thaiDistribute"/>
         <w:rPr>
-          <w:rFonts w:ascii="Lotuss Smart TX" w:hAnsi="Lotuss Smart TX" w:eastAsia="Arial Unicode MS" w:cs="Lotuss Smart TX"/>
+          <w:rFonts w:ascii="Lotuss Smart TX" w:eastAsia="Arial Unicode MS" w:hAnsi="Lotuss Smart TX" w:cs="Lotuss Smart TX"/>
           <w:b/>
           <w:bCs/>
           <w:sz w:val="18"/>
@@ -687,7 +569,7 @@
       </w:pPr>
       <w:r>
         <w:rPr>
-          <w:rFonts w:ascii="Lotuss Smart TX" w:hAnsi="Lotuss Smart TX" w:eastAsia="Arial Unicode MS" w:cs="Lotuss Smart TX"/>
+          <w:rFonts w:ascii="Lotuss Smart TX" w:eastAsia="Arial Unicode MS" w:hAnsi="Lotuss Smart TX" w:cs="Lotuss Smart TX"/>
           <w:b/>
           <w:bCs/>
           <w:sz w:val="18"/>
@@ -697,7 +579,7 @@
       </w:r>
       <w:r>
         <w:rPr>
-          <w:rFonts w:ascii="Lotuss Smart TX" w:hAnsi="Lotuss Smart TX" w:eastAsia="Arial Unicode MS" w:cs="Lotuss Smart TX"/>
+          <w:rFonts w:ascii="Lotuss Smart TX" w:eastAsia="Arial Unicode MS" w:hAnsi="Lotuss Smart TX" w:cs="Lotuss Smart TX"/>
           <w:b/>
           <w:bCs/>
           <w:sz w:val="18"/>
@@ -712,49 +594,111 @@
         <w:spacing w:after="40" w:line="300" w:lineRule="exact"/>
         <w:jc w:val="thaiDistribute"/>
         <w:rPr>
-          <w:rFonts w:ascii="Lotuss Smart TX" w:hAnsi="Lotuss Smart TX" w:eastAsia="Arial Unicode MS" w:cs="Lotuss Smart TX"/>
-          <w:sz w:val="18"/>
-          <w:szCs w:val="18"/>
-        </w:rPr>
-      </w:pPr>
-      <w:r>
-        <w:rPr>
-          <w:rFonts w:ascii="Lotuss Smart TX" w:hAnsi="Lotuss Smart TX" w:eastAsia="Arial Unicode MS" w:cs="Lotuss Smart TX"/>
+          <w:rFonts w:ascii="Lotuss Smart TX" w:eastAsia="Arial Unicode MS" w:hAnsi="Lotuss Smart TX" w:cs="Lotuss Smart TX"/>
+          <w:sz w:val="18"/>
+          <w:szCs w:val="18"/>
+        </w:rPr>
+      </w:pPr>
+      <w:r>
+        <w:rPr>
+          <w:rFonts w:ascii="Lotuss Smart TX" w:eastAsia="Arial Unicode MS" w:hAnsi="Lotuss Smart TX" w:cs="Lotuss Smart TX"/>
           <w:sz w:val="18"/>
           <w:szCs w:val="18"/>
           <w:cs/>
         </w:rPr>
         <w:t xml:space="preserve">วันและเวลาที่พนักงานสามารถเบิกเงินทดรองจ่ายตามที่ระบุใน </w:t>
       </w:r>
-      <w:proofErr w:type="spellStart"/>
-      <w:r>
-        <w:rPr>
-          <w:rFonts w:ascii="Lotuss Smart TX" w:hAnsi="Lotuss Smart TX" w:eastAsia="Arial Unicode MS" w:cs="Lotuss Smart TX"/>
+      <w:r>
+        <w:rPr>
+          <w:rFonts w:ascii="Lotuss Smart TX" w:eastAsia="Arial Unicode MS" w:hAnsi="Lotuss Smart TX" w:cs="Lotuss Smart TX"/>
           <w:color w:val="0000FF"/>
           <w:sz w:val="18"/>
           <w:szCs w:val="18"/>
           <w:u w:val="single"/>
         </w:rPr>
-        <w:t>เอกสารแนบ</w:t>
-      </w:r>
-      <w:proofErr w:type="spellEnd"/>
-      <w:r>
-        <w:rPr>
-          <w:rFonts w:ascii="Lotuss Smart TX" w:hAnsi="Lotuss Smart TX" w:eastAsia="Arial Unicode MS" w:cs="Lotuss Smart TX"/>
+        <w:t xml:space="preserve">เอกสารแนบ </w:t>
+      </w:r>
+      <w:r>
+        <w:rPr>
+          <w:rFonts w:ascii="Lotuss Smart TX" w:eastAsia="Arial Unicode MS" w:hAnsi="Lotuss Smart TX" w:cs="Lotuss Smart TX"/>
           <w:color w:val="0000FF"/>
           <w:sz w:val="18"/>
           <w:szCs w:val="18"/>
           <w:u w:val="single"/>
-        </w:rPr>
-        <w:t xml:space="preserve"> </w:t>
-      </w:r>
-      <w:r>
-        <w:rPr>
-          <w:rFonts w:ascii="Lotuss Smart TX" w:hAnsi="Lotuss Smart TX" w:eastAsia="Arial Unicode MS" w:cs="Lotuss Smart TX"/>
+          <w:cs/>
+          <w:lang w:val="en-US"/>
+        </w:rPr>
+        <w:t>ก</w:t>
+      </w:r>
+    </w:p>
+    <w:p>
+      <w:pPr>
+        <w:spacing w:before="240" w:after="240" w:line="240" w:lineRule="auto"/>
+        <w:rPr>
+          <w:rFonts w:ascii="Lotuss Smart TX" w:eastAsia="Arial Unicode MS" w:hAnsi="Lotuss Smart TX" w:cs="Lotuss Smart TX"/>
+          <w:bCs/>
+          <w:sz w:val="18"/>
+          <w:szCs w:val="18"/>
+        </w:rPr>
+      </w:pPr>
+      <w:r>
+        <w:rPr>
+          <w:rFonts w:ascii="Lotuss Smart TX" w:eastAsia="Arial Unicode MS" w:hAnsi="Lotuss Smart TX" w:cs="Lotuss Smart TX"/>
+          <w:bCs/>
+          <w:sz w:val="18"/>
+          <w:szCs w:val="18"/>
+        </w:rPr>
+        <w:t xml:space="preserve"># </w:t>
+      </w:r>
+      <w:r>
+        <w:rPr>
+          <w:rFonts w:ascii="Lotuss Smart TX" w:eastAsia="Arial Unicode MS" w:hAnsi="Lotuss Smart TX" w:cs="Lotuss Smart TX"/>
+          <w:bCs/>
+          <w:sz w:val="18"/>
+          <w:szCs w:val="18"/>
+          <w:cs/>
+        </w:rPr>
+        <w:t>ตารางจ่ายเงินพนักงาน</w:t>
+      </w:r>
+    </w:p>
+    <w:p>
+      <w:pPr>
+        <w:spacing w:before="240" w:after="240" w:line="240" w:lineRule="auto"/>
+        <w:rPr>
+          <w:rFonts w:ascii="Lotuss Smart TX" w:eastAsia="Arial Unicode MS" w:hAnsi="Lotuss Smart TX" w:cs="Lotuss Smart TX"/>
           <w:color w:val="0000FF"/>
           <w:sz w:val="18"/>
           <w:szCs w:val="18"/>
           <w:u w:val="single"/>
+          <w:lang w:val="en-US"/>
+        </w:rPr>
+      </w:pPr>
+      <w:r>
+        <w:rPr>
+          <w:rFonts w:ascii="Lotuss Smart TX" w:eastAsia="Arial Unicode MS" w:hAnsi="Lotuss Smart TX" w:cs="Lotuss Smart TX"/>
+          <w:sz w:val="18"/>
+          <w:szCs w:val="18"/>
+          <w:cs/>
+        </w:rPr>
+        <w:t xml:space="preserve">วันและเวลาที่บริษัทจ่ายเงินพนักงานตามที่ระบุใน </w:t>
+      </w:r>
+      <w:r>
+        <w:rPr>
+          <w:rFonts w:ascii="Lotuss Smart TX" w:eastAsia="Arial Unicode MS" w:hAnsi="Lotuss Smart TX" w:cs="Lotuss Smart TX"/>
+          <w:color w:val="0000FF"/>
+          <w:sz w:val="18"/>
+          <w:szCs w:val="18"/>
+          <w:u w:val="single"/>
+        </w:rPr>
+        <w:t xml:space="preserve">เอกสารแนบ </w:t>
+      </w:r>
+      <w:r>
+        <w:rPr>
+          <w:rFonts w:ascii="Lotuss Smart TX" w:eastAsia="Arial Unicode MS" w:hAnsi="Lotuss Smart TX" w:cs="Lotuss Smart TX"/>
+          <w:color w:val="0000FF"/>
+          <w:sz w:val="18"/>
+          <w:szCs w:val="18"/>
+          <w:u w:val="single"/>
           <w:cs/>
           <w:lang w:val="en-US"/>
         </w:rPr>
@@ -763,147 +707,61 @@
     </w:p>
     <w:p>
       <w:pPr>
-        <w:spacing w:before="240" w:after="240" w:line="240" w:lineRule="auto"/>
-        <w:rPr>
-          <w:rFonts w:ascii="Lotuss Smart TX" w:hAnsi="Lotuss Smart TX" w:eastAsia="Arial Unicode MS" w:cs="Lotuss Smart TX"/>
+        <w:spacing w:before="40" w:afterLines="40" w:after="96" w:line="280" w:lineRule="exact"/>
+        <w:jc w:val="thaiDistribute"/>
+        <w:rPr>
+          <w:rFonts w:ascii="Lotuss Smart TX" w:eastAsia="Arial Unicode MS" w:hAnsi="Lotuss Smart TX" w:cs="Lotuss Smart TX"/>
           <w:bCs/>
           <w:sz w:val="18"/>
           <w:szCs w:val="18"/>
-        </w:rPr>
-      </w:pPr>
-      <w:r>
-        <w:rPr>
-          <w:rFonts w:ascii="Lotuss Smart TX" w:hAnsi="Lotuss Smart TX" w:eastAsia="Arial Unicode MS" w:cs="Lotuss Smart TX"/>
+          <w:u w:val="single"/>
+        </w:rPr>
+      </w:pPr>
+      <w:r>
+        <w:rPr>
+          <w:rFonts w:ascii="Lotuss Smart TX" w:eastAsia="Arial Unicode MS" w:hAnsi="Lotuss Smart TX" w:cs="Lotuss Smart TX"/>
           <w:bCs/>
           <w:sz w:val="18"/>
           <w:szCs w:val="18"/>
+          <w:u w:val="single"/>
         </w:rPr>
         <w:t xml:space="preserve"># </w:t>
       </w:r>
       <w:r>
         <w:rPr>
-          <w:rFonts w:ascii="Lotuss Smart TX" w:hAnsi="Lotuss Smart TX" w:eastAsia="Arial Unicode MS" w:cs="Lotuss Smart TX"/>
+          <w:rFonts w:ascii="Lotuss Smart TX" w:eastAsia="Arial Unicode MS" w:hAnsi="Lotuss Smart TX" w:cs="Lotuss Smart TX"/>
           <w:bCs/>
           <w:sz w:val="18"/>
           <w:szCs w:val="18"/>
-          <w:cs/>
-        </w:rPr>
-        <w:t>ตารางจ่ายเงินพนักงาน</w:t>
-      </w:r>
-    </w:p>
-    <w:p>
-      <w:pPr>
-        <w:spacing w:before="240" w:after="240" w:line="240" w:lineRule="auto"/>
-        <w:rPr>
-          <w:rFonts w:ascii="Lotuss Smart TX" w:hAnsi="Lotuss Smart TX" w:eastAsia="Arial Unicode MS" w:cs="Lotuss Smart TX"/>
-          <w:color w:val="0000FF"/>
-          <w:sz w:val="18"/>
-          <w:szCs w:val="18"/>
           <w:u w:val="single"/>
-          <w:lang w:val="en-US"/>
-        </w:rPr>
-      </w:pPr>
-      <w:r>
-        <w:rPr>
-          <w:rFonts w:ascii="Lotuss Smart TX" w:hAnsi="Lotuss Smart TX" w:eastAsia="Arial Unicode MS" w:cs="Lotuss Smart TX"/>
-          <w:sz w:val="18"/>
-          <w:szCs w:val="18"/>
-          <w:cs/>
-        </w:rPr>
-        <w:t xml:space="preserve">วันและเวลาที่บริษัทจ่ายเงินพนักงานตามที่ระบุใน </w:t>
-      </w:r>
-      <w:proofErr w:type="spellStart"/>
-      <w:r>
-        <w:rPr>
-          <w:rFonts w:ascii="Lotuss Smart TX" w:hAnsi="Lotuss Smart TX" w:eastAsia="Arial Unicode MS" w:cs="Lotuss Smart TX"/>
-          <w:color w:val="0000FF"/>
-          <w:sz w:val="18"/>
-          <w:szCs w:val="18"/>
-          <w:u w:val="single"/>
-        </w:rPr>
-        <w:t>เอกสารแนบ</w:t>
-      </w:r>
-      <w:proofErr w:type="spellEnd"/>
-      <w:r>
-        <w:rPr>
-          <w:rFonts w:ascii="Lotuss Smart TX" w:hAnsi="Lotuss Smart TX" w:eastAsia="Arial Unicode MS" w:cs="Lotuss Smart TX"/>
-          <w:color w:val="0000FF"/>
-          <w:sz w:val="18"/>
-          <w:szCs w:val="18"/>
-          <w:u w:val="single"/>
-        </w:rPr>
-        <w:t xml:space="preserve"> </w:t>
-      </w:r>
-      <w:r>
-        <w:rPr>
-          <w:rFonts w:ascii="Lotuss Smart TX" w:hAnsi="Lotuss Smart TX" w:eastAsia="Arial Unicode MS" w:cs="Lotuss Smart TX"/>
-          <w:color w:val="0000FF"/>
-          <w:sz w:val="18"/>
-          <w:szCs w:val="18"/>
-          <w:u w:val="single"/>
-          <w:cs/>
-          <w:lang w:val="en-US"/>
-        </w:rPr>
-        <w:t>ก</w:t>
-      </w:r>
-    </w:p>
-    <w:p>
-      <w:pPr>
-        <w:spacing w:before="40" w:after="96" w:afterLines="40" w:line="280" w:lineRule="exact"/>
+          <w:cs/>
+        </w:rPr>
+        <w:t xml:space="preserve">ขั้นตอนการปฏิบัติ </w:t>
+      </w:r>
+    </w:p>
+    <w:p>
+      <w:pPr>
+        <w:spacing w:before="40" w:afterLines="40" w:after="96" w:line="280" w:lineRule="exact"/>
         <w:jc w:val="thaiDistribute"/>
         <w:rPr>
-          <w:rFonts w:ascii="Lotuss Smart TX" w:hAnsi="Lotuss Smart TX" w:eastAsia="Arial Unicode MS" w:cs="Lotuss Smart TX"/>
+          <w:rFonts w:ascii="Lotuss Smart TX" w:eastAsia="Arial Unicode MS" w:hAnsi="Lotuss Smart TX" w:cs="Lotuss Smart TX"/>
           <w:bCs/>
           <w:sz w:val="18"/>
           <w:szCs w:val="18"/>
-          <w:u w:val="single"/>
-        </w:rPr>
-      </w:pPr>
-      <w:r>
-        <w:rPr>
-          <w:rFonts w:ascii="Lotuss Smart TX" w:hAnsi="Lotuss Smart TX" w:eastAsia="Arial Unicode MS" w:cs="Lotuss Smart TX"/>
+        </w:rPr>
+      </w:pPr>
+      <w:r>
+        <w:rPr>
+          <w:rFonts w:ascii="Lotuss Smart TX" w:eastAsia="Arial Unicode MS" w:hAnsi="Lotuss Smart TX" w:cs="Lotuss Smart TX"/>
           <w:bCs/>
           <w:sz w:val="18"/>
           <w:szCs w:val="18"/>
-          <w:u w:val="single"/>
-        </w:rPr>
-        <w:t xml:space="preserve"># </w:t>
-      </w:r>
-      <w:r>
-        <w:rPr>
-          <w:rFonts w:ascii="Lotuss Smart TX" w:hAnsi="Lotuss Smart TX" w:eastAsia="Arial Unicode MS" w:cs="Lotuss Smart TX"/>
-          <w:bCs/>
-          <w:sz w:val="18"/>
-          <w:szCs w:val="18"/>
-          <w:u w:val="single"/>
-          <w:cs/>
-        </w:rPr>
-        <w:t xml:space="preserve">ขั้นตอนการปฏิบัติ </w:t>
-      </w:r>
-    </w:p>
-    <w:p>
-      <w:pPr>
-        <w:spacing w:before="40" w:after="96" w:afterLines="40" w:line="280" w:lineRule="exact"/>
-        <w:jc w:val="thaiDistribute"/>
-        <w:rPr>
-          <w:rFonts w:ascii="Lotuss Smart TX" w:hAnsi="Lotuss Smart TX" w:eastAsia="Arial Unicode MS" w:cs="Lotuss Smart TX"/>
-          <w:bCs/>
-          <w:sz w:val="18"/>
-          <w:szCs w:val="18"/>
-        </w:rPr>
-      </w:pPr>
-      <w:r>
-        <w:rPr>
-          <w:rFonts w:ascii="Lotuss Smart TX" w:hAnsi="Lotuss Smart TX" w:eastAsia="Arial Unicode MS" w:cs="Lotuss Smart TX"/>
-          <w:bCs/>
-          <w:sz w:val="18"/>
-          <w:szCs w:val="18"/>
         </w:rPr>
         <w:t xml:space="preserve">## </w:t>
       </w:r>
       <w:r>
         <w:rPr>
-          <w:rFonts w:ascii="Lotuss Smart TX" w:hAnsi="Lotuss Smart TX" w:eastAsia="Arial Unicode MS" w:cs="Lotuss Smart TX"/>
+          <w:rFonts w:ascii="Lotuss Smart TX" w:eastAsia="Arial Unicode MS" w:hAnsi="Lotuss Smart TX" w:cs="Lotuss Smart TX"/>
           <w:bCs/>
           <w:sz w:val="18"/>
           <w:szCs w:val="18"/>
@@ -919,10 +777,10 @@
           <w:ilvl w:val="0"/>
           <w:numId w:val="4"/>
         </w:numPr>
-        <w:spacing w:before="40" w:after="96" w:afterLines="40" w:line="280" w:lineRule="exact"/>
+        <w:spacing w:before="40" w:afterLines="40" w:after="96" w:line="280" w:lineRule="exact"/>
         <w:jc w:val="thaiDistribute"/>
         <w:rPr>
-          <w:rFonts w:ascii="Lotuss Smart TX" w:hAnsi="Lotuss Smart TX" w:eastAsia="Arial Unicode MS" w:cs="Lotuss Smart TX"/>
+          <w:rFonts w:ascii="Lotuss Smart TX" w:eastAsia="Arial Unicode MS" w:hAnsi="Lotuss Smart TX" w:cs="Lotuss Smart TX"/>
           <w:sz w:val="18"/>
           <w:szCs w:val="18"/>
           <w:u w:val="single"/>
@@ -963,10 +821,10 @@
     </w:p>
     <w:p>
       <w:pPr>
-        <w:spacing w:before="40" w:after="96" w:afterLines="40" w:line="280" w:lineRule="exact"/>
+        <w:spacing w:before="40" w:afterLines="40" w:after="96" w:line="280" w:lineRule="exact"/>
         <w:jc w:val="thaiDistribute"/>
         <w:rPr>
-          <w:rFonts w:ascii="Lotuss Smart TX" w:hAnsi="Lotuss Smart TX" w:eastAsia="Arial Unicode MS" w:cs="Lotuss Smart TX"/>
+          <w:rFonts w:ascii="Lotuss Smart TX" w:eastAsia="Arial Unicode MS" w:hAnsi="Lotuss Smart TX" w:cs="Lotuss Smart TX"/>
           <w:b/>
           <w:bCs/>
           <w:sz w:val="18"/>
@@ -975,7 +833,7 @@
       </w:pPr>
       <w:r>
         <w:rPr>
-          <w:rFonts w:ascii="Lotuss Smart TX" w:hAnsi="Lotuss Smart TX" w:eastAsia="Arial Unicode MS" w:cs="Lotuss Smart TX"/>
+          <w:rFonts w:ascii="Lotuss Smart TX" w:eastAsia="Arial Unicode MS" w:hAnsi="Lotuss Smart TX" w:cs="Lotuss Smart TX"/>
           <w:b/>
           <w:bCs/>
           <w:sz w:val="18"/>
@@ -986,7 +844,7 @@
       </w:r>
       <w:r>
         <w:rPr>
-          <w:rFonts w:ascii="Lotuss Smart TX" w:hAnsi="Lotuss Smart TX" w:eastAsia="Arial Unicode MS" w:cs="Lotuss Smart TX"/>
+          <w:rFonts w:ascii="Lotuss Smart TX" w:eastAsia="Arial Unicode MS" w:hAnsi="Lotuss Smart TX" w:cs="Lotuss Smart TX"/>
           <w:b/>
           <w:bCs/>
           <w:sz w:val="18"/>
@@ -1003,10 +861,10 @@
           <w:ilvl w:val="0"/>
           <w:numId w:val="4"/>
         </w:numPr>
-        <w:spacing w:before="40" w:after="96" w:afterLines="40" w:line="280" w:lineRule="exact"/>
+        <w:spacing w:before="40" w:afterLines="40" w:after="96" w:line="280" w:lineRule="exact"/>
         <w:jc w:val="thaiDistribute"/>
         <w:rPr>
-          <w:rFonts w:ascii="Lotuss Smart TX" w:hAnsi="Lotuss Smart TX" w:eastAsia="Arial Unicode MS" w:cs="Lotuss Smart TX"/>
+          <w:rFonts w:ascii="Lotuss Smart TX" w:eastAsia="Arial Unicode MS" w:hAnsi="Lotuss Smart TX" w:cs="Lotuss Smart TX"/>
           <w:sz w:val="18"/>
           <w:szCs w:val="18"/>
           <w:u w:val="single"/>
@@ -1032,7 +890,7 @@
           <w:ilvl w:val="0"/>
           <w:numId w:val="4"/>
         </w:numPr>
-        <w:spacing w:before="40" w:after="96" w:afterLines="40" w:line="280" w:lineRule="exact"/>
+        <w:spacing w:before="40" w:afterLines="40" w:after="96" w:line="280" w:lineRule="exact"/>
         <w:jc w:val="thaiDistribute"/>
         <w:rPr>
           <w:rFonts w:ascii="Lotuss Smart TX" w:hAnsi="Lotuss Smart TX" w:cs="Lotuss Smart TX"/>
@@ -1060,7 +918,7 @@
           <w:ilvl w:val="0"/>
           <w:numId w:val="4"/>
         </w:numPr>
-        <w:spacing w:before="40" w:after="96" w:afterLines="40" w:line="280" w:lineRule="exact"/>
+        <w:spacing w:before="40" w:afterLines="40" w:after="96" w:line="280" w:lineRule="exact"/>
         <w:jc w:val="thaiDistribute"/>
         <w:rPr>
           <w:rFonts w:ascii="Lotuss Smart TX" w:hAnsi="Lotuss Smart TX" w:cs="Lotuss Smart TX"/>
@@ -1123,7 +981,6 @@
         </w:rPr>
         <w:t xml:space="preserve">หรือ </w:t>
       </w:r>
-      <w:proofErr w:type="spellStart"/>
       <w:r>
         <w:rPr>
           <w:rFonts w:ascii="Lotuss Smart TX" w:hAnsi="Lotuss Smart TX" w:cs="Lotuss Smart TX"/>
@@ -1132,18 +989,7 @@
           <w:szCs w:val="18"/>
           <w:lang w:eastAsia="th-TH"/>
         </w:rPr>
-        <w:t>iExpense</w:t>
-      </w:r>
-      <w:proofErr w:type="spellEnd"/>
-      <w:r>
-        <w:rPr>
-          <w:rFonts w:ascii="Lotuss Smart TX" w:hAnsi="Lotuss Smart TX" w:cs="Lotuss Smart TX"/>
-          <w:snapToGrid w:val="0"/>
-          <w:sz w:val="18"/>
-          <w:szCs w:val="18"/>
-          <w:lang w:eastAsia="th-TH"/>
-        </w:rPr>
-        <w:t xml:space="preserve"> </w:t>
+        <w:t xml:space="preserve">iExpense </w:t>
       </w:r>
       <w:r>
         <w:rPr>
@@ -1185,7 +1031,7 @@
           <w:ilvl w:val="0"/>
           <w:numId w:val="4"/>
         </w:numPr>
-        <w:spacing w:before="40" w:after="96" w:afterLines="40" w:line="280" w:lineRule="exact"/>
+        <w:spacing w:before="40" w:afterLines="40" w:after="96" w:line="280" w:lineRule="exact"/>
         <w:jc w:val="thaiDistribute"/>
         <w:rPr>
           <w:rFonts w:ascii="Lotuss Smart TX" w:hAnsi="Lotuss Smart TX" w:cs="Lotuss Smart TX"/>
@@ -1214,7 +1060,7 @@
           <w:ilvl w:val="0"/>
           <w:numId w:val="4"/>
         </w:numPr>
-        <w:spacing w:before="40" w:after="96" w:afterLines="40" w:line="280" w:lineRule="exact"/>
+        <w:spacing w:before="40" w:afterLines="40" w:after="96" w:line="280" w:lineRule="exact"/>
         <w:jc w:val="thaiDistribute"/>
         <w:rPr>
           <w:rFonts w:ascii="Lotuss Smart TX" w:hAnsi="Lotuss Smart TX" w:cs="Lotuss Smart TX"/>
@@ -1262,70 +1108,39 @@
           <w:snapToGrid w:val="0"/>
           <w:sz w:val="18"/>
           <w:szCs w:val="18"/>
+          <w:lang w:val="en-US" w:eastAsia="th-TH"/>
+        </w:rPr>
+        <w:t>5</w:t>
+      </w:r>
+      <w:r>
+        <w:rPr>
+          <w:rFonts w:ascii="Lotuss Smart TX" w:hAnsi="Lotuss Smart TX" w:cs="Lotuss Smart TX"/>
+          <w:snapToGrid w:val="0"/>
+          <w:sz w:val="18"/>
+          <w:szCs w:val="18"/>
           <w:cs/>
           <w:lang w:eastAsia="th-TH"/>
         </w:rPr>
-        <w:t>7</w:t>
-      </w:r>
-      <w:r>
-        <w:rPr>
-          <w:rFonts w:ascii="Lotuss Smart TX" w:hAnsi="Lotuss Smart TX" w:cs="Lotuss Smart TX"/>
-          <w:snapToGrid w:val="0"/>
-          <w:sz w:val="18"/>
-          <w:szCs w:val="18"/>
-          <w:cs/>
+        <w:t xml:space="preserve"> วันทำการ และต้องไม่ก่อนวันที่คาดว่าจะดำเนินกิจกรรมธุรกิจที่ได้รับอนุมัติเกินกว่า 10 วันทำการ</w:t>
+      </w:r>
+    </w:p>
+    <w:p>
+      <w:pPr>
+        <w:pStyle w:val="ListParagraph"/>
+        <w:rPr>
+          <w:rFonts w:ascii="Lotuss Smart TX" w:hAnsi="Lotuss Smart TX" w:cs="Lotuss Smart TX"/>
+          <w:sz w:val="18"/>
+          <w:szCs w:val="18"/>
           <w:lang w:eastAsia="th-TH"/>
         </w:rPr>
-        <w:t xml:space="preserve"> </w:t>
-      </w:r>
-      <w:r>
-        <w:rPr>
-          <w:rFonts w:ascii="Lotuss Smart TX" w:hAnsi="Lotuss Smart TX" w:cs="Lotuss Smart TX"/>
-          <w:snapToGrid w:val="0"/>
-          <w:sz w:val="18"/>
-          <w:szCs w:val="18"/>
-          <w:cs/>
-          <w:lang w:eastAsia="th-TH"/>
-        </w:rPr>
-        <w:t>ว</w:t>
-      </w:r>
-      <w:r>
-        <w:rPr>
-          <w:rFonts w:ascii="Lotuss Smart TX" w:hAnsi="Lotuss Smart TX" w:cs="Lotuss Smart TX"/>
-          <w:snapToGrid w:val="0"/>
-          <w:sz w:val="18"/>
-          <w:szCs w:val="18"/>
-          <w:cs/>
-          <w:lang w:eastAsia="th-TH"/>
-        </w:rPr>
-        <w:t>ันทำการ และต้องไม่ก่อนวันที่คาดว่าจะดำเนินกิจกรรมธุรกิจที่ได้รับอนุมัติเกินกว่า 10 วันทำการ</w:t>
-      </w:r>
-    </w:p>
-    <w:p w14:noSpellErr="1">
-      <w:pPr>
-        <w:pStyle w:val="ListParagraph"/>
-        <w:rPr>
-          <w:rFonts w:ascii="Lotuss Smart TX" w:hAnsi="Lotuss Smart TX" w:cs="Lotuss Smart TX"/>
-          <w:sz w:val="22"/>
-          <w:szCs w:val="22"/>
-          <w:lang w:eastAsia="th-TH"/>
-        </w:rPr>
-      </w:pPr>
-      <w:r>
-        <w:rPr/>
-        <w:t>โดยปกติแล้วกิจกรรมธุรกิจที่จะเบิกเงินทดรองจ่าย ต้องเกิดขึ้นหลังจากได้รับเงินทดรองจ่าย หากกิจกรรมธุรกิจเกิดแล้วพนักงานจะต้องใช้ระเบียบปฏิบัติการเบิกค่าใช้จ่ายพนักงาน (</w:t>
-      </w:r>
-      <w:r>
-        <w:rPr/>
-        <w:t>FA-G-</w:t>
-      </w:r>
-      <w:r>
-        <w:rPr/>
-        <w:t xml:space="preserve">02) </w:t>
-      </w:r>
-      <w:r>
-        <w:rPr/>
-        <w:t>แทน</w:t>
+      </w:pPr>
+      <w:r>
+        <w:rPr>
+          <w:rFonts w:ascii="Lotuss Smart TX" w:hAnsi="Lotuss Smart TX" w:cs="Lotuss Smart TX"/>
+          <w:sz w:val="18"/>
+          <w:szCs w:val="18"/>
+        </w:rPr>
+        <w:t>โดยปกติแล้วกิจกรรมธุรกิจที่จะเบิกเงินทดรองจ่าย ต้องเกิดขึ้นหลังจากได้รับเงินทดรองจ่าย หากกิจกรรมธุรกิจเกิดแล้วพนักงานจะต้องใช้ระเบียบปฏิบัติการเบิกค่าใช้จ่ายพนักงาน (FA-G-02) แทน</w:t>
       </w:r>
     </w:p>
     <w:p>
@@ -1335,7 +1150,7 @@
           <w:ilvl w:val="0"/>
           <w:numId w:val="4"/>
         </w:numPr>
-        <w:spacing w:before="40" w:after="96" w:afterLines="40" w:line="280" w:lineRule="exact"/>
+        <w:spacing w:before="40" w:afterLines="40" w:after="96" w:line="280" w:lineRule="exact"/>
         <w:jc w:val="thaiDistribute"/>
         <w:rPr>
           <w:rStyle w:val="eop"/>
@@ -1378,18 +1193,30 @@
           <w:szCs w:val="18"/>
           <w:shd w:val="clear" w:color="auto" w:fill="FFFFFF"/>
         </w:rPr>
-        <w:t xml:space="preserve">หรือเคลีย์</w:t>
+        <w:t>หรือเคลีย</w:t>
       </w:r>
       <w:r>
         <w:rPr>
           <w:rStyle w:val="normaltextrun"/>
-          <w:rFonts w:ascii="Lotuss Smart TX" w:hAnsi="Lotuss Smart TX" w:cs="Lotuss Smart TX"/>
+          <w:rFonts w:ascii="Lotuss Smart TX" w:hAnsi="Lotuss Smart TX" w:cs="Lotuss Smart TX" w:hint="cs"/>
           <w:color w:val="000000"/>
           <w:sz w:val="18"/>
           <w:szCs w:val="18"/>
           <w:shd w:val="clear" w:color="auto" w:fill="FFFFFF"/>
           <w:cs/>
         </w:rPr>
+        <w:t>ร์</w:t>
+      </w:r>
+      <w:r>
+        <w:rPr>
+          <w:rStyle w:val="normaltextrun"/>
+          <w:rFonts w:ascii="Lotuss Smart TX" w:hAnsi="Lotuss Smart TX" w:cs="Lotuss Smart TX"/>
+          <w:color w:val="000000"/>
+          <w:sz w:val="18"/>
+          <w:szCs w:val="18"/>
+          <w:shd w:val="clear" w:color="auto" w:fill="FFFFFF"/>
+          <w:cs/>
+        </w:rPr>
         <w:t>เงินทดรองจ่าย (</w:t>
       </w:r>
       <w:r>
@@ -1436,19 +1263,7 @@
           <w:shd w:val="clear" w:color="auto" w:fill="FFFFFF"/>
           <w:cs/>
         </w:rPr>
-        <w:t>วัน</w:t>
-      </w:r>
-      <w:r>
-        <w:rPr>
-          <w:rStyle w:val="normaltextrun"/>
-          <w:rFonts w:ascii="Lotuss Smart TX" w:hAnsi="Lotuss Smart TX" w:cs="Lotuss Smart TX"/>
-          <w:color w:val="000000"/>
-          <w:sz w:val="18"/>
-          <w:szCs w:val="18"/>
-          <w:shd w:val="clear" w:color="auto" w:fill="FFFFFF"/>
-          <w:cs/>
-        </w:rPr>
-        <w:t>นับจากวันที่ได้รับเงินทดรองจ่าย</w:t>
+        <w:t>วันนับจากวันที่ได้รับเงินทดรองจ่าย</w:t>
       </w:r>
       <w:r>
         <w:rPr>
@@ -1469,7 +1284,7 @@
           <w:ilvl w:val="0"/>
           <w:numId w:val="4"/>
         </w:numPr>
-        <w:spacing w:before="40" w:after="96" w:afterLines="40" w:line="280" w:lineRule="exact"/>
+        <w:spacing w:before="40" w:afterLines="40" w:after="96" w:line="280" w:lineRule="exact"/>
         <w:jc w:val="thaiDistribute"/>
         <w:rPr>
           <w:rFonts w:ascii="Lotuss Smart TX" w:hAnsi="Lotuss Smart TX" w:cs="Lotuss Smart TX"/>
@@ -1668,7 +1483,7 @@
           <w:ilvl w:val="0"/>
           <w:numId w:val="4"/>
         </w:numPr>
-        <w:spacing w:before="40" w:after="96" w:afterLines="40" w:line="280" w:lineRule="exact"/>
+        <w:spacing w:before="40" w:afterLines="40" w:after="96" w:line="280" w:lineRule="exact"/>
         <w:jc w:val="thaiDistribute"/>
         <w:rPr>
           <w:rFonts w:ascii="Lotuss Smart TX" w:hAnsi="Lotuss Smart TX" w:cs="Lotuss Smart TX"/>
@@ -1728,7 +1543,7 @@
     <w:p>
       <w:pPr>
         <w:pStyle w:val="ListParagraph"/>
-        <w:spacing w:before="40" w:after="96" w:afterLines="40" w:line="280" w:lineRule="exact"/>
+        <w:spacing w:before="40" w:afterLines="40" w:after="96" w:line="280" w:lineRule="exact"/>
         <w:jc w:val="thaiDistribute"/>
         <w:rPr>
           <w:rFonts w:ascii="Lotuss Smart TX" w:hAnsi="Lotuss Smart TX" w:cs="Lotuss Smart TX"/>
@@ -1741,7 +1556,7 @@
     </w:p>
     <w:p>
       <w:pPr>
-        <w:spacing w:after="96" w:afterLines="40" w:line="280" w:lineRule="exact"/>
+        <w:spacing w:afterLines="40" w:after="96" w:line="280" w:lineRule="exact"/>
         <w:jc w:val="thaiDistribute"/>
         <w:rPr>
           <w:rFonts w:ascii="Lotuss Smart TX" w:hAnsi="Lotuss Smart TX" w:cs="Lotuss Smart TX"/>
@@ -1753,7 +1568,7 @@
       </w:pPr>
       <w:r>
         <w:rPr>
-          <w:rFonts w:ascii="Lotuss Smart TX" w:hAnsi="Lotuss Smart TX" w:eastAsia="Arial Unicode MS" w:cs="Lotuss Smart TX"/>
+          <w:rFonts w:ascii="Lotuss Smart TX" w:eastAsia="Arial Unicode MS" w:hAnsi="Lotuss Smart TX" w:cs="Lotuss Smart TX"/>
           <w:bCs/>
           <w:sz w:val="18"/>
           <w:szCs w:val="18"/>
@@ -1762,7 +1577,7 @@
       </w:r>
       <w:r>
         <w:rPr>
-          <w:rFonts w:ascii="Lotuss Smart TX" w:hAnsi="Lotuss Smart TX" w:eastAsia="Arial Unicode MS" w:cs="Lotuss Smart TX"/>
+          <w:rFonts w:ascii="Lotuss Smart TX" w:eastAsia="Arial Unicode MS" w:hAnsi="Lotuss Smart TX" w:cs="Lotuss Smart TX"/>
           <w:bCs/>
           <w:sz w:val="18"/>
           <w:szCs w:val="18"/>
@@ -1778,10 +1593,10 @@
           <w:ilvl w:val="0"/>
           <w:numId w:val="5"/>
         </w:numPr>
-        <w:spacing w:before="40" w:after="96" w:afterLines="40" w:line="280" w:lineRule="exact"/>
+        <w:spacing w:before="40" w:afterLines="40" w:after="96" w:line="280" w:lineRule="exact"/>
         <w:jc w:val="thaiDistribute"/>
         <w:rPr>
-          <w:rFonts w:ascii="Lotuss Smart TX" w:hAnsi="Lotuss Smart TX" w:eastAsia="Arial Unicode MS" w:cs="Lotuss Smart TX"/>
+          <w:rFonts w:ascii="Lotuss Smart TX" w:eastAsia="Arial Unicode MS" w:hAnsi="Lotuss Smart TX" w:cs="Lotuss Smart TX"/>
           <w:b/>
           <w:sz w:val="18"/>
           <w:szCs w:val="18"/>
@@ -1789,7 +1604,7 @@
       </w:pPr>
       <w:r>
         <w:rPr>
-          <w:rFonts w:ascii="Lotuss Smart TX" w:hAnsi="Lotuss Smart TX" w:eastAsia="Arial Unicode MS" w:cs="Lotuss Smart TX"/>
+          <w:rFonts w:ascii="Lotuss Smart TX" w:eastAsia="Arial Unicode MS" w:hAnsi="Lotuss Smart TX" w:cs="Lotuss Smart TX"/>
           <w:b/>
           <w:sz w:val="18"/>
           <w:szCs w:val="18"/>
@@ -1810,7 +1625,7 @@
       </w:pPr>
       <w:r>
         <w:rPr>
-          <w:rFonts w:ascii="Lotuss Smart TX" w:hAnsi="Lotuss Smart TX" w:eastAsia="Arial Unicode MS" w:cs="Lotuss Smart TX"/>
+          <w:rFonts w:ascii="Lotuss Smart TX" w:eastAsia="Arial Unicode MS" w:hAnsi="Lotuss Smart TX" w:cs="Lotuss Smart TX"/>
           <w:bCs/>
           <w:sz w:val="18"/>
           <w:szCs w:val="18"/>
@@ -1819,7 +1634,7 @@
       </w:r>
       <w:r>
         <w:rPr>
-          <w:rFonts w:ascii="Lotuss Smart TX" w:hAnsi="Lotuss Smart TX" w:eastAsia="Arial Unicode MS" w:cs="Lotuss Smart TX"/>
+          <w:rFonts w:ascii="Lotuss Smart TX" w:eastAsia="Arial Unicode MS" w:hAnsi="Lotuss Smart TX" w:cs="Lotuss Smart TX"/>
           <w:bCs/>
           <w:sz w:val="18"/>
           <w:szCs w:val="18"/>
@@ -1829,7 +1644,7 @@
       </w:r>
       <w:r>
         <w:rPr>
-          <w:rFonts w:ascii="Lotuss Smart TX" w:hAnsi="Lotuss Smart TX" w:eastAsia="Arial Unicode MS" w:cs="Lotuss Smart TX"/>
+          <w:rFonts w:ascii="Lotuss Smart TX" w:eastAsia="Arial Unicode MS" w:hAnsi="Lotuss Smart TX" w:cs="Lotuss Smart TX"/>
           <w:b/>
           <w:sz w:val="18"/>
           <w:szCs w:val="18"/>
@@ -1838,7 +1653,7 @@
       </w:r>
       <w:r>
         <w:rPr>
-          <w:rFonts w:ascii="Lotuss Smart TX" w:hAnsi="Lotuss Smart TX" w:eastAsia="Arial Unicode MS" w:cs="Lotuss Smart TX"/>
+          <w:rFonts w:ascii="Lotuss Smart TX" w:eastAsia="Arial Unicode MS" w:hAnsi="Lotuss Smart TX" w:cs="Lotuss Smart TX"/>
           <w:bCs/>
           <w:sz w:val="18"/>
           <w:szCs w:val="18"/>
@@ -1856,14 +1671,14 @@
         </w:numPr>
         <w:spacing w:before="240" w:line="240" w:lineRule="auto"/>
         <w:rPr>
-          <w:rFonts w:ascii="Lotuss Smart TX" w:hAnsi="Lotuss Smart TX" w:eastAsia="Arial Unicode MS" w:cs="Lotuss Smart TX"/>
-          <w:sz w:val="18"/>
-          <w:szCs w:val="18"/>
-        </w:rPr>
-      </w:pPr>
-      <w:r>
-        <w:rPr>
-          <w:rFonts w:ascii="Lotuss Smart TX" w:hAnsi="Lotuss Smart TX" w:eastAsia="Arial Unicode MS" w:cs="Lotuss Smart TX"/>
+          <w:rFonts w:ascii="Lotuss Smart TX" w:eastAsia="Arial Unicode MS" w:hAnsi="Lotuss Smart TX" w:cs="Lotuss Smart TX"/>
+          <w:sz w:val="18"/>
+          <w:szCs w:val="18"/>
+        </w:rPr>
+      </w:pPr>
+      <w:r>
+        <w:rPr>
+          <w:rFonts w:ascii="Lotuss Smart TX" w:eastAsia="Arial Unicode MS" w:hAnsi="Lotuss Smart TX" w:cs="Lotuss Smart TX"/>
           <w:sz w:val="18"/>
           <w:szCs w:val="18"/>
           <w:cs/>
@@ -1872,7 +1687,7 @@
       </w:r>
       <w:r>
         <w:rPr>
-          <w:rFonts w:ascii="Lotuss Smart TX" w:hAnsi="Lotuss Smart TX" w:eastAsia="Arial Unicode MS" w:cs="Lotuss Smart TX"/>
+          <w:rFonts w:ascii="Lotuss Smart TX" w:eastAsia="Arial Unicode MS" w:hAnsi="Lotuss Smart TX" w:cs="Lotuss Smart TX"/>
           <w:sz w:val="18"/>
           <w:szCs w:val="18"/>
         </w:rPr>
@@ -1880,7 +1695,7 @@
       </w:r>
       <w:r>
         <w:rPr>
-          <w:rFonts w:ascii="Lotuss Smart TX" w:hAnsi="Lotuss Smart TX" w:eastAsia="Arial Unicode MS" w:cs="Lotuss Smart TX"/>
+          <w:rFonts w:ascii="Lotuss Smart TX" w:eastAsia="Arial Unicode MS" w:hAnsi="Lotuss Smart TX" w:cs="Lotuss Smart TX"/>
           <w:sz w:val="18"/>
           <w:szCs w:val="18"/>
           <w:cs/>
@@ -1889,7 +1704,7 @@
       </w:r>
       <w:r>
         <w:rPr>
-          <w:rFonts w:ascii="Lotuss Smart TX" w:hAnsi="Lotuss Smart TX" w:eastAsia="Arial Unicode MS" w:cs="Lotuss Smart TX"/>
+          <w:rFonts w:ascii="Lotuss Smart TX" w:eastAsia="Arial Unicode MS" w:hAnsi="Lotuss Smart TX" w:cs="Lotuss Smart TX"/>
           <w:sz w:val="18"/>
           <w:szCs w:val="18"/>
         </w:rPr>
@@ -1897,7 +1712,7 @@
       </w:r>
       <w:r>
         <w:rPr>
-          <w:rFonts w:ascii="Lotuss Smart TX" w:hAnsi="Lotuss Smart TX" w:eastAsia="Arial Unicode MS" w:cs="Lotuss Smart TX"/>
+          <w:rFonts w:ascii="Lotuss Smart TX" w:eastAsia="Arial Unicode MS" w:hAnsi="Lotuss Smart TX" w:cs="Lotuss Smart TX"/>
           <w:sz w:val="18"/>
           <w:szCs w:val="18"/>
           <w:cs/>
@@ -1914,14 +1729,14 @@
         </w:numPr>
         <w:spacing w:before="240" w:line="240" w:lineRule="auto"/>
         <w:rPr>
-          <w:rFonts w:ascii="Lotuss Smart TX" w:hAnsi="Lotuss Smart TX" w:eastAsia="Arial Unicode MS" w:cs="Lotuss Smart TX"/>
-          <w:sz w:val="18"/>
-          <w:szCs w:val="18"/>
-        </w:rPr>
-      </w:pPr>
-      <w:r>
-        <w:rPr>
-          <w:rFonts w:ascii="Lotuss Smart TX" w:hAnsi="Lotuss Smart TX" w:eastAsia="Arial Unicode MS" w:cs="Lotuss Smart TX"/>
+          <w:rFonts w:ascii="Lotuss Smart TX" w:eastAsia="Arial Unicode MS" w:hAnsi="Lotuss Smart TX" w:cs="Lotuss Smart TX"/>
+          <w:sz w:val="18"/>
+          <w:szCs w:val="18"/>
+        </w:rPr>
+      </w:pPr>
+      <w:r>
+        <w:rPr>
+          <w:rFonts w:ascii="Lotuss Smart TX" w:eastAsia="Arial Unicode MS" w:hAnsi="Lotuss Smart TX" w:cs="Lotuss Smart TX"/>
           <w:sz w:val="18"/>
           <w:szCs w:val="18"/>
           <w:cs/>
@@ -1938,14 +1753,14 @@
         </w:numPr>
         <w:spacing w:before="240" w:line="240" w:lineRule="auto"/>
         <w:rPr>
-          <w:rFonts w:ascii="Lotuss Smart TX" w:hAnsi="Lotuss Smart TX" w:eastAsia="Arial Unicode MS" w:cs="Lotuss Smart TX"/>
-          <w:sz w:val="18"/>
-          <w:szCs w:val="18"/>
-        </w:rPr>
-      </w:pPr>
-      <w:r>
-        <w:rPr>
-          <w:rFonts w:ascii="Lotuss Smart TX" w:hAnsi="Lotuss Smart TX" w:eastAsia="Arial Unicode MS" w:cs="Lotuss Smart TX"/>
+          <w:rFonts w:ascii="Lotuss Smart TX" w:eastAsia="Arial Unicode MS" w:hAnsi="Lotuss Smart TX" w:cs="Lotuss Smart TX"/>
+          <w:sz w:val="18"/>
+          <w:szCs w:val="18"/>
+        </w:rPr>
+      </w:pPr>
+      <w:r>
+        <w:rPr>
+          <w:rFonts w:ascii="Lotuss Smart TX" w:eastAsia="Arial Unicode MS" w:hAnsi="Lotuss Smart TX" w:cs="Lotuss Smart TX"/>
           <w:sz w:val="18"/>
           <w:szCs w:val="18"/>
           <w:cs/>
@@ -1954,7 +1769,7 @@
       </w:r>
       <w:r>
         <w:rPr>
-          <w:rFonts w:ascii="Lotuss Smart TX" w:hAnsi="Lotuss Smart TX" w:eastAsia="Arial Unicode MS" w:cs="Lotuss Smart TX"/>
+          <w:rFonts w:ascii="Lotuss Smart TX" w:eastAsia="Arial Unicode MS" w:hAnsi="Lotuss Smart TX" w:cs="Lotuss Smart TX"/>
           <w:sz w:val="18"/>
           <w:szCs w:val="18"/>
         </w:rPr>
@@ -1962,7 +1777,7 @@
       </w:r>
       <w:r>
         <w:rPr>
-          <w:rFonts w:ascii="Lotuss Smart TX" w:hAnsi="Lotuss Smart TX" w:eastAsia="Arial Unicode MS" w:cs="Lotuss Smart TX"/>
+          <w:rFonts w:ascii="Lotuss Smart TX" w:eastAsia="Arial Unicode MS" w:hAnsi="Lotuss Smart TX" w:cs="Lotuss Smart TX"/>
           <w:sz w:val="18"/>
           <w:szCs w:val="18"/>
           <w:cs/>
@@ -1971,7 +1786,7 @@
       </w:r>
       <w:r>
         <w:rPr>
-          <w:rFonts w:ascii="Lotuss Smart TX" w:hAnsi="Lotuss Smart TX" w:eastAsia="Arial Unicode MS" w:cs="Lotuss Smart TX"/>
+          <w:rFonts w:ascii="Lotuss Smart TX" w:eastAsia="Arial Unicode MS" w:hAnsi="Lotuss Smart TX" w:cs="Lotuss Smart TX"/>
           <w:sz w:val="18"/>
           <w:szCs w:val="18"/>
           <w:cs/>
@@ -1980,7 +1795,7 @@
       </w:r>
       <w:r>
         <w:rPr>
-          <w:rFonts w:ascii="Lotuss Smart TX" w:hAnsi="Lotuss Smart TX" w:eastAsia="Arial Unicode MS" w:cs="Lotuss Smart TX"/>
+          <w:rFonts w:ascii="Lotuss Smart TX" w:eastAsia="Arial Unicode MS" w:hAnsi="Lotuss Smart TX" w:cs="Lotuss Smart TX"/>
           <w:color w:val="0000FF"/>
           <w:sz w:val="18"/>
           <w:szCs w:val="18"/>
@@ -1990,7 +1805,7 @@
       </w:r>
       <w:r>
         <w:rPr>
-          <w:rFonts w:ascii="Lotuss Smart TX" w:hAnsi="Lotuss Smart TX" w:eastAsia="Arial Unicode MS" w:cs="Lotuss Smart TX"/>
+          <w:rFonts w:ascii="Lotuss Smart TX" w:eastAsia="Arial Unicode MS" w:hAnsi="Lotuss Smart TX" w:cs="Lotuss Smart TX"/>
           <w:color w:val="0000FF"/>
           <w:sz w:val="18"/>
           <w:szCs w:val="18"/>
@@ -1999,7 +1814,7 @@
       </w:r>
       <w:r>
         <w:rPr>
-          <w:rFonts w:ascii="Lotuss Smart TX" w:hAnsi="Lotuss Smart TX" w:eastAsia="Arial Unicode MS" w:cs="Lotuss Smart TX"/>
+          <w:rFonts w:ascii="Lotuss Smart TX" w:eastAsia="Arial Unicode MS" w:hAnsi="Lotuss Smart TX" w:cs="Lotuss Smart TX"/>
           <w:color w:val="0000FF"/>
           <w:sz w:val="18"/>
           <w:szCs w:val="18"/>
@@ -2009,7 +1824,7 @@
       </w:r>
       <w:r>
         <w:rPr>
-          <w:rFonts w:ascii="Lotuss Smart TX" w:hAnsi="Lotuss Smart TX" w:eastAsia="Arial Unicode MS" w:cs="Lotuss Smart TX"/>
+          <w:rFonts w:ascii="Lotuss Smart TX" w:eastAsia="Arial Unicode MS" w:hAnsi="Lotuss Smart TX" w:cs="Lotuss Smart TX"/>
           <w:sz w:val="18"/>
           <w:szCs w:val="18"/>
           <w:cs/>
@@ -2018,7 +1833,7 @@
       </w:r>
       <w:r>
         <w:rPr>
-          <w:rFonts w:ascii="Lotuss Smart TX" w:hAnsi="Lotuss Smart TX" w:eastAsia="Arial Unicode MS" w:cs="Lotuss Smart TX"/>
+          <w:rFonts w:ascii="Lotuss Smart TX" w:eastAsia="Arial Unicode MS" w:hAnsi="Lotuss Smart TX" w:cs="Lotuss Smart TX"/>
           <w:sz w:val="18"/>
           <w:szCs w:val="18"/>
           <w:cs/>
@@ -2027,7 +1842,7 @@
       </w:r>
       <w:r>
         <w:rPr>
-          <w:rFonts w:ascii="Lotuss Smart TX" w:hAnsi="Lotuss Smart TX" w:eastAsia="Arial Unicode MS" w:cs="Lotuss Smart TX"/>
+          <w:rFonts w:ascii="Lotuss Smart TX" w:eastAsia="Arial Unicode MS" w:hAnsi="Lotuss Smart TX" w:cs="Lotuss Smart TX"/>
           <w:color w:val="0000FF"/>
           <w:sz w:val="18"/>
           <w:szCs w:val="18"/>
@@ -2037,7 +1852,7 @@
       </w:r>
       <w:r>
         <w:rPr>
-          <w:rFonts w:ascii="Lotuss Smart TX" w:hAnsi="Lotuss Smart TX" w:eastAsia="Arial Unicode MS" w:cs="Lotuss Smart TX"/>
+          <w:rFonts w:ascii="Lotuss Smart TX" w:eastAsia="Arial Unicode MS" w:hAnsi="Lotuss Smart TX" w:cs="Lotuss Smart TX"/>
           <w:color w:val="0000FF"/>
           <w:sz w:val="18"/>
           <w:szCs w:val="18"/>
@@ -2046,7 +1861,7 @@
       </w:r>
       <w:r>
         <w:rPr>
-          <w:rFonts w:ascii="Lotuss Smart TX" w:hAnsi="Lotuss Smart TX" w:eastAsia="Arial Unicode MS" w:cs="Lotuss Smart TX"/>
+          <w:rFonts w:ascii="Lotuss Smart TX" w:eastAsia="Arial Unicode MS" w:hAnsi="Lotuss Smart TX" w:cs="Lotuss Smart TX"/>
           <w:color w:val="0000FF"/>
           <w:sz w:val="18"/>
           <w:szCs w:val="18"/>
@@ -2059,7 +1874,7 @@
       <w:pPr>
         <w:spacing w:before="240" w:after="240" w:line="240" w:lineRule="auto"/>
         <w:rPr>
-          <w:rFonts w:ascii="Lotuss Smart TX" w:hAnsi="Lotuss Smart TX" w:eastAsia="Arial Unicode MS" w:cs="Lotuss Smart TX"/>
+          <w:rFonts w:ascii="Lotuss Smart TX" w:eastAsia="Arial Unicode MS" w:hAnsi="Lotuss Smart TX" w:cs="Lotuss Smart TX"/>
           <w:bCs/>
           <w:sz w:val="18"/>
           <w:szCs w:val="18"/>
@@ -2067,7 +1882,7 @@
       </w:pPr>
       <w:r>
         <w:rPr>
-          <w:rFonts w:ascii="Lotuss Smart TX" w:hAnsi="Lotuss Smart TX" w:eastAsia="Arial Unicode MS" w:cs="Lotuss Smart TX"/>
+          <w:rFonts w:ascii="Lotuss Smart TX" w:eastAsia="Arial Unicode MS" w:hAnsi="Lotuss Smart TX" w:cs="Lotuss Smart TX"/>
           <w:bCs/>
           <w:sz w:val="18"/>
           <w:szCs w:val="18"/>
@@ -2077,7 +1892,7 @@
       </w:r>
       <w:r>
         <w:rPr>
-          <w:rFonts w:ascii="Lotuss Smart TX" w:hAnsi="Lotuss Smart TX" w:eastAsia="Arial Unicode MS" w:cs="Lotuss Smart TX"/>
+          <w:rFonts w:ascii="Lotuss Smart TX" w:eastAsia="Arial Unicode MS" w:hAnsi="Lotuss Smart TX" w:cs="Lotuss Smart TX"/>
           <w:bCs/>
           <w:sz w:val="18"/>
           <w:szCs w:val="18"/>
@@ -2087,7 +1902,7 @@
       </w:r>
       <w:r>
         <w:rPr>
-          <w:rFonts w:hint="cs" w:ascii="Lotuss Smart TX" w:hAnsi="Lotuss Smart TX" w:eastAsia="Arial Unicode MS" w:cs="Lotuss Smart TX"/>
+          <w:rFonts w:ascii="Lotuss Smart TX" w:eastAsia="Arial Unicode MS" w:hAnsi="Lotuss Smart TX" w:cs="Lotuss Smart TX"/>
           <w:bCs/>
           <w:sz w:val="18"/>
           <w:szCs w:val="18"/>
@@ -2139,7 +1954,7 @@
       <w:pPr>
         <w:spacing w:before="240" w:after="240" w:line="240" w:lineRule="auto"/>
         <w:rPr>
-          <w:rFonts w:ascii="Lotuss Smart TX" w:hAnsi="Lotuss Smart TX" w:eastAsia="Arial Unicode MS" w:cs="Lotuss Smart TX"/>
+          <w:rFonts w:ascii="Lotuss Smart TX" w:eastAsia="Arial Unicode MS" w:hAnsi="Lotuss Smart TX" w:cs="Lotuss Smart TX"/>
           <w:b/>
           <w:bCs/>
           <w:sz w:val="18"/>
@@ -2152,7 +1967,7 @@
       <w:pPr>
         <w:spacing w:before="240" w:after="240" w:line="240" w:lineRule="auto"/>
         <w:rPr>
-          <w:rFonts w:ascii="Lotuss Smart TX" w:hAnsi="Lotuss Smart TX" w:eastAsia="Arial Unicode MS" w:cs="Lotuss Smart TX"/>
+          <w:rFonts w:ascii="Lotuss Smart TX" w:eastAsia="Arial Unicode MS" w:hAnsi="Lotuss Smart TX" w:cs="Lotuss Smart TX"/>
           <w:b/>
           <w:bCs/>
           <w:sz w:val="18"/>
@@ -2165,14 +1980,14 @@
       <w:pPr>
         <w:spacing w:before="240" w:after="240" w:line="240" w:lineRule="auto"/>
         <w:rPr>
-          <w:rFonts w:ascii="Lotuss Smart TX" w:hAnsi="Lotuss Smart TX" w:eastAsia="Arial Unicode MS" w:cs="Lotuss Smart TX"/>
-          <w:sz w:val="18"/>
-          <w:szCs w:val="18"/>
-        </w:rPr>
-      </w:pPr>
-      <w:r>
-        <w:rPr>
-          <w:rFonts w:ascii="Lotuss Smart TX" w:hAnsi="Lotuss Smart TX" w:eastAsia="Arial Unicode MS" w:cs="Lotuss Smart TX"/>
+          <w:rFonts w:ascii="Lotuss Smart TX" w:eastAsia="Arial Unicode MS" w:hAnsi="Lotuss Smart TX" w:cs="Lotuss Smart TX"/>
+          <w:sz w:val="18"/>
+          <w:szCs w:val="18"/>
+        </w:rPr>
+      </w:pPr>
+      <w:r>
+        <w:rPr>
+          <w:rFonts w:ascii="Lotuss Smart TX" w:eastAsia="Arial Unicode MS" w:hAnsi="Lotuss Smart TX" w:cs="Lotuss Smart TX"/>
           <w:b/>
           <w:bCs/>
           <w:sz w:val="18"/>
@@ -2180,12 +1995,11 @@
           <w:u w:val="single"/>
           <w:cs/>
         </w:rPr>
-        <w:lastRenderedPageBreak/>
         <w:t>เอกสารแนบ</w:t>
       </w:r>
       <w:r>
         <w:rPr>
-          <w:rFonts w:ascii="Lotuss Smart TX" w:hAnsi="Lotuss Smart TX" w:eastAsia="Arial Unicode MS" w:cs="Lotuss Smart TX"/>
+          <w:rFonts w:ascii="Lotuss Smart TX" w:eastAsia="Arial Unicode MS" w:hAnsi="Lotuss Smart TX" w:cs="Lotuss Smart TX"/>
           <w:b/>
           <w:bCs/>
           <w:sz w:val="18"/>
@@ -2196,7 +2010,7 @@
       </w:r>
       <w:r>
         <w:rPr>
-          <w:rFonts w:ascii="Lotuss Smart TX" w:hAnsi="Lotuss Smart TX" w:eastAsia="Arial Unicode MS" w:cs="Lotuss Smart TX"/>
+          <w:rFonts w:ascii="Lotuss Smart TX" w:eastAsia="Arial Unicode MS" w:hAnsi="Lotuss Smart TX" w:cs="Lotuss Smart TX"/>
           <w:b/>
           <w:bCs/>
           <w:sz w:val="18"/>
@@ -2208,7 +2022,7 @@
       </w:r>
       <w:r>
         <w:rPr>
-          <w:rFonts w:ascii="Lotuss Smart TX" w:hAnsi="Lotuss Smart TX" w:eastAsia="Arial Unicode MS" w:cs="Lotuss Smart TX"/>
+          <w:rFonts w:ascii="Lotuss Smart TX" w:eastAsia="Arial Unicode MS" w:hAnsi="Lotuss Smart TX" w:cs="Lotuss Smart TX"/>
           <w:sz w:val="18"/>
           <w:szCs w:val="18"/>
           <w:cs/>
@@ -2217,7 +2031,7 @@
       </w:r>
       <w:r>
         <w:rPr>
-          <w:rFonts w:ascii="Lotuss Smart TX" w:hAnsi="Lotuss Smart TX" w:eastAsia="Arial Unicode MS" w:cs="Lotuss Smart TX"/>
+          <w:rFonts w:ascii="Lotuss Smart TX" w:eastAsia="Arial Unicode MS" w:hAnsi="Lotuss Smart TX" w:cs="Lotuss Smart TX"/>
           <w:sz w:val="18"/>
           <w:szCs w:val="18"/>
         </w:rPr>
@@ -2228,7 +2042,7 @@
       <w:pPr>
         <w:spacing w:before="240" w:after="240" w:line="240" w:lineRule="auto"/>
         <w:rPr>
-          <w:rFonts w:ascii="Lotuss Smart TX" w:hAnsi="Lotuss Smart TX" w:eastAsia="Arial Unicode MS" w:cs="Lotuss Smart TX"/>
+          <w:rFonts w:ascii="Lotuss Smart TX" w:eastAsia="Arial Unicode MS" w:hAnsi="Lotuss Smart TX" w:cs="Lotuss Smart TX"/>
           <w:b/>
           <w:bCs/>
           <w:sz w:val="18"/>
@@ -2237,7 +2051,7 @@
       </w:pPr>
       <w:r>
         <w:rPr>
-          <w:rFonts w:ascii="Lotuss Smart TX" w:hAnsi="Lotuss Smart TX" w:eastAsia="Arial Unicode MS" w:cs="Lotuss Smart TX"/>
+          <w:rFonts w:ascii="Lotuss Smart TX" w:eastAsia="Arial Unicode MS" w:hAnsi="Lotuss Smart TX" w:cs="Lotuss Smart TX"/>
           <w:b/>
           <w:bCs/>
           <w:sz w:val="18"/>
@@ -2247,7 +2061,7 @@
       </w:r>
       <w:r>
         <w:rPr>
-          <w:rFonts w:ascii="Lotuss Smart TX" w:hAnsi="Lotuss Smart TX" w:eastAsia="Arial Unicode MS" w:cs="Lotuss Smart TX"/>
+          <w:rFonts w:ascii="Lotuss Smart TX" w:eastAsia="Arial Unicode MS" w:hAnsi="Lotuss Smart TX" w:cs="Lotuss Smart TX"/>
           <w:b/>
           <w:bCs/>
           <w:sz w:val="18"/>
@@ -2266,14 +2080,14 @@
         </w:numPr>
         <w:spacing w:before="240" w:after="240" w:line="240" w:lineRule="auto"/>
         <w:rPr>
-          <w:rFonts w:ascii="Lotuss Smart TX" w:hAnsi="Lotuss Smart TX" w:eastAsia="Arial Unicode MS" w:cs="Lotuss Smart TX"/>
-          <w:sz w:val="18"/>
-          <w:szCs w:val="18"/>
-        </w:rPr>
-      </w:pPr>
-      <w:r>
-        <w:rPr>
-          <w:rFonts w:ascii="Lotuss Smart TX" w:hAnsi="Lotuss Smart TX" w:eastAsia="Arial Unicode MS" w:cs="Lotuss Smart TX"/>
+          <w:rFonts w:ascii="Lotuss Smart TX" w:eastAsia="Arial Unicode MS" w:hAnsi="Lotuss Smart TX" w:cs="Lotuss Smart TX"/>
+          <w:sz w:val="18"/>
+          <w:szCs w:val="18"/>
+        </w:rPr>
+      </w:pPr>
+      <w:r>
+        <w:rPr>
+          <w:rFonts w:ascii="Lotuss Smart TX" w:eastAsia="Arial Unicode MS" w:hAnsi="Lotuss Smart TX" w:cs="Lotuss Smart TX"/>
           <w:sz w:val="18"/>
           <w:szCs w:val="18"/>
           <w:cs/>
@@ -2282,7 +2096,7 @@
       </w:r>
       <w:r>
         <w:rPr>
-          <w:rFonts w:ascii="Lotuss Smart TX" w:hAnsi="Lotuss Smart TX" w:eastAsia="Arial Unicode MS" w:cs="Lotuss Smart TX"/>
+          <w:rFonts w:ascii="Lotuss Smart TX" w:eastAsia="Arial Unicode MS" w:hAnsi="Lotuss Smart TX" w:cs="Lotuss Smart TX"/>
           <w:sz w:val="18"/>
           <w:szCs w:val="18"/>
         </w:rPr>
@@ -2298,14 +2112,14 @@
         </w:numPr>
         <w:spacing w:before="240" w:after="240" w:line="240" w:lineRule="auto"/>
         <w:rPr>
-          <w:rFonts w:ascii="Lotuss Smart TX" w:hAnsi="Lotuss Smart TX" w:eastAsia="Arial Unicode MS" w:cs="Lotuss Smart TX"/>
-          <w:sz w:val="18"/>
-          <w:szCs w:val="18"/>
-        </w:rPr>
-      </w:pPr>
-      <w:r>
-        <w:rPr>
-          <w:rFonts w:ascii="Lotuss Smart TX" w:hAnsi="Lotuss Smart TX" w:eastAsia="Arial Unicode MS" w:cs="Lotuss Smart TX"/>
+          <w:rFonts w:ascii="Lotuss Smart TX" w:eastAsia="Arial Unicode MS" w:hAnsi="Lotuss Smart TX" w:cs="Lotuss Smart TX"/>
+          <w:sz w:val="18"/>
+          <w:szCs w:val="18"/>
+        </w:rPr>
+      </w:pPr>
+      <w:r>
+        <w:rPr>
+          <w:rFonts w:ascii="Lotuss Smart TX" w:eastAsia="Arial Unicode MS" w:hAnsi="Lotuss Smart TX" w:cs="Lotuss Smart TX"/>
           <w:sz w:val="18"/>
           <w:szCs w:val="18"/>
           <w:cs/>
@@ -2314,7 +2128,7 @@
       </w:r>
       <w:r>
         <w:rPr>
-          <w:rFonts w:ascii="Lotuss Smart TX" w:hAnsi="Lotuss Smart TX" w:eastAsia="Arial Unicode MS" w:cs="Lotuss Smart TX"/>
+          <w:rFonts w:ascii="Lotuss Smart TX" w:eastAsia="Arial Unicode MS" w:hAnsi="Lotuss Smart TX" w:cs="Lotuss Smart TX"/>
           <w:sz w:val="18"/>
           <w:szCs w:val="18"/>
         </w:rPr>
@@ -2322,7 +2136,7 @@
       </w:r>
       <w:r>
         <w:rPr>
-          <w:rFonts w:ascii="Lotuss Smart TX" w:hAnsi="Lotuss Smart TX" w:eastAsia="Arial Unicode MS" w:cs="Lotuss Smart TX"/>
+          <w:rFonts w:ascii="Lotuss Smart TX" w:eastAsia="Arial Unicode MS" w:hAnsi="Lotuss Smart TX" w:cs="Lotuss Smart TX"/>
           <w:sz w:val="18"/>
           <w:szCs w:val="18"/>
           <w:cs/>
@@ -2339,14 +2153,14 @@
         </w:numPr>
         <w:spacing w:before="240" w:after="240" w:line="240" w:lineRule="auto"/>
         <w:rPr>
-          <w:rFonts w:ascii="Lotuss Smart TX" w:hAnsi="Lotuss Smart TX" w:eastAsia="Arial Unicode MS" w:cs="Lotuss Smart TX"/>
-          <w:sz w:val="18"/>
-          <w:szCs w:val="18"/>
-        </w:rPr>
-      </w:pPr>
-      <w:r>
-        <w:rPr>
-          <w:rFonts w:hint="cs" w:ascii="Lotuss Smart TX" w:hAnsi="Lotuss Smart TX" w:eastAsia="Arial Unicode MS" w:cs="Lotuss Smart TX"/>
+          <w:rFonts w:ascii="Lotuss Smart TX" w:eastAsia="Arial Unicode MS" w:hAnsi="Lotuss Smart TX" w:cs="Lotuss Smart TX"/>
+          <w:sz w:val="18"/>
+          <w:szCs w:val="18"/>
+        </w:rPr>
+      </w:pPr>
+      <w:r>
+        <w:rPr>
+          <w:rFonts w:ascii="Lotuss Smart TX" w:eastAsia="Arial Unicode MS" w:hAnsi="Lotuss Smart TX" w:cs="Lotuss Smart TX"/>
           <w:sz w:val="18"/>
           <w:szCs w:val="18"/>
           <w:cs/>
@@ -2355,7 +2169,7 @@
       </w:r>
       <w:r>
         <w:rPr>
-          <w:rFonts w:ascii="Lotuss Smart TX" w:hAnsi="Lotuss Smart TX" w:eastAsia="Arial Unicode MS" w:cs="Lotuss Smart TX"/>
+          <w:rFonts w:ascii="Lotuss Smart TX" w:eastAsia="Arial Unicode MS" w:hAnsi="Lotuss Smart TX" w:cs="Lotuss Smart TX"/>
           <w:sz w:val="18"/>
           <w:szCs w:val="18"/>
           <w:cs/>
@@ -2379,7 +2193,7 @@
       <w:pPr>
         <w:spacing w:before="240" w:after="240" w:line="240" w:lineRule="auto"/>
         <w:rPr>
-          <w:rFonts w:ascii="Lotuss Smart TX" w:hAnsi="Lotuss Smart TX" w:eastAsia="Arial Unicode MS" w:cs="Lotuss Smart TX"/>
+          <w:rFonts w:ascii="Lotuss Smart TX" w:eastAsia="Arial Unicode MS" w:hAnsi="Lotuss Smart TX" w:cs="Lotuss Smart TX"/>
           <w:b/>
           <w:bCs/>
           <w:sz w:val="18"/>
@@ -2388,7 +2202,7 @@
       </w:pPr>
       <w:r>
         <w:rPr>
-          <w:rFonts w:ascii="Lotuss Smart TX" w:hAnsi="Lotuss Smart TX" w:eastAsia="Arial Unicode MS" w:cs="Lotuss Smart TX"/>
+          <w:rFonts w:ascii="Lotuss Smart TX" w:eastAsia="Arial Unicode MS" w:hAnsi="Lotuss Smart TX" w:cs="Lotuss Smart TX"/>
           <w:b/>
           <w:bCs/>
           <w:sz w:val="18"/>
@@ -2400,7 +2214,7 @@
       </w:r>
       <w:r>
         <w:rPr>
-          <w:rFonts w:ascii="Lotuss Smart TX" w:hAnsi="Lotuss Smart TX" w:eastAsia="Arial Unicode MS" w:cs="Lotuss Smart TX"/>
+          <w:rFonts w:ascii="Lotuss Smart TX" w:eastAsia="Arial Unicode MS" w:hAnsi="Lotuss Smart TX" w:cs="Lotuss Smart TX"/>
           <w:b/>
           <w:bCs/>
           <w:sz w:val="18"/>
@@ -2414,7 +2228,7 @@
       <w:pPr>
         <w:spacing w:before="240" w:after="240" w:line="240" w:lineRule="auto"/>
         <w:rPr>
-          <w:rFonts w:ascii="Lotuss Smart TX" w:hAnsi="Lotuss Smart TX" w:eastAsia="Arial Unicode MS" w:cs="Lotuss Smart TX"/>
+          <w:rFonts w:ascii="Lotuss Smart TX" w:eastAsia="Arial Unicode MS" w:hAnsi="Lotuss Smart TX" w:cs="Lotuss Smart TX"/>
           <w:b/>
           <w:bCs/>
           <w:sz w:val="18"/>
@@ -2423,7 +2237,7 @@
       </w:pPr>
       <w:r>
         <w:rPr>
-          <w:rFonts w:ascii="Lotuss Smart TX" w:hAnsi="Lotuss Smart TX" w:eastAsia="Arial Unicode MS" w:cs="Lotuss Smart TX"/>
+          <w:rFonts w:ascii="Lotuss Smart TX" w:eastAsia="Arial Unicode MS" w:hAnsi="Lotuss Smart TX" w:cs="Lotuss Smart TX"/>
           <w:b/>
           <w:bCs/>
           <w:sz w:val="18"/>
@@ -2434,7 +2248,7 @@
       </w:r>
       <w:r>
         <w:rPr>
-          <w:rFonts w:ascii="Lotuss Smart TX" w:hAnsi="Lotuss Smart TX" w:eastAsia="Arial Unicode MS" w:cs="Lotuss Smart TX"/>
+          <w:rFonts w:ascii="Lotuss Smart TX" w:eastAsia="Arial Unicode MS" w:hAnsi="Lotuss Smart TX" w:cs="Lotuss Smart TX"/>
           <w:b/>
           <w:bCs/>
           <w:sz w:val="18"/>
@@ -2466,7 +2280,7 @@
       </w:r>
       <w:r>
         <w:rPr>
-          <w:rFonts w:hint="cs" w:ascii="Lotuss Smart TX" w:hAnsi="Lotuss Smart TX" w:cs="Lotuss Smart TX"/>
+          <w:rFonts w:ascii="Lotuss Smart TX" w:hAnsi="Lotuss Smart TX" w:cs="Lotuss Smart TX"/>
           <w:color w:val="FF0000"/>
           <w:sz w:val="18"/>
           <w:szCs w:val="18"/>
@@ -2498,7 +2312,7 @@
       </w:r>
       <w:r>
         <w:rPr>
-          <w:rFonts w:hint="cs" w:ascii="Lotuss Smart TX" w:hAnsi="Lotuss Smart TX" w:cs="Lotuss Smart TX"/>
+          <w:rFonts w:ascii="Lotuss Smart TX" w:hAnsi="Lotuss Smart TX" w:cs="Lotuss Smart TX"/>
           <w:color w:val="0000FF"/>
           <w:sz w:val="18"/>
           <w:szCs w:val="18"/>
@@ -2519,7 +2333,7 @@
       </w:r>
       <w:r>
         <w:rPr>
-          <w:rFonts w:hint="cs" w:ascii="Lotuss Smart TX" w:hAnsi="Lotuss Smart TX" w:cs="Lotuss Smart TX"/>
+          <w:rFonts w:ascii="Lotuss Smart TX" w:hAnsi="Lotuss Smart TX" w:cs="Lotuss Smart TX"/>
           <w:color w:val="0000FF"/>
           <w:sz w:val="18"/>
           <w:szCs w:val="18"/>
@@ -2879,36 +2693,14 @@
       </w:r>
       <w:r>
         <w:rPr>
-          <w:rFonts w:hint="cs" w:ascii="Lotuss Smart TX" w:hAnsi="Lotuss Smart TX" w:cs="Lotuss Smart TX"/>
+          <w:rFonts w:ascii="Lotuss Smart TX" w:hAnsi="Lotuss Smart TX" w:cs="Lotuss Smart TX"/>
           <w:color w:val="0000FF"/>
           <w:sz w:val="18"/>
           <w:szCs w:val="18"/>
           <w:cs/>
           <w:lang w:val="en-US"/>
         </w:rPr>
-        <w:t>กรณี</w:t>
-      </w:r>
-      <w:r>
-        <w:rPr>
-          <w:rFonts w:ascii="Lotuss Smart TX" w:hAnsi="Lotuss Smart TX" w:cs="Lotuss Smart TX"/>
-          <w:color w:val="0000FF"/>
-          <w:sz w:val="18"/>
-          <w:szCs w:val="18"/>
-          <w:cs/>
-          <w:lang w:val="en-US"/>
-        </w:rPr>
-        <w:t xml:space="preserve">สำนักงานใหญ่ </w:t>
-      </w:r>
-      <w:r>
-        <w:rPr>
-          <w:rFonts w:hint="cs" w:ascii="Lotuss Smart TX" w:hAnsi="Lotuss Smart TX" w:cs="Lotuss Smart TX"/>
-          <w:color w:val="0000FF"/>
-          <w:sz w:val="18"/>
-          <w:szCs w:val="18"/>
-          <w:cs/>
-          <w:lang w:val="en-US"/>
-        </w:rPr>
-        <w:t xml:space="preserve">สำหรับ </w:t>
+        <w:t xml:space="preserve">กรณีสำนักงานใหญ่ สำหรับ </w:t>
       </w:r>
       <w:r>
         <w:rPr>
@@ -3329,25 +3121,14 @@
       </w:r>
       <w:r>
         <w:rPr>
-          <w:rFonts w:hint="cs" w:ascii="Lotuss Smart TX" w:hAnsi="Lotuss Smart TX" w:cs="Lotuss Smart TX"/>
+          <w:rFonts w:ascii="Lotuss Smart TX" w:hAnsi="Lotuss Smart TX" w:cs="Lotuss Smart TX"/>
           <w:color w:val="FF0000"/>
           <w:sz w:val="18"/>
           <w:szCs w:val="18"/>
           <w:cs/>
           <w:lang w:val="en-US"/>
         </w:rPr>
-        <w:t>กรณี</w:t>
-      </w:r>
-      <w:r>
-        <w:rPr>
-          <w:rFonts w:hint="cs" w:ascii="Lotuss Smart TX" w:hAnsi="Lotuss Smart TX" w:cs="Lotuss Smart TX"/>
-          <w:color w:val="FF0000"/>
-          <w:sz w:val="18"/>
-          <w:szCs w:val="18"/>
-          <w:cs/>
-          <w:lang w:val="en-US"/>
-        </w:rPr>
-        <w:t xml:space="preserve">ศูนย์กระจายสินค้า </w:t>
+        <w:t xml:space="preserve">กรณีศูนย์กระจายสินค้า </w:t>
       </w:r>
       <w:r>
         <w:rPr>
@@ -3561,6 +3342,7 @@
           <w:cs/>
           <w:lang w:val="en-US"/>
         </w:rPr>
+        <w:lastRenderedPageBreak/>
         <w:t xml:space="preserve">เงินทดรองจ่ายจำนวนไม่เกิน 20,000 บาท จะต้องได้รับอนุมัติขั้นสุดท้ายจาก </w:t>
       </w:r>
       <w:r>
@@ -3597,7 +3379,6 @@
           <w:cs/>
           <w:lang w:val="en-US"/>
         </w:rPr>
-        <w:lastRenderedPageBreak/>
         <w:t>เงินทดรองจ่ายจำนวนมากกว่า 20</w:t>
       </w:r>
       <w:r>
@@ -3630,7 +3411,7 @@
       </w:r>
       <w:r>
         <w:rPr>
-          <w:rFonts w:hint="cs" w:ascii="Lotuss Smart TX" w:hAnsi="Lotuss Smart TX" w:cs="Lotuss Smart TX"/>
+          <w:rFonts w:ascii="Lotuss Smart TX" w:hAnsi="Lotuss Smart TX" w:cs="Lotuss Smart TX"/>
           <w:sz w:val="18"/>
           <w:szCs w:val="18"/>
           <w:cs/>
@@ -3667,29 +3448,7 @@
           <w:szCs w:val="18"/>
           <w:lang w:val="en-US"/>
         </w:rPr>
-        <w:t xml:space="preserve">## </w:t>
-      </w:r>
-      <w:proofErr w:type="spellStart"/>
-      <w:r>
-        <w:rPr>
-          <w:rFonts w:ascii="Lotuss Smart TX" w:hAnsi="Lotuss Smart TX" w:cs="Lotuss Smart TX"/>
-          <w:color w:val="FF0000"/>
-          <w:sz w:val="18"/>
-          <w:szCs w:val="18"/>
-          <w:lang w:val="en-US"/>
-        </w:rPr>
-        <w:t>กรณีสาขา</w:t>
-      </w:r>
-      <w:proofErr w:type="spellEnd"/>
-      <w:r>
-        <w:rPr>
-          <w:rFonts w:ascii="Lotuss Smart TX" w:hAnsi="Lotuss Smart TX" w:cs="Lotuss Smart TX"/>
-          <w:color w:val="FF0000"/>
-          <w:sz w:val="18"/>
-          <w:szCs w:val="18"/>
-          <w:lang w:val="en-US"/>
-        </w:rPr>
-        <w:t xml:space="preserve"> Retail Operation</w:t>
+        <w:t>## กรณีสาขา Retail Operation</w:t>
       </w:r>
     </w:p>
     <w:p>
@@ -3714,7 +3473,7 @@
       </w:r>
       <w:r>
         <w:rPr>
-          <w:rFonts w:hint="cs" w:ascii="Lotuss Smart TX" w:hAnsi="Lotuss Smart TX" w:cs="Lotuss Smart TX"/>
+          <w:rFonts w:ascii="Lotuss Smart TX" w:hAnsi="Lotuss Smart TX" w:cs="Lotuss Smart TX"/>
           <w:color w:val="0000FF"/>
           <w:sz w:val="18"/>
           <w:szCs w:val="18"/>
@@ -3735,7 +3494,7 @@
       </w:r>
       <w:r>
         <w:rPr>
-          <w:rFonts w:hint="cs" w:ascii="Lotuss Smart TX" w:hAnsi="Lotuss Smart TX" w:cs="Lotuss Smart TX"/>
+          <w:rFonts w:ascii="Lotuss Smart TX" w:hAnsi="Lotuss Smart TX" w:cs="Lotuss Smart TX"/>
           <w:color w:val="0000FF"/>
           <w:sz w:val="18"/>
           <w:szCs w:val="18"/>
@@ -4038,7 +3797,7 @@
       </w:r>
       <w:r>
         <w:rPr>
-          <w:rFonts w:hint="cs" w:ascii="Lotuss Smart TX" w:hAnsi="Lotuss Smart TX" w:cs="Lotuss Smart TX"/>
+          <w:rFonts w:ascii="Lotuss Smart TX" w:hAnsi="Lotuss Smart TX" w:cs="Lotuss Smart TX"/>
           <w:color w:val="0000FF"/>
           <w:sz w:val="18"/>
           <w:szCs w:val="18"/>
@@ -4059,29 +3818,27 @@
       </w:r>
       <w:r>
         <w:rPr>
-          <w:rFonts w:hint="cs" w:ascii="Lotuss Smart TX" w:hAnsi="Lotuss Smart TX" w:cs="Lotuss Smart TX"/>
+          <w:rFonts w:ascii="Lotuss Smart TX" w:hAnsi="Lotuss Smart TX" w:cs="Lotuss Smart TX"/>
           <w:color w:val="0000FF"/>
           <w:sz w:val="18"/>
           <w:szCs w:val="18"/>
           <w:cs/>
           <w:lang w:val="en-US"/>
         </w:rPr>
-        <w:t>สำหรับ</w:t>
-      </w:r>
-      <w:r>
-        <w:rPr>
-          <w:rFonts w:hint="cs" w:ascii="Lotuss Smart TX" w:hAnsi="Lotuss Smart TX" w:cs="Lotuss Smart TX"/>
+        <w:t>สำหรับค่าสาธาณูปโภค</w:t>
+      </w:r>
+    </w:p>
+    <w:p>
+      <w:pPr>
+        <w:rPr>
+          <w:rFonts w:ascii="Lotuss Smart TX" w:hAnsi="Lotuss Smart TX" w:cs="Lotuss Smart TX"/>
           <w:color w:val="0000FF"/>
           <w:sz w:val="18"/>
           <w:szCs w:val="18"/>
-          <w:cs/>
-          <w:lang w:val="en-US"/>
-        </w:rPr>
-        <w:t>ค่าสาธาณูปโภค</w:t>
-      </w:r>
-    </w:p>
-    <w:p>
-      <w:pPr>
+          <w:lang w:val="en-US"/>
+        </w:rPr>
+      </w:pPr>
+      <w:r>
         <w:rPr>
           <w:rFonts w:ascii="Lotuss Smart TX" w:hAnsi="Lotuss Smart TX" w:cs="Lotuss Smart TX"/>
           <w:color w:val="0000FF"/>
@@ -4089,16 +3846,18 @@
           <w:szCs w:val="18"/>
           <w:lang w:val="en-US"/>
         </w:rPr>
-      </w:pPr>
+        <w:t xml:space="preserve">#### </w:t>
+      </w:r>
       <w:r>
         <w:rPr>
           <w:rFonts w:ascii="Lotuss Smart TX" w:hAnsi="Lotuss Smart TX" w:cs="Lotuss Smart TX"/>
           <w:color w:val="0000FF"/>
           <w:sz w:val="18"/>
           <w:szCs w:val="18"/>
-          <w:lang w:val="en-US"/>
-        </w:rPr>
-        <w:t>####</w:t>
+          <w:cs/>
+          <w:lang w:val="en-US"/>
+        </w:rPr>
+        <w:t xml:space="preserve">กรณีสาขา </w:t>
       </w:r>
       <w:r>
         <w:rPr>
@@ -4108,50 +3867,18 @@
           <w:szCs w:val="18"/>
           <w:lang w:val="en-US"/>
         </w:rPr>
-        <w:t xml:space="preserve"> </w:t>
-      </w:r>
-      <w:r>
-        <w:rPr>
-          <w:rFonts w:hint="cs" w:ascii="Lotuss Smart TX" w:hAnsi="Lotuss Smart TX" w:cs="Lotuss Smart TX"/>
+        <w:t xml:space="preserve">Retail Operation </w:t>
+      </w:r>
+      <w:r>
+        <w:rPr>
+          <w:rFonts w:ascii="Lotuss Smart TX" w:hAnsi="Lotuss Smart TX" w:cs="Lotuss Smart TX"/>
           <w:color w:val="0000FF"/>
           <w:sz w:val="18"/>
           <w:szCs w:val="18"/>
           <w:cs/>
           <w:lang w:val="en-US"/>
         </w:rPr>
-        <w:t xml:space="preserve">กรณีสาขา </w:t>
-      </w:r>
-      <w:r>
-        <w:rPr>
-          <w:rFonts w:ascii="Lotuss Smart TX" w:hAnsi="Lotuss Smart TX" w:cs="Lotuss Smart TX"/>
-          <w:color w:val="0000FF"/>
-          <w:sz w:val="18"/>
-          <w:szCs w:val="18"/>
-          <w:lang w:val="en-US"/>
-        </w:rPr>
-        <w:t xml:space="preserve">Retail Operation </w:t>
-      </w:r>
-      <w:r>
-        <w:rPr>
-          <w:rFonts w:hint="cs" w:ascii="Lotuss Smart TX" w:hAnsi="Lotuss Smart TX" w:cs="Lotuss Smart TX"/>
-          <w:color w:val="0000FF"/>
-          <w:sz w:val="18"/>
-          <w:szCs w:val="18"/>
-          <w:cs/>
-          <w:lang w:val="en-US"/>
-        </w:rPr>
-        <w:t>สำหรับ</w:t>
-      </w:r>
-      <w:r>
-        <w:rPr>
-          <w:rFonts w:hint="cs" w:ascii="Lotuss Smart TX" w:hAnsi="Lotuss Smart TX" w:cs="Lotuss Smart TX"/>
-          <w:color w:val="0000FF"/>
-          <w:sz w:val="18"/>
-          <w:szCs w:val="18"/>
-          <w:cs/>
-          <w:lang w:val="en-US"/>
-        </w:rPr>
-        <w:t>ค่าสาธาณูปโภค</w:t>
+        <w:t>สำหรับค่าสาธาณูปโภค</w:t>
       </w:r>
       <w:r>
         <w:rPr>
@@ -4454,7 +4181,7 @@
           <w:szCs w:val="18"/>
           <w:lang w:val="en-US"/>
         </w:rPr>
-        <w:t>####</w:t>
+        <w:t xml:space="preserve">#### </w:t>
       </w:r>
       <w:r>
         <w:rPr>
@@ -4462,20 +4189,20 @@
           <w:color w:val="0000FF"/>
           <w:sz w:val="18"/>
           <w:szCs w:val="18"/>
-          <w:lang w:val="en-US"/>
-        </w:rPr>
-        <w:t xml:space="preserve"> </w:t>
-      </w:r>
-      <w:r>
-        <w:rPr>
-          <w:rFonts w:hint="cs" w:ascii="Lotuss Smart TX" w:hAnsi="Lotuss Smart TX" w:cs="Lotuss Smart TX"/>
+          <w:cs/>
+          <w:lang w:val="en-US"/>
+        </w:rPr>
+        <w:t xml:space="preserve">กรณีสาขา </w:t>
+      </w:r>
+      <w:r>
+        <w:rPr>
+          <w:rFonts w:ascii="Lotuss Smart TX" w:hAnsi="Lotuss Smart TX" w:cs="Lotuss Smart TX"/>
           <w:color w:val="0000FF"/>
           <w:sz w:val="18"/>
           <w:szCs w:val="18"/>
-          <w:cs/>
-          <w:lang w:val="en-US"/>
-        </w:rPr>
-        <w:t xml:space="preserve">กรณีสาขา </w:t>
+          <w:lang w:val="en-US"/>
+        </w:rPr>
+        <w:t xml:space="preserve">Retail Operation </w:t>
       </w:r>
       <w:r>
         <w:rPr>
@@ -4483,31 +4210,10 @@
           <w:color w:val="0000FF"/>
           <w:sz w:val="18"/>
           <w:szCs w:val="18"/>
-          <w:lang w:val="en-US"/>
-        </w:rPr>
-        <w:t xml:space="preserve">Retail Operation </w:t>
-      </w:r>
-      <w:r>
-        <w:rPr>
-          <w:rFonts w:hint="cs" w:ascii="Lotuss Smart TX" w:hAnsi="Lotuss Smart TX" w:cs="Lotuss Smart TX"/>
-          <w:color w:val="0000FF"/>
-          <w:sz w:val="18"/>
-          <w:szCs w:val="18"/>
-          <w:cs/>
-          <w:lang w:val="en-US"/>
-        </w:rPr>
-        <w:t>สำหรับ</w:t>
-      </w:r>
-      <w:r>
-        <w:rPr>
-          <w:rFonts w:hint="cs" w:ascii="Lotuss Smart TX" w:hAnsi="Lotuss Smart TX" w:cs="Lotuss Smart TX"/>
-          <w:color w:val="0000FF"/>
-          <w:sz w:val="18"/>
-          <w:szCs w:val="18"/>
-          <w:cs/>
-          <w:lang w:val="en-US"/>
-        </w:rPr>
-        <w:t>ค่าสาธาณูปโภค</w:t>
+          <w:cs/>
+          <w:lang w:val="en-US"/>
+        </w:rPr>
+        <w:t>สำหรับค่าสาธาณูปโภค</w:t>
       </w:r>
       <w:r>
         <w:rPr>
@@ -4783,14 +4489,18 @@
     </w:p>
     <w:p>
       <w:pPr>
-        <w:spacing w:before="240" w:beforeAutospacing="off" w:after="240" w:afterAutospacing="off" w:line="240" w:lineRule="auto"/>
-      </w:pPr>
-      <w:r>
-        <w:rPr>
-          <w:rFonts w:ascii="Lotuss Smart TX" w:hAnsi="Lotuss Smart TX" w:eastAsia="Lotuss Smart TX" w:cs="Lotuss Smart TX"/>
-          <w:b w:val="1"/>
-          <w:bCs w:val="1"/>
-          <w:noProof w:val="0"/>
+        <w:spacing w:before="240" w:after="240" w:line="240" w:lineRule="auto"/>
+        <w:rPr>
+          <w:rFonts w:ascii="Lotuss Smart TX" w:hAnsi="Lotuss Smart TX" w:cs="Lotuss Smart TX"/>
+          <w:sz w:val="18"/>
+          <w:szCs w:val="18"/>
+        </w:rPr>
+      </w:pPr>
+      <w:r>
+        <w:rPr>
+          <w:rFonts w:ascii="Lotuss Smart TX" w:eastAsia="Lotuss Smart TX" w:hAnsi="Lotuss Smart TX" w:cs="Lotuss Smart TX"/>
+          <w:b/>
+          <w:bCs/>
           <w:sz w:val="18"/>
           <w:szCs w:val="18"/>
           <w:lang w:val="en-US"/>
@@ -4800,89 +4510,22 @@
     </w:p>
     <w:p>
       <w:pPr>
-        <w:pStyle w:val="Normal"/>
-        <w:suppressLineNumbers w:val="0"/>
-        <w:bidi w:val="0"/>
-        <w:spacing w:before="240" w:beforeAutospacing="off" w:after="240" w:afterAutospacing="off" w:line="276" w:lineRule="auto"/>
-        <w:ind w:left="0" w:right="0"/>
-        <w:jc w:val="left"/>
-        <w:rPr>
-          <w:rFonts w:ascii="Lotuss Smart TX" w:hAnsi="Lotuss Smart TX" w:eastAsia="Lotuss Smart TX" w:cs="Lotuss Smart TX"/>
-          <w:noProof w:val="0"/>
-          <w:sz w:val="18"/>
-          <w:szCs w:val="18"/>
-          <w:lang w:val="en-US"/>
-        </w:rPr>
-      </w:pPr>
-      <w:r>
-        <w:rPr>
-          <w:rFonts w:ascii="Lotuss Smart TX" w:hAnsi="Lotuss Smart TX" w:eastAsia="Lotuss Smart TX" w:cs="Lotuss Smart TX"/>
-          <w:noProof w:val="0"/>
-          <w:sz w:val="18"/>
-          <w:szCs w:val="18"/>
-          <w:lang w:val="en-US"/>
-        </w:rPr>
-        <w:t xml:space="preserve">- </w:t>
-      </w:r>
-      <w:r>
-        <w:rPr>
-          <w:rFonts w:ascii="Lotuss Smart TX" w:hAnsi="Lotuss Smart TX" w:eastAsia="Lotuss Smart TX" w:cs="Lotuss Smart TX"/>
-          <w:noProof w:val="0"/>
-          <w:sz w:val="18"/>
-          <w:szCs w:val="18"/>
-          <w:lang w:val="en-US"/>
-        </w:rPr>
-        <w:t>ติดต่อ</w:t>
-      </w:r>
-      <w:r>
-        <w:rPr>
-          <w:rFonts w:ascii="Lotuss Smart TX" w:hAnsi="Lotuss Smart TX" w:eastAsia="Lotuss Smart TX" w:cs="Lotuss Smart TX"/>
-          <w:noProof w:val="0"/>
-          <w:sz w:val="18"/>
-          <w:szCs w:val="18"/>
-          <w:lang w:val="en-US"/>
-        </w:rPr>
-        <w:t xml:space="preserve">  </w:t>
-      </w:r>
-      <w:r>
-        <w:rPr>
-          <w:rFonts w:ascii="Lotuss Smart TX" w:hAnsi="Lotuss Smart TX" w:eastAsia="Lotuss Smart TX" w:cs="Lotuss Smart TX"/>
-          <w:noProof w:val="0"/>
-          <w:sz w:val="18"/>
-          <w:szCs w:val="18"/>
-          <w:lang w:val="en-US"/>
-        </w:rPr>
-        <w:t>K.Piyawan</w:t>
-      </w:r>
-      <w:r>
-        <w:rPr>
-          <w:rFonts w:ascii="Lotuss Smart TX" w:hAnsi="Lotuss Smart TX" w:eastAsia="Lotuss Smart TX" w:cs="Lotuss Smart TX"/>
-          <w:noProof w:val="0"/>
-          <w:sz w:val="18"/>
-          <w:szCs w:val="18"/>
-          <w:lang w:val="en-US"/>
-        </w:rPr>
-        <w:t xml:space="preserve"> </w:t>
-      </w:r>
-      <w:r>
-        <w:rPr>
-          <w:rFonts w:ascii="Lotuss Smart TX" w:hAnsi="Lotuss Smart TX" w:eastAsia="Lotuss Smart TX" w:cs="Lotuss Smart TX"/>
-          <w:noProof w:val="0"/>
-          <w:sz w:val="18"/>
-          <w:szCs w:val="18"/>
-          <w:lang w:val="en-US"/>
-        </w:rPr>
-        <w:t>Poonsasomsup</w:t>
-      </w:r>
-      <w:r>
-        <w:rPr>
-          <w:rFonts w:ascii="Lotuss Smart TX" w:hAnsi="Lotuss Smart TX" w:eastAsia="Lotuss Smart TX" w:cs="Lotuss Smart TX"/>
-          <w:noProof w:val="0"/>
-          <w:sz w:val="18"/>
-          <w:szCs w:val="18"/>
-          <w:lang w:val="en-US"/>
-        </w:rPr>
-        <w:t xml:space="preserve"> </w:t>
+        <w:spacing w:before="240" w:after="240"/>
+        <w:rPr>
+          <w:rFonts w:ascii="Lotuss Smart TX" w:eastAsia="Lotuss Smart TX" w:hAnsi="Lotuss Smart TX" w:cs="Lotuss Smart TX"/>
+          <w:sz w:val="18"/>
+          <w:szCs w:val="18"/>
+          <w:lang w:val="en-US"/>
+        </w:rPr>
+      </w:pPr>
+      <w:r>
+        <w:rPr>
+          <w:rFonts w:ascii="Lotuss Smart TX" w:eastAsia="Lotuss Smart TX" w:hAnsi="Lotuss Smart TX" w:cs="Lotuss Smart TX"/>
+          <w:sz w:val="18"/>
+          <w:szCs w:val="18"/>
+          <w:lang w:val="en-US"/>
+        </w:rPr>
+        <w:t xml:space="preserve">- ติดต่อ  K.Piyawan Poonsasomsup </w:t>
       </w:r>
     </w:p>
     <w:p>
@@ -4891,8 +4534,8 @@
         <w:rPr>
           <w:rStyle w:val="normaltextrun"/>
           <w:rFonts w:ascii="Lotuss Smart TX" w:hAnsi="Lotuss Smart TX" w:cs="Lotuss Smart TX"/>
-          <w:b w:val="1"/>
-          <w:bCs w:val="1"/>
+          <w:b/>
+          <w:bCs/>
           <w:color w:val="000000"/>
           <w:sz w:val="18"/>
           <w:szCs w:val="18"/>
@@ -4901,7 +4544,7 @@
       </w:pPr>
     </w:p>
     <w:sectPr>
-      <w:pgSz w:w="12240" w:h="15840" w:orient="portrait"/>
+      <w:pgSz w:w="12240" w:h="15840"/>
       <w:pgMar w:top="1440" w:right="1440" w:bottom="1440" w:left="1440" w:header="720" w:footer="720" w:gutter="0"/>
       <w:pgNumType w:start="1"/>
       <w:cols w:space="720"/>
@@ -4925,7 +4568,7 @@
         <w:ind w:left="1440" w:hanging="360"/>
       </w:pPr>
       <w:rPr>
-        <w:rFonts w:hint="default" w:ascii="Symbol" w:hAnsi="Symbol"/>
+        <w:rFonts w:ascii="Symbol" w:hAnsi="Symbol" w:hint="default"/>
       </w:rPr>
     </w:lvl>
     <w:lvl w:ilvl="1" w:tplc="04090003" w:tentative="1">
@@ -4937,7 +4580,7 @@
         <w:ind w:left="2160" w:hanging="360"/>
       </w:pPr>
       <w:rPr>
-        <w:rFonts w:hint="default" w:ascii="Courier New" w:hAnsi="Courier New" w:cs="Courier New"/>
+        <w:rFonts w:ascii="Courier New" w:hAnsi="Courier New" w:cs="Courier New" w:hint="default"/>
       </w:rPr>
     </w:lvl>
     <w:lvl w:ilvl="2" w:tplc="04090005" w:tentative="1">
@@ -4949,7 +4592,7 @@
         <w:ind w:left="2880" w:hanging="360"/>
       </w:pPr>
       <w:rPr>
-        <w:rFonts w:hint="default" w:ascii="Wingdings" w:hAnsi="Wingdings"/>
+        <w:rFonts w:ascii="Wingdings" w:hAnsi="Wingdings" w:hint="default"/>
       </w:rPr>
     </w:lvl>
     <w:lvl w:ilvl="3" w:tplc="04090001" w:tentative="1">
@@ -4961,7 +4604,7 @@
         <w:ind w:left="3600" w:hanging="360"/>
       </w:pPr>
       <w:rPr>
-        <w:rFonts w:hint="default" w:ascii="Symbol" w:hAnsi="Symbol"/>
+        <w:rFonts w:ascii="Symbol" w:hAnsi="Symbol" w:hint="default"/>
       </w:rPr>
     </w:lvl>
     <w:lvl w:ilvl="4" w:tplc="04090003" w:tentative="1">
@@ -4973,7 +4616,7 @@
         <w:ind w:left="4320" w:hanging="360"/>
       </w:pPr>
       <w:rPr>
-        <w:rFonts w:hint="default" w:ascii="Courier New" w:hAnsi="Courier New" w:cs="Courier New"/>
+        <w:rFonts w:ascii="Courier New" w:hAnsi="Courier New" w:cs="Courier New" w:hint="default"/>
       </w:rPr>
     </w:lvl>
     <w:lvl w:ilvl="5" w:tplc="04090005" w:tentative="1">
@@ -4985,7 +4628,7 @@
         <w:ind w:left="5040" w:hanging="360"/>
       </w:pPr>
       <w:rPr>
-        <w:rFonts w:hint="default" w:ascii="Wingdings" w:hAnsi="Wingdings"/>
+        <w:rFonts w:ascii="Wingdings" w:hAnsi="Wingdings" w:hint="default"/>
       </w:rPr>
     </w:lvl>
     <w:lvl w:ilvl="6" w:tplc="04090001" w:tentative="1">
@@ -4997,7 +4640,7 @@
         <w:ind w:left="5760" w:hanging="360"/>
       </w:pPr>
       <w:rPr>
-        <w:rFonts w:hint="default" w:ascii="Symbol" w:hAnsi="Symbol"/>
+        <w:rFonts w:ascii="Symbol" w:hAnsi="Symbol" w:hint="default"/>
       </w:rPr>
     </w:lvl>
     <w:lvl w:ilvl="7" w:tplc="04090003" w:tentative="1">
@@ -5009,7 +4652,7 @@
         <w:ind w:left="6480" w:hanging="360"/>
       </w:pPr>
       <w:rPr>
-        <w:rFonts w:hint="default" w:ascii="Courier New" w:hAnsi="Courier New" w:cs="Courier New"/>
+        <w:rFonts w:ascii="Courier New" w:hAnsi="Courier New" w:cs="Courier New" w:hint="default"/>
       </w:rPr>
     </w:lvl>
     <w:lvl w:ilvl="8" w:tplc="04090005" w:tentative="1">
@@ -5021,7 +4664,7 @@
         <w:ind w:left="7200" w:hanging="360"/>
       </w:pPr>
       <w:rPr>
-        <w:rFonts w:hint="default" w:ascii="Wingdings" w:hAnsi="Wingdings"/>
+        <w:rFonts w:ascii="Wingdings" w:hAnsi="Wingdings" w:hint="default"/>
       </w:rPr>
     </w:lvl>
   </w:abstractNum>
@@ -5038,7 +4681,7 @@
         <w:ind w:left="720" w:hanging="360"/>
       </w:pPr>
       <w:rPr>
-        <w:rFonts w:hint="default" w:ascii="Wingdings" w:hAnsi="Wingdings"/>
+        <w:rFonts w:ascii="Wingdings" w:hAnsi="Wingdings" w:hint="default"/>
       </w:rPr>
     </w:lvl>
     <w:lvl w:ilvl="1" w:tplc="04090003" w:tentative="1">
@@ -5050,7 +4693,7 @@
         <w:ind w:left="1440" w:hanging="360"/>
       </w:pPr>
       <w:rPr>
-        <w:rFonts w:hint="default" w:ascii="Courier New" w:hAnsi="Courier New" w:cs="Courier New"/>
+        <w:rFonts w:ascii="Courier New" w:hAnsi="Courier New" w:cs="Courier New" w:hint="default"/>
       </w:rPr>
     </w:lvl>
     <w:lvl w:ilvl="2" w:tplc="04090005" w:tentative="1">
@@ -5062,7 +4705,7 @@
         <w:ind w:left="2160" w:hanging="360"/>
       </w:pPr>
       <w:rPr>
-        <w:rFonts w:hint="default" w:ascii="Wingdings" w:hAnsi="Wingdings"/>
+        <w:rFonts w:ascii="Wingdings" w:hAnsi="Wingdings" w:hint="default"/>
       </w:rPr>
     </w:lvl>
     <w:lvl w:ilvl="3" w:tplc="04090001" w:tentative="1">
@@ -5074,7 +4717,7 @@
         <w:ind w:left="2880" w:hanging="360"/>
       </w:pPr>
       <w:rPr>
-        <w:rFonts w:hint="default" w:ascii="Symbol" w:hAnsi="Symbol"/>
+        <w:rFonts w:ascii="Symbol" w:hAnsi="Symbol" w:hint="default"/>
       </w:rPr>
     </w:lvl>
     <w:lvl w:ilvl="4" w:tplc="04090003" w:tentative="1">
@@ -5086,7 +4729,7 @@
         <w:ind w:left="3600" w:hanging="360"/>
       </w:pPr>
       <w:rPr>
-        <w:rFonts w:hint="default" w:ascii="Courier New" w:hAnsi="Courier New" w:cs="Courier New"/>
+        <w:rFonts w:ascii="Courier New" w:hAnsi="Courier New" w:cs="Courier New" w:hint="default"/>
       </w:rPr>
     </w:lvl>
     <w:lvl w:ilvl="5" w:tplc="04090005" w:tentative="1">
@@ -5098,7 +4741,7 @@
         <w:ind w:left="4320" w:hanging="360"/>
       </w:pPr>
       <w:rPr>
-        <w:rFonts w:hint="default" w:ascii="Wingdings" w:hAnsi="Wingdings"/>
+        <w:rFonts w:ascii="Wingdings" w:hAnsi="Wingdings" w:hint="default"/>
       </w:rPr>
     </w:lvl>
     <w:lvl w:ilvl="6" w:tplc="04090001" w:tentative="1">
@@ -5110,7 +4753,7 @@
         <w:ind w:left="5040" w:hanging="360"/>
       </w:pPr>
       <w:rPr>
-        <w:rFonts w:hint="default" w:ascii="Symbol" w:hAnsi="Symbol"/>
+        <w:rFonts w:ascii="Symbol" w:hAnsi="Symbol" w:hint="default"/>
       </w:rPr>
     </w:lvl>
     <w:lvl w:ilvl="7" w:tplc="04090003" w:tentative="1">
@@ -5122,7 +4765,7 @@
         <w:ind w:left="5760" w:hanging="360"/>
       </w:pPr>
       <w:rPr>
-        <w:rFonts w:hint="default" w:ascii="Courier New" w:hAnsi="Courier New" w:cs="Courier New"/>
+        <w:rFonts w:ascii="Courier New" w:hAnsi="Courier New" w:cs="Courier New" w:hint="default"/>
       </w:rPr>
     </w:lvl>
     <w:lvl w:ilvl="8" w:tplc="04090005" w:tentative="1">
@@ -5134,7 +4777,7 @@
         <w:ind w:left="6480" w:hanging="360"/>
       </w:pPr>
       <w:rPr>
-        <w:rFonts w:hint="default" w:ascii="Wingdings" w:hAnsi="Wingdings"/>
+        <w:rFonts w:ascii="Wingdings" w:hAnsi="Wingdings" w:hint="default"/>
       </w:rPr>
     </w:lvl>
   </w:abstractNum>
@@ -5151,7 +4794,7 @@
         <w:ind w:left="720" w:hanging="360"/>
       </w:pPr>
       <w:rPr>
-        <w:rFonts w:hint="default" w:ascii="Wingdings" w:hAnsi="Wingdings"/>
+        <w:rFonts w:ascii="Wingdings" w:hAnsi="Wingdings" w:hint="default"/>
       </w:rPr>
     </w:lvl>
     <w:lvl w:ilvl="1" w:tplc="04090003" w:tentative="1">
@@ -5163,7 +4806,7 @@
         <w:ind w:left="1440" w:hanging="360"/>
       </w:pPr>
       <w:rPr>
-        <w:rFonts w:hint="default" w:ascii="Courier New" w:hAnsi="Courier New" w:cs="Courier New"/>
+        <w:rFonts w:ascii="Courier New" w:hAnsi="Courier New" w:cs="Courier New" w:hint="default"/>
       </w:rPr>
     </w:lvl>
     <w:lvl w:ilvl="2" w:tplc="04090005" w:tentative="1">
@@ -5175,7 +4818,7 @@
         <w:ind w:left="2160" w:hanging="360"/>
       </w:pPr>
       <w:rPr>
-        <w:rFonts w:hint="default" w:ascii="Wingdings" w:hAnsi="Wingdings"/>
+        <w:rFonts w:ascii="Wingdings" w:hAnsi="Wingdings" w:hint="default"/>
       </w:rPr>
     </w:lvl>
     <w:lvl w:ilvl="3" w:tplc="04090001" w:tentative="1">
@@ -5187,7 +4830,7 @@
         <w:ind w:left="2880" w:hanging="360"/>
       </w:pPr>
       <w:rPr>
-        <w:rFonts w:hint="default" w:ascii="Symbol" w:hAnsi="Symbol"/>
+        <w:rFonts w:ascii="Symbol" w:hAnsi="Symbol" w:hint="default"/>
       </w:rPr>
     </w:lvl>
     <w:lvl w:ilvl="4" w:tplc="04090003" w:tentative="1">
@@ -5199,7 +4842,7 @@
         <w:ind w:left="3600" w:hanging="360"/>
       </w:pPr>
       <w:rPr>
-        <w:rFonts w:hint="default" w:ascii="Courier New" w:hAnsi="Courier New" w:cs="Courier New"/>
+        <w:rFonts w:ascii="Courier New" w:hAnsi="Courier New" w:cs="Courier New" w:hint="default"/>
       </w:rPr>
     </w:lvl>
     <w:lvl w:ilvl="5" w:tplc="04090005" w:tentative="1">
@@ -5211,7 +4854,7 @@
         <w:ind w:left="4320" w:hanging="360"/>
       </w:pPr>
       <w:rPr>
-        <w:rFonts w:hint="default" w:ascii="Wingdings" w:hAnsi="Wingdings"/>
+        <w:rFonts w:ascii="Wingdings" w:hAnsi="Wingdings" w:hint="default"/>
       </w:rPr>
     </w:lvl>
     <w:lvl w:ilvl="6" w:tplc="04090001" w:tentative="1">
@@ -5223,7 +4866,7 @@
         <w:ind w:left="5040" w:hanging="360"/>
       </w:pPr>
       <w:rPr>
-        <w:rFonts w:hint="default" w:ascii="Symbol" w:hAnsi="Symbol"/>
+        <w:rFonts w:ascii="Symbol" w:hAnsi="Symbol" w:hint="default"/>
       </w:rPr>
     </w:lvl>
     <w:lvl w:ilvl="7" w:tplc="04090003" w:tentative="1">
@@ -5235,7 +4878,7 @@
         <w:ind w:left="5760" w:hanging="360"/>
       </w:pPr>
       <w:rPr>
-        <w:rFonts w:hint="default" w:ascii="Courier New" w:hAnsi="Courier New" w:cs="Courier New"/>
+        <w:rFonts w:ascii="Courier New" w:hAnsi="Courier New" w:cs="Courier New" w:hint="default"/>
       </w:rPr>
     </w:lvl>
     <w:lvl w:ilvl="8" w:tplc="04090005" w:tentative="1">
@@ -5247,7 +4890,7 @@
         <w:ind w:left="6480" w:hanging="360"/>
       </w:pPr>
       <w:rPr>
-        <w:rFonts w:hint="default" w:ascii="Wingdings" w:hAnsi="Wingdings"/>
+        <w:rFonts w:ascii="Wingdings" w:hAnsi="Wingdings" w:hint="default"/>
       </w:rPr>
     </w:lvl>
   </w:abstractNum>
@@ -5377,7 +5020,7 @@
         <w:ind w:left="720" w:hanging="360"/>
       </w:pPr>
       <w:rPr>
-        <w:rFonts w:hint="default" w:ascii="Wingdings" w:hAnsi="Wingdings"/>
+        <w:rFonts w:ascii="Wingdings" w:hAnsi="Wingdings" w:hint="default"/>
       </w:rPr>
     </w:lvl>
     <w:lvl w:ilvl="1" w:tplc="04090003" w:tentative="1">
@@ -5389,7 +5032,7 @@
         <w:ind w:left="1440" w:hanging="360"/>
       </w:pPr>
       <w:rPr>
-        <w:rFonts w:hint="default" w:ascii="Courier New" w:hAnsi="Courier New" w:cs="Courier New"/>
+        <w:rFonts w:ascii="Courier New" w:hAnsi="Courier New" w:cs="Courier New" w:hint="default"/>
       </w:rPr>
     </w:lvl>
     <w:lvl w:ilvl="2" w:tplc="04090005" w:tentative="1">
@@ -5401,7 +5044,7 @@
         <w:ind w:left="2160" w:hanging="360"/>
       </w:pPr>
       <w:rPr>
-        <w:rFonts w:hint="default" w:ascii="Wingdings" w:hAnsi="Wingdings"/>
+        <w:rFonts w:ascii="Wingdings" w:hAnsi="Wingdings" w:hint="default"/>
       </w:rPr>
     </w:lvl>
     <w:lvl w:ilvl="3" w:tplc="04090001" w:tentative="1">
@@ -5413,7 +5056,7 @@
         <w:ind w:left="2880" w:hanging="360"/>
       </w:pPr>
       <w:rPr>
-        <w:rFonts w:hint="default" w:ascii="Symbol" w:hAnsi="Symbol"/>
+        <w:rFonts w:ascii="Symbol" w:hAnsi="Symbol" w:hint="default"/>
       </w:rPr>
     </w:lvl>
     <w:lvl w:ilvl="4" w:tplc="04090003" w:tentative="1">
@@ -5425,7 +5068,7 @@
         <w:ind w:left="3600" w:hanging="360"/>
       </w:pPr>
       <w:rPr>
-        <w:rFonts w:hint="default" w:ascii="Courier New" w:hAnsi="Courier New" w:cs="Courier New"/>
+        <w:rFonts w:ascii="Courier New" w:hAnsi="Courier New" w:cs="Courier New" w:hint="default"/>
       </w:rPr>
     </w:lvl>
     <w:lvl w:ilvl="5" w:tplc="04090005" w:tentative="1">
@@ -5437,7 +5080,7 @@
         <w:ind w:left="4320" w:hanging="360"/>
       </w:pPr>
       <w:rPr>
-        <w:rFonts w:hint="default" w:ascii="Wingdings" w:hAnsi="Wingdings"/>
+        <w:rFonts w:ascii="Wingdings" w:hAnsi="Wingdings" w:hint="default"/>
       </w:rPr>
     </w:lvl>
     <w:lvl w:ilvl="6" w:tplc="04090001" w:tentative="1">
@@ -5449,7 +5092,7 @@
         <w:ind w:left="5040" w:hanging="360"/>
       </w:pPr>
       <w:rPr>
-        <w:rFonts w:hint="default" w:ascii="Symbol" w:hAnsi="Symbol"/>
+        <w:rFonts w:ascii="Symbol" w:hAnsi="Symbol" w:hint="default"/>
       </w:rPr>
     </w:lvl>
     <w:lvl w:ilvl="7" w:tplc="04090003" w:tentative="1">
@@ -5461,7 +5104,7 @@
         <w:ind w:left="5760" w:hanging="360"/>
       </w:pPr>
       <w:rPr>
-        <w:rFonts w:hint="default" w:ascii="Courier New" w:hAnsi="Courier New" w:cs="Courier New"/>
+        <w:rFonts w:ascii="Courier New" w:hAnsi="Courier New" w:cs="Courier New" w:hint="default"/>
       </w:rPr>
     </w:lvl>
     <w:lvl w:ilvl="8" w:tplc="04090005" w:tentative="1">
@@ -5473,7 +5116,7 @@
         <w:ind w:left="6480" w:hanging="360"/>
       </w:pPr>
       <w:rPr>
-        <w:rFonts w:hint="default" w:ascii="Wingdings" w:hAnsi="Wingdings"/>
+        <w:rFonts w:ascii="Wingdings" w:hAnsi="Wingdings" w:hint="default"/>
       </w:rPr>
     </w:lvl>
   </w:abstractNum>
@@ -5490,7 +5133,7 @@
         <w:ind w:left="1440" w:hanging="360"/>
       </w:pPr>
       <w:rPr>
-        <w:rFonts w:hint="default" w:ascii="Symbol" w:hAnsi="Symbol"/>
+        <w:rFonts w:ascii="Symbol" w:hAnsi="Symbol" w:hint="default"/>
       </w:rPr>
     </w:lvl>
     <w:lvl w:ilvl="1" w:tplc="04090003" w:tentative="1">
@@ -5502,7 +5145,7 @@
         <w:ind w:left="2160" w:hanging="360"/>
       </w:pPr>
       <w:rPr>
-        <w:rFonts w:hint="default" w:ascii="Courier New" w:hAnsi="Courier New" w:cs="Courier New"/>
+        <w:rFonts w:ascii="Courier New" w:hAnsi="Courier New" w:cs="Courier New" w:hint="default"/>
       </w:rPr>
     </w:lvl>
     <w:lvl w:ilvl="2" w:tplc="04090005" w:tentative="1">
@@ -5514,7 +5157,7 @@
         <w:ind w:left="2880" w:hanging="360"/>
       </w:pPr>
       <w:rPr>
-        <w:rFonts w:hint="default" w:ascii="Wingdings" w:hAnsi="Wingdings"/>
+        <w:rFonts w:ascii="Wingdings" w:hAnsi="Wingdings" w:hint="default"/>
       </w:rPr>
     </w:lvl>
     <w:lvl w:ilvl="3" w:tplc="04090001" w:tentative="1">
@@ -5526,7 +5169,7 @@
         <w:ind w:left="3600" w:hanging="360"/>
       </w:pPr>
       <w:rPr>
-        <w:rFonts w:hint="default" w:ascii="Symbol" w:hAnsi="Symbol"/>
+        <w:rFonts w:ascii="Symbol" w:hAnsi="Symbol" w:hint="default"/>
       </w:rPr>
     </w:lvl>
     <w:lvl w:ilvl="4" w:tplc="04090003" w:tentative="1">
@@ -5538,7 +5181,7 @@
         <w:ind w:left="4320" w:hanging="360"/>
       </w:pPr>
       <w:rPr>
-        <w:rFonts w:hint="default" w:ascii="Courier New" w:hAnsi="Courier New" w:cs="Courier New"/>
+        <w:rFonts w:ascii="Courier New" w:hAnsi="Courier New" w:cs="Courier New" w:hint="default"/>
       </w:rPr>
     </w:lvl>
     <w:lvl w:ilvl="5" w:tplc="04090005" w:tentative="1">
@@ -5550,7 +5193,7 @@
         <w:ind w:left="5040" w:hanging="360"/>
       </w:pPr>
       <w:rPr>
-        <w:rFonts w:hint="default" w:ascii="Wingdings" w:hAnsi="Wingdings"/>
+        <w:rFonts w:ascii="Wingdings" w:hAnsi="Wingdings" w:hint="default"/>
       </w:rPr>
     </w:lvl>
     <w:lvl w:ilvl="6" w:tplc="04090001" w:tentative="1">
@@ -5562,7 +5205,7 @@
         <w:ind w:left="5760" w:hanging="360"/>
       </w:pPr>
       <w:rPr>
-        <w:rFonts w:hint="default" w:ascii="Symbol" w:hAnsi="Symbol"/>
+        <w:rFonts w:ascii="Symbol" w:hAnsi="Symbol" w:hint="default"/>
       </w:rPr>
     </w:lvl>
     <w:lvl w:ilvl="7" w:tplc="04090003" w:tentative="1">
@@ -5574,7 +5217,7 @@
         <w:ind w:left="6480" w:hanging="360"/>
       </w:pPr>
       <w:rPr>
-        <w:rFonts w:hint="default" w:ascii="Courier New" w:hAnsi="Courier New" w:cs="Courier New"/>
+        <w:rFonts w:ascii="Courier New" w:hAnsi="Courier New" w:cs="Courier New" w:hint="default"/>
       </w:rPr>
     </w:lvl>
     <w:lvl w:ilvl="8" w:tplc="04090005" w:tentative="1">
@@ -5586,7 +5229,7 @@
         <w:ind w:left="7200" w:hanging="360"/>
       </w:pPr>
       <w:rPr>
-        <w:rFonts w:hint="default" w:ascii="Wingdings" w:hAnsi="Wingdings"/>
+        <w:rFonts w:ascii="Wingdings" w:hAnsi="Wingdings" w:hint="default"/>
       </w:rPr>
     </w:lvl>
   </w:abstractNum>
@@ -5603,7 +5246,7 @@
         <w:ind w:left="720" w:hanging="360"/>
       </w:pPr>
       <w:rPr>
-        <w:rFonts w:hint="default" w:ascii="Wingdings" w:hAnsi="Wingdings"/>
+        <w:rFonts w:ascii="Wingdings" w:hAnsi="Wingdings" w:hint="default"/>
       </w:rPr>
     </w:lvl>
     <w:lvl w:ilvl="1" w:tplc="04090003" w:tentative="1">
@@ -5615,7 +5258,7 @@
         <w:ind w:left="1440" w:hanging="360"/>
       </w:pPr>
       <w:rPr>
-        <w:rFonts w:hint="default" w:ascii="Courier New" w:hAnsi="Courier New" w:cs="Courier New"/>
+        <w:rFonts w:ascii="Courier New" w:hAnsi="Courier New" w:cs="Courier New" w:hint="default"/>
       </w:rPr>
     </w:lvl>
     <w:lvl w:ilvl="2" w:tplc="04090005" w:tentative="1">
@@ -5627,7 +5270,7 @@
         <w:ind w:left="2160" w:hanging="360"/>
       </w:pPr>
       <w:rPr>
-        <w:rFonts w:hint="default" w:ascii="Wingdings" w:hAnsi="Wingdings"/>
+        <w:rFonts w:ascii="Wingdings" w:hAnsi="Wingdings" w:hint="default"/>
       </w:rPr>
     </w:lvl>
     <w:lvl w:ilvl="3" w:tplc="04090001" w:tentative="1">
@@ -5639,7 +5282,7 @@
         <w:ind w:left="2880" w:hanging="360"/>
       </w:pPr>
       <w:rPr>
-        <w:rFonts w:hint="default" w:ascii="Symbol" w:hAnsi="Symbol"/>
+        <w:rFonts w:ascii="Symbol" w:hAnsi="Symbol" w:hint="default"/>
       </w:rPr>
     </w:lvl>
     <w:lvl w:ilvl="4" w:tplc="04090003" w:tentative="1">
@@ -5651,7 +5294,7 @@
         <w:ind w:left="3600" w:hanging="360"/>
       </w:pPr>
       <w:rPr>
-        <w:rFonts w:hint="default" w:ascii="Courier New" w:hAnsi="Courier New" w:cs="Courier New"/>
+        <w:rFonts w:ascii="Courier New" w:hAnsi="Courier New" w:cs="Courier New" w:hint="default"/>
       </w:rPr>
     </w:lvl>
     <w:lvl w:ilvl="5" w:tplc="04090005" w:tentative="1">
@@ -5663,7 +5306,7 @@
         <w:ind w:left="4320" w:hanging="360"/>
       </w:pPr>
       <w:rPr>
-        <w:rFonts w:hint="default" w:ascii="Wingdings" w:hAnsi="Wingdings"/>
+        <w:rFonts w:ascii="Wingdings" w:hAnsi="Wingdings" w:hint="default"/>
       </w:rPr>
     </w:lvl>
     <w:lvl w:ilvl="6" w:tplc="04090001" w:tentative="1">
@@ -5675,7 +5318,7 @@
         <w:ind w:left="5040" w:hanging="360"/>
       </w:pPr>
       <w:rPr>
-        <w:rFonts w:hint="default" w:ascii="Symbol" w:hAnsi="Symbol"/>
+        <w:rFonts w:ascii="Symbol" w:hAnsi="Symbol" w:hint="default"/>
       </w:rPr>
     </w:lvl>
     <w:lvl w:ilvl="7" w:tplc="04090003" w:tentative="1">
@@ -5687,7 +5330,7 @@
         <w:ind w:left="5760" w:hanging="360"/>
       </w:pPr>
       <w:rPr>
-        <w:rFonts w:hint="default" w:ascii="Courier New" w:hAnsi="Courier New" w:cs="Courier New"/>
+        <w:rFonts w:ascii="Courier New" w:hAnsi="Courier New" w:cs="Courier New" w:hint="default"/>
       </w:rPr>
     </w:lvl>
     <w:lvl w:ilvl="8" w:tplc="04090005" w:tentative="1">
@@ -5699,7 +5342,7 @@
         <w:ind w:left="6480" w:hanging="360"/>
       </w:pPr>
       <w:rPr>
-        <w:rFonts w:hint="default" w:ascii="Wingdings" w:hAnsi="Wingdings"/>
+        <w:rFonts w:ascii="Wingdings" w:hAnsi="Wingdings" w:hint="default"/>
       </w:rPr>
     </w:lvl>
   </w:abstractNum>
@@ -5716,7 +5359,7 @@
         <w:ind w:left="720" w:hanging="360"/>
       </w:pPr>
       <w:rPr>
-        <w:rFonts w:hint="default" w:ascii="Symbol" w:hAnsi="Symbol"/>
+        <w:rFonts w:ascii="Symbol" w:hAnsi="Symbol" w:hint="default"/>
       </w:rPr>
     </w:lvl>
     <w:lvl w:ilvl="1" w:tplc="04090003" w:tentative="1">
@@ -5728,7 +5371,7 @@
         <w:ind w:left="1440" w:hanging="360"/>
       </w:pPr>
       <w:rPr>
-        <w:rFonts w:hint="default" w:ascii="Courier New" w:hAnsi="Courier New" w:cs="Courier New"/>
+        <w:rFonts w:ascii="Courier New" w:hAnsi="Courier New" w:cs="Courier New" w:hint="default"/>
       </w:rPr>
     </w:lvl>
     <w:lvl w:ilvl="2" w:tplc="04090005" w:tentative="1">
@@ -5740,7 +5383,7 @@
         <w:ind w:left="2160" w:hanging="360"/>
       </w:pPr>
       <w:rPr>
-        <w:rFonts w:hint="default" w:ascii="Wingdings" w:hAnsi="Wingdings"/>
+        <w:rFonts w:ascii="Wingdings" w:hAnsi="Wingdings" w:hint="default"/>
       </w:rPr>
     </w:lvl>
     <w:lvl w:ilvl="3" w:tplc="04090001" w:tentative="1">
@@ -5752,7 +5395,7 @@
         <w:ind w:left="2880" w:hanging="360"/>
       </w:pPr>
       <w:rPr>
-        <w:rFonts w:hint="default" w:ascii="Symbol" w:hAnsi="Symbol"/>
+        <w:rFonts w:ascii="Symbol" w:hAnsi="Symbol" w:hint="default"/>
       </w:rPr>
     </w:lvl>
     <w:lvl w:ilvl="4" w:tplc="04090003" w:tentative="1">
@@ -5764,7 +5407,7 @@
         <w:ind w:left="3600" w:hanging="360"/>
       </w:pPr>
       <w:rPr>
-        <w:rFonts w:hint="default" w:ascii="Courier New" w:hAnsi="Courier New" w:cs="Courier New"/>
+        <w:rFonts w:ascii="Courier New" w:hAnsi="Courier New" w:cs="Courier New" w:hint="default"/>
       </w:rPr>
     </w:lvl>
     <w:lvl w:ilvl="5" w:tplc="04090005" w:tentative="1">
@@ -5776,7 +5419,7 @@
         <w:ind w:left="4320" w:hanging="360"/>
       </w:pPr>
       <w:rPr>
-        <w:rFonts w:hint="default" w:ascii="Wingdings" w:hAnsi="Wingdings"/>
+        <w:rFonts w:ascii="Wingdings" w:hAnsi="Wingdings" w:hint="default"/>
       </w:rPr>
     </w:lvl>
     <w:lvl w:ilvl="6" w:tplc="04090001" w:tentative="1">
@@ -5788,7 +5431,7 @@
         <w:ind w:left="5040" w:hanging="360"/>
       </w:pPr>
       <w:rPr>
-        <w:rFonts w:hint="default" w:ascii="Symbol" w:hAnsi="Symbol"/>
+        <w:rFonts w:ascii="Symbol" w:hAnsi="Symbol" w:hint="default"/>
       </w:rPr>
     </w:lvl>
     <w:lvl w:ilvl="7" w:tplc="04090003" w:tentative="1">
@@ -5800,7 +5443,7 @@
         <w:ind w:left="5760" w:hanging="360"/>
       </w:pPr>
       <w:rPr>
-        <w:rFonts w:hint="default" w:ascii="Courier New" w:hAnsi="Courier New" w:cs="Courier New"/>
+        <w:rFonts w:ascii="Courier New" w:hAnsi="Courier New" w:cs="Courier New" w:hint="default"/>
       </w:rPr>
     </w:lvl>
     <w:lvl w:ilvl="8" w:tplc="04090005" w:tentative="1">
@@ -5812,7 +5455,7 @@
         <w:ind w:left="6480" w:hanging="360"/>
       </w:pPr>
       <w:rPr>
-        <w:rFonts w:hint="default" w:ascii="Wingdings" w:hAnsi="Wingdings"/>
+        <w:rFonts w:ascii="Wingdings" w:hAnsi="Wingdings" w:hint="default"/>
       </w:rPr>
     </w:lvl>
   </w:abstractNum>
@@ -5828,7 +5471,7 @@
         <w:ind w:left="2640" w:hanging="360"/>
       </w:pPr>
       <w:rPr>
-        <w:rFonts w:hint="default" w:ascii="Cordia New" w:hAnsi="Cordia New" w:eastAsia="Times New Roman" w:cs="Cordia New"/>
+        <w:rFonts w:ascii="Cordia New" w:eastAsia="Times New Roman" w:hAnsi="Cordia New" w:cs="Cordia New" w:hint="default"/>
         <w:color w:val="000000"/>
       </w:rPr>
     </w:lvl>
@@ -5841,7 +5484,7 @@
         <w:ind w:left="2760" w:hanging="360"/>
       </w:pPr>
       <w:rPr>
-        <w:rFonts w:hint="default" w:ascii="Courier New" w:hAnsi="Courier New" w:cs="Courier New"/>
+        <w:rFonts w:ascii="Courier New" w:hAnsi="Courier New" w:cs="Courier New" w:hint="default"/>
       </w:rPr>
     </w:lvl>
     <w:lvl w:ilvl="2" w:tplc="04090005" w:tentative="1">
@@ -5853,7 +5496,7 @@
         <w:ind w:left="3480" w:hanging="360"/>
       </w:pPr>
       <w:rPr>
-        <w:rFonts w:hint="default" w:ascii="Wingdings" w:hAnsi="Wingdings"/>
+        <w:rFonts w:ascii="Wingdings" w:hAnsi="Wingdings" w:hint="default"/>
       </w:rPr>
     </w:lvl>
     <w:lvl w:ilvl="3" w:tplc="04090001" w:tentative="1">
@@ -5865,7 +5508,7 @@
         <w:ind w:left="4200" w:hanging="360"/>
       </w:pPr>
       <w:rPr>
-        <w:rFonts w:hint="default" w:ascii="Symbol" w:hAnsi="Symbol"/>
+        <w:rFonts w:ascii="Symbol" w:hAnsi="Symbol" w:hint="default"/>
       </w:rPr>
     </w:lvl>
     <w:lvl w:ilvl="4" w:tplc="04090003" w:tentative="1">
@@ -5877,7 +5520,7 @@
         <w:ind w:left="4920" w:hanging="360"/>
       </w:pPr>
       <w:rPr>
-        <w:rFonts w:hint="default" w:ascii="Courier New" w:hAnsi="Courier New" w:cs="Courier New"/>
+        <w:rFonts w:ascii="Courier New" w:hAnsi="Courier New" w:cs="Courier New" w:hint="default"/>
       </w:rPr>
     </w:lvl>
     <w:lvl w:ilvl="5" w:tplc="04090005" w:tentative="1">
@@ -5889,7 +5532,7 @@
         <w:ind w:left="5640" w:hanging="360"/>
       </w:pPr>
       <w:rPr>
-        <w:rFonts w:hint="default" w:ascii="Wingdings" w:hAnsi="Wingdings"/>
+        <w:rFonts w:ascii="Wingdings" w:hAnsi="Wingdings" w:hint="default"/>
       </w:rPr>
     </w:lvl>
     <w:lvl w:ilvl="6" w:tplc="04090001" w:tentative="1">
@@ -5901,7 +5544,7 @@
         <w:ind w:left="6360" w:hanging="360"/>
       </w:pPr>
       <w:rPr>
-        <w:rFonts w:hint="default" w:ascii="Symbol" w:hAnsi="Symbol"/>
+        <w:rFonts w:ascii="Symbol" w:hAnsi="Symbol" w:hint="default"/>
       </w:rPr>
     </w:lvl>
     <w:lvl w:ilvl="7" w:tplc="04090003" w:tentative="1">
@@ -5913,7 +5556,7 @@
         <w:ind w:left="7080" w:hanging="360"/>
       </w:pPr>
       <w:rPr>
-        <w:rFonts w:hint="default" w:ascii="Courier New" w:hAnsi="Courier New" w:cs="Courier New"/>
+        <w:rFonts w:ascii="Courier New" w:hAnsi="Courier New" w:cs="Courier New" w:hint="default"/>
       </w:rPr>
     </w:lvl>
     <w:lvl w:ilvl="8" w:tplc="04090005" w:tentative="1">
@@ -5925,7 +5568,7 @@
         <w:ind w:left="7800" w:hanging="360"/>
       </w:pPr>
       <w:rPr>
-        <w:rFonts w:hint="default" w:ascii="Wingdings" w:hAnsi="Wingdings"/>
+        <w:rFonts w:ascii="Wingdings" w:hAnsi="Wingdings" w:hint="default"/>
       </w:rPr>
     </w:lvl>
   </w:abstractNum>
@@ -5942,7 +5585,7 @@
         <w:ind w:left="720" w:hanging="360"/>
       </w:pPr>
       <w:rPr>
-        <w:rFonts w:hint="default" w:ascii="Lotuss Smart TX" w:hAnsi="Lotuss Smart TX" w:cs="Lotuss Smart TX" w:eastAsiaTheme="minorHAnsi"/>
+        <w:rFonts w:ascii="Lotuss Smart TX" w:eastAsiaTheme="minorHAnsi" w:hAnsi="Lotuss Smart TX" w:cs="Lotuss Smart TX" w:hint="default"/>
       </w:rPr>
     </w:lvl>
     <w:lvl w:ilvl="1" w:tplc="04090003" w:tentative="1">
@@ -5954,7 +5597,7 @@
         <w:ind w:left="1440" w:hanging="360"/>
       </w:pPr>
       <w:rPr>
-        <w:rFonts w:hint="default" w:ascii="Courier New" w:hAnsi="Courier New" w:cs="Courier New"/>
+        <w:rFonts w:ascii="Courier New" w:hAnsi="Courier New" w:cs="Courier New" w:hint="default"/>
       </w:rPr>
     </w:lvl>
     <w:lvl w:ilvl="2" w:tplc="04090005" w:tentative="1">
@@ -5966,7 +5609,7 @@
         <w:ind w:left="2160" w:hanging="360"/>
       </w:pPr>
       <w:rPr>
-        <w:rFonts w:hint="default" w:ascii="Wingdings" w:hAnsi="Wingdings"/>
+        <w:rFonts w:ascii="Wingdings" w:hAnsi="Wingdings" w:hint="default"/>
       </w:rPr>
     </w:lvl>
     <w:lvl w:ilvl="3" w:tplc="04090001" w:tentative="1">
@@ -5978,7 +5621,7 @@
         <w:ind w:left="2880" w:hanging="360"/>
       </w:pPr>
       <w:rPr>
-        <w:rFonts w:hint="default" w:ascii="Symbol" w:hAnsi="Symbol"/>
+        <w:rFonts w:ascii="Symbol" w:hAnsi="Symbol" w:hint="default"/>
       </w:rPr>
     </w:lvl>
     <w:lvl w:ilvl="4" w:tplc="04090003" w:tentative="1">
@@ -5990,7 +5633,7 @@
         <w:ind w:left="3600" w:hanging="360"/>
       </w:pPr>
       <w:rPr>
-        <w:rFonts w:hint="default" w:ascii="Courier New" w:hAnsi="Courier New" w:cs="Courier New"/>
+        <w:rFonts w:ascii="Courier New" w:hAnsi="Courier New" w:cs="Courier New" w:hint="default"/>
       </w:rPr>
     </w:lvl>
     <w:lvl w:ilvl="5" w:tplc="04090005" w:tentative="1">
@@ -6002,7 +5645,7 @@
         <w:ind w:left="4320" w:hanging="360"/>
       </w:pPr>
       <w:rPr>
-        <w:rFonts w:hint="default" w:ascii="Wingdings" w:hAnsi="Wingdings"/>
+        <w:rFonts w:ascii="Wingdings" w:hAnsi="Wingdings" w:hint="default"/>
       </w:rPr>
     </w:lvl>
     <w:lvl w:ilvl="6" w:tplc="04090001" w:tentative="1">
@@ -6014,7 +5657,7 @@
         <w:ind w:left="5040" w:hanging="360"/>
       </w:pPr>
       <w:rPr>
-        <w:rFonts w:hint="default" w:ascii="Symbol" w:hAnsi="Symbol"/>
+        <w:rFonts w:ascii="Symbol" w:hAnsi="Symbol" w:hint="default"/>
       </w:rPr>
     </w:lvl>
     <w:lvl w:ilvl="7" w:tplc="04090003" w:tentative="1">
@@ -6026,7 +5669,7 @@
         <w:ind w:left="5760" w:hanging="360"/>
       </w:pPr>
       <w:rPr>
-        <w:rFonts w:hint="default" w:ascii="Courier New" w:hAnsi="Courier New" w:cs="Courier New"/>
+        <w:rFonts w:ascii="Courier New" w:hAnsi="Courier New" w:cs="Courier New" w:hint="default"/>
       </w:rPr>
     </w:lvl>
     <w:lvl w:ilvl="8" w:tplc="04090005" w:tentative="1">
@@ -6038,7 +5681,7 @@
         <w:ind w:left="6480" w:hanging="360"/>
       </w:pPr>
       <w:rPr>
-        <w:rFonts w:hint="default" w:ascii="Wingdings" w:hAnsi="Wingdings"/>
+        <w:rFonts w:ascii="Wingdings" w:hAnsi="Wingdings" w:hint="default"/>
       </w:rPr>
     </w:lvl>
   </w:abstractNum>
@@ -6055,7 +5698,7 @@
         <w:ind w:left="720" w:hanging="360"/>
       </w:pPr>
       <w:rPr>
-        <w:rFonts w:hint="default" w:ascii="Wingdings" w:hAnsi="Wingdings"/>
+        <w:rFonts w:ascii="Wingdings" w:hAnsi="Wingdings" w:hint="default"/>
       </w:rPr>
     </w:lvl>
     <w:lvl w:ilvl="1" w:tplc="04090003" w:tentative="1">
@@ -6067,7 +5710,7 @@
         <w:ind w:left="1440" w:hanging="360"/>
       </w:pPr>
       <w:rPr>
-        <w:rFonts w:hint="default" w:ascii="Courier New" w:hAnsi="Courier New" w:cs="Courier New"/>
+        <w:rFonts w:ascii="Courier New" w:hAnsi="Courier New" w:cs="Courier New" w:hint="default"/>
       </w:rPr>
     </w:lvl>
     <w:lvl w:ilvl="2" w:tplc="04090005" w:tentative="1">
@@ -6079,7 +5722,7 @@
         <w:ind w:left="2160" w:hanging="360"/>
       </w:pPr>
       <w:rPr>
-        <w:rFonts w:hint="default" w:ascii="Wingdings" w:hAnsi="Wingdings"/>
+        <w:rFonts w:ascii="Wingdings" w:hAnsi="Wingdings" w:hint="default"/>
       </w:rPr>
     </w:lvl>
     <w:lvl w:ilvl="3" w:tplc="04090001" w:tentative="1">
@@ -6091,7 +5734,7 @@
         <w:ind w:left="2880" w:hanging="360"/>
       </w:pPr>
       <w:rPr>
-        <w:rFonts w:hint="default" w:ascii="Symbol" w:hAnsi="Symbol"/>
+        <w:rFonts w:ascii="Symbol" w:hAnsi="Symbol" w:hint="default"/>
       </w:rPr>
     </w:lvl>
     <w:lvl w:ilvl="4" w:tplc="04090003" w:tentative="1">
@@ -6103,7 +5746,7 @@
         <w:ind w:left="3600" w:hanging="360"/>
       </w:pPr>
       <w:rPr>
-        <w:rFonts w:hint="default" w:ascii="Courier New" w:hAnsi="Courier New" w:cs="Courier New"/>
+        <w:rFonts w:ascii="Courier New" w:hAnsi="Courier New" w:cs="Courier New" w:hint="default"/>
       </w:rPr>
     </w:lvl>
     <w:lvl w:ilvl="5" w:tplc="04090005" w:tentative="1">
@@ -6115,7 +5758,7 @@
         <w:ind w:left="4320" w:hanging="360"/>
       </w:pPr>
       <w:rPr>
-        <w:rFonts w:hint="default" w:ascii="Wingdings" w:hAnsi="Wingdings"/>
+        <w:rFonts w:ascii="Wingdings" w:hAnsi="Wingdings" w:hint="default"/>
       </w:rPr>
     </w:lvl>
     <w:lvl w:ilvl="6" w:tplc="04090001" w:tentative="1">
@@ -6127,7 +5770,7 @@
         <w:ind w:left="5040" w:hanging="360"/>
       </w:pPr>
       <w:rPr>
-        <w:rFonts w:hint="default" w:ascii="Symbol" w:hAnsi="Symbol"/>
+        <w:rFonts w:ascii="Symbol" w:hAnsi="Symbol" w:hint="default"/>
       </w:rPr>
     </w:lvl>
     <w:lvl w:ilvl="7" w:tplc="04090003" w:tentative="1">
@@ -6139,7 +5782,7 @@
         <w:ind w:left="5760" w:hanging="360"/>
       </w:pPr>
       <w:rPr>
-        <w:rFonts w:hint="default" w:ascii="Courier New" w:hAnsi="Courier New" w:cs="Courier New"/>
+        <w:rFonts w:ascii="Courier New" w:hAnsi="Courier New" w:cs="Courier New" w:hint="default"/>
       </w:rPr>
     </w:lvl>
     <w:lvl w:ilvl="8" w:tplc="04090005" w:tentative="1">
@@ -6151,7 +5794,7 @@
         <w:ind w:left="6480" w:hanging="360"/>
       </w:pPr>
       <w:rPr>
-        <w:rFonts w:hint="default" w:ascii="Wingdings" w:hAnsi="Wingdings"/>
+        <w:rFonts w:ascii="Wingdings" w:hAnsi="Wingdings" w:hint="default"/>
       </w:rPr>
     </w:lvl>
   </w:abstractNum>
@@ -6281,7 +5924,7 @@
         <w:ind w:left="720" w:hanging="360"/>
       </w:pPr>
       <w:rPr>
-        <w:rFonts w:hint="default" w:ascii="Wingdings" w:hAnsi="Wingdings"/>
+        <w:rFonts w:ascii="Wingdings" w:hAnsi="Wingdings" w:hint="default"/>
       </w:rPr>
     </w:lvl>
     <w:lvl w:ilvl="1" w:tplc="04090003" w:tentative="1">
@@ -6293,7 +5936,7 @@
         <w:ind w:left="1440" w:hanging="360"/>
       </w:pPr>
       <w:rPr>
-        <w:rFonts w:hint="default" w:ascii="Courier New" w:hAnsi="Courier New" w:cs="Courier New"/>
+        <w:rFonts w:ascii="Courier New" w:hAnsi="Courier New" w:cs="Courier New" w:hint="default"/>
       </w:rPr>
     </w:lvl>
     <w:lvl w:ilvl="2" w:tplc="04090005" w:tentative="1">
@@ -6305,7 +5948,7 @@
         <w:ind w:left="2160" w:hanging="360"/>
       </w:pPr>
       <w:rPr>
-        <w:rFonts w:hint="default" w:ascii="Wingdings" w:hAnsi="Wingdings"/>
+        <w:rFonts w:ascii="Wingdings" w:hAnsi="Wingdings" w:hint="default"/>
       </w:rPr>
     </w:lvl>
     <w:lvl w:ilvl="3" w:tplc="04090001" w:tentative="1">
@@ -6317,7 +5960,7 @@
         <w:ind w:left="2880" w:hanging="360"/>
       </w:pPr>
       <w:rPr>
-        <w:rFonts w:hint="default" w:ascii="Symbol" w:hAnsi="Symbol"/>
+        <w:rFonts w:ascii="Symbol" w:hAnsi="Symbol" w:hint="default"/>
       </w:rPr>
     </w:lvl>
     <w:lvl w:ilvl="4" w:tplc="04090003" w:tentative="1">
@@ -6329,7 +5972,7 @@
         <w:ind w:left="3600" w:hanging="360"/>
       </w:pPr>
       <w:rPr>
-        <w:rFonts w:hint="default" w:ascii="Courier New" w:hAnsi="Courier New" w:cs="Courier New"/>
+        <w:rFonts w:ascii="Courier New" w:hAnsi="Courier New" w:cs="Courier New" w:hint="default"/>
       </w:rPr>
     </w:lvl>
     <w:lvl w:ilvl="5" w:tplc="04090005" w:tentative="1">
@@ -6341,7 +5984,7 @@
         <w:ind w:left="4320" w:hanging="360"/>
       </w:pPr>
       <w:rPr>
-        <w:rFonts w:hint="default" w:ascii="Wingdings" w:hAnsi="Wingdings"/>
+        <w:rFonts w:ascii="Wingdings" w:hAnsi="Wingdings" w:hint="default"/>
       </w:rPr>
     </w:lvl>
     <w:lvl w:ilvl="6" w:tplc="04090001" w:tentative="1">
@@ -6353,7 +5996,7 @@
         <w:ind w:left="5040" w:hanging="360"/>
       </w:pPr>
       <w:rPr>
-        <w:rFonts w:hint="default" w:ascii="Symbol" w:hAnsi="Symbol"/>
+        <w:rFonts w:ascii="Symbol" w:hAnsi="Symbol" w:hint="default"/>
       </w:rPr>
     </w:lvl>
     <w:lvl w:ilvl="7" w:tplc="04090003" w:tentative="1">
@@ -6365,7 +6008,7 @@
         <w:ind w:left="5760" w:hanging="360"/>
       </w:pPr>
       <w:rPr>
-        <w:rFonts w:hint="default" w:ascii="Courier New" w:hAnsi="Courier New" w:cs="Courier New"/>
+        <w:rFonts w:ascii="Courier New" w:hAnsi="Courier New" w:cs="Courier New" w:hint="default"/>
       </w:rPr>
     </w:lvl>
     <w:lvl w:ilvl="8" w:tplc="04090005" w:tentative="1">
@@ -6377,7 +6020,7 @@
         <w:ind w:left="6480" w:hanging="360"/>
       </w:pPr>
       <w:rPr>
-        <w:rFonts w:hint="default" w:ascii="Wingdings" w:hAnsi="Wingdings"/>
+        <w:rFonts w:ascii="Wingdings" w:hAnsi="Wingdings" w:hint="default"/>
       </w:rPr>
     </w:lvl>
   </w:abstractNum>
@@ -6394,7 +6037,7 @@
         <w:ind w:left="1440" w:hanging="360"/>
       </w:pPr>
       <w:rPr>
-        <w:rFonts w:hint="default" w:ascii="Courier New" w:hAnsi="Courier New" w:cs="Courier New"/>
+        <w:rFonts w:ascii="Courier New" w:hAnsi="Courier New" w:cs="Courier New" w:hint="default"/>
       </w:rPr>
     </w:lvl>
     <w:lvl w:ilvl="1" w:tplc="04090003" w:tentative="1">
@@ -6406,7 +6049,7 @@
         <w:ind w:left="2160" w:hanging="360"/>
       </w:pPr>
       <w:rPr>
-        <w:rFonts w:hint="default" w:ascii="Courier New" w:hAnsi="Courier New" w:cs="Courier New"/>
+        <w:rFonts w:ascii="Courier New" w:hAnsi="Courier New" w:cs="Courier New" w:hint="default"/>
       </w:rPr>
     </w:lvl>
     <w:lvl w:ilvl="2" w:tplc="04090005" w:tentative="1">
@@ -6418,7 +6061,7 @@
         <w:ind w:left="2880" w:hanging="360"/>
       </w:pPr>
       <w:rPr>
-        <w:rFonts w:hint="default" w:ascii="Wingdings" w:hAnsi="Wingdings"/>
+        <w:rFonts w:ascii="Wingdings" w:hAnsi="Wingdings" w:hint="default"/>
       </w:rPr>
     </w:lvl>
     <w:lvl w:ilvl="3" w:tplc="04090001" w:tentative="1">
@@ -6430,7 +6073,7 @@
         <w:ind w:left="3600" w:hanging="360"/>
       </w:pPr>
       <w:rPr>
-        <w:rFonts w:hint="default" w:ascii="Symbol" w:hAnsi="Symbol"/>
+        <w:rFonts w:ascii="Symbol" w:hAnsi="Symbol" w:hint="default"/>
       </w:rPr>
     </w:lvl>
     <w:lvl w:ilvl="4" w:tplc="04090003" w:tentative="1">
@@ -6442,7 +6085,7 @@
         <w:ind w:left="4320" w:hanging="360"/>
       </w:pPr>
       <w:rPr>
-        <w:rFonts w:hint="default" w:ascii="Courier New" w:hAnsi="Courier New" w:cs="Courier New"/>
+        <w:rFonts w:ascii="Courier New" w:hAnsi="Courier New" w:cs="Courier New" w:hint="default"/>
       </w:rPr>
     </w:lvl>
     <w:lvl w:ilvl="5" w:tplc="04090005" w:tentative="1">
@@ -6454,7 +6097,7 @@
         <w:ind w:left="5040" w:hanging="360"/>
       </w:pPr>
       <w:rPr>
-        <w:rFonts w:hint="default" w:ascii="Wingdings" w:hAnsi="Wingdings"/>
+        <w:rFonts w:ascii="Wingdings" w:hAnsi="Wingdings" w:hint="default"/>
       </w:rPr>
     </w:lvl>
     <w:lvl w:ilvl="6" w:tplc="04090001" w:tentative="1">
@@ -6466,7 +6109,7 @@
         <w:ind w:left="5760" w:hanging="360"/>
       </w:pPr>
       <w:rPr>
-        <w:rFonts w:hint="default" w:ascii="Symbol" w:hAnsi="Symbol"/>
+        <w:rFonts w:ascii="Symbol" w:hAnsi="Symbol" w:hint="default"/>
       </w:rPr>
     </w:lvl>
     <w:lvl w:ilvl="7" w:tplc="04090003" w:tentative="1">
@@ -6478,7 +6121,7 @@
         <w:ind w:left="6480" w:hanging="360"/>
       </w:pPr>
       <w:rPr>
-        <w:rFonts w:hint="default" w:ascii="Courier New" w:hAnsi="Courier New" w:cs="Courier New"/>
+        <w:rFonts w:ascii="Courier New" w:hAnsi="Courier New" w:cs="Courier New" w:hint="default"/>
       </w:rPr>
     </w:lvl>
     <w:lvl w:ilvl="8" w:tplc="04090005" w:tentative="1">
@@ -6490,7 +6133,7 @@
         <w:ind w:left="7200" w:hanging="360"/>
       </w:pPr>
       <w:rPr>
-        <w:rFonts w:hint="default" w:ascii="Wingdings" w:hAnsi="Wingdings"/>
+        <w:rFonts w:ascii="Wingdings" w:hAnsi="Wingdings" w:hint="default"/>
       </w:rPr>
     </w:lvl>
   </w:abstractNum>
@@ -6507,7 +6150,7 @@
         <w:ind w:left="720" w:hanging="360"/>
       </w:pPr>
       <w:rPr>
-        <w:rFonts w:hint="default" w:ascii="Wingdings" w:hAnsi="Wingdings"/>
+        <w:rFonts w:ascii="Wingdings" w:hAnsi="Wingdings" w:hint="default"/>
       </w:rPr>
     </w:lvl>
     <w:lvl w:ilvl="1" w:tplc="04090003" w:tentative="1">
@@ -6519,7 +6162,7 @@
         <w:ind w:left="1440" w:hanging="360"/>
       </w:pPr>
       <w:rPr>
-        <w:rFonts w:hint="default" w:ascii="Courier New" w:hAnsi="Courier New" w:cs="Courier New"/>
+        <w:rFonts w:ascii="Courier New" w:hAnsi="Courier New" w:cs="Courier New" w:hint="default"/>
       </w:rPr>
     </w:lvl>
     <w:lvl w:ilvl="2" w:tplc="04090005" w:tentative="1">
@@ -6531,7 +6174,7 @@
         <w:ind w:left="2160" w:hanging="360"/>
       </w:pPr>
       <w:rPr>
-        <w:rFonts w:hint="default" w:ascii="Wingdings" w:hAnsi="Wingdings"/>
+        <w:rFonts w:ascii="Wingdings" w:hAnsi="Wingdings" w:hint="default"/>
       </w:rPr>
     </w:lvl>
     <w:lvl w:ilvl="3" w:tplc="04090001" w:tentative="1">
@@ -6543,7 +6186,7 @@
         <w:ind w:left="2880" w:hanging="360"/>
       </w:pPr>
       <w:rPr>
-        <w:rFonts w:hint="default" w:ascii="Symbol" w:hAnsi="Symbol"/>
+        <w:rFonts w:ascii="Symbol" w:hAnsi="Symbol" w:hint="default"/>
       </w:rPr>
     </w:lvl>
     <w:lvl w:ilvl="4" w:tplc="04090003" w:tentative="1">
@@ -6555,7 +6198,7 @@
         <w:ind w:left="3600" w:hanging="360"/>
       </w:pPr>
       <w:rPr>
-        <w:rFonts w:hint="default" w:ascii="Courier New" w:hAnsi="Courier New" w:cs="Courier New"/>
+        <w:rFonts w:ascii="Courier New" w:hAnsi="Courier New" w:cs="Courier New" w:hint="default"/>
       </w:rPr>
     </w:lvl>
     <w:lvl w:ilvl="5" w:tplc="04090005" w:tentative="1">
@@ -6567,7 +6210,7 @@
         <w:ind w:left="4320" w:hanging="360"/>
       </w:pPr>
       <w:rPr>
-        <w:rFonts w:hint="default" w:ascii="Wingdings" w:hAnsi="Wingdings"/>
+        <w:rFonts w:ascii="Wingdings" w:hAnsi="Wingdings" w:hint="default"/>
       </w:rPr>
     </w:lvl>
     <w:lvl w:ilvl="6" w:tplc="04090001" w:tentative="1">
@@ -6579,7 +6222,7 @@
         <w:ind w:left="5040" w:hanging="360"/>
       </w:pPr>
       <w:rPr>
-        <w:rFonts w:hint="default" w:ascii="Symbol" w:hAnsi="Symbol"/>
+        <w:rFonts w:ascii="Symbol" w:hAnsi="Symbol" w:hint="default"/>
       </w:rPr>
     </w:lvl>
     <w:lvl w:ilvl="7" w:tplc="04090003" w:tentative="1">
@@ -6591,7 +6234,7 @@
         <w:ind w:left="5760" w:hanging="360"/>
       </w:pPr>
       <w:rPr>
-        <w:rFonts w:hint="default" w:ascii="Courier New" w:hAnsi="Courier New" w:cs="Courier New"/>
+        <w:rFonts w:ascii="Courier New" w:hAnsi="Courier New" w:cs="Courier New" w:hint="default"/>
       </w:rPr>
     </w:lvl>
     <w:lvl w:ilvl="8" w:tplc="04090005" w:tentative="1">
@@ -6603,7 +6246,7 @@
         <w:ind w:left="6480" w:hanging="360"/>
       </w:pPr>
       <w:rPr>
-        <w:rFonts w:hint="default" w:ascii="Wingdings" w:hAnsi="Wingdings"/>
+        <w:rFonts w:ascii="Wingdings" w:hAnsi="Wingdings" w:hint="default"/>
       </w:rPr>
     </w:lvl>
   </w:abstractNum>
@@ -6620,7 +6263,7 @@
         <w:ind w:left="720" w:hanging="360"/>
       </w:pPr>
       <w:rPr>
-        <w:rFonts w:hint="default" w:ascii="Wingdings" w:hAnsi="Wingdings"/>
+        <w:rFonts w:ascii="Wingdings" w:hAnsi="Wingdings" w:hint="default"/>
       </w:rPr>
     </w:lvl>
     <w:lvl w:ilvl="1" w:tplc="04090003" w:tentative="1">
@@ -6632,7 +6275,7 @@
         <w:ind w:left="1440" w:hanging="360"/>
       </w:pPr>
       <w:rPr>
-        <w:rFonts w:hint="default" w:ascii="Courier New" w:hAnsi="Courier New" w:cs="Courier New"/>
+        <w:rFonts w:ascii="Courier New" w:hAnsi="Courier New" w:cs="Courier New" w:hint="default"/>
       </w:rPr>
     </w:lvl>
     <w:lvl w:ilvl="2" w:tplc="04090005" w:tentative="1">
@@ -6644,7 +6287,7 @@
         <w:ind w:left="2160" w:hanging="360"/>
       </w:pPr>
       <w:rPr>
-        <w:rFonts w:hint="default" w:ascii="Wingdings" w:hAnsi="Wingdings"/>
+        <w:rFonts w:ascii="Wingdings" w:hAnsi="Wingdings" w:hint="default"/>
       </w:rPr>
     </w:lvl>
     <w:lvl w:ilvl="3" w:tplc="04090001" w:tentative="1">
@@ -6656,7 +6299,7 @@
         <w:ind w:left="2880" w:hanging="360"/>
       </w:pPr>
       <w:rPr>
-        <w:rFonts w:hint="default" w:ascii="Symbol" w:hAnsi="Symbol"/>
+        <w:rFonts w:ascii="Symbol" w:hAnsi="Symbol" w:hint="default"/>
       </w:rPr>
     </w:lvl>
     <w:lvl w:ilvl="4" w:tplc="04090003" w:tentative="1">
@@ -6668,7 +6311,7 @@
         <w:ind w:left="3600" w:hanging="360"/>
       </w:pPr>
       <w:rPr>
-        <w:rFonts w:hint="default" w:ascii="Courier New" w:hAnsi="Courier New" w:cs="Courier New"/>
+        <w:rFonts w:ascii="Courier New" w:hAnsi="Courier New" w:cs="Courier New" w:hint="default"/>
       </w:rPr>
     </w:lvl>
     <w:lvl w:ilvl="5" w:tplc="04090005" w:tentative="1">
@@ -6680,7 +6323,7 @@
         <w:ind w:left="4320" w:hanging="360"/>
       </w:pPr>
       <w:rPr>
-        <w:rFonts w:hint="default" w:ascii="Wingdings" w:hAnsi="Wingdings"/>
+        <w:rFonts w:ascii="Wingdings" w:hAnsi="Wingdings" w:hint="default"/>
       </w:rPr>
     </w:lvl>
     <w:lvl w:ilvl="6" w:tplc="04090001" w:tentative="1">
@@ -6692,7 +6335,7 @@
         <w:ind w:left="5040" w:hanging="360"/>
       </w:pPr>
       <w:rPr>
-        <w:rFonts w:hint="default" w:ascii="Symbol" w:hAnsi="Symbol"/>
+        <w:rFonts w:ascii="Symbol" w:hAnsi="Symbol" w:hint="default"/>
       </w:rPr>
     </w:lvl>
     <w:lvl w:ilvl="7" w:tplc="04090003" w:tentative="1">
@@ -6704,7 +6347,7 @@
         <w:ind w:left="5760" w:hanging="360"/>
       </w:pPr>
       <w:rPr>
-        <w:rFonts w:hint="default" w:ascii="Courier New" w:hAnsi="Courier New" w:cs="Courier New"/>
+        <w:rFonts w:ascii="Courier New" w:hAnsi="Courier New" w:cs="Courier New" w:hint="default"/>
       </w:rPr>
     </w:lvl>
     <w:lvl w:ilvl="8" w:tplc="04090005" w:tentative="1">
@@ -6716,7 +6359,7 @@
         <w:ind w:left="6480" w:hanging="360"/>
       </w:pPr>
       <w:rPr>
-        <w:rFonts w:hint="default" w:ascii="Wingdings" w:hAnsi="Wingdings"/>
+        <w:rFonts w:ascii="Wingdings" w:hAnsi="Wingdings" w:hint="default"/>
       </w:rPr>
     </w:lvl>
   </w:abstractNum>
@@ -6733,7 +6376,7 @@
         <w:ind w:left="770" w:hanging="360"/>
       </w:pPr>
       <w:rPr>
-        <w:rFonts w:hint="default" w:ascii="Wingdings" w:hAnsi="Wingdings"/>
+        <w:rFonts w:ascii="Wingdings" w:hAnsi="Wingdings" w:hint="default"/>
       </w:rPr>
     </w:lvl>
     <w:lvl w:ilvl="1" w:tplc="04090003" w:tentative="1">
@@ -6745,7 +6388,7 @@
         <w:ind w:left="1490" w:hanging="360"/>
       </w:pPr>
       <w:rPr>
-        <w:rFonts w:hint="default" w:ascii="Courier New" w:hAnsi="Courier New" w:cs="Courier New"/>
+        <w:rFonts w:ascii="Courier New" w:hAnsi="Courier New" w:cs="Courier New" w:hint="default"/>
       </w:rPr>
     </w:lvl>
     <w:lvl w:ilvl="2" w:tplc="04090005" w:tentative="1">
@@ -6757,7 +6400,7 @@
         <w:ind w:left="2210" w:hanging="360"/>
       </w:pPr>
       <w:rPr>
-        <w:rFonts w:hint="default" w:ascii="Wingdings" w:hAnsi="Wingdings"/>
+        <w:rFonts w:ascii="Wingdings" w:hAnsi="Wingdings" w:hint="default"/>
       </w:rPr>
     </w:lvl>
     <w:lvl w:ilvl="3" w:tplc="04090001" w:tentative="1">
@@ -6769,7 +6412,7 @@
         <w:ind w:left="2930" w:hanging="360"/>
       </w:pPr>
       <w:rPr>
-        <w:rFonts w:hint="default" w:ascii="Symbol" w:hAnsi="Symbol"/>
+        <w:rFonts w:ascii="Symbol" w:hAnsi="Symbol" w:hint="default"/>
       </w:rPr>
     </w:lvl>
     <w:lvl w:ilvl="4" w:tplc="04090003" w:tentative="1">
@@ -6781,7 +6424,7 @@
         <w:ind w:left="3650" w:hanging="360"/>
       </w:pPr>
       <w:rPr>
-        <w:rFonts w:hint="default" w:ascii="Courier New" w:hAnsi="Courier New" w:cs="Courier New"/>
+        <w:rFonts w:ascii="Courier New" w:hAnsi="Courier New" w:cs="Courier New" w:hint="default"/>
       </w:rPr>
     </w:lvl>
     <w:lvl w:ilvl="5" w:tplc="04090005" w:tentative="1">
@@ -6793,7 +6436,7 @@
         <w:ind w:left="4370" w:hanging="360"/>
       </w:pPr>
       <w:rPr>
-        <w:rFonts w:hint="default" w:ascii="Wingdings" w:hAnsi="Wingdings"/>
+        <w:rFonts w:ascii="Wingdings" w:hAnsi="Wingdings" w:hint="default"/>
       </w:rPr>
     </w:lvl>
     <w:lvl w:ilvl="6" w:tplc="04090001" w:tentative="1">
@@ -6805,7 +6448,7 @@
         <w:ind w:left="5090" w:hanging="360"/>
       </w:pPr>
       <w:rPr>
-        <w:rFonts w:hint="default" w:ascii="Symbol" w:hAnsi="Symbol"/>
+        <w:rFonts w:ascii="Symbol" w:hAnsi="Symbol" w:hint="default"/>
       </w:rPr>
     </w:lvl>
     <w:lvl w:ilvl="7" w:tplc="04090003" w:tentative="1">
@@ -6817,7 +6460,7 @@
         <w:ind w:left="5810" w:hanging="360"/>
       </w:pPr>
       <w:rPr>
-        <w:rFonts w:hint="default" w:ascii="Courier New" w:hAnsi="Courier New" w:cs="Courier New"/>
+        <w:rFonts w:ascii="Courier New" w:hAnsi="Courier New" w:cs="Courier New" w:hint="default"/>
       </w:rPr>
     </w:lvl>
     <w:lvl w:ilvl="8" w:tplc="04090005" w:tentative="1">
@@ -6829,7 +6472,7 @@
         <w:ind w:left="6530" w:hanging="360"/>
       </w:pPr>
       <w:rPr>
-        <w:rFonts w:hint="default" w:ascii="Wingdings" w:hAnsi="Wingdings"/>
+        <w:rFonts w:ascii="Wingdings" w:hAnsi="Wingdings" w:hint="default"/>
       </w:rPr>
     </w:lvl>
   </w:abstractNum>
@@ -6846,7 +6489,7 @@
         <w:ind w:left="720" w:hanging="360"/>
       </w:pPr>
       <w:rPr>
-        <w:rFonts w:hint="default" w:ascii="Wingdings" w:hAnsi="Wingdings"/>
+        <w:rFonts w:ascii="Wingdings" w:hAnsi="Wingdings" w:hint="default"/>
       </w:rPr>
     </w:lvl>
     <w:lvl w:ilvl="1" w:tplc="04090003" w:tentative="1">
@@ -6858,7 +6501,7 @@
         <w:ind w:left="1440" w:hanging="360"/>
       </w:pPr>
       <w:rPr>
-        <w:rFonts w:hint="default" w:ascii="Courier New" w:hAnsi="Courier New" w:cs="Courier New"/>
+        <w:rFonts w:ascii="Courier New" w:hAnsi="Courier New" w:cs="Courier New" w:hint="default"/>
       </w:rPr>
     </w:lvl>
     <w:lvl w:ilvl="2" w:tplc="04090005" w:tentative="1">
@@ -6870,7 +6513,7 @@
         <w:ind w:left="2160" w:hanging="360"/>
       </w:pPr>
       <w:rPr>
-        <w:rFonts w:hint="default" w:ascii="Wingdings" w:hAnsi="Wingdings"/>
+        <w:rFonts w:ascii="Wingdings" w:hAnsi="Wingdings" w:hint="default"/>
       </w:rPr>
     </w:lvl>
     <w:lvl w:ilvl="3" w:tplc="04090001" w:tentative="1">
@@ -6882,7 +6525,7 @@
         <w:ind w:left="2880" w:hanging="360"/>
       </w:pPr>
       <w:rPr>
-        <w:rFonts w:hint="default" w:ascii="Symbol" w:hAnsi="Symbol"/>
+        <w:rFonts w:ascii="Symbol" w:hAnsi="Symbol" w:hint="default"/>
       </w:rPr>
     </w:lvl>
     <w:lvl w:ilvl="4" w:tplc="04090003" w:tentative="1">
@@ -6894,7 +6537,7 @@
         <w:ind w:left="3600" w:hanging="360"/>
       </w:pPr>
       <w:rPr>
-        <w:rFonts w:hint="default" w:ascii="Courier New" w:hAnsi="Courier New" w:cs="Courier New"/>
+        <w:rFonts w:ascii="Courier New" w:hAnsi="Courier New" w:cs="Courier New" w:hint="default"/>
       </w:rPr>
     </w:lvl>
     <w:lvl w:ilvl="5" w:tplc="04090005" w:tentative="1">
@@ -6906,7 +6549,7 @@
         <w:ind w:left="4320" w:hanging="360"/>
       </w:pPr>
       <w:rPr>
-        <w:rFonts w:hint="default" w:ascii="Wingdings" w:hAnsi="Wingdings"/>
+        <w:rFonts w:ascii="Wingdings" w:hAnsi="Wingdings" w:hint="default"/>
       </w:rPr>
     </w:lvl>
     <w:lvl w:ilvl="6" w:tplc="04090001" w:tentative="1">
@@ -6918,7 +6561,7 @@
         <w:ind w:left="5040" w:hanging="360"/>
       </w:pPr>
       <w:rPr>
-        <w:rFonts w:hint="default" w:ascii="Symbol" w:hAnsi="Symbol"/>
+        <w:rFonts w:ascii="Symbol" w:hAnsi="Symbol" w:hint="default"/>
       </w:rPr>
     </w:lvl>
     <w:lvl w:ilvl="7" w:tplc="04090003" w:tentative="1">
@@ -6930,7 +6573,7 @@
         <w:ind w:left="5760" w:hanging="360"/>
       </w:pPr>
       <w:rPr>
-        <w:rFonts w:hint="default" w:ascii="Courier New" w:hAnsi="Courier New" w:cs="Courier New"/>
+        <w:rFonts w:ascii="Courier New" w:hAnsi="Courier New" w:cs="Courier New" w:hint="default"/>
       </w:rPr>
     </w:lvl>
     <w:lvl w:ilvl="8" w:tplc="04090005" w:tentative="1">
@@ -6942,7 +6585,7 @@
         <w:ind w:left="6480" w:hanging="360"/>
       </w:pPr>
       <w:rPr>
-        <w:rFonts w:hint="default" w:ascii="Wingdings" w:hAnsi="Wingdings"/>
+        <w:rFonts w:ascii="Wingdings" w:hAnsi="Wingdings" w:hint="default"/>
       </w:rPr>
     </w:lvl>
   </w:abstractNum>
@@ -7072,7 +6715,7 @@
         <w:ind w:left="720" w:hanging="360"/>
       </w:pPr>
       <w:rPr>
-        <w:rFonts w:hint="default" w:ascii="Wingdings" w:hAnsi="Wingdings"/>
+        <w:rFonts w:ascii="Wingdings" w:hAnsi="Wingdings" w:hint="default"/>
       </w:rPr>
     </w:lvl>
     <w:lvl w:ilvl="1" w:tplc="04090003" w:tentative="1">
@@ -7084,7 +6727,7 @@
         <w:ind w:left="1440" w:hanging="360"/>
       </w:pPr>
       <w:rPr>
-        <w:rFonts w:hint="default" w:ascii="Courier New" w:hAnsi="Courier New" w:cs="Courier New"/>
+        <w:rFonts w:ascii="Courier New" w:hAnsi="Courier New" w:cs="Courier New" w:hint="default"/>
       </w:rPr>
     </w:lvl>
     <w:lvl w:ilvl="2" w:tplc="04090005" w:tentative="1">
@@ -7096,7 +6739,7 @@
         <w:ind w:left="2160" w:hanging="360"/>
       </w:pPr>
       <w:rPr>
-        <w:rFonts w:hint="default" w:ascii="Wingdings" w:hAnsi="Wingdings"/>
+        <w:rFonts w:ascii="Wingdings" w:hAnsi="Wingdings" w:hint="default"/>
       </w:rPr>
     </w:lvl>
     <w:lvl w:ilvl="3" w:tplc="04090001" w:tentative="1">
@@ -7108,7 +6751,7 @@
         <w:ind w:left="2880" w:hanging="360"/>
       </w:pPr>
       <w:rPr>
-        <w:rFonts w:hint="default" w:ascii="Symbol" w:hAnsi="Symbol"/>
+        <w:rFonts w:ascii="Symbol" w:hAnsi="Symbol" w:hint="default"/>
       </w:rPr>
     </w:lvl>
     <w:lvl w:ilvl="4" w:tplc="04090003" w:tentative="1">
@@ -7120,7 +6763,7 @@
         <w:ind w:left="3600" w:hanging="360"/>
       </w:pPr>
       <w:rPr>
-        <w:rFonts w:hint="default" w:ascii="Courier New" w:hAnsi="Courier New" w:cs="Courier New"/>
+        <w:rFonts w:ascii="Courier New" w:hAnsi="Courier New" w:cs="Courier New" w:hint="default"/>
       </w:rPr>
     </w:lvl>
     <w:lvl w:ilvl="5" w:tplc="04090005" w:tentative="1">
@@ -7132,7 +6775,7 @@
         <w:ind w:left="4320" w:hanging="360"/>
       </w:pPr>
       <w:rPr>
-        <w:rFonts w:hint="default" w:ascii="Wingdings" w:hAnsi="Wingdings"/>
+        <w:rFonts w:ascii="Wingdings" w:hAnsi="Wingdings" w:hint="default"/>
       </w:rPr>
     </w:lvl>
     <w:lvl w:ilvl="6" w:tplc="04090001" w:tentative="1">
@@ -7144,7 +6787,7 @@
         <w:ind w:left="5040" w:hanging="360"/>
       </w:pPr>
       <w:rPr>
-        <w:rFonts w:hint="default" w:ascii="Symbol" w:hAnsi="Symbol"/>
+        <w:rFonts w:ascii="Symbol" w:hAnsi="Symbol" w:hint="default"/>
       </w:rPr>
     </w:lvl>
     <w:lvl w:ilvl="7" w:tplc="04090003" w:tentative="1">
@@ -7156,7 +6799,7 @@
         <w:ind w:left="5760" w:hanging="360"/>
       </w:pPr>
       <w:rPr>
-        <w:rFonts w:hint="default" w:ascii="Courier New" w:hAnsi="Courier New" w:cs="Courier New"/>
+        <w:rFonts w:ascii="Courier New" w:hAnsi="Courier New" w:cs="Courier New" w:hint="default"/>
       </w:rPr>
     </w:lvl>
     <w:lvl w:ilvl="8" w:tplc="04090005" w:tentative="1">
@@ -7168,7 +6811,7 @@
         <w:ind w:left="6480" w:hanging="360"/>
       </w:pPr>
       <w:rPr>
-        <w:rFonts w:hint="default" w:ascii="Wingdings" w:hAnsi="Wingdings"/>
+        <w:rFonts w:ascii="Wingdings" w:hAnsi="Wingdings" w:hint="default"/>
       </w:rPr>
     </w:lvl>
   </w:abstractNum>
@@ -7184,7 +6827,7 @@
         <w:ind w:left="1320" w:hanging="360"/>
       </w:pPr>
       <w:rPr>
-        <w:rFonts w:hint="default" w:ascii="Cordia New" w:hAnsi="Cordia New" w:eastAsia="Times New Roman" w:cs="Cordia New"/>
+        <w:rFonts w:ascii="Cordia New" w:eastAsia="Times New Roman" w:hAnsi="Cordia New" w:cs="Cordia New" w:hint="default"/>
         <w:color w:val="000000"/>
       </w:rPr>
     </w:lvl>
@@ -7197,7 +6840,7 @@
         <w:ind w:left="2040" w:hanging="360"/>
       </w:pPr>
       <w:rPr>
-        <w:rFonts w:hint="default" w:ascii="Courier New" w:hAnsi="Courier New" w:cs="Courier New"/>
+        <w:rFonts w:ascii="Courier New" w:hAnsi="Courier New" w:cs="Courier New" w:hint="default"/>
       </w:rPr>
     </w:lvl>
     <w:lvl w:ilvl="2" w:tplc="04090005" w:tentative="1">
@@ -7209,7 +6852,7 @@
         <w:ind w:left="2760" w:hanging="360"/>
       </w:pPr>
       <w:rPr>
-        <w:rFonts w:hint="default" w:ascii="Wingdings" w:hAnsi="Wingdings"/>
+        <w:rFonts w:ascii="Wingdings" w:hAnsi="Wingdings" w:hint="default"/>
       </w:rPr>
     </w:lvl>
     <w:lvl w:ilvl="3" w:tplc="04090001" w:tentative="1">
@@ -7221,7 +6864,7 @@
         <w:ind w:left="3480" w:hanging="360"/>
       </w:pPr>
       <w:rPr>
-        <w:rFonts w:hint="default" w:ascii="Symbol" w:hAnsi="Symbol"/>
+        <w:rFonts w:ascii="Symbol" w:hAnsi="Symbol" w:hint="default"/>
       </w:rPr>
     </w:lvl>
     <w:lvl w:ilvl="4" w:tplc="04090003" w:tentative="1">
@@ -7233,7 +6876,7 @@
         <w:ind w:left="4200" w:hanging="360"/>
       </w:pPr>
       <w:rPr>
-        <w:rFonts w:hint="default" w:ascii="Courier New" w:hAnsi="Courier New" w:cs="Courier New"/>
+        <w:rFonts w:ascii="Courier New" w:hAnsi="Courier New" w:cs="Courier New" w:hint="default"/>
       </w:rPr>
     </w:lvl>
     <w:lvl w:ilvl="5" w:tplc="04090005" w:tentative="1">
@@ -7245,7 +6888,7 @@
         <w:ind w:left="4920" w:hanging="360"/>
       </w:pPr>
       <w:rPr>
-        <w:rFonts w:hint="default" w:ascii="Wingdings" w:hAnsi="Wingdings"/>
+        <w:rFonts w:ascii="Wingdings" w:hAnsi="Wingdings" w:hint="default"/>
       </w:rPr>
     </w:lvl>
     <w:lvl w:ilvl="6" w:tplc="04090001" w:tentative="1">
@@ -7257,7 +6900,7 @@
         <w:ind w:left="5640" w:hanging="360"/>
       </w:pPr>
       <w:rPr>
-        <w:rFonts w:hint="default" w:ascii="Symbol" w:hAnsi="Symbol"/>
+        <w:rFonts w:ascii="Symbol" w:hAnsi="Symbol" w:hint="default"/>
       </w:rPr>
     </w:lvl>
     <w:lvl w:ilvl="7" w:tplc="04090003" w:tentative="1">
@@ -7269,7 +6912,7 @@
         <w:ind w:left="6360" w:hanging="360"/>
       </w:pPr>
       <w:rPr>
-        <w:rFonts w:hint="default" w:ascii="Courier New" w:hAnsi="Courier New" w:cs="Courier New"/>
+        <w:rFonts w:ascii="Courier New" w:hAnsi="Courier New" w:cs="Courier New" w:hint="default"/>
       </w:rPr>
     </w:lvl>
     <w:lvl w:ilvl="8" w:tplc="04090005" w:tentative="1">
@@ -7281,7 +6924,7 @@
         <w:ind w:left="7080" w:hanging="360"/>
       </w:pPr>
       <w:rPr>
-        <w:rFonts w:hint="default" w:ascii="Wingdings" w:hAnsi="Wingdings"/>
+        <w:rFonts w:ascii="Wingdings" w:hAnsi="Wingdings" w:hint="default"/>
       </w:rPr>
     </w:lvl>
   </w:abstractNum>
@@ -7298,7 +6941,7 @@
         <w:ind w:left="720" w:hanging="360"/>
       </w:pPr>
       <w:rPr>
-        <w:rFonts w:hint="default" w:ascii="Wingdings" w:hAnsi="Wingdings"/>
+        <w:rFonts w:ascii="Wingdings" w:hAnsi="Wingdings" w:hint="default"/>
       </w:rPr>
     </w:lvl>
     <w:lvl w:ilvl="1" w:tplc="04090003" w:tentative="1">
@@ -7310,7 +6953,7 @@
         <w:ind w:left="1440" w:hanging="360"/>
       </w:pPr>
       <w:rPr>
-        <w:rFonts w:hint="default" w:ascii="Courier New" w:hAnsi="Courier New" w:cs="Courier New"/>
+        <w:rFonts w:ascii="Courier New" w:hAnsi="Courier New" w:cs="Courier New" w:hint="default"/>
       </w:rPr>
     </w:lvl>
     <w:lvl w:ilvl="2" w:tplc="04090005" w:tentative="1">
@@ -7322,7 +6965,7 @@
         <w:ind w:left="2160" w:hanging="360"/>
       </w:pPr>
       <w:rPr>
-        <w:rFonts w:hint="default" w:ascii="Wingdings" w:hAnsi="Wingdings"/>
+        <w:rFonts w:ascii="Wingdings" w:hAnsi="Wingdings" w:hint="default"/>
       </w:rPr>
     </w:lvl>
     <w:lvl w:ilvl="3" w:tplc="04090001" w:tentative="1">
@@ -7334,7 +6977,7 @@
         <w:ind w:left="2880" w:hanging="360"/>
       </w:pPr>
       <w:rPr>
-        <w:rFonts w:hint="default" w:ascii="Symbol" w:hAnsi="Symbol"/>
+        <w:rFonts w:ascii="Symbol" w:hAnsi="Symbol" w:hint="default"/>
       </w:rPr>
     </w:lvl>
     <w:lvl w:ilvl="4" w:tplc="04090003" w:tentative="1">
@@ -7346,7 +6989,7 @@
         <w:ind w:left="3600" w:hanging="360"/>
       </w:pPr>
       <w:rPr>
-        <w:rFonts w:hint="default" w:ascii="Courier New" w:hAnsi="Courier New" w:cs="Courier New"/>
+        <w:rFonts w:ascii="Courier New" w:hAnsi="Courier New" w:cs="Courier New" w:hint="default"/>
       </w:rPr>
     </w:lvl>
     <w:lvl w:ilvl="5" w:tplc="04090005" w:tentative="1">
@@ -7358,7 +7001,7 @@
         <w:ind w:left="4320" w:hanging="360"/>
       </w:pPr>
       <w:rPr>
-        <w:rFonts w:hint="default" w:ascii="Wingdings" w:hAnsi="Wingdings"/>
+        <w:rFonts w:ascii="Wingdings" w:hAnsi="Wingdings" w:hint="default"/>
       </w:rPr>
     </w:lvl>
     <w:lvl w:ilvl="6" w:tplc="04090001" w:tentative="1">
@@ -7370,7 +7013,7 @@
         <w:ind w:left="5040" w:hanging="360"/>
       </w:pPr>
       <w:rPr>
-        <w:rFonts w:hint="default" w:ascii="Symbol" w:hAnsi="Symbol"/>
+        <w:rFonts w:ascii="Symbol" w:hAnsi="Symbol" w:hint="default"/>
       </w:rPr>
     </w:lvl>
     <w:lvl w:ilvl="7" w:tplc="04090003" w:tentative="1">
@@ -7382,7 +7025,7 @@
         <w:ind w:left="5760" w:hanging="360"/>
       </w:pPr>
       <w:rPr>
-        <w:rFonts w:hint="default" w:ascii="Courier New" w:hAnsi="Courier New" w:cs="Courier New"/>
+        <w:rFonts w:ascii="Courier New" w:hAnsi="Courier New" w:cs="Courier New" w:hint="default"/>
       </w:rPr>
     </w:lvl>
     <w:lvl w:ilvl="8" w:tplc="04090005" w:tentative="1">
@@ -7394,7 +7037,7 @@
         <w:ind w:left="6480" w:hanging="360"/>
       </w:pPr>
       <w:rPr>
-        <w:rFonts w:hint="default" w:ascii="Wingdings" w:hAnsi="Wingdings"/>
+        <w:rFonts w:ascii="Wingdings" w:hAnsi="Wingdings" w:hint="default"/>
       </w:rPr>
     </w:lvl>
   </w:abstractNum>
@@ -7473,7 +7116,7 @@
   <w:docDefaults>
     <w:rPrDefault>
       <w:rPr>
-        <w:rFonts w:ascii="Arial" w:hAnsi="Arial" w:eastAsia="Arial" w:cs="Arial"/>
+        <w:rFonts w:ascii="Arial" w:eastAsia="Arial" w:hAnsi="Arial" w:cs="Arial"/>
         <w:sz w:val="22"/>
         <w:szCs w:val="22"/>
         <w:lang w:val="en" w:eastAsia="en-US" w:bidi="th-TH"/>
@@ -7488,14 +7131,14 @@
   <w:latentStyles w:defLockedState="0" w:defUIPriority="99" w:defSemiHidden="0" w:defUnhideWhenUsed="0" w:defQFormat="0" w:count="376">
     <w:lsdException w:name="Normal" w:uiPriority="0" w:qFormat="1"/>
     <w:lsdException w:name="heading 1" w:uiPriority="9" w:qFormat="1"/>
-    <w:lsdException w:name="heading 2" w:uiPriority="9" w:semiHidden="1" w:unhideWhenUsed="1" w:qFormat="1"/>
-    <w:lsdException w:name="heading 3" w:uiPriority="9" w:semiHidden="1" w:unhideWhenUsed="1" w:qFormat="1"/>
-    <w:lsdException w:name="heading 4" w:uiPriority="9" w:semiHidden="1" w:unhideWhenUsed="1" w:qFormat="1"/>
-    <w:lsdException w:name="heading 5" w:uiPriority="9" w:semiHidden="1" w:unhideWhenUsed="1" w:qFormat="1"/>
-    <w:lsdException w:name="heading 6" w:uiPriority="9" w:semiHidden="1" w:unhideWhenUsed="1" w:qFormat="1"/>
-    <w:lsdException w:name="heading 7" w:uiPriority="9" w:semiHidden="1" w:unhideWhenUsed="1" w:qFormat="1"/>
-    <w:lsdException w:name="heading 8" w:uiPriority="9" w:semiHidden="1" w:unhideWhenUsed="1" w:qFormat="1"/>
-    <w:lsdException w:name="heading 9" w:uiPriority="9" w:semiHidden="1" w:unhideWhenUsed="1" w:qFormat="1"/>
+    <w:lsdException w:name="heading 2" w:semiHidden="1" w:uiPriority="9" w:unhideWhenUsed="1" w:qFormat="1"/>
+    <w:lsdException w:name="heading 3" w:semiHidden="1" w:uiPriority="9" w:unhideWhenUsed="1" w:qFormat="1"/>
+    <w:lsdException w:name="heading 4" w:semiHidden="1" w:uiPriority="9" w:unhideWhenUsed="1" w:qFormat="1"/>
+    <w:lsdException w:name="heading 5" w:semiHidden="1" w:uiPriority="9" w:unhideWhenUsed="1" w:qFormat="1"/>
+    <w:lsdException w:name="heading 6" w:semiHidden="1" w:uiPriority="9" w:unhideWhenUsed="1" w:qFormat="1"/>
+    <w:lsdException w:name="heading 7" w:semiHidden="1" w:uiPriority="9" w:unhideWhenUsed="1" w:qFormat="1"/>
+    <w:lsdException w:name="heading 8" w:semiHidden="1" w:uiPriority="9" w:unhideWhenUsed="1" w:qFormat="1"/>
+    <w:lsdException w:name="heading 9" w:semiHidden="1" w:uiPriority="9" w:unhideWhenUsed="1" w:qFormat="1"/>
     <w:lsdException w:name="index 1" w:semiHidden="1" w:unhideWhenUsed="1"/>
     <w:lsdException w:name="index 2" w:semiHidden="1" w:unhideWhenUsed="1"/>
     <w:lsdException w:name="index 3" w:semiHidden="1" w:unhideWhenUsed="1"/>
@@ -7505,22 +7148,22 @@
     <w:lsdException w:name="index 7" w:semiHidden="1" w:unhideWhenUsed="1"/>
     <w:lsdException w:name="index 8" w:semiHidden="1" w:unhideWhenUsed="1"/>
     <w:lsdException w:name="index 9" w:semiHidden="1" w:unhideWhenUsed="1"/>
-    <w:lsdException w:name="toc 1" w:uiPriority="39" w:semiHidden="1" w:unhideWhenUsed="1"/>
-    <w:lsdException w:name="toc 2" w:uiPriority="39" w:semiHidden="1" w:unhideWhenUsed="1"/>
-    <w:lsdException w:name="toc 3" w:uiPriority="39" w:semiHidden="1" w:unhideWhenUsed="1"/>
-    <w:lsdException w:name="toc 4" w:uiPriority="39" w:semiHidden="1" w:unhideWhenUsed="1"/>
-    <w:lsdException w:name="toc 5" w:uiPriority="39" w:semiHidden="1" w:unhideWhenUsed="1"/>
-    <w:lsdException w:name="toc 6" w:uiPriority="39" w:semiHidden="1" w:unhideWhenUsed="1"/>
-    <w:lsdException w:name="toc 7" w:uiPriority="39" w:semiHidden="1" w:unhideWhenUsed="1"/>
-    <w:lsdException w:name="toc 8" w:uiPriority="39" w:semiHidden="1" w:unhideWhenUsed="1"/>
-    <w:lsdException w:name="toc 9" w:uiPriority="39" w:semiHidden="1" w:unhideWhenUsed="1"/>
+    <w:lsdException w:name="toc 1" w:semiHidden="1" w:uiPriority="39" w:unhideWhenUsed="1"/>
+    <w:lsdException w:name="toc 2" w:semiHidden="1" w:uiPriority="39" w:unhideWhenUsed="1"/>
+    <w:lsdException w:name="toc 3" w:semiHidden="1" w:uiPriority="39" w:unhideWhenUsed="1"/>
+    <w:lsdException w:name="toc 4" w:semiHidden="1" w:uiPriority="39" w:unhideWhenUsed="1"/>
+    <w:lsdException w:name="toc 5" w:semiHidden="1" w:uiPriority="39" w:unhideWhenUsed="1"/>
+    <w:lsdException w:name="toc 6" w:semiHidden="1" w:uiPriority="39" w:unhideWhenUsed="1"/>
+    <w:lsdException w:name="toc 7" w:semiHidden="1" w:uiPriority="39" w:unhideWhenUsed="1"/>
+    <w:lsdException w:name="toc 8" w:semiHidden="1" w:uiPriority="39" w:unhideWhenUsed="1"/>
+    <w:lsdException w:name="toc 9" w:semiHidden="1" w:uiPriority="39" w:unhideWhenUsed="1"/>
     <w:lsdException w:name="Normal Indent" w:semiHidden="1" w:unhideWhenUsed="1"/>
     <w:lsdException w:name="footnote text" w:semiHidden="1" w:unhideWhenUsed="1"/>
     <w:lsdException w:name="annotation text" w:semiHidden="1" w:unhideWhenUsed="1"/>
     <w:lsdException w:name="header" w:semiHidden="1" w:unhideWhenUsed="1"/>
     <w:lsdException w:name="footer" w:semiHidden="1" w:unhideWhenUsed="1"/>
     <w:lsdException w:name="index heading" w:semiHidden="1" w:unhideWhenUsed="1"/>
-    <w:lsdException w:name="caption" w:uiPriority="35" w:semiHidden="1" w:unhideWhenUsed="1" w:qFormat="1"/>
+    <w:lsdException w:name="caption" w:semiHidden="1" w:uiPriority="35" w:unhideWhenUsed="1" w:qFormat="1"/>
     <w:lsdException w:name="table of figures" w:semiHidden="1" w:unhideWhenUsed="1"/>
     <w:lsdException w:name="envelope address" w:semiHidden="1" w:unhideWhenUsed="1"/>
     <w:lsdException w:name="envelope return" w:semiHidden="1" w:unhideWhenUsed="1"/>
@@ -7551,7 +7194,7 @@
     <w:lsdException w:name="Title" w:uiPriority="10" w:qFormat="1"/>
     <w:lsdException w:name="Closing" w:semiHidden="1" w:unhideWhenUsed="1"/>
     <w:lsdException w:name="Signature" w:semiHidden="1" w:unhideWhenUsed="1"/>
-    <w:lsdException w:name="Default Paragraph Font" w:uiPriority="1" w:semiHidden="1" w:unhideWhenUsed="1"/>
+    <w:lsdException w:name="Default Paragraph Font" w:semiHidden="1" w:uiPriority="1" w:unhideWhenUsed="1"/>
     <w:lsdException w:name="Body Text" w:semiHidden="1" w:unhideWhenUsed="1"/>
     <w:lsdException w:name="Body Text Indent" w:semiHidden="1" w:unhideWhenUsed="1"/>
     <w:lsdException w:name="List Continue" w:semiHidden="1" w:unhideWhenUsed="1"/>
@@ -7751,8 +7394,8 @@
     <w:lsdException w:name="Subtle Reference" w:uiPriority="31" w:qFormat="1"/>
     <w:lsdException w:name="Intense Reference" w:uiPriority="32" w:qFormat="1"/>
     <w:lsdException w:name="Book Title" w:uiPriority="33" w:qFormat="1"/>
-    <w:lsdException w:name="Bibliography" w:uiPriority="37" w:semiHidden="1" w:unhideWhenUsed="1"/>
-    <w:lsdException w:name="TOC Heading" w:uiPriority="39" w:semiHidden="1" w:unhideWhenUsed="1" w:qFormat="1"/>
+    <w:lsdException w:name="Bibliography" w:semiHidden="1" w:uiPriority="37" w:unhideWhenUsed="1"/>
+    <w:lsdException w:name="TOC Heading" w:semiHidden="1" w:uiPriority="39" w:unhideWhenUsed="1" w:qFormat="1"/>
     <w:lsdException w:name="Plain Table 1" w:uiPriority="41"/>
     <w:lsdException w:name="Plain Table 2" w:uiPriority="42"/>
     <w:lsdException w:name="Plain Table 3" w:uiPriority="43"/>
@@ -7863,7 +7506,7 @@
     <w:lsdException w:name="Unresolved Mention" w:semiHidden="1" w:unhideWhenUsed="1"/>
     <w:lsdException w:name="Smart Link" w:semiHidden="1" w:unhideWhenUsed="1"/>
   </w:latentStyles>
-  <w:style w:type="paragraph" w:styleId="Normal" w:default="1">
+  <w:style w:type="paragraph" w:default="1" w:styleId="Normal">
     <w:name w:val="Normal"/>
     <w:qFormat/>
   </w:style>
@@ -7980,13 +7623,13 @@
       <w:color w:val="666666"/>
     </w:rPr>
   </w:style>
-  <w:style w:type="character" w:styleId="DefaultParagraphFont" w:default="1">
+  <w:style w:type="character" w:default="1" w:styleId="DefaultParagraphFont">
     <w:name w:val="Default Paragraph Font"/>
     <w:uiPriority w:val="1"/>
     <w:semiHidden/>
     <w:unhideWhenUsed/>
   </w:style>
-  <w:style w:type="table" w:styleId="TableNormal" w:default="1">
+  <w:style w:type="table" w:default="1" w:styleId="TableNormal">
     <w:name w:val="Normal Table"/>
     <w:uiPriority w:val="99"/>
     <w:semiHidden/>
@@ -8001,7 +7644,7 @@
       </w:tblCellMar>
     </w:tblPr>
   </w:style>
-  <w:style w:type="numbering" w:styleId="NoList" w:default="1">
+  <w:style w:type="numbering" w:default="1" w:styleId="NoList">
     <w:name w:val="No List"/>
     <w:uiPriority w:val="99"/>
     <w:semiHidden/>
@@ -8077,7 +7720,7 @@
       <w:spacing w:before="100" w:beforeAutospacing="1" w:after="100" w:afterAutospacing="1" w:line="240" w:lineRule="auto"/>
     </w:pPr>
     <w:rPr>
-      <w:rFonts w:ascii="Times New Roman" w:hAnsi="Times New Roman" w:eastAsia="Times New Roman" w:cs="Times New Roman"/>
+      <w:rFonts w:ascii="Times New Roman" w:eastAsia="Times New Roman" w:hAnsi="Times New Roman" w:cs="Times New Roman"/>
       <w:sz w:val="24"/>
       <w:szCs w:val="24"/>
       <w:lang w:val="en-US"/>
@@ -8097,20 +7740,20 @@
       <w:spacing w:line="240" w:lineRule="auto"/>
     </w:pPr>
     <w:rPr>
-      <w:rFonts w:ascii="Cordia New" w:hAnsi="Cordia New" w:eastAsia="Cordia New" w:cs="Angsana New"/>
+      <w:rFonts w:ascii="Cordia New" w:eastAsia="Cordia New" w:hAnsi="Cordia New" w:cs="Angsana New"/>
       <w:sz w:val="28"/>
       <w:szCs w:val="28"/>
       <w:lang w:val="en-US"/>
     </w:rPr>
   </w:style>
-  <w:style w:type="character" w:styleId="FooterChar" w:customStyle="1">
+  <w:style w:type="character" w:customStyle="1" w:styleId="FooterChar">
     <w:name w:val="Footer Char"/>
     <w:basedOn w:val="DefaultParagraphFont"/>
     <w:link w:val="Footer"/>
     <w:uiPriority w:val="99"/>
     <w:rsid w:val="008C7C1D"/>
     <w:rPr>
-      <w:rFonts w:ascii="Cordia New" w:hAnsi="Cordia New" w:eastAsia="Cordia New" w:cs="Angsana New"/>
+      <w:rFonts w:ascii="Cordia New" w:eastAsia="Cordia New" w:hAnsi="Cordia New" w:cs="Angsana New"/>
       <w:sz w:val="28"/>
       <w:szCs w:val="28"/>
       <w:lang w:val="en-US"/>
@@ -8127,17 +7770,17 @@
       <w:u w:val="single"/>
     </w:rPr>
   </w:style>
-  <w:style w:type="character" w:styleId="normaltextrun" w:customStyle="1">
+  <w:style w:type="character" w:customStyle="1" w:styleId="normaltextrun">
     <w:name w:val="normaltextrun"/>
     <w:basedOn w:val="DefaultParagraphFont"/>
     <w:rsid w:val="00AD0F31"/>
   </w:style>
-  <w:style w:type="character" w:styleId="eop" w:customStyle="1">
+  <w:style w:type="character" w:customStyle="1" w:styleId="eop">
     <w:name w:val="eop"/>
     <w:basedOn w:val="DefaultParagraphFont"/>
     <w:rsid w:val="00AD0F31"/>
   </w:style>
-  <w:style w:type="paragraph" w:styleId="paragraph" w:customStyle="1">
+  <w:style w:type="paragraph" w:customStyle="1" w:styleId="paragraph">
     <w:name w:val="paragraph"/>
     <w:basedOn w:val="Normal"/>
     <w:rsid w:val="00DC6589"/>
@@ -8145,7 +7788,7 @@
       <w:spacing w:before="100" w:beforeAutospacing="1" w:after="100" w:afterAutospacing="1" w:line="240" w:lineRule="auto"/>
     </w:pPr>
     <w:rPr>
-      <w:rFonts w:ascii="Times New Roman" w:hAnsi="Times New Roman" w:eastAsia="Times New Roman" w:cs="Times New Roman"/>
+      <w:rFonts w:ascii="Times New Roman" w:eastAsia="Times New Roman" w:hAnsi="Times New Roman" w:cs="Times New Roman"/>
       <w:sz w:val="24"/>
       <w:szCs w:val="24"/>
       <w:lang w:val="en-US"/>

</xml_diff>